<commit_message>
Sistemato layout tabella, affiancato alla tabella originale
</commit_message>
<xml_diff>
--- a/Documentazione/Elaborazione/Iterazione 2/Iterazione 2.docx
+++ b/Documentazione/Elaborazione/Iterazione 2/Iterazione 2.docx
@@ -53,7 +53,7 @@
                         <pic:cNvPicPr/>
                       </pic:nvPicPr>
                       <pic:blipFill>
-                        <a:blip r:embed="rId8">
+                        <a:blip r:embed="rId9">
                           <a:extLst>
                             <a:ext uri="{28A0092B-C50C-407E-A947-70E740481C1C}">
                               <a14:useLocalDpi xmlns:a14="http://schemas.microsoft.com/office/drawing/2010/main" val="0"/>
@@ -968,8 +968,20 @@
           <w:sz w:val="28"/>
           <w:szCs w:val="28"/>
         </w:rPr>
-        <w:t>Partita singleplayer</w:t>
+        <w:t xml:space="preserve">Partita </w:t>
       </w:r>
+      <w:proofErr w:type="spellStart"/>
+      <w:r>
+        <w:rPr>
+          <w:rFonts w:ascii="Calibri" w:eastAsia="Calibri" w:hAnsi="Calibri" w:cs="Calibri"/>
+          <w:i/>
+          <w:color w:val="0D0D0D"/>
+          <w:sz w:val="28"/>
+          <w:szCs w:val="28"/>
+        </w:rPr>
+        <w:t>singleplayer</w:t>
+      </w:r>
+      <w:proofErr w:type="spellEnd"/>
       <w:r>
         <w:rPr>
           <w:rFonts w:ascii="Calibri" w:eastAsia="Calibri" w:hAnsi="Calibri" w:cs="Calibri"/>
@@ -1081,9 +1093,17 @@
         <w:rPr>
           <w:rFonts w:ascii="Calibri" w:hAnsi="Calibri" w:cs="Calibri"/>
         </w:rPr>
-        <w:t>Partita singleplayer</w:t>
+        <w:t xml:space="preserve">Partita </w:t>
+      </w:r>
+      <w:proofErr w:type="spellStart"/>
+      <w:r>
+        <w:rPr>
+          <w:rFonts w:ascii="Calibri" w:hAnsi="Calibri" w:cs="Calibri"/>
+        </w:rPr>
+        <w:t>singleplayer</w:t>
       </w:r>
       <w:bookmarkEnd w:id="1"/>
+      <w:proofErr w:type="spellEnd"/>
     </w:p>
     <w:p>
       <w:pPr>
@@ -1126,8 +1146,18 @@
           <w:i/>
           <w:highlight w:val="white"/>
         </w:rPr>
-        <w:t>Partita singleplayer</w:t>
+        <w:t xml:space="preserve">Partita </w:t>
       </w:r>
+      <w:proofErr w:type="spellStart"/>
+      <w:r>
+        <w:rPr>
+          <w:rFonts w:ascii="Calibri" w:hAnsi="Calibri" w:cs="Calibri"/>
+          <w:i/>
+          <w:highlight w:val="white"/>
+        </w:rPr>
+        <w:t>singleplayer</w:t>
+      </w:r>
+      <w:proofErr w:type="spellEnd"/>
       <w:r>
         <w:rPr>
           <w:rFonts w:ascii="Calibri" w:hAnsi="Calibri" w:cs="Calibri"/>
@@ -1197,6 +1227,2424 @@
         </w:rPr>
       </w:pPr>
     </w:p>
+    <w:tbl>
+      <w:tblPr>
+        <w:tblStyle w:val="Elencomedio2-Colore1"/>
+        <w:tblW w:w="5132" w:type="pct"/>
+        <w:jc w:val="center"/>
+        <w:tblLook w:val="04A0" w:firstRow="1" w:lastRow="0" w:firstColumn="1" w:lastColumn="0" w:noHBand="0" w:noVBand="1"/>
+      </w:tblPr>
+      <w:tblGrid>
+        <w:gridCol w:w="4449"/>
+        <w:gridCol w:w="5443"/>
+      </w:tblGrid>
+      <w:tr>
+        <w:trPr>
+          <w:cnfStyle w:val="100000000000" w:firstRow="1" w:lastRow="0" w:firstColumn="0" w:lastColumn="0" w:oddVBand="0" w:evenVBand="0" w:oddHBand="0" w:evenHBand="0" w:firstRowFirstColumn="0" w:firstRowLastColumn="0" w:lastRowFirstColumn="0" w:lastRowLastColumn="0"/>
+          <w:trHeight w:val="338"/>
+          <w:jc w:val="center"/>
+        </w:trPr>
+        <w:tc>
+          <w:tcPr>
+            <w:cnfStyle w:val="001000000100" w:firstRow="0" w:lastRow="0" w:firstColumn="1" w:lastColumn="0" w:oddVBand="0" w:evenVBand="0" w:oddHBand="0" w:evenHBand="0" w:firstRowFirstColumn="1" w:firstRowLastColumn="0" w:lastRowFirstColumn="0" w:lastRowLastColumn="0"/>
+            <w:tcW w:w="2249" w:type="pct"/>
+            <w:noWrap/>
+            <w:vAlign w:val="center"/>
+          </w:tcPr>
+          <w:p>
+            <w:pPr>
+              <w:rPr>
+                <w:rFonts w:ascii="Calibri" w:eastAsiaTheme="minorEastAsia" w:hAnsi="Calibri" w:cs="Calibri"/>
+                <w:color w:val="auto"/>
+              </w:rPr>
+            </w:pPr>
+            <w:r>
+              <w:rPr>
+                <w:rFonts w:ascii="Calibri" w:eastAsiaTheme="minorEastAsia" w:hAnsi="Calibri" w:cs="Calibri"/>
+                <w:color w:val="215E99" w:themeColor="text2" w:themeTint="BF"/>
+              </w:rPr>
+              <w:t>Caso d’uso</w:t>
+            </w:r>
+          </w:p>
+        </w:tc>
+        <w:tc>
+          <w:tcPr>
+            <w:tcW w:w="2751" w:type="pct"/>
+            <w:vAlign w:val="center"/>
+          </w:tcPr>
+          <w:p>
+            <w:pPr>
+              <w:jc w:val="center"/>
+              <w:cnfStyle w:val="100000000000" w:firstRow="1" w:lastRow="0" w:firstColumn="0" w:lastColumn="0" w:oddVBand="0" w:evenVBand="0" w:oddHBand="0" w:evenHBand="0" w:firstRowFirstColumn="0" w:firstRowLastColumn="0" w:lastRowFirstColumn="0" w:lastRowLastColumn="0"/>
+              <w:rPr>
+                <w:rFonts w:ascii="Calibri" w:eastAsiaTheme="minorEastAsia" w:hAnsi="Calibri" w:cs="Calibri"/>
+                <w:color w:val="auto"/>
+              </w:rPr>
+            </w:pPr>
+            <w:r>
+              <w:rPr>
+                <w:rFonts w:ascii="Calibri" w:hAnsi="Calibri" w:cs="Calibri"/>
+                <w:color w:val="0D0D0D"/>
+                <w:shd w:val="clear" w:color="auto" w:fill="FFFFFF"/>
+              </w:rPr>
+              <w:t xml:space="preserve">Partita </w:t>
+            </w:r>
+            <w:proofErr w:type="spellStart"/>
+            <w:r>
+              <w:rPr>
+                <w:rFonts w:ascii="Calibri" w:hAnsi="Calibri" w:cs="Calibri"/>
+                <w:color w:val="0D0D0D"/>
+                <w:shd w:val="clear" w:color="auto" w:fill="FFFFFF"/>
+              </w:rPr>
+              <w:t>singleplayer</w:t>
+            </w:r>
+            <w:proofErr w:type="spellEnd"/>
+          </w:p>
+        </w:tc>
+      </w:tr>
+      <w:tr>
+        <w:trPr>
+          <w:cnfStyle w:val="000000100000" w:firstRow="0" w:lastRow="0" w:firstColumn="0" w:lastColumn="0" w:oddVBand="0" w:evenVBand="0" w:oddHBand="1" w:evenHBand="0" w:firstRowFirstColumn="0" w:firstRowLastColumn="0" w:lastRowFirstColumn="0" w:lastRowLastColumn="0"/>
+          <w:trHeight w:val="354"/>
+          <w:jc w:val="center"/>
+        </w:trPr>
+        <w:tc>
+          <w:tcPr>
+            <w:cnfStyle w:val="001000000000" w:firstRow="0" w:lastRow="0" w:firstColumn="1" w:lastColumn="0" w:oddVBand="0" w:evenVBand="0" w:oddHBand="0" w:evenHBand="0" w:firstRowFirstColumn="0" w:firstRowLastColumn="0" w:lastRowFirstColumn="0" w:lastRowLastColumn="0"/>
+            <w:tcW w:w="2249" w:type="pct"/>
+            <w:noWrap/>
+            <w:vAlign w:val="center"/>
+          </w:tcPr>
+          <w:p>
+            <w:pPr>
+              <w:rPr>
+                <w:rFonts w:ascii="Calibri" w:eastAsiaTheme="minorEastAsia" w:hAnsi="Calibri" w:cs="Calibri"/>
+                <w:color w:val="auto"/>
+                <w:sz w:val="24"/>
+                <w:szCs w:val="24"/>
+              </w:rPr>
+            </w:pPr>
+            <w:r>
+              <w:rPr>
+                <w:rFonts w:ascii="Calibri" w:hAnsi="Calibri" w:cs="Calibri"/>
+                <w:color w:val="0D0D0D"/>
+                <w:sz w:val="24"/>
+                <w:szCs w:val="24"/>
+                <w:shd w:val="clear" w:color="auto" w:fill="FFFFFF"/>
+              </w:rPr>
+              <w:t>Nome del caso d’uso</w:t>
+            </w:r>
+          </w:p>
+        </w:tc>
+        <w:tc>
+          <w:tcPr>
+            <w:tcW w:w="2751" w:type="pct"/>
+            <w:vAlign w:val="center"/>
+          </w:tcPr>
+          <w:p>
+            <w:pPr>
+              <w:jc w:val="center"/>
+              <w:cnfStyle w:val="000000100000" w:firstRow="0" w:lastRow="0" w:firstColumn="0" w:lastColumn="0" w:oddVBand="0" w:evenVBand="0" w:oddHBand="1" w:evenHBand="0" w:firstRowFirstColumn="0" w:firstRowLastColumn="0" w:lastRowFirstColumn="0" w:lastRowLastColumn="0"/>
+              <w:rPr>
+                <w:rFonts w:ascii="Calibri" w:eastAsiaTheme="minorEastAsia" w:hAnsi="Calibri" w:cs="Calibri"/>
+                <w:color w:val="auto"/>
+                <w:sz w:val="24"/>
+                <w:szCs w:val="24"/>
+              </w:rPr>
+            </w:pPr>
+            <w:r>
+              <w:rPr>
+                <w:rFonts w:ascii="Calibri" w:eastAsiaTheme="minorEastAsia" w:hAnsi="Calibri" w:cs="Calibri"/>
+                <w:color w:val="auto"/>
+                <w:sz w:val="24"/>
+                <w:szCs w:val="24"/>
+              </w:rPr>
+              <w:t xml:space="preserve">UC2: Partita </w:t>
+            </w:r>
+            <w:proofErr w:type="spellStart"/>
+            <w:r>
+              <w:rPr>
+                <w:rFonts w:ascii="Calibri" w:eastAsiaTheme="minorEastAsia" w:hAnsi="Calibri" w:cs="Calibri"/>
+                <w:color w:val="auto"/>
+                <w:sz w:val="24"/>
+                <w:szCs w:val="24"/>
+              </w:rPr>
+              <w:t>singleplayer</w:t>
+            </w:r>
+            <w:proofErr w:type="spellEnd"/>
+          </w:p>
+        </w:tc>
+      </w:tr>
+      <w:tr>
+        <w:trPr>
+          <w:trHeight w:val="433"/>
+          <w:jc w:val="center"/>
+        </w:trPr>
+        <w:tc>
+          <w:tcPr>
+            <w:cnfStyle w:val="001000000000" w:firstRow="0" w:lastRow="0" w:firstColumn="1" w:lastColumn="0" w:oddVBand="0" w:evenVBand="0" w:oddHBand="0" w:evenHBand="0" w:firstRowFirstColumn="0" w:firstRowLastColumn="0" w:lastRowFirstColumn="0" w:lastRowLastColumn="0"/>
+            <w:tcW w:w="2249" w:type="pct"/>
+            <w:noWrap/>
+            <w:vAlign w:val="center"/>
+          </w:tcPr>
+          <w:p>
+            <w:pPr>
+              <w:rPr>
+                <w:rFonts w:ascii="Calibri" w:eastAsiaTheme="minorEastAsia" w:hAnsi="Calibri" w:cs="Calibri"/>
+                <w:color w:val="auto"/>
+                <w:sz w:val="24"/>
+                <w:szCs w:val="24"/>
+              </w:rPr>
+            </w:pPr>
+            <w:r>
+              <w:rPr>
+                <w:rFonts w:ascii="Calibri" w:hAnsi="Calibri" w:cs="Calibri"/>
+                <w:color w:val="0D0D0D"/>
+                <w:sz w:val="24"/>
+                <w:szCs w:val="24"/>
+                <w:shd w:val="clear" w:color="auto" w:fill="FFFFFF"/>
+              </w:rPr>
+              <w:t>Portata</w:t>
+            </w:r>
+          </w:p>
+        </w:tc>
+        <w:tc>
+          <w:tcPr>
+            <w:tcW w:w="2751" w:type="pct"/>
+            <w:vAlign w:val="center"/>
+          </w:tcPr>
+          <w:p>
+            <w:pPr>
+              <w:jc w:val="center"/>
+              <w:cnfStyle w:val="000000000000" w:firstRow="0" w:lastRow="0" w:firstColumn="0" w:lastColumn="0" w:oddVBand="0" w:evenVBand="0" w:oddHBand="0" w:evenHBand="0" w:firstRowFirstColumn="0" w:firstRowLastColumn="0" w:lastRowFirstColumn="0" w:lastRowLastColumn="0"/>
+              <w:rPr>
+                <w:rFonts w:ascii="Calibri" w:eastAsiaTheme="minorEastAsia" w:hAnsi="Calibri" w:cs="Calibri"/>
+                <w:color w:val="auto"/>
+                <w:sz w:val="24"/>
+                <w:szCs w:val="24"/>
+              </w:rPr>
+            </w:pPr>
+            <w:r>
+              <w:rPr>
+                <w:rFonts w:ascii="Calibri" w:eastAsiaTheme="minorEastAsia" w:hAnsi="Calibri" w:cs="Calibri"/>
+                <w:color w:val="auto"/>
+                <w:sz w:val="24"/>
+                <w:szCs w:val="24"/>
+              </w:rPr>
+              <w:t>Applicazione Gioco dell’Oca</w:t>
+            </w:r>
+          </w:p>
+        </w:tc>
+      </w:tr>
+      <w:tr>
+        <w:trPr>
+          <w:cnfStyle w:val="000000100000" w:firstRow="0" w:lastRow="0" w:firstColumn="0" w:lastColumn="0" w:oddVBand="0" w:evenVBand="0" w:oddHBand="1" w:evenHBand="0" w:firstRowFirstColumn="0" w:firstRowLastColumn="0" w:lastRowFirstColumn="0" w:lastRowLastColumn="0"/>
+          <w:trHeight w:val="426"/>
+          <w:jc w:val="center"/>
+        </w:trPr>
+        <w:tc>
+          <w:tcPr>
+            <w:cnfStyle w:val="001000000000" w:firstRow="0" w:lastRow="0" w:firstColumn="1" w:lastColumn="0" w:oddVBand="0" w:evenVBand="0" w:oddHBand="0" w:evenHBand="0" w:firstRowFirstColumn="0" w:firstRowLastColumn="0" w:lastRowFirstColumn="0" w:lastRowLastColumn="0"/>
+            <w:tcW w:w="2249" w:type="pct"/>
+            <w:noWrap/>
+            <w:vAlign w:val="center"/>
+          </w:tcPr>
+          <w:p>
+            <w:pPr>
+              <w:rPr>
+                <w:rFonts w:ascii="Calibri" w:eastAsiaTheme="minorEastAsia" w:hAnsi="Calibri" w:cs="Calibri"/>
+                <w:color w:val="auto"/>
+                <w:sz w:val="24"/>
+                <w:szCs w:val="24"/>
+              </w:rPr>
+            </w:pPr>
+            <w:r>
+              <w:rPr>
+                <w:rFonts w:ascii="Calibri" w:hAnsi="Calibri" w:cs="Calibri"/>
+                <w:color w:val="0D0D0D"/>
+                <w:sz w:val="24"/>
+                <w:szCs w:val="24"/>
+                <w:shd w:val="clear" w:color="auto" w:fill="FFFFFF"/>
+              </w:rPr>
+              <w:t>Livello</w:t>
+            </w:r>
+          </w:p>
+        </w:tc>
+        <w:tc>
+          <w:tcPr>
+            <w:tcW w:w="2751" w:type="pct"/>
+            <w:vAlign w:val="center"/>
+          </w:tcPr>
+          <w:p>
+            <w:pPr>
+              <w:jc w:val="center"/>
+              <w:cnfStyle w:val="000000100000" w:firstRow="0" w:lastRow="0" w:firstColumn="0" w:lastColumn="0" w:oddVBand="0" w:evenVBand="0" w:oddHBand="1" w:evenHBand="0" w:firstRowFirstColumn="0" w:firstRowLastColumn="0" w:lastRowFirstColumn="0" w:lastRowLastColumn="0"/>
+              <w:rPr>
+                <w:rFonts w:ascii="Calibri" w:eastAsiaTheme="minorEastAsia" w:hAnsi="Calibri" w:cs="Calibri"/>
+                <w:color w:val="auto"/>
+                <w:sz w:val="24"/>
+                <w:szCs w:val="24"/>
+              </w:rPr>
+            </w:pPr>
+            <w:r>
+              <w:rPr>
+                <w:rFonts w:ascii="Calibri" w:eastAsiaTheme="minorEastAsia" w:hAnsi="Calibri" w:cs="Calibri"/>
+                <w:color w:val="auto"/>
+                <w:sz w:val="24"/>
+                <w:szCs w:val="24"/>
+              </w:rPr>
+              <w:t>Obiettivo Utente</w:t>
+            </w:r>
+          </w:p>
+        </w:tc>
+      </w:tr>
+      <w:tr>
+        <w:trPr>
+          <w:trHeight w:val="432"/>
+          <w:jc w:val="center"/>
+        </w:trPr>
+        <w:tc>
+          <w:tcPr>
+            <w:cnfStyle w:val="001000000000" w:firstRow="0" w:lastRow="0" w:firstColumn="1" w:lastColumn="0" w:oddVBand="0" w:evenVBand="0" w:oddHBand="0" w:evenHBand="0" w:firstRowFirstColumn="0" w:firstRowLastColumn="0" w:lastRowFirstColumn="0" w:lastRowLastColumn="0"/>
+            <w:tcW w:w="2249" w:type="pct"/>
+            <w:noWrap/>
+            <w:vAlign w:val="center"/>
+          </w:tcPr>
+          <w:p>
+            <w:pPr>
+              <w:rPr>
+                <w:rFonts w:ascii="Calibri" w:eastAsiaTheme="minorEastAsia" w:hAnsi="Calibri" w:cs="Calibri"/>
+                <w:color w:val="auto"/>
+                <w:sz w:val="24"/>
+                <w:szCs w:val="24"/>
+              </w:rPr>
+            </w:pPr>
+            <w:r>
+              <w:rPr>
+                <w:rFonts w:ascii="Calibri" w:hAnsi="Calibri" w:cs="Calibri"/>
+                <w:color w:val="0D0D0D"/>
+                <w:sz w:val="24"/>
+                <w:szCs w:val="24"/>
+                <w:shd w:val="clear" w:color="auto" w:fill="FFFFFF"/>
+              </w:rPr>
+              <w:t>Attore primario</w:t>
+            </w:r>
+          </w:p>
+        </w:tc>
+        <w:tc>
+          <w:tcPr>
+            <w:tcW w:w="2751" w:type="pct"/>
+            <w:vAlign w:val="center"/>
+          </w:tcPr>
+          <w:p>
+            <w:pPr>
+              <w:jc w:val="center"/>
+              <w:cnfStyle w:val="000000000000" w:firstRow="0" w:lastRow="0" w:firstColumn="0" w:lastColumn="0" w:oddVBand="0" w:evenVBand="0" w:oddHBand="0" w:evenHBand="0" w:firstRowFirstColumn="0" w:firstRowLastColumn="0" w:lastRowFirstColumn="0" w:lastRowLastColumn="0"/>
+              <w:rPr>
+                <w:rFonts w:ascii="Calibri" w:eastAsiaTheme="minorEastAsia" w:hAnsi="Calibri" w:cs="Calibri"/>
+                <w:color w:val="auto"/>
+                <w:sz w:val="24"/>
+                <w:szCs w:val="24"/>
+              </w:rPr>
+            </w:pPr>
+            <w:r>
+              <w:rPr>
+                <w:rFonts w:ascii="Calibri" w:eastAsiaTheme="minorEastAsia" w:hAnsi="Calibri" w:cs="Calibri"/>
+                <w:color w:val="auto"/>
+                <w:sz w:val="24"/>
+                <w:szCs w:val="24"/>
+              </w:rPr>
+              <w:t>Giocatore</w:t>
+            </w:r>
+          </w:p>
+        </w:tc>
+      </w:tr>
+      <w:tr>
+        <w:trPr>
+          <w:cnfStyle w:val="000000100000" w:firstRow="0" w:lastRow="0" w:firstColumn="0" w:lastColumn="0" w:oddVBand="0" w:evenVBand="0" w:oddHBand="1" w:evenHBand="0" w:firstRowFirstColumn="0" w:firstRowLastColumn="0" w:lastRowFirstColumn="0" w:lastRowLastColumn="0"/>
+          <w:trHeight w:val="708"/>
+          <w:jc w:val="center"/>
+        </w:trPr>
+        <w:tc>
+          <w:tcPr>
+            <w:cnfStyle w:val="001000000000" w:firstRow="0" w:lastRow="0" w:firstColumn="1" w:lastColumn="0" w:oddVBand="0" w:evenVBand="0" w:oddHBand="0" w:evenHBand="0" w:firstRowFirstColumn="0" w:firstRowLastColumn="0" w:lastRowFirstColumn="0" w:lastRowLastColumn="0"/>
+            <w:tcW w:w="2249" w:type="pct"/>
+            <w:noWrap/>
+            <w:vAlign w:val="center"/>
+          </w:tcPr>
+          <w:p>
+            <w:pPr>
+              <w:rPr>
+                <w:rFonts w:ascii="Calibri" w:eastAsiaTheme="minorEastAsia" w:hAnsi="Calibri" w:cs="Calibri"/>
+                <w:color w:val="auto"/>
+                <w:sz w:val="24"/>
+                <w:szCs w:val="24"/>
+              </w:rPr>
+            </w:pPr>
+            <w:r>
+              <w:rPr>
+                <w:rFonts w:ascii="Calibri" w:hAnsi="Calibri" w:cs="Calibri"/>
+                <w:color w:val="0D0D0D"/>
+                <w:sz w:val="24"/>
+                <w:szCs w:val="24"/>
+                <w:shd w:val="clear" w:color="auto" w:fill="FFFFFF"/>
+              </w:rPr>
+              <w:t>Parti interessate e interessi</w:t>
+            </w:r>
+          </w:p>
+        </w:tc>
+        <w:tc>
+          <w:tcPr>
+            <w:tcW w:w="2751" w:type="pct"/>
+            <w:vAlign w:val="center"/>
+          </w:tcPr>
+          <w:p>
+            <w:pPr>
+              <w:cnfStyle w:val="000000100000" w:firstRow="0" w:lastRow="0" w:firstColumn="0" w:lastColumn="0" w:oddVBand="0" w:evenVBand="0" w:oddHBand="1" w:evenHBand="0" w:firstRowFirstColumn="0" w:firstRowLastColumn="0" w:lastRowFirstColumn="0" w:lastRowLastColumn="0"/>
+              <w:rPr>
+                <w:rFonts w:ascii="Calibri" w:eastAsiaTheme="minorEastAsia" w:hAnsi="Calibri" w:cs="Calibri"/>
+                <w:sz w:val="24"/>
+                <w:szCs w:val="24"/>
+              </w:rPr>
+            </w:pPr>
+            <w:r>
+              <w:rPr>
+                <w:rFonts w:ascii="Calibri" w:eastAsiaTheme="minorEastAsia" w:hAnsi="Calibri" w:cs="Calibri"/>
+                <w:sz w:val="24"/>
+                <w:szCs w:val="24"/>
+              </w:rPr>
+              <w:t xml:space="preserve">Giocatore → Vuole giocare una partita </w:t>
+            </w:r>
+            <w:proofErr w:type="spellStart"/>
+            <w:r>
+              <w:rPr>
+                <w:rFonts w:ascii="Calibri" w:eastAsiaTheme="minorEastAsia" w:hAnsi="Calibri" w:cs="Calibri"/>
+                <w:sz w:val="24"/>
+                <w:szCs w:val="24"/>
+              </w:rPr>
+              <w:t>singleplayer</w:t>
+            </w:r>
+            <w:proofErr w:type="spellEnd"/>
+            <w:r>
+              <w:rPr>
+                <w:rFonts w:ascii="Calibri" w:eastAsiaTheme="minorEastAsia" w:hAnsi="Calibri" w:cs="Calibri"/>
+                <w:sz w:val="24"/>
+                <w:szCs w:val="24"/>
+              </w:rPr>
+              <w:t xml:space="preserve"> al Gioco dell’Oca</w:t>
+            </w:r>
+          </w:p>
+        </w:tc>
+      </w:tr>
+      <w:tr>
+        <w:trPr>
+          <w:trHeight w:val="703"/>
+          <w:jc w:val="center"/>
+        </w:trPr>
+        <w:tc>
+          <w:tcPr>
+            <w:cnfStyle w:val="001000000000" w:firstRow="0" w:lastRow="0" w:firstColumn="1" w:lastColumn="0" w:oddVBand="0" w:evenVBand="0" w:oddHBand="0" w:evenHBand="0" w:firstRowFirstColumn="0" w:firstRowLastColumn="0" w:lastRowFirstColumn="0" w:lastRowLastColumn="0"/>
+            <w:tcW w:w="2249" w:type="pct"/>
+            <w:noWrap/>
+            <w:vAlign w:val="center"/>
+          </w:tcPr>
+          <w:p>
+            <w:pPr>
+              <w:rPr>
+                <w:rFonts w:ascii="Calibri" w:hAnsi="Calibri" w:cs="Calibri"/>
+                <w:color w:val="0D0D0D"/>
+                <w:sz w:val="24"/>
+                <w:szCs w:val="24"/>
+                <w:shd w:val="clear" w:color="auto" w:fill="FFFFFF"/>
+              </w:rPr>
+            </w:pPr>
+            <w:r>
+              <w:rPr>
+                <w:rFonts w:ascii="Calibri" w:hAnsi="Calibri" w:cs="Calibri"/>
+                <w:color w:val="0D0D0D"/>
+                <w:sz w:val="24"/>
+                <w:szCs w:val="24"/>
+                <w:shd w:val="clear" w:color="auto" w:fill="FFFFFF"/>
+              </w:rPr>
+              <w:t>Pre-condizioni</w:t>
+            </w:r>
+          </w:p>
+        </w:tc>
+        <w:tc>
+          <w:tcPr>
+            <w:tcW w:w="2751" w:type="pct"/>
+            <w:vAlign w:val="center"/>
+          </w:tcPr>
+          <w:p>
+            <w:pPr>
+              <w:cnfStyle w:val="000000000000" w:firstRow="0" w:lastRow="0" w:firstColumn="0" w:lastColumn="0" w:oddVBand="0" w:evenVBand="0" w:oddHBand="0" w:evenHBand="0" w:firstRowFirstColumn="0" w:firstRowLastColumn="0" w:lastRowFirstColumn="0" w:lastRowLastColumn="0"/>
+              <w:rPr>
+                <w:rFonts w:ascii="Calibri" w:eastAsiaTheme="minorEastAsia" w:hAnsi="Calibri" w:cs="Calibri"/>
+                <w:sz w:val="24"/>
+                <w:szCs w:val="24"/>
+              </w:rPr>
+            </w:pPr>
+            <w:r>
+              <w:rPr>
+                <w:rFonts w:ascii="Calibri" w:eastAsiaTheme="minorEastAsia" w:hAnsi="Calibri" w:cs="Calibri"/>
+                <w:sz w:val="24"/>
+                <w:szCs w:val="24"/>
+              </w:rPr>
+              <w:t xml:space="preserve">Il giocatore deve aver configurato e avviato una partita </w:t>
+            </w:r>
+            <w:proofErr w:type="spellStart"/>
+            <w:r>
+              <w:rPr>
+                <w:rFonts w:ascii="Calibri" w:eastAsiaTheme="minorEastAsia" w:hAnsi="Calibri" w:cs="Calibri"/>
+                <w:sz w:val="24"/>
+                <w:szCs w:val="24"/>
+              </w:rPr>
+              <w:t>singleplayer</w:t>
+            </w:r>
+            <w:proofErr w:type="spellEnd"/>
+          </w:p>
+        </w:tc>
+      </w:tr>
+      <w:tr>
+        <w:trPr>
+          <w:cnfStyle w:val="000000100000" w:firstRow="0" w:lastRow="0" w:firstColumn="0" w:lastColumn="0" w:oddVBand="0" w:evenVBand="0" w:oddHBand="1" w:evenHBand="0" w:firstRowFirstColumn="0" w:firstRowLastColumn="0" w:lastRowFirstColumn="0" w:lastRowLastColumn="0"/>
+          <w:trHeight w:val="713"/>
+          <w:jc w:val="center"/>
+        </w:trPr>
+        <w:tc>
+          <w:tcPr>
+            <w:cnfStyle w:val="001000000000" w:firstRow="0" w:lastRow="0" w:firstColumn="1" w:lastColumn="0" w:oddVBand="0" w:evenVBand="0" w:oddHBand="0" w:evenHBand="0" w:firstRowFirstColumn="0" w:firstRowLastColumn="0" w:lastRowFirstColumn="0" w:lastRowLastColumn="0"/>
+            <w:tcW w:w="2249" w:type="pct"/>
+            <w:noWrap/>
+            <w:vAlign w:val="center"/>
+          </w:tcPr>
+          <w:p>
+            <w:pPr>
+              <w:rPr>
+                <w:rFonts w:ascii="Calibri" w:hAnsi="Calibri" w:cs="Calibri"/>
+                <w:color w:val="0D0D0D"/>
+                <w:sz w:val="24"/>
+                <w:szCs w:val="24"/>
+                <w:shd w:val="clear" w:color="auto" w:fill="FFFFFF"/>
+              </w:rPr>
+            </w:pPr>
+            <w:r>
+              <w:rPr>
+                <w:rFonts w:ascii="Calibri" w:hAnsi="Calibri" w:cs="Calibri"/>
+                <w:color w:val="0D0D0D"/>
+                <w:sz w:val="24"/>
+                <w:szCs w:val="24"/>
+                <w:shd w:val="clear" w:color="auto" w:fill="FFFFFF"/>
+              </w:rPr>
+              <w:t>Garanzia di successo</w:t>
+            </w:r>
+          </w:p>
+        </w:tc>
+        <w:tc>
+          <w:tcPr>
+            <w:tcW w:w="2751" w:type="pct"/>
+            <w:vAlign w:val="center"/>
+          </w:tcPr>
+          <w:p>
+            <w:pPr>
+              <w:cnfStyle w:val="000000100000" w:firstRow="0" w:lastRow="0" w:firstColumn="0" w:lastColumn="0" w:oddVBand="0" w:evenVBand="0" w:oddHBand="1" w:evenHBand="0" w:firstRowFirstColumn="0" w:firstRowLastColumn="0" w:lastRowFirstColumn="0" w:lastRowLastColumn="0"/>
+              <w:rPr>
+                <w:rFonts w:ascii="Calibri" w:eastAsiaTheme="minorEastAsia" w:hAnsi="Calibri" w:cs="Calibri"/>
+                <w:sz w:val="24"/>
+                <w:szCs w:val="24"/>
+              </w:rPr>
+            </w:pPr>
+            <w:r>
+              <w:rPr>
+                <w:rFonts w:ascii="Calibri" w:eastAsiaTheme="minorEastAsia" w:hAnsi="Calibri" w:cs="Calibri"/>
+                <w:sz w:val="24"/>
+                <w:szCs w:val="24"/>
+              </w:rPr>
+              <w:t>Il sistema conclude la partita precedentemente avviata</w:t>
+            </w:r>
+          </w:p>
+        </w:tc>
+      </w:tr>
+      <w:tr>
+        <w:trPr>
+          <w:jc w:val="center"/>
+        </w:trPr>
+        <w:tc>
+          <w:tcPr>
+            <w:cnfStyle w:val="001000000000" w:firstRow="0" w:lastRow="0" w:firstColumn="1" w:lastColumn="0" w:oddVBand="0" w:evenVBand="0" w:oddHBand="0" w:evenHBand="0" w:firstRowFirstColumn="0" w:firstRowLastColumn="0" w:lastRowFirstColumn="0" w:lastRowLastColumn="0"/>
+            <w:tcW w:w="2249" w:type="pct"/>
+            <w:noWrap/>
+            <w:vAlign w:val="center"/>
+          </w:tcPr>
+          <w:p>
+            <w:pPr>
+              <w:rPr>
+                <w:rFonts w:ascii="Calibri" w:hAnsi="Calibri" w:cs="Calibri"/>
+                <w:color w:val="0D0D0D"/>
+                <w:sz w:val="24"/>
+                <w:szCs w:val="24"/>
+                <w:shd w:val="clear" w:color="auto" w:fill="FFFFFF"/>
+              </w:rPr>
+            </w:pPr>
+            <w:r>
+              <w:rPr>
+                <w:rFonts w:ascii="Calibri" w:hAnsi="Calibri" w:cs="Calibri"/>
+                <w:color w:val="0D0D0D"/>
+                <w:sz w:val="24"/>
+                <w:szCs w:val="24"/>
+                <w:shd w:val="clear" w:color="auto" w:fill="FFFFFF"/>
+              </w:rPr>
+              <w:lastRenderedPageBreak/>
+              <w:t>Scenario principale di successo</w:t>
+            </w:r>
+          </w:p>
+        </w:tc>
+        <w:tc>
+          <w:tcPr>
+            <w:tcW w:w="2751" w:type="pct"/>
+            <w:vAlign w:val="center"/>
+          </w:tcPr>
+          <w:p>
+            <w:pPr>
+              <w:cnfStyle w:val="000000000000" w:firstRow="0" w:lastRow="0" w:firstColumn="0" w:lastColumn="0" w:oddVBand="0" w:evenVBand="0" w:oddHBand="0" w:evenHBand="0" w:firstRowFirstColumn="0" w:firstRowLastColumn="0" w:lastRowFirstColumn="0" w:lastRowLastColumn="0"/>
+              <w:rPr>
+                <w:rFonts w:ascii="Calibri" w:eastAsiaTheme="minorEastAsia" w:hAnsi="Calibri" w:cs="Calibri"/>
+                <w:sz w:val="24"/>
+                <w:szCs w:val="24"/>
+              </w:rPr>
+            </w:pPr>
+            <w:r>
+              <w:rPr>
+                <w:rFonts w:ascii="Calibri" w:eastAsiaTheme="minorEastAsia" w:hAnsi="Calibri" w:cs="Calibri"/>
+                <w:sz w:val="24"/>
+                <w:szCs w:val="24"/>
+              </w:rPr>
+              <w:t>1.</w:t>
+            </w:r>
+            <w:r>
+              <w:rPr>
+                <w:rFonts w:ascii="Calibri" w:eastAsiaTheme="minorEastAsia" w:hAnsi="Calibri" w:cs="Calibri"/>
+                <w:sz w:val="24"/>
+                <w:szCs w:val="24"/>
+              </w:rPr>
+              <w:tab/>
+              <w:t>Il sistema imposta l’utente come primo giocatore di turno.</w:t>
+            </w:r>
+          </w:p>
+          <w:p>
+            <w:pPr>
+              <w:cnfStyle w:val="000000000000" w:firstRow="0" w:lastRow="0" w:firstColumn="0" w:lastColumn="0" w:oddVBand="0" w:evenVBand="0" w:oddHBand="0" w:evenHBand="0" w:firstRowFirstColumn="0" w:firstRowLastColumn="0" w:lastRowFirstColumn="0" w:lastRowLastColumn="0"/>
+              <w:rPr>
+                <w:rFonts w:ascii="Calibri" w:eastAsiaTheme="minorEastAsia" w:hAnsi="Calibri" w:cs="Calibri"/>
+                <w:sz w:val="24"/>
+                <w:szCs w:val="24"/>
+              </w:rPr>
+            </w:pPr>
+            <w:r>
+              <w:rPr>
+                <w:rFonts w:ascii="Calibri" w:eastAsiaTheme="minorEastAsia" w:hAnsi="Calibri" w:cs="Calibri"/>
+                <w:sz w:val="24"/>
+                <w:szCs w:val="24"/>
+              </w:rPr>
+              <w:t>2.</w:t>
+            </w:r>
+            <w:r>
+              <w:rPr>
+                <w:rFonts w:ascii="Calibri" w:eastAsiaTheme="minorEastAsia" w:hAnsi="Calibri" w:cs="Calibri"/>
+                <w:sz w:val="24"/>
+                <w:szCs w:val="24"/>
+              </w:rPr>
+              <w:tab/>
+              <w:t>Il sistema controlla lo stato del giocatore di turno.</w:t>
+            </w:r>
+          </w:p>
+          <w:p>
+            <w:pPr>
+              <w:cnfStyle w:val="000000000000" w:firstRow="0" w:lastRow="0" w:firstColumn="0" w:lastColumn="0" w:oddVBand="0" w:evenVBand="0" w:oddHBand="0" w:evenHBand="0" w:firstRowFirstColumn="0" w:firstRowLastColumn="0" w:lastRowFirstColumn="0" w:lastRowLastColumn="0"/>
+              <w:rPr>
+                <w:rFonts w:ascii="Calibri" w:eastAsiaTheme="minorEastAsia" w:hAnsi="Calibri" w:cs="Calibri"/>
+                <w:sz w:val="24"/>
+                <w:szCs w:val="24"/>
+              </w:rPr>
+            </w:pPr>
+            <w:r>
+              <w:rPr>
+                <w:rFonts w:ascii="Calibri" w:eastAsiaTheme="minorEastAsia" w:hAnsi="Calibri" w:cs="Calibri"/>
+                <w:sz w:val="24"/>
+                <w:szCs w:val="24"/>
+              </w:rPr>
+              <w:t>3.</w:t>
+            </w:r>
+            <w:r>
+              <w:rPr>
+                <w:rFonts w:ascii="Calibri" w:eastAsiaTheme="minorEastAsia" w:hAnsi="Calibri" w:cs="Calibri"/>
+                <w:sz w:val="24"/>
+                <w:szCs w:val="24"/>
+              </w:rPr>
+              <w:tab/>
+              <w:t>L’utente inizia il proprio turno cliccando sul pulsante “Lancia dadi”.</w:t>
+            </w:r>
+          </w:p>
+          <w:p>
+            <w:pPr>
+              <w:cnfStyle w:val="000000000000" w:firstRow="0" w:lastRow="0" w:firstColumn="0" w:lastColumn="0" w:oddVBand="0" w:evenVBand="0" w:oddHBand="0" w:evenHBand="0" w:firstRowFirstColumn="0" w:firstRowLastColumn="0" w:lastRowFirstColumn="0" w:lastRowLastColumn="0"/>
+              <w:rPr>
+                <w:rFonts w:ascii="Calibri" w:eastAsiaTheme="minorEastAsia" w:hAnsi="Calibri" w:cs="Calibri"/>
+                <w:sz w:val="24"/>
+                <w:szCs w:val="24"/>
+              </w:rPr>
+            </w:pPr>
+            <w:r>
+              <w:rPr>
+                <w:rFonts w:ascii="Calibri" w:eastAsiaTheme="minorEastAsia" w:hAnsi="Calibri" w:cs="Calibri"/>
+                <w:sz w:val="24"/>
+                <w:szCs w:val="24"/>
+              </w:rPr>
+              <w:t>4.</w:t>
+            </w:r>
+            <w:r>
+              <w:rPr>
+                <w:rFonts w:ascii="Calibri" w:eastAsiaTheme="minorEastAsia" w:hAnsi="Calibri" w:cs="Calibri"/>
+                <w:sz w:val="24"/>
+                <w:szCs w:val="24"/>
+              </w:rPr>
+              <w:tab/>
+              <w:t>Il sistema genera due numeri casuali da 1 a 6.</w:t>
+            </w:r>
+          </w:p>
+          <w:p>
+            <w:pPr>
+              <w:cnfStyle w:val="000000000000" w:firstRow="0" w:lastRow="0" w:firstColumn="0" w:lastColumn="0" w:oddVBand="0" w:evenVBand="0" w:oddHBand="0" w:evenHBand="0" w:firstRowFirstColumn="0" w:firstRowLastColumn="0" w:lastRowFirstColumn="0" w:lastRowLastColumn="0"/>
+              <w:rPr>
+                <w:rFonts w:ascii="Calibri" w:eastAsiaTheme="minorEastAsia" w:hAnsi="Calibri" w:cs="Calibri"/>
+                <w:sz w:val="24"/>
+                <w:szCs w:val="24"/>
+              </w:rPr>
+            </w:pPr>
+            <w:r>
+              <w:rPr>
+                <w:rFonts w:ascii="Calibri" w:eastAsiaTheme="minorEastAsia" w:hAnsi="Calibri" w:cs="Calibri"/>
+                <w:sz w:val="24"/>
+                <w:szCs w:val="24"/>
+              </w:rPr>
+              <w:t>5.</w:t>
+            </w:r>
+            <w:r>
+              <w:rPr>
+                <w:rFonts w:ascii="Calibri" w:eastAsiaTheme="minorEastAsia" w:hAnsi="Calibri" w:cs="Calibri"/>
+                <w:sz w:val="24"/>
+                <w:szCs w:val="24"/>
+              </w:rPr>
+              <w:tab/>
+              <w:t>La pedina del giocatore di turno si muove in avanti della somma dei numeri che scaturiscono dal lancio dei dadi.</w:t>
+            </w:r>
+          </w:p>
+          <w:p>
+            <w:pPr>
+              <w:cnfStyle w:val="000000000000" w:firstRow="0" w:lastRow="0" w:firstColumn="0" w:lastColumn="0" w:oddVBand="0" w:evenVBand="0" w:oddHBand="0" w:evenHBand="0" w:firstRowFirstColumn="0" w:firstRowLastColumn="0" w:lastRowFirstColumn="0" w:lastRowLastColumn="0"/>
+              <w:rPr>
+                <w:rFonts w:ascii="Calibri" w:eastAsiaTheme="minorEastAsia" w:hAnsi="Calibri" w:cs="Calibri"/>
+                <w:sz w:val="24"/>
+                <w:szCs w:val="24"/>
+              </w:rPr>
+            </w:pPr>
+            <w:r>
+              <w:rPr>
+                <w:rFonts w:ascii="Calibri" w:eastAsiaTheme="minorEastAsia" w:hAnsi="Calibri" w:cs="Calibri"/>
+                <w:sz w:val="24"/>
+                <w:szCs w:val="24"/>
+              </w:rPr>
+              <w:t>6.</w:t>
+            </w:r>
+            <w:r>
+              <w:rPr>
+                <w:rFonts w:ascii="Calibri" w:eastAsiaTheme="minorEastAsia" w:hAnsi="Calibri" w:cs="Calibri"/>
+                <w:sz w:val="24"/>
+                <w:szCs w:val="24"/>
+              </w:rPr>
+              <w:tab/>
+              <w:t>In base alla casella del tabellone sulla quale finisce la pedina del giocatore di turno, viene applicato l’effetto appropriato.</w:t>
+            </w:r>
+          </w:p>
+          <w:p>
+            <w:pPr>
+              <w:cnfStyle w:val="000000000000" w:firstRow="0" w:lastRow="0" w:firstColumn="0" w:lastColumn="0" w:oddVBand="0" w:evenVBand="0" w:oddHBand="0" w:evenHBand="0" w:firstRowFirstColumn="0" w:firstRowLastColumn="0" w:lastRowFirstColumn="0" w:lastRowLastColumn="0"/>
+              <w:rPr>
+                <w:rFonts w:ascii="Calibri" w:eastAsiaTheme="minorEastAsia" w:hAnsi="Calibri" w:cs="Calibri"/>
+                <w:sz w:val="24"/>
+                <w:szCs w:val="24"/>
+              </w:rPr>
+            </w:pPr>
+            <w:r>
+              <w:rPr>
+                <w:rFonts w:ascii="Calibri" w:eastAsiaTheme="minorEastAsia" w:hAnsi="Calibri" w:cs="Calibri"/>
+                <w:sz w:val="24"/>
+                <w:szCs w:val="24"/>
+              </w:rPr>
+              <w:t>7.</w:t>
+            </w:r>
+            <w:r>
+              <w:rPr>
+                <w:rFonts w:ascii="Calibri" w:eastAsiaTheme="minorEastAsia" w:hAnsi="Calibri" w:cs="Calibri"/>
+                <w:sz w:val="24"/>
+                <w:szCs w:val="24"/>
+              </w:rPr>
+              <w:tab/>
+              <w:t>Il sistema salva il numero della casella sulla quale finisce la pedina del giocatore di turno.</w:t>
+            </w:r>
+          </w:p>
+          <w:p>
+            <w:pPr>
+              <w:cnfStyle w:val="000000000000" w:firstRow="0" w:lastRow="0" w:firstColumn="0" w:lastColumn="0" w:oddVBand="0" w:evenVBand="0" w:oddHBand="0" w:evenHBand="0" w:firstRowFirstColumn="0" w:firstRowLastColumn="0" w:lastRowFirstColumn="0" w:lastRowLastColumn="0"/>
+              <w:rPr>
+                <w:rFonts w:ascii="Calibri" w:eastAsiaTheme="minorEastAsia" w:hAnsi="Calibri" w:cs="Calibri"/>
+                <w:sz w:val="24"/>
+                <w:szCs w:val="24"/>
+              </w:rPr>
+            </w:pPr>
+            <w:r>
+              <w:rPr>
+                <w:rFonts w:ascii="Calibri" w:eastAsiaTheme="minorEastAsia" w:hAnsi="Calibri" w:cs="Calibri"/>
+                <w:sz w:val="24"/>
+                <w:szCs w:val="24"/>
+              </w:rPr>
+              <w:t>8.</w:t>
+            </w:r>
+            <w:r>
+              <w:rPr>
+                <w:rFonts w:ascii="Calibri" w:eastAsiaTheme="minorEastAsia" w:hAnsi="Calibri" w:cs="Calibri"/>
+                <w:sz w:val="24"/>
+                <w:szCs w:val="24"/>
+              </w:rPr>
+              <w:tab/>
+              <w:t>Il sistema controlla che la casella sulla quale è finita la pedina del giocatore di turno sia quella finale.</w:t>
+            </w:r>
+          </w:p>
+          <w:p>
+            <w:pPr>
+              <w:cnfStyle w:val="000000000000" w:firstRow="0" w:lastRow="0" w:firstColumn="0" w:lastColumn="0" w:oddVBand="0" w:evenVBand="0" w:oddHBand="0" w:evenHBand="0" w:firstRowFirstColumn="0" w:firstRowLastColumn="0" w:lastRowFirstColumn="0" w:lastRowLastColumn="0"/>
+              <w:rPr>
+                <w:rFonts w:ascii="Calibri" w:eastAsiaTheme="minorEastAsia" w:hAnsi="Calibri" w:cs="Calibri"/>
+                <w:sz w:val="24"/>
+                <w:szCs w:val="24"/>
+              </w:rPr>
+            </w:pPr>
+            <w:r>
+              <w:rPr>
+                <w:rFonts w:ascii="Calibri" w:eastAsiaTheme="minorEastAsia" w:hAnsi="Calibri" w:cs="Calibri"/>
+                <w:sz w:val="24"/>
+                <w:szCs w:val="24"/>
+              </w:rPr>
+              <w:t>9.</w:t>
+            </w:r>
+            <w:r>
+              <w:rPr>
+                <w:rFonts w:ascii="Calibri" w:eastAsiaTheme="minorEastAsia" w:hAnsi="Calibri" w:cs="Calibri"/>
+                <w:sz w:val="24"/>
+                <w:szCs w:val="24"/>
+              </w:rPr>
+              <w:tab/>
+              <w:t>Il sistema conclude la partita, indicando come vincitore il giocatore la cui pedina è finita sulla casella finale.</w:t>
+            </w:r>
+          </w:p>
+          <w:p>
+            <w:pPr>
+              <w:cnfStyle w:val="000000000000" w:firstRow="0" w:lastRow="0" w:firstColumn="0" w:lastColumn="0" w:oddVBand="0" w:evenVBand="0" w:oddHBand="0" w:evenHBand="0" w:firstRowFirstColumn="0" w:firstRowLastColumn="0" w:lastRowFirstColumn="0" w:lastRowLastColumn="0"/>
+              <w:rPr>
+                <w:rFonts w:ascii="Calibri" w:eastAsiaTheme="minorEastAsia" w:hAnsi="Calibri" w:cs="Calibri"/>
+                <w:sz w:val="24"/>
+                <w:szCs w:val="24"/>
+              </w:rPr>
+            </w:pPr>
+            <w:r>
+              <w:rPr>
+                <w:rFonts w:ascii="Calibri" w:eastAsiaTheme="minorEastAsia" w:hAnsi="Calibri" w:cs="Calibri"/>
+                <w:sz w:val="24"/>
+                <w:szCs w:val="24"/>
+              </w:rPr>
+              <w:t>10.</w:t>
+            </w:r>
+            <w:r>
+              <w:rPr>
+                <w:rFonts w:ascii="Calibri" w:eastAsiaTheme="minorEastAsia" w:hAnsi="Calibri" w:cs="Calibri"/>
+                <w:sz w:val="24"/>
+                <w:szCs w:val="24"/>
+              </w:rPr>
+              <w:tab/>
+              <w:t xml:space="preserve"> L’utente clicca sul pulsante “Torna al menu principale”.</w:t>
+            </w:r>
+          </w:p>
+          <w:p>
+            <w:pPr>
+              <w:cnfStyle w:val="000000000000" w:firstRow="0" w:lastRow="0" w:firstColumn="0" w:lastColumn="0" w:oddVBand="0" w:evenVBand="0" w:oddHBand="0" w:evenHBand="0" w:firstRowFirstColumn="0" w:firstRowLastColumn="0" w:lastRowFirstColumn="0" w:lastRowLastColumn="0"/>
+              <w:rPr>
+                <w:rFonts w:ascii="Calibri" w:eastAsiaTheme="minorEastAsia" w:hAnsi="Calibri" w:cs="Calibri"/>
+                <w:sz w:val="24"/>
+                <w:szCs w:val="24"/>
+              </w:rPr>
+            </w:pPr>
+            <w:r>
+              <w:rPr>
+                <w:rFonts w:ascii="Calibri" w:eastAsiaTheme="minorEastAsia" w:hAnsi="Calibri" w:cs="Calibri"/>
+                <w:sz w:val="24"/>
+                <w:szCs w:val="24"/>
+              </w:rPr>
+              <w:t>11.</w:t>
+            </w:r>
+            <w:r>
+              <w:rPr>
+                <w:rFonts w:ascii="Calibri" w:eastAsiaTheme="minorEastAsia" w:hAnsi="Calibri" w:cs="Calibri"/>
+                <w:sz w:val="24"/>
+                <w:szCs w:val="24"/>
+              </w:rPr>
+              <w:tab/>
+              <w:t xml:space="preserve"> Il sistema torna alla pagina del menu principale.</w:t>
+            </w:r>
+          </w:p>
+        </w:tc>
+      </w:tr>
+      <w:tr>
+        <w:trPr>
+          <w:cnfStyle w:val="000000100000" w:firstRow="0" w:lastRow="0" w:firstColumn="0" w:lastColumn="0" w:oddVBand="0" w:evenVBand="0" w:oddHBand="1" w:evenHBand="0" w:firstRowFirstColumn="0" w:firstRowLastColumn="0" w:lastRowFirstColumn="0" w:lastRowLastColumn="0"/>
+          <w:jc w:val="center"/>
+        </w:trPr>
+        <w:tc>
+          <w:tcPr>
+            <w:cnfStyle w:val="001000000000" w:firstRow="0" w:lastRow="0" w:firstColumn="1" w:lastColumn="0" w:oddVBand="0" w:evenVBand="0" w:oddHBand="0" w:evenHBand="0" w:firstRowFirstColumn="0" w:firstRowLastColumn="0" w:lastRowFirstColumn="0" w:lastRowLastColumn="0"/>
+            <w:tcW w:w="2249" w:type="pct"/>
+            <w:noWrap/>
+            <w:vAlign w:val="center"/>
+          </w:tcPr>
+          <w:p>
+            <w:pPr>
+              <w:rPr>
+                <w:rFonts w:ascii="Calibri" w:hAnsi="Calibri" w:cs="Calibri"/>
+                <w:color w:val="0D0D0D"/>
+                <w:sz w:val="24"/>
+                <w:szCs w:val="24"/>
+                <w:shd w:val="clear" w:color="auto" w:fill="FFFFFF"/>
+              </w:rPr>
+            </w:pPr>
+            <w:r>
+              <w:rPr>
+                <w:rFonts w:ascii="Calibri" w:hAnsi="Calibri" w:cs="Calibri"/>
+                <w:color w:val="0D0D0D"/>
+                <w:sz w:val="24"/>
+                <w:szCs w:val="24"/>
+                <w:shd w:val="clear" w:color="auto" w:fill="FFFFFF"/>
+              </w:rPr>
+              <w:t>Estensioni</w:t>
+            </w:r>
+          </w:p>
+        </w:tc>
+        <w:tc>
+          <w:tcPr>
+            <w:tcW w:w="2751" w:type="pct"/>
+            <w:vAlign w:val="center"/>
+          </w:tcPr>
+          <w:p>
+            <w:pPr>
+              <w:cnfStyle w:val="000000100000" w:firstRow="0" w:lastRow="0" w:firstColumn="0" w:lastColumn="0" w:oddVBand="0" w:evenVBand="0" w:oddHBand="1" w:evenHBand="0" w:firstRowFirstColumn="0" w:firstRowLastColumn="0" w:lastRowFirstColumn="0" w:lastRowLastColumn="0"/>
+              <w:rPr>
+                <w:rFonts w:ascii="Calibri" w:eastAsiaTheme="minorEastAsia" w:hAnsi="Calibri" w:cs="Calibri"/>
+                <w:sz w:val="24"/>
+                <w:szCs w:val="24"/>
+              </w:rPr>
+            </w:pPr>
+            <w:r>
+              <w:rPr>
+                <w:rFonts w:ascii="Calibri" w:eastAsiaTheme="minorEastAsia" w:hAnsi="Calibri" w:cs="Calibri"/>
+                <w:sz w:val="24"/>
+                <w:szCs w:val="24"/>
+              </w:rPr>
+              <w:t>1a. In qualsiasi momento, l’utente può cliccare sul pulsante “Torna al menu principale”.</w:t>
+            </w:r>
+          </w:p>
+          <w:p>
+            <w:pPr>
+              <w:cnfStyle w:val="000000100000" w:firstRow="0" w:lastRow="0" w:firstColumn="0" w:lastColumn="0" w:oddVBand="0" w:evenVBand="0" w:oddHBand="1" w:evenHBand="0" w:firstRowFirstColumn="0" w:firstRowLastColumn="0" w:lastRowFirstColumn="0" w:lastRowLastColumn="0"/>
+              <w:rPr>
+                <w:rFonts w:ascii="Calibri" w:eastAsiaTheme="minorEastAsia" w:hAnsi="Calibri" w:cs="Calibri"/>
+                <w:sz w:val="24"/>
+                <w:szCs w:val="24"/>
+              </w:rPr>
+            </w:pPr>
+            <w:r>
+              <w:rPr>
+                <w:rFonts w:ascii="Calibri" w:eastAsiaTheme="minorEastAsia" w:hAnsi="Calibri" w:cs="Calibri"/>
+                <w:sz w:val="24"/>
+                <w:szCs w:val="24"/>
+              </w:rPr>
+              <w:t>1.</w:t>
+            </w:r>
+            <w:r>
+              <w:rPr>
+                <w:rFonts w:ascii="Calibri" w:eastAsiaTheme="minorEastAsia" w:hAnsi="Calibri" w:cs="Calibri"/>
+                <w:sz w:val="24"/>
+                <w:szCs w:val="24"/>
+              </w:rPr>
+              <w:tab/>
+              <w:t>Il sistema chiede conferma della scelta, avvisando l’utente che perderà i progressi relativi alla partita in corso.</w:t>
+            </w:r>
+          </w:p>
+          <w:p>
+            <w:pPr>
+              <w:cnfStyle w:val="000000100000" w:firstRow="0" w:lastRow="0" w:firstColumn="0" w:lastColumn="0" w:oddVBand="0" w:evenVBand="0" w:oddHBand="1" w:evenHBand="0" w:firstRowFirstColumn="0" w:firstRowLastColumn="0" w:lastRowFirstColumn="0" w:lastRowLastColumn="0"/>
+              <w:rPr>
+                <w:rFonts w:ascii="Calibri" w:eastAsiaTheme="minorEastAsia" w:hAnsi="Calibri" w:cs="Calibri"/>
+                <w:sz w:val="24"/>
+                <w:szCs w:val="24"/>
+              </w:rPr>
+            </w:pPr>
+            <w:r>
+              <w:rPr>
+                <w:rFonts w:ascii="Calibri" w:eastAsiaTheme="minorEastAsia" w:hAnsi="Calibri" w:cs="Calibri"/>
+                <w:sz w:val="24"/>
+                <w:szCs w:val="24"/>
+              </w:rPr>
+              <w:t>2.</w:t>
+            </w:r>
+            <w:r>
+              <w:rPr>
+                <w:rFonts w:ascii="Calibri" w:eastAsiaTheme="minorEastAsia" w:hAnsi="Calibri" w:cs="Calibri"/>
+                <w:sz w:val="24"/>
+                <w:szCs w:val="24"/>
+              </w:rPr>
+              <w:tab/>
+              <w:t>L’utente decide se abbandonare la partita o meno.</w:t>
+            </w:r>
+          </w:p>
+          <w:p>
+            <w:pPr>
+              <w:cnfStyle w:val="000000100000" w:firstRow="0" w:lastRow="0" w:firstColumn="0" w:lastColumn="0" w:oddVBand="0" w:evenVBand="0" w:oddHBand="1" w:evenHBand="0" w:firstRowFirstColumn="0" w:firstRowLastColumn="0" w:lastRowFirstColumn="0" w:lastRowLastColumn="0"/>
+              <w:rPr>
+                <w:rFonts w:ascii="Calibri" w:eastAsiaTheme="minorEastAsia" w:hAnsi="Calibri" w:cs="Calibri"/>
+                <w:sz w:val="24"/>
+                <w:szCs w:val="24"/>
+              </w:rPr>
+            </w:pPr>
+            <w:r>
+              <w:rPr>
+                <w:rFonts w:ascii="Calibri" w:eastAsiaTheme="minorEastAsia" w:hAnsi="Calibri" w:cs="Calibri"/>
+                <w:sz w:val="24"/>
+                <w:szCs w:val="24"/>
+              </w:rPr>
+              <w:t>2a.  L’utente clicca su “Sì”.</w:t>
+            </w:r>
+          </w:p>
+          <w:p>
+            <w:pPr>
+              <w:cnfStyle w:val="000000100000" w:firstRow="0" w:lastRow="0" w:firstColumn="0" w:lastColumn="0" w:oddVBand="0" w:evenVBand="0" w:oddHBand="1" w:evenHBand="0" w:firstRowFirstColumn="0" w:firstRowLastColumn="0" w:lastRowFirstColumn="0" w:lastRowLastColumn="0"/>
+              <w:rPr>
+                <w:rFonts w:ascii="Calibri" w:eastAsiaTheme="minorEastAsia" w:hAnsi="Calibri" w:cs="Calibri"/>
+                <w:sz w:val="24"/>
+                <w:szCs w:val="24"/>
+              </w:rPr>
+            </w:pPr>
+            <w:r>
+              <w:rPr>
+                <w:rFonts w:ascii="Calibri" w:eastAsiaTheme="minorEastAsia" w:hAnsi="Calibri" w:cs="Calibri"/>
+                <w:sz w:val="24"/>
+                <w:szCs w:val="24"/>
+              </w:rPr>
+              <w:t>1.</w:t>
+            </w:r>
+            <w:r>
+              <w:rPr>
+                <w:rFonts w:ascii="Calibri" w:eastAsiaTheme="minorEastAsia" w:hAnsi="Calibri" w:cs="Calibri"/>
+                <w:sz w:val="24"/>
+                <w:szCs w:val="24"/>
+              </w:rPr>
+              <w:tab/>
+              <w:t>Il sistema apre la pagina del menu principale, perdendo traccia dei progressi relativi alla partita in corso.</w:t>
+            </w:r>
+          </w:p>
+          <w:p>
+            <w:pPr>
+              <w:cnfStyle w:val="000000100000" w:firstRow="0" w:lastRow="0" w:firstColumn="0" w:lastColumn="0" w:oddVBand="0" w:evenVBand="0" w:oddHBand="1" w:evenHBand="0" w:firstRowFirstColumn="0" w:firstRowLastColumn="0" w:lastRowFirstColumn="0" w:lastRowLastColumn="0"/>
+              <w:rPr>
+                <w:rFonts w:ascii="Calibri" w:eastAsiaTheme="minorEastAsia" w:hAnsi="Calibri" w:cs="Calibri"/>
+                <w:sz w:val="24"/>
+                <w:szCs w:val="24"/>
+              </w:rPr>
+            </w:pPr>
+            <w:r>
+              <w:rPr>
+                <w:rFonts w:ascii="Calibri" w:eastAsiaTheme="minorEastAsia" w:hAnsi="Calibri" w:cs="Calibri"/>
+                <w:sz w:val="24"/>
+                <w:szCs w:val="24"/>
+              </w:rPr>
+              <w:t>2b. L’utente clicca su “No”.</w:t>
+            </w:r>
+          </w:p>
+          <w:p>
+            <w:pPr>
+              <w:cnfStyle w:val="000000100000" w:firstRow="0" w:lastRow="0" w:firstColumn="0" w:lastColumn="0" w:oddVBand="0" w:evenVBand="0" w:oddHBand="1" w:evenHBand="0" w:firstRowFirstColumn="0" w:firstRowLastColumn="0" w:lastRowFirstColumn="0" w:lastRowLastColumn="0"/>
+              <w:rPr>
+                <w:rFonts w:ascii="Calibri" w:eastAsiaTheme="minorEastAsia" w:hAnsi="Calibri" w:cs="Calibri"/>
+                <w:sz w:val="24"/>
+                <w:szCs w:val="24"/>
+              </w:rPr>
+            </w:pPr>
+            <w:r>
+              <w:rPr>
+                <w:rFonts w:ascii="Calibri" w:eastAsiaTheme="minorEastAsia" w:hAnsi="Calibri" w:cs="Calibri"/>
+                <w:sz w:val="24"/>
+                <w:szCs w:val="24"/>
+              </w:rPr>
+              <w:t>1.</w:t>
+            </w:r>
+            <w:r>
+              <w:rPr>
+                <w:rFonts w:ascii="Calibri" w:eastAsiaTheme="minorEastAsia" w:hAnsi="Calibri" w:cs="Calibri"/>
+                <w:sz w:val="24"/>
+                <w:szCs w:val="24"/>
+              </w:rPr>
+              <w:tab/>
+              <w:t>Il sistema permette di continuare normalmente la partita.</w:t>
+            </w:r>
+          </w:p>
+          <w:p>
+            <w:pPr>
+              <w:cnfStyle w:val="000000100000" w:firstRow="0" w:lastRow="0" w:firstColumn="0" w:lastColumn="0" w:oddVBand="0" w:evenVBand="0" w:oddHBand="1" w:evenHBand="0" w:firstRowFirstColumn="0" w:firstRowLastColumn="0" w:lastRowFirstColumn="0" w:lastRowLastColumn="0"/>
+              <w:rPr>
+                <w:rFonts w:ascii="Calibri" w:eastAsiaTheme="minorEastAsia" w:hAnsi="Calibri" w:cs="Calibri"/>
+                <w:sz w:val="24"/>
+                <w:szCs w:val="24"/>
+              </w:rPr>
+            </w:pPr>
+          </w:p>
+          <w:p>
+            <w:pPr>
+              <w:cnfStyle w:val="000000100000" w:firstRow="0" w:lastRow="0" w:firstColumn="0" w:lastColumn="0" w:oddVBand="0" w:evenVBand="0" w:oddHBand="1" w:evenHBand="0" w:firstRowFirstColumn="0" w:firstRowLastColumn="0" w:lastRowFirstColumn="0" w:lastRowLastColumn="0"/>
+              <w:rPr>
+                <w:rFonts w:ascii="Calibri" w:eastAsiaTheme="minorEastAsia" w:hAnsi="Calibri" w:cs="Calibri"/>
+                <w:sz w:val="24"/>
+                <w:szCs w:val="24"/>
+              </w:rPr>
+            </w:pPr>
+            <w:r>
+              <w:rPr>
+                <w:rFonts w:ascii="Calibri" w:eastAsiaTheme="minorEastAsia" w:hAnsi="Calibri" w:cs="Calibri"/>
+                <w:sz w:val="24"/>
+                <w:szCs w:val="24"/>
+              </w:rPr>
+              <w:t>1b. In qualsiasi momento, il sistema subisce un arresto improvviso.</w:t>
+            </w:r>
+          </w:p>
+          <w:p>
+            <w:pPr>
+              <w:cnfStyle w:val="000000100000" w:firstRow="0" w:lastRow="0" w:firstColumn="0" w:lastColumn="0" w:oddVBand="0" w:evenVBand="0" w:oddHBand="1" w:evenHBand="0" w:firstRowFirstColumn="0" w:firstRowLastColumn="0" w:lastRowFirstColumn="0" w:lastRowLastColumn="0"/>
+              <w:rPr>
+                <w:rFonts w:ascii="Calibri" w:eastAsiaTheme="minorEastAsia" w:hAnsi="Calibri" w:cs="Calibri"/>
+                <w:sz w:val="24"/>
+                <w:szCs w:val="24"/>
+              </w:rPr>
+            </w:pPr>
+            <w:r>
+              <w:rPr>
+                <w:rFonts w:ascii="Calibri" w:eastAsiaTheme="minorEastAsia" w:hAnsi="Calibri" w:cs="Calibri"/>
+                <w:sz w:val="24"/>
+                <w:szCs w:val="24"/>
+              </w:rPr>
+              <w:t>1.</w:t>
+            </w:r>
+            <w:r>
+              <w:rPr>
+                <w:rFonts w:ascii="Calibri" w:eastAsiaTheme="minorEastAsia" w:hAnsi="Calibri" w:cs="Calibri"/>
+                <w:sz w:val="24"/>
+                <w:szCs w:val="24"/>
+              </w:rPr>
+              <w:tab/>
+              <w:t>L’utente ripristina il sistema.</w:t>
+            </w:r>
+          </w:p>
+          <w:p>
+            <w:pPr>
+              <w:cnfStyle w:val="000000100000" w:firstRow="0" w:lastRow="0" w:firstColumn="0" w:lastColumn="0" w:oddVBand="0" w:evenVBand="0" w:oddHBand="1" w:evenHBand="0" w:firstRowFirstColumn="0" w:firstRowLastColumn="0" w:lastRowFirstColumn="0" w:lastRowLastColumn="0"/>
+              <w:rPr>
+                <w:rFonts w:ascii="Calibri" w:eastAsiaTheme="minorEastAsia" w:hAnsi="Calibri" w:cs="Calibri"/>
+                <w:sz w:val="24"/>
+                <w:szCs w:val="24"/>
+              </w:rPr>
+            </w:pPr>
+            <w:r>
+              <w:rPr>
+                <w:rFonts w:ascii="Calibri" w:eastAsiaTheme="minorEastAsia" w:hAnsi="Calibri" w:cs="Calibri"/>
+                <w:sz w:val="24"/>
+                <w:szCs w:val="24"/>
+              </w:rPr>
+              <w:t>2.</w:t>
+            </w:r>
+            <w:r>
+              <w:rPr>
+                <w:rFonts w:ascii="Calibri" w:eastAsiaTheme="minorEastAsia" w:hAnsi="Calibri" w:cs="Calibri"/>
+                <w:sz w:val="24"/>
+                <w:szCs w:val="24"/>
+              </w:rPr>
+              <w:tab/>
+              <w:t>Il sistema ripristina lo stato della partita.</w:t>
+            </w:r>
+          </w:p>
+          <w:p>
+            <w:pPr>
+              <w:cnfStyle w:val="000000100000" w:firstRow="0" w:lastRow="0" w:firstColumn="0" w:lastColumn="0" w:oddVBand="0" w:evenVBand="0" w:oddHBand="1" w:evenHBand="0" w:firstRowFirstColumn="0" w:firstRowLastColumn="0" w:lastRowFirstColumn="0" w:lastRowLastColumn="0"/>
+              <w:rPr>
+                <w:rFonts w:ascii="Calibri" w:eastAsiaTheme="minorEastAsia" w:hAnsi="Calibri" w:cs="Calibri"/>
+                <w:sz w:val="24"/>
+                <w:szCs w:val="24"/>
+              </w:rPr>
+            </w:pPr>
+          </w:p>
+          <w:p>
+            <w:pPr>
+              <w:cnfStyle w:val="000000100000" w:firstRow="0" w:lastRow="0" w:firstColumn="0" w:lastColumn="0" w:oddVBand="0" w:evenVBand="0" w:oddHBand="1" w:evenHBand="0" w:firstRowFirstColumn="0" w:firstRowLastColumn="0" w:lastRowFirstColumn="0" w:lastRowLastColumn="0"/>
+              <w:rPr>
+                <w:rFonts w:ascii="Calibri" w:eastAsiaTheme="minorEastAsia" w:hAnsi="Calibri" w:cs="Calibri"/>
+                <w:sz w:val="24"/>
+                <w:szCs w:val="24"/>
+              </w:rPr>
+            </w:pPr>
+            <w:r>
+              <w:rPr>
+                <w:rFonts w:ascii="Calibri" w:eastAsiaTheme="minorEastAsia" w:hAnsi="Calibri" w:cs="Calibri"/>
+                <w:sz w:val="24"/>
+                <w:szCs w:val="24"/>
+              </w:rPr>
+              <w:t xml:space="preserve">2a. Il giocatore di turno è nello stato “Bloccato”. </w:t>
+            </w:r>
+          </w:p>
+          <w:p>
+            <w:pPr>
+              <w:cnfStyle w:val="000000100000" w:firstRow="0" w:lastRow="0" w:firstColumn="0" w:lastColumn="0" w:oddVBand="0" w:evenVBand="0" w:oddHBand="1" w:evenHBand="0" w:firstRowFirstColumn="0" w:firstRowLastColumn="0" w:lastRowFirstColumn="0" w:lastRowLastColumn="0"/>
+              <w:rPr>
+                <w:rFonts w:ascii="Calibri" w:eastAsiaTheme="minorEastAsia" w:hAnsi="Calibri" w:cs="Calibri"/>
+                <w:sz w:val="24"/>
+                <w:szCs w:val="24"/>
+              </w:rPr>
+            </w:pPr>
+            <w:r>
+              <w:rPr>
+                <w:rFonts w:ascii="Calibri" w:eastAsiaTheme="minorEastAsia" w:hAnsi="Calibri" w:cs="Calibri"/>
+                <w:sz w:val="24"/>
+                <w:szCs w:val="24"/>
+              </w:rPr>
+              <w:t>1.</w:t>
+            </w:r>
+            <w:r>
+              <w:rPr>
+                <w:rFonts w:ascii="Calibri" w:eastAsiaTheme="minorEastAsia" w:hAnsi="Calibri" w:cs="Calibri"/>
+                <w:sz w:val="24"/>
+                <w:szCs w:val="24"/>
+              </w:rPr>
+              <w:tab/>
+              <w:t>Il sistema controlla chi è il giocatore di turno.</w:t>
+            </w:r>
+          </w:p>
+          <w:p>
+            <w:pPr>
+              <w:cnfStyle w:val="000000100000" w:firstRow="0" w:lastRow="0" w:firstColumn="0" w:lastColumn="0" w:oddVBand="0" w:evenVBand="0" w:oddHBand="1" w:evenHBand="0" w:firstRowFirstColumn="0" w:firstRowLastColumn="0" w:lastRowFirstColumn="0" w:lastRowLastColumn="0"/>
+              <w:rPr>
+                <w:rFonts w:ascii="Calibri" w:eastAsiaTheme="minorEastAsia" w:hAnsi="Calibri" w:cs="Calibri"/>
+                <w:sz w:val="24"/>
+                <w:szCs w:val="24"/>
+              </w:rPr>
+            </w:pPr>
+            <w:r>
+              <w:rPr>
+                <w:rFonts w:ascii="Calibri" w:eastAsiaTheme="minorEastAsia" w:hAnsi="Calibri" w:cs="Calibri"/>
+                <w:sz w:val="24"/>
+                <w:szCs w:val="24"/>
+              </w:rPr>
+              <w:lastRenderedPageBreak/>
+              <w:t>1a.  Il giocatore di turno è l’utente.</w:t>
+            </w:r>
+          </w:p>
+          <w:p>
+            <w:pPr>
+              <w:cnfStyle w:val="000000100000" w:firstRow="0" w:lastRow="0" w:firstColumn="0" w:lastColumn="0" w:oddVBand="0" w:evenVBand="0" w:oddHBand="1" w:evenHBand="0" w:firstRowFirstColumn="0" w:firstRowLastColumn="0" w:lastRowFirstColumn="0" w:lastRowLastColumn="0"/>
+              <w:rPr>
+                <w:rFonts w:ascii="Calibri" w:eastAsiaTheme="minorEastAsia" w:hAnsi="Calibri" w:cs="Calibri"/>
+                <w:sz w:val="24"/>
+                <w:szCs w:val="24"/>
+              </w:rPr>
+            </w:pPr>
+            <w:r>
+              <w:rPr>
+                <w:rFonts w:ascii="Calibri" w:eastAsiaTheme="minorEastAsia" w:hAnsi="Calibri" w:cs="Calibri"/>
+                <w:sz w:val="24"/>
+                <w:szCs w:val="24"/>
+              </w:rPr>
+              <w:t>1.</w:t>
+            </w:r>
+            <w:r>
+              <w:rPr>
+                <w:rFonts w:ascii="Calibri" w:eastAsiaTheme="minorEastAsia" w:hAnsi="Calibri" w:cs="Calibri"/>
+                <w:sz w:val="24"/>
+                <w:szCs w:val="24"/>
+              </w:rPr>
+              <w:tab/>
+              <w:t>Il sistema imposta come nuovo giocatore di turno il computer e continua con il passo 4.</w:t>
+            </w:r>
+          </w:p>
+          <w:p>
+            <w:pPr>
+              <w:cnfStyle w:val="000000100000" w:firstRow="0" w:lastRow="0" w:firstColumn="0" w:lastColumn="0" w:oddVBand="0" w:evenVBand="0" w:oddHBand="1" w:evenHBand="0" w:firstRowFirstColumn="0" w:firstRowLastColumn="0" w:lastRowFirstColumn="0" w:lastRowLastColumn="0"/>
+              <w:rPr>
+                <w:rFonts w:ascii="Calibri" w:eastAsiaTheme="minorEastAsia" w:hAnsi="Calibri" w:cs="Calibri"/>
+                <w:sz w:val="24"/>
+                <w:szCs w:val="24"/>
+              </w:rPr>
+            </w:pPr>
+            <w:r>
+              <w:rPr>
+                <w:rFonts w:ascii="Calibri" w:eastAsiaTheme="minorEastAsia" w:hAnsi="Calibri" w:cs="Calibri"/>
+                <w:sz w:val="24"/>
+                <w:szCs w:val="24"/>
+              </w:rPr>
+              <w:t>1b. Il giocatore di turno è il computer.</w:t>
+            </w:r>
+          </w:p>
+          <w:p>
+            <w:pPr>
+              <w:cnfStyle w:val="000000100000" w:firstRow="0" w:lastRow="0" w:firstColumn="0" w:lastColumn="0" w:oddVBand="0" w:evenVBand="0" w:oddHBand="1" w:evenHBand="0" w:firstRowFirstColumn="0" w:firstRowLastColumn="0" w:lastRowFirstColumn="0" w:lastRowLastColumn="0"/>
+              <w:rPr>
+                <w:rFonts w:ascii="Calibri" w:eastAsiaTheme="minorEastAsia" w:hAnsi="Calibri" w:cs="Calibri"/>
+                <w:sz w:val="24"/>
+                <w:szCs w:val="24"/>
+              </w:rPr>
+            </w:pPr>
+            <w:r>
+              <w:rPr>
+                <w:rFonts w:ascii="Calibri" w:eastAsiaTheme="minorEastAsia" w:hAnsi="Calibri" w:cs="Calibri"/>
+                <w:sz w:val="24"/>
+                <w:szCs w:val="24"/>
+              </w:rPr>
+              <w:t>1.</w:t>
+            </w:r>
+            <w:r>
+              <w:rPr>
+                <w:rFonts w:ascii="Calibri" w:eastAsiaTheme="minorEastAsia" w:hAnsi="Calibri" w:cs="Calibri"/>
+                <w:sz w:val="24"/>
+                <w:szCs w:val="24"/>
+              </w:rPr>
+              <w:tab/>
+              <w:t>Il sistema imposta come nuovo giocatore di turno l’utente e continua con il passo 3.</w:t>
+            </w:r>
+          </w:p>
+          <w:p>
+            <w:pPr>
+              <w:cnfStyle w:val="000000100000" w:firstRow="0" w:lastRow="0" w:firstColumn="0" w:lastColumn="0" w:oddVBand="0" w:evenVBand="0" w:oddHBand="1" w:evenHBand="0" w:firstRowFirstColumn="0" w:firstRowLastColumn="0" w:lastRowFirstColumn="0" w:lastRowLastColumn="0"/>
+              <w:rPr>
+                <w:rFonts w:ascii="Calibri" w:eastAsiaTheme="minorEastAsia" w:hAnsi="Calibri" w:cs="Calibri"/>
+                <w:sz w:val="24"/>
+                <w:szCs w:val="24"/>
+              </w:rPr>
+            </w:pPr>
+          </w:p>
+          <w:p>
+            <w:pPr>
+              <w:cnfStyle w:val="000000100000" w:firstRow="0" w:lastRow="0" w:firstColumn="0" w:lastColumn="0" w:oddVBand="0" w:evenVBand="0" w:oddHBand="1" w:evenHBand="0" w:firstRowFirstColumn="0" w:firstRowLastColumn="0" w:lastRowFirstColumn="0" w:lastRowLastColumn="0"/>
+              <w:rPr>
+                <w:rFonts w:ascii="Calibri" w:eastAsiaTheme="minorEastAsia" w:hAnsi="Calibri" w:cs="Calibri"/>
+                <w:sz w:val="24"/>
+                <w:szCs w:val="24"/>
+              </w:rPr>
+            </w:pPr>
+            <w:r>
+              <w:rPr>
+                <w:rFonts w:ascii="Calibri" w:eastAsiaTheme="minorEastAsia" w:hAnsi="Calibri" w:cs="Calibri"/>
+                <w:sz w:val="24"/>
+                <w:szCs w:val="24"/>
+              </w:rPr>
+              <w:t xml:space="preserve">2b. Il giocatore NON è nello stato “Bloccato”. </w:t>
+            </w:r>
+          </w:p>
+          <w:p>
+            <w:pPr>
+              <w:cnfStyle w:val="000000100000" w:firstRow="0" w:lastRow="0" w:firstColumn="0" w:lastColumn="0" w:oddVBand="0" w:evenVBand="0" w:oddHBand="1" w:evenHBand="0" w:firstRowFirstColumn="0" w:firstRowLastColumn="0" w:lastRowFirstColumn="0" w:lastRowLastColumn="0"/>
+              <w:rPr>
+                <w:rFonts w:ascii="Calibri" w:eastAsiaTheme="minorEastAsia" w:hAnsi="Calibri" w:cs="Calibri"/>
+                <w:sz w:val="24"/>
+                <w:szCs w:val="24"/>
+              </w:rPr>
+            </w:pPr>
+            <w:r>
+              <w:rPr>
+                <w:rFonts w:ascii="Calibri" w:eastAsiaTheme="minorEastAsia" w:hAnsi="Calibri" w:cs="Calibri"/>
+                <w:sz w:val="24"/>
+                <w:szCs w:val="24"/>
+              </w:rPr>
+              <w:t>1.</w:t>
+            </w:r>
+            <w:r>
+              <w:rPr>
+                <w:rFonts w:ascii="Calibri" w:eastAsiaTheme="minorEastAsia" w:hAnsi="Calibri" w:cs="Calibri"/>
+                <w:sz w:val="24"/>
+                <w:szCs w:val="24"/>
+              </w:rPr>
+              <w:tab/>
+              <w:t>Il sistema controlla chi è il giocatore di turno.</w:t>
+            </w:r>
+          </w:p>
+          <w:p>
+            <w:pPr>
+              <w:cnfStyle w:val="000000100000" w:firstRow="0" w:lastRow="0" w:firstColumn="0" w:lastColumn="0" w:oddVBand="0" w:evenVBand="0" w:oddHBand="1" w:evenHBand="0" w:firstRowFirstColumn="0" w:firstRowLastColumn="0" w:lastRowFirstColumn="0" w:lastRowLastColumn="0"/>
+              <w:rPr>
+                <w:rFonts w:ascii="Calibri" w:eastAsiaTheme="minorEastAsia" w:hAnsi="Calibri" w:cs="Calibri"/>
+                <w:sz w:val="24"/>
+                <w:szCs w:val="24"/>
+              </w:rPr>
+            </w:pPr>
+            <w:r>
+              <w:rPr>
+                <w:rFonts w:ascii="Calibri" w:eastAsiaTheme="minorEastAsia" w:hAnsi="Calibri" w:cs="Calibri"/>
+                <w:sz w:val="24"/>
+                <w:szCs w:val="24"/>
+              </w:rPr>
+              <w:t>1a.  Il giocatore di turno è l’utente.</w:t>
+            </w:r>
+          </w:p>
+          <w:p>
+            <w:pPr>
+              <w:cnfStyle w:val="000000100000" w:firstRow="0" w:lastRow="0" w:firstColumn="0" w:lastColumn="0" w:oddVBand="0" w:evenVBand="0" w:oddHBand="1" w:evenHBand="0" w:firstRowFirstColumn="0" w:firstRowLastColumn="0" w:lastRowFirstColumn="0" w:lastRowLastColumn="0"/>
+              <w:rPr>
+                <w:rFonts w:ascii="Calibri" w:eastAsiaTheme="minorEastAsia" w:hAnsi="Calibri" w:cs="Calibri"/>
+                <w:sz w:val="24"/>
+                <w:szCs w:val="24"/>
+              </w:rPr>
+            </w:pPr>
+            <w:r>
+              <w:rPr>
+                <w:rFonts w:ascii="Calibri" w:eastAsiaTheme="minorEastAsia" w:hAnsi="Calibri" w:cs="Calibri"/>
+                <w:sz w:val="24"/>
+                <w:szCs w:val="24"/>
+              </w:rPr>
+              <w:t>1.</w:t>
+            </w:r>
+            <w:r>
+              <w:rPr>
+                <w:rFonts w:ascii="Calibri" w:eastAsiaTheme="minorEastAsia" w:hAnsi="Calibri" w:cs="Calibri"/>
+                <w:sz w:val="24"/>
+                <w:szCs w:val="24"/>
+              </w:rPr>
+              <w:tab/>
+              <w:t>Il sistema continua con il passo 3.</w:t>
+            </w:r>
+          </w:p>
+          <w:p>
+            <w:pPr>
+              <w:cnfStyle w:val="000000100000" w:firstRow="0" w:lastRow="0" w:firstColumn="0" w:lastColumn="0" w:oddVBand="0" w:evenVBand="0" w:oddHBand="1" w:evenHBand="0" w:firstRowFirstColumn="0" w:firstRowLastColumn="0" w:lastRowFirstColumn="0" w:lastRowLastColumn="0"/>
+              <w:rPr>
+                <w:rFonts w:ascii="Calibri" w:eastAsiaTheme="minorEastAsia" w:hAnsi="Calibri" w:cs="Calibri"/>
+                <w:sz w:val="24"/>
+                <w:szCs w:val="24"/>
+              </w:rPr>
+            </w:pPr>
+            <w:r>
+              <w:rPr>
+                <w:rFonts w:ascii="Calibri" w:eastAsiaTheme="minorEastAsia" w:hAnsi="Calibri" w:cs="Calibri"/>
+                <w:sz w:val="24"/>
+                <w:szCs w:val="24"/>
+              </w:rPr>
+              <w:t>1b. Il giocatore di turno è il computer.</w:t>
+            </w:r>
+          </w:p>
+          <w:p>
+            <w:pPr>
+              <w:cnfStyle w:val="000000100000" w:firstRow="0" w:lastRow="0" w:firstColumn="0" w:lastColumn="0" w:oddVBand="0" w:evenVBand="0" w:oddHBand="1" w:evenHBand="0" w:firstRowFirstColumn="0" w:firstRowLastColumn="0" w:lastRowFirstColumn="0" w:lastRowLastColumn="0"/>
+              <w:rPr>
+                <w:rFonts w:ascii="Calibri" w:eastAsiaTheme="minorEastAsia" w:hAnsi="Calibri" w:cs="Calibri"/>
+                <w:sz w:val="24"/>
+                <w:szCs w:val="24"/>
+              </w:rPr>
+            </w:pPr>
+            <w:r>
+              <w:rPr>
+                <w:rFonts w:ascii="Calibri" w:eastAsiaTheme="minorEastAsia" w:hAnsi="Calibri" w:cs="Calibri"/>
+                <w:sz w:val="24"/>
+                <w:szCs w:val="24"/>
+              </w:rPr>
+              <w:t>1.</w:t>
+            </w:r>
+            <w:r>
+              <w:rPr>
+                <w:rFonts w:ascii="Calibri" w:eastAsiaTheme="minorEastAsia" w:hAnsi="Calibri" w:cs="Calibri"/>
+                <w:sz w:val="24"/>
+                <w:szCs w:val="24"/>
+              </w:rPr>
+              <w:tab/>
+              <w:t>Il sistema continua con il passo 4.</w:t>
+            </w:r>
+          </w:p>
+          <w:p>
+            <w:pPr>
+              <w:cnfStyle w:val="000000100000" w:firstRow="0" w:lastRow="0" w:firstColumn="0" w:lastColumn="0" w:oddVBand="0" w:evenVBand="0" w:oddHBand="1" w:evenHBand="0" w:firstRowFirstColumn="0" w:firstRowLastColumn="0" w:lastRowFirstColumn="0" w:lastRowLastColumn="0"/>
+              <w:rPr>
+                <w:rFonts w:ascii="Calibri" w:eastAsiaTheme="minorEastAsia" w:hAnsi="Calibri" w:cs="Calibri"/>
+                <w:sz w:val="24"/>
+                <w:szCs w:val="24"/>
+              </w:rPr>
+            </w:pPr>
+          </w:p>
+          <w:p>
+            <w:pPr>
+              <w:cnfStyle w:val="000000100000" w:firstRow="0" w:lastRow="0" w:firstColumn="0" w:lastColumn="0" w:oddVBand="0" w:evenVBand="0" w:oddHBand="1" w:evenHBand="0" w:firstRowFirstColumn="0" w:firstRowLastColumn="0" w:lastRowFirstColumn="0" w:lastRowLastColumn="0"/>
+              <w:rPr>
+                <w:rFonts w:ascii="Calibri" w:eastAsiaTheme="minorEastAsia" w:hAnsi="Calibri" w:cs="Calibri"/>
+                <w:sz w:val="24"/>
+                <w:szCs w:val="24"/>
+              </w:rPr>
+            </w:pPr>
+          </w:p>
+          <w:p>
+            <w:pPr>
+              <w:cnfStyle w:val="000000100000" w:firstRow="0" w:lastRow="0" w:firstColumn="0" w:lastColumn="0" w:oddVBand="0" w:evenVBand="0" w:oddHBand="1" w:evenHBand="0" w:firstRowFirstColumn="0" w:firstRowLastColumn="0" w:lastRowFirstColumn="0" w:lastRowLastColumn="0"/>
+              <w:rPr>
+                <w:rFonts w:ascii="Calibri" w:eastAsiaTheme="minorEastAsia" w:hAnsi="Calibri" w:cs="Calibri"/>
+                <w:sz w:val="24"/>
+                <w:szCs w:val="24"/>
+              </w:rPr>
+            </w:pPr>
+            <w:r>
+              <w:rPr>
+                <w:rFonts w:ascii="Calibri" w:eastAsiaTheme="minorEastAsia" w:hAnsi="Calibri" w:cs="Calibri"/>
+                <w:sz w:val="24"/>
+                <w:szCs w:val="24"/>
+              </w:rPr>
+              <w:t>6a. La casella sulla quale è finito il giocatore di turno è una casella normale.</w:t>
+            </w:r>
+          </w:p>
+          <w:p>
+            <w:pPr>
+              <w:cnfStyle w:val="000000100000" w:firstRow="0" w:lastRow="0" w:firstColumn="0" w:lastColumn="0" w:oddVBand="0" w:evenVBand="0" w:oddHBand="1" w:evenHBand="0" w:firstRowFirstColumn="0" w:firstRowLastColumn="0" w:lastRowFirstColumn="0" w:lastRowLastColumn="0"/>
+              <w:rPr>
+                <w:rFonts w:ascii="Calibri" w:eastAsiaTheme="minorEastAsia" w:hAnsi="Calibri" w:cs="Calibri"/>
+                <w:sz w:val="24"/>
+                <w:szCs w:val="24"/>
+              </w:rPr>
+            </w:pPr>
+            <w:r>
+              <w:rPr>
+                <w:rFonts w:ascii="Calibri" w:eastAsiaTheme="minorEastAsia" w:hAnsi="Calibri" w:cs="Calibri"/>
+                <w:sz w:val="24"/>
+                <w:szCs w:val="24"/>
+              </w:rPr>
+              <w:t>1.</w:t>
+            </w:r>
+            <w:r>
+              <w:rPr>
+                <w:rFonts w:ascii="Calibri" w:eastAsiaTheme="minorEastAsia" w:hAnsi="Calibri" w:cs="Calibri"/>
+                <w:sz w:val="24"/>
+                <w:szCs w:val="24"/>
+              </w:rPr>
+              <w:tab/>
+              <w:t>La casella sulla quale finisce la pedina viene impostata alla casella attuale e il sistema continua con il passo 7.</w:t>
+            </w:r>
+          </w:p>
+          <w:p>
+            <w:pPr>
+              <w:cnfStyle w:val="000000100000" w:firstRow="0" w:lastRow="0" w:firstColumn="0" w:lastColumn="0" w:oddVBand="0" w:evenVBand="0" w:oddHBand="1" w:evenHBand="0" w:firstRowFirstColumn="0" w:firstRowLastColumn="0" w:lastRowFirstColumn="0" w:lastRowLastColumn="0"/>
+              <w:rPr>
+                <w:rFonts w:ascii="Calibri" w:eastAsiaTheme="minorEastAsia" w:hAnsi="Calibri" w:cs="Calibri"/>
+                <w:sz w:val="24"/>
+                <w:szCs w:val="24"/>
+              </w:rPr>
+            </w:pPr>
+          </w:p>
+          <w:p>
+            <w:pPr>
+              <w:cnfStyle w:val="000000100000" w:firstRow="0" w:lastRow="0" w:firstColumn="0" w:lastColumn="0" w:oddVBand="0" w:evenVBand="0" w:oddHBand="1" w:evenHBand="0" w:firstRowFirstColumn="0" w:firstRowLastColumn="0" w:lastRowFirstColumn="0" w:lastRowLastColumn="0"/>
+              <w:rPr>
+                <w:rFonts w:ascii="Calibri" w:eastAsiaTheme="minorEastAsia" w:hAnsi="Calibri" w:cs="Calibri"/>
+                <w:sz w:val="24"/>
+                <w:szCs w:val="24"/>
+              </w:rPr>
+            </w:pPr>
+            <w:r>
+              <w:rPr>
+                <w:rFonts w:ascii="Calibri" w:eastAsiaTheme="minorEastAsia" w:hAnsi="Calibri" w:cs="Calibri"/>
+                <w:sz w:val="24"/>
+                <w:szCs w:val="24"/>
+              </w:rPr>
+              <w:t>6b. La casella sulla quale è finito il giocatore di turno è una casella speciale di tipo “Oca”.</w:t>
+            </w:r>
+          </w:p>
+          <w:p>
+            <w:pPr>
+              <w:cnfStyle w:val="000000100000" w:firstRow="0" w:lastRow="0" w:firstColumn="0" w:lastColumn="0" w:oddVBand="0" w:evenVBand="0" w:oddHBand="1" w:evenHBand="0" w:firstRowFirstColumn="0" w:firstRowLastColumn="0" w:lastRowFirstColumn="0" w:lastRowLastColumn="0"/>
+              <w:rPr>
+                <w:rFonts w:ascii="Calibri" w:eastAsiaTheme="minorEastAsia" w:hAnsi="Calibri" w:cs="Calibri"/>
+                <w:sz w:val="24"/>
+                <w:szCs w:val="24"/>
+              </w:rPr>
+            </w:pPr>
+            <w:r>
+              <w:rPr>
+                <w:rFonts w:ascii="Calibri" w:eastAsiaTheme="minorEastAsia" w:hAnsi="Calibri" w:cs="Calibri"/>
+                <w:sz w:val="24"/>
+                <w:szCs w:val="24"/>
+              </w:rPr>
+              <w:t>1.</w:t>
+            </w:r>
+            <w:r>
+              <w:rPr>
+                <w:rFonts w:ascii="Calibri" w:eastAsiaTheme="minorEastAsia" w:hAnsi="Calibri" w:cs="Calibri"/>
+                <w:sz w:val="24"/>
+                <w:szCs w:val="24"/>
+              </w:rPr>
+              <w:tab/>
+              <w:t>La nuova casella sulla quale finisce la pedina del giocatore di turno sarà calcolata come “Casella attuale” + “Somma dei numeri ottenuti dal lancio dei dadi”.</w:t>
+            </w:r>
+          </w:p>
+          <w:p>
+            <w:pPr>
+              <w:cnfStyle w:val="000000100000" w:firstRow="0" w:lastRow="0" w:firstColumn="0" w:lastColumn="0" w:oddVBand="0" w:evenVBand="0" w:oddHBand="1" w:evenHBand="0" w:firstRowFirstColumn="0" w:firstRowLastColumn="0" w:lastRowFirstColumn="0" w:lastRowLastColumn="0"/>
+              <w:rPr>
+                <w:rFonts w:ascii="Calibri" w:eastAsiaTheme="minorEastAsia" w:hAnsi="Calibri" w:cs="Calibri"/>
+                <w:sz w:val="24"/>
+                <w:szCs w:val="24"/>
+              </w:rPr>
+            </w:pPr>
+          </w:p>
+          <w:p>
+            <w:pPr>
+              <w:cnfStyle w:val="000000100000" w:firstRow="0" w:lastRow="0" w:firstColumn="0" w:lastColumn="0" w:oddVBand="0" w:evenVBand="0" w:oddHBand="1" w:evenHBand="0" w:firstRowFirstColumn="0" w:firstRowLastColumn="0" w:lastRowFirstColumn="0" w:lastRowLastColumn="0"/>
+              <w:rPr>
+                <w:rFonts w:ascii="Calibri" w:eastAsiaTheme="minorEastAsia" w:hAnsi="Calibri" w:cs="Calibri"/>
+                <w:sz w:val="24"/>
+                <w:szCs w:val="24"/>
+              </w:rPr>
+            </w:pPr>
+            <w:r>
+              <w:rPr>
+                <w:rFonts w:ascii="Calibri" w:eastAsiaTheme="minorEastAsia" w:hAnsi="Calibri" w:cs="Calibri"/>
+                <w:sz w:val="24"/>
+                <w:szCs w:val="24"/>
+              </w:rPr>
+              <w:t>6c. La casella sulla quale è finito il giocatore di turno è una casella speciale di tipo “Ponte”.</w:t>
+            </w:r>
+          </w:p>
+          <w:p>
+            <w:pPr>
+              <w:cnfStyle w:val="000000100000" w:firstRow="0" w:lastRow="0" w:firstColumn="0" w:lastColumn="0" w:oddVBand="0" w:evenVBand="0" w:oddHBand="1" w:evenHBand="0" w:firstRowFirstColumn="0" w:firstRowLastColumn="0" w:lastRowFirstColumn="0" w:lastRowLastColumn="0"/>
+              <w:rPr>
+                <w:rFonts w:ascii="Calibri" w:eastAsiaTheme="minorEastAsia" w:hAnsi="Calibri" w:cs="Calibri"/>
+                <w:sz w:val="24"/>
+                <w:szCs w:val="24"/>
+              </w:rPr>
+            </w:pPr>
+            <w:r>
+              <w:rPr>
+                <w:rFonts w:ascii="Calibri" w:eastAsiaTheme="minorEastAsia" w:hAnsi="Calibri" w:cs="Calibri"/>
+                <w:sz w:val="24"/>
+                <w:szCs w:val="24"/>
+              </w:rPr>
+              <w:t>1.</w:t>
+            </w:r>
+            <w:r>
+              <w:rPr>
+                <w:rFonts w:ascii="Calibri" w:eastAsiaTheme="minorEastAsia" w:hAnsi="Calibri" w:cs="Calibri"/>
+                <w:sz w:val="24"/>
+                <w:szCs w:val="24"/>
+              </w:rPr>
+              <w:tab/>
+              <w:t>La nuova casella sulla quale finisce la pedina del giocatore di turno sarà calcolata come “Casella attuale” * 2.</w:t>
+            </w:r>
+          </w:p>
+          <w:p>
+            <w:pPr>
+              <w:cnfStyle w:val="000000100000" w:firstRow="0" w:lastRow="0" w:firstColumn="0" w:lastColumn="0" w:oddVBand="0" w:evenVBand="0" w:oddHBand="1" w:evenHBand="0" w:firstRowFirstColumn="0" w:firstRowLastColumn="0" w:lastRowFirstColumn="0" w:lastRowLastColumn="0"/>
+              <w:rPr>
+                <w:rFonts w:ascii="Calibri" w:eastAsiaTheme="minorEastAsia" w:hAnsi="Calibri" w:cs="Calibri"/>
+                <w:sz w:val="24"/>
+                <w:szCs w:val="24"/>
+              </w:rPr>
+            </w:pPr>
+          </w:p>
+          <w:p>
+            <w:pPr>
+              <w:cnfStyle w:val="000000100000" w:firstRow="0" w:lastRow="0" w:firstColumn="0" w:lastColumn="0" w:oddVBand="0" w:evenVBand="0" w:oddHBand="1" w:evenHBand="0" w:firstRowFirstColumn="0" w:firstRowLastColumn="0" w:lastRowFirstColumn="0" w:lastRowLastColumn="0"/>
+              <w:rPr>
+                <w:rFonts w:ascii="Calibri" w:eastAsiaTheme="minorEastAsia" w:hAnsi="Calibri" w:cs="Calibri"/>
+                <w:sz w:val="24"/>
+                <w:szCs w:val="24"/>
+              </w:rPr>
+            </w:pPr>
+            <w:r>
+              <w:rPr>
+                <w:rFonts w:ascii="Calibri" w:eastAsiaTheme="minorEastAsia" w:hAnsi="Calibri" w:cs="Calibri"/>
+                <w:sz w:val="24"/>
+                <w:szCs w:val="24"/>
+              </w:rPr>
+              <w:t>6d. La casella sulla quale è finito il giocatore di turno è una casella speciale di tipo “Locanda”.</w:t>
+            </w:r>
+          </w:p>
+          <w:p>
+            <w:pPr>
+              <w:cnfStyle w:val="000000100000" w:firstRow="0" w:lastRow="0" w:firstColumn="0" w:lastColumn="0" w:oddVBand="0" w:evenVBand="0" w:oddHBand="1" w:evenHBand="0" w:firstRowFirstColumn="0" w:firstRowLastColumn="0" w:lastRowFirstColumn="0" w:lastRowLastColumn="0"/>
+              <w:rPr>
+                <w:rFonts w:ascii="Calibri" w:eastAsiaTheme="minorEastAsia" w:hAnsi="Calibri" w:cs="Calibri"/>
+                <w:sz w:val="24"/>
+                <w:szCs w:val="24"/>
+              </w:rPr>
+            </w:pPr>
+            <w:r>
+              <w:rPr>
+                <w:rFonts w:ascii="Calibri" w:eastAsiaTheme="minorEastAsia" w:hAnsi="Calibri" w:cs="Calibri"/>
+                <w:sz w:val="24"/>
+                <w:szCs w:val="24"/>
+              </w:rPr>
+              <w:t>1.</w:t>
+            </w:r>
+            <w:r>
+              <w:rPr>
+                <w:rFonts w:ascii="Calibri" w:eastAsiaTheme="minorEastAsia" w:hAnsi="Calibri" w:cs="Calibri"/>
+                <w:sz w:val="24"/>
+                <w:szCs w:val="24"/>
+              </w:rPr>
+              <w:tab/>
+              <w:t>Il sistema imposta lo stato del giocatore di turno a “Bloccato” per il turno successivo.</w:t>
+            </w:r>
+          </w:p>
+          <w:p>
+            <w:pPr>
+              <w:cnfStyle w:val="000000100000" w:firstRow="0" w:lastRow="0" w:firstColumn="0" w:lastColumn="0" w:oddVBand="0" w:evenVBand="0" w:oddHBand="1" w:evenHBand="0" w:firstRowFirstColumn="0" w:firstRowLastColumn="0" w:lastRowFirstColumn="0" w:lastRowLastColumn="0"/>
+              <w:rPr>
+                <w:rFonts w:ascii="Calibri" w:eastAsiaTheme="minorEastAsia" w:hAnsi="Calibri" w:cs="Calibri"/>
+                <w:sz w:val="24"/>
+                <w:szCs w:val="24"/>
+              </w:rPr>
+            </w:pPr>
+          </w:p>
+          <w:p>
+            <w:pPr>
+              <w:cnfStyle w:val="000000100000" w:firstRow="0" w:lastRow="0" w:firstColumn="0" w:lastColumn="0" w:oddVBand="0" w:evenVBand="0" w:oddHBand="1" w:evenHBand="0" w:firstRowFirstColumn="0" w:firstRowLastColumn="0" w:lastRowFirstColumn="0" w:lastRowLastColumn="0"/>
+              <w:rPr>
+                <w:rFonts w:ascii="Calibri" w:eastAsiaTheme="minorEastAsia" w:hAnsi="Calibri" w:cs="Calibri"/>
+                <w:sz w:val="24"/>
+                <w:szCs w:val="24"/>
+              </w:rPr>
+            </w:pPr>
+            <w:r>
+              <w:rPr>
+                <w:rFonts w:ascii="Calibri" w:eastAsiaTheme="minorEastAsia" w:hAnsi="Calibri" w:cs="Calibri"/>
+                <w:sz w:val="24"/>
+                <w:szCs w:val="24"/>
+              </w:rPr>
+              <w:t>6e. La casella sulla quale è finito il giocatore di turno è una casella speciale di tipo “Prigione”.</w:t>
+            </w:r>
+          </w:p>
+          <w:p>
+            <w:pPr>
+              <w:cnfStyle w:val="000000100000" w:firstRow="0" w:lastRow="0" w:firstColumn="0" w:lastColumn="0" w:oddVBand="0" w:evenVBand="0" w:oddHBand="1" w:evenHBand="0" w:firstRowFirstColumn="0" w:firstRowLastColumn="0" w:lastRowFirstColumn="0" w:lastRowLastColumn="0"/>
+              <w:rPr>
+                <w:rFonts w:ascii="Calibri" w:eastAsiaTheme="minorEastAsia" w:hAnsi="Calibri" w:cs="Calibri"/>
+                <w:sz w:val="24"/>
+                <w:szCs w:val="24"/>
+              </w:rPr>
+            </w:pPr>
+            <w:r>
+              <w:rPr>
+                <w:rFonts w:ascii="Calibri" w:eastAsiaTheme="minorEastAsia" w:hAnsi="Calibri" w:cs="Calibri"/>
+                <w:sz w:val="24"/>
+                <w:szCs w:val="24"/>
+              </w:rPr>
+              <w:t>1.</w:t>
+            </w:r>
+            <w:r>
+              <w:rPr>
+                <w:rFonts w:ascii="Calibri" w:eastAsiaTheme="minorEastAsia" w:hAnsi="Calibri" w:cs="Calibri"/>
+                <w:sz w:val="24"/>
+                <w:szCs w:val="24"/>
+              </w:rPr>
+              <w:tab/>
+              <w:t>Il sistema controlla se sulla stessa casella è presente un altro giocatore.</w:t>
+            </w:r>
+          </w:p>
+          <w:p>
+            <w:pPr>
+              <w:cnfStyle w:val="000000100000" w:firstRow="0" w:lastRow="0" w:firstColumn="0" w:lastColumn="0" w:oddVBand="0" w:evenVBand="0" w:oddHBand="1" w:evenHBand="0" w:firstRowFirstColumn="0" w:firstRowLastColumn="0" w:lastRowFirstColumn="0" w:lastRowLastColumn="0"/>
+              <w:rPr>
+                <w:rFonts w:ascii="Calibri" w:eastAsiaTheme="minorEastAsia" w:hAnsi="Calibri" w:cs="Calibri"/>
+                <w:sz w:val="24"/>
+                <w:szCs w:val="24"/>
+              </w:rPr>
+            </w:pPr>
+            <w:r>
+              <w:rPr>
+                <w:rFonts w:ascii="Calibri" w:eastAsiaTheme="minorEastAsia" w:hAnsi="Calibri" w:cs="Calibri"/>
+                <w:sz w:val="24"/>
+                <w:szCs w:val="24"/>
+              </w:rPr>
+              <w:t>1a.  Sulla stessa casella NON è presente un altro giocatore.</w:t>
+            </w:r>
+          </w:p>
+          <w:p>
+            <w:pPr>
+              <w:cnfStyle w:val="000000100000" w:firstRow="0" w:lastRow="0" w:firstColumn="0" w:lastColumn="0" w:oddVBand="0" w:evenVBand="0" w:oddHBand="1" w:evenHBand="0" w:firstRowFirstColumn="0" w:firstRowLastColumn="0" w:lastRowFirstColumn="0" w:lastRowLastColumn="0"/>
+              <w:rPr>
+                <w:rFonts w:ascii="Calibri" w:eastAsiaTheme="minorEastAsia" w:hAnsi="Calibri" w:cs="Calibri"/>
+                <w:sz w:val="24"/>
+                <w:szCs w:val="24"/>
+              </w:rPr>
+            </w:pPr>
+            <w:r>
+              <w:rPr>
+                <w:rFonts w:ascii="Calibri" w:eastAsiaTheme="minorEastAsia" w:hAnsi="Calibri" w:cs="Calibri"/>
+                <w:sz w:val="24"/>
+                <w:szCs w:val="24"/>
+              </w:rPr>
+              <w:t>1.</w:t>
+            </w:r>
+            <w:r>
+              <w:rPr>
+                <w:rFonts w:ascii="Calibri" w:eastAsiaTheme="minorEastAsia" w:hAnsi="Calibri" w:cs="Calibri"/>
+                <w:sz w:val="24"/>
+                <w:szCs w:val="24"/>
+              </w:rPr>
+              <w:tab/>
+              <w:t>Il sistema imposta lo stato del giocatore di turno a “Bloccato” indefinitamente.</w:t>
+            </w:r>
+          </w:p>
+          <w:p>
+            <w:pPr>
+              <w:cnfStyle w:val="000000100000" w:firstRow="0" w:lastRow="0" w:firstColumn="0" w:lastColumn="0" w:oddVBand="0" w:evenVBand="0" w:oddHBand="1" w:evenHBand="0" w:firstRowFirstColumn="0" w:firstRowLastColumn="0" w:lastRowFirstColumn="0" w:lastRowLastColumn="0"/>
+              <w:rPr>
+                <w:rFonts w:ascii="Calibri" w:eastAsiaTheme="minorEastAsia" w:hAnsi="Calibri" w:cs="Calibri"/>
+                <w:sz w:val="24"/>
+                <w:szCs w:val="24"/>
+              </w:rPr>
+            </w:pPr>
+            <w:r>
+              <w:rPr>
+                <w:rFonts w:ascii="Calibri" w:eastAsiaTheme="minorEastAsia" w:hAnsi="Calibri" w:cs="Calibri"/>
+                <w:sz w:val="24"/>
+                <w:szCs w:val="24"/>
+              </w:rPr>
+              <w:lastRenderedPageBreak/>
+              <w:t>1b. Sulla stessa casella è presente un altro giocatore.</w:t>
+            </w:r>
+          </w:p>
+          <w:p>
+            <w:pPr>
+              <w:cnfStyle w:val="000000100000" w:firstRow="0" w:lastRow="0" w:firstColumn="0" w:lastColumn="0" w:oddVBand="0" w:evenVBand="0" w:oddHBand="1" w:evenHBand="0" w:firstRowFirstColumn="0" w:firstRowLastColumn="0" w:lastRowFirstColumn="0" w:lastRowLastColumn="0"/>
+              <w:rPr>
+                <w:rFonts w:ascii="Calibri" w:eastAsiaTheme="minorEastAsia" w:hAnsi="Calibri" w:cs="Calibri"/>
+                <w:sz w:val="24"/>
+                <w:szCs w:val="24"/>
+              </w:rPr>
+            </w:pPr>
+            <w:r>
+              <w:rPr>
+                <w:rFonts w:ascii="Calibri" w:eastAsiaTheme="minorEastAsia" w:hAnsi="Calibri" w:cs="Calibri"/>
+                <w:sz w:val="24"/>
+                <w:szCs w:val="24"/>
+              </w:rPr>
+              <w:t>1.</w:t>
+            </w:r>
+            <w:r>
+              <w:rPr>
+                <w:rFonts w:ascii="Calibri" w:eastAsiaTheme="minorEastAsia" w:hAnsi="Calibri" w:cs="Calibri"/>
+                <w:sz w:val="24"/>
+                <w:szCs w:val="24"/>
+              </w:rPr>
+              <w:tab/>
+              <w:t>Il sistema imposta lo stato giocatore che è finito sulla casella a “Bloccato” indefinitamente e imposta lo stato del giocatore che era già presente sulla casella a “Sbloccato”.</w:t>
+            </w:r>
+          </w:p>
+          <w:p>
+            <w:pPr>
+              <w:cnfStyle w:val="000000100000" w:firstRow="0" w:lastRow="0" w:firstColumn="0" w:lastColumn="0" w:oddVBand="0" w:evenVBand="0" w:oddHBand="1" w:evenHBand="0" w:firstRowFirstColumn="0" w:firstRowLastColumn="0" w:lastRowFirstColumn="0" w:lastRowLastColumn="0"/>
+              <w:rPr>
+                <w:rFonts w:ascii="Calibri" w:eastAsiaTheme="minorEastAsia" w:hAnsi="Calibri" w:cs="Calibri"/>
+                <w:sz w:val="24"/>
+                <w:szCs w:val="24"/>
+              </w:rPr>
+            </w:pPr>
+          </w:p>
+          <w:p>
+            <w:pPr>
+              <w:cnfStyle w:val="000000100000" w:firstRow="0" w:lastRow="0" w:firstColumn="0" w:lastColumn="0" w:oddVBand="0" w:evenVBand="0" w:oddHBand="1" w:evenHBand="0" w:firstRowFirstColumn="0" w:firstRowLastColumn="0" w:lastRowFirstColumn="0" w:lastRowLastColumn="0"/>
+              <w:rPr>
+                <w:rFonts w:ascii="Calibri" w:eastAsiaTheme="minorEastAsia" w:hAnsi="Calibri" w:cs="Calibri"/>
+                <w:sz w:val="24"/>
+                <w:szCs w:val="24"/>
+              </w:rPr>
+            </w:pPr>
+            <w:r>
+              <w:rPr>
+                <w:rFonts w:ascii="Calibri" w:eastAsiaTheme="minorEastAsia" w:hAnsi="Calibri" w:cs="Calibri"/>
+                <w:sz w:val="24"/>
+                <w:szCs w:val="24"/>
+              </w:rPr>
+              <w:t>6f. La casella sulla quale è finito il giocatore di turno è una casella speciale di tipo “Labirinto”.</w:t>
+            </w:r>
+          </w:p>
+          <w:p>
+            <w:pPr>
+              <w:cnfStyle w:val="000000100000" w:firstRow="0" w:lastRow="0" w:firstColumn="0" w:lastColumn="0" w:oddVBand="0" w:evenVBand="0" w:oddHBand="1" w:evenHBand="0" w:firstRowFirstColumn="0" w:firstRowLastColumn="0" w:lastRowFirstColumn="0" w:lastRowLastColumn="0"/>
+              <w:rPr>
+                <w:rFonts w:ascii="Calibri" w:eastAsiaTheme="minorEastAsia" w:hAnsi="Calibri" w:cs="Calibri"/>
+                <w:sz w:val="24"/>
+                <w:szCs w:val="24"/>
+              </w:rPr>
+            </w:pPr>
+            <w:r>
+              <w:rPr>
+                <w:rFonts w:ascii="Calibri" w:eastAsiaTheme="minorEastAsia" w:hAnsi="Calibri" w:cs="Calibri"/>
+                <w:sz w:val="24"/>
+                <w:szCs w:val="24"/>
+              </w:rPr>
+              <w:t>1.</w:t>
+            </w:r>
+            <w:r>
+              <w:rPr>
+                <w:rFonts w:ascii="Calibri" w:eastAsiaTheme="minorEastAsia" w:hAnsi="Calibri" w:cs="Calibri"/>
+                <w:sz w:val="24"/>
+                <w:szCs w:val="24"/>
+              </w:rPr>
+              <w:tab/>
+              <w:t>La nuova casella sulla quale finisce la pedina del giocatore di turno sarà calcolata come “Casella attuale” - 3.</w:t>
+            </w:r>
+          </w:p>
+          <w:p>
+            <w:pPr>
+              <w:cnfStyle w:val="000000100000" w:firstRow="0" w:lastRow="0" w:firstColumn="0" w:lastColumn="0" w:oddVBand="0" w:evenVBand="0" w:oddHBand="1" w:evenHBand="0" w:firstRowFirstColumn="0" w:firstRowLastColumn="0" w:lastRowFirstColumn="0" w:lastRowLastColumn="0"/>
+              <w:rPr>
+                <w:rFonts w:ascii="Calibri" w:eastAsiaTheme="minorEastAsia" w:hAnsi="Calibri" w:cs="Calibri"/>
+                <w:sz w:val="24"/>
+                <w:szCs w:val="24"/>
+              </w:rPr>
+            </w:pPr>
+          </w:p>
+          <w:p>
+            <w:pPr>
+              <w:cnfStyle w:val="000000100000" w:firstRow="0" w:lastRow="0" w:firstColumn="0" w:lastColumn="0" w:oddVBand="0" w:evenVBand="0" w:oddHBand="1" w:evenHBand="0" w:firstRowFirstColumn="0" w:firstRowLastColumn="0" w:lastRowFirstColumn="0" w:lastRowLastColumn="0"/>
+              <w:rPr>
+                <w:rFonts w:ascii="Calibri" w:eastAsiaTheme="minorEastAsia" w:hAnsi="Calibri" w:cs="Calibri"/>
+                <w:sz w:val="24"/>
+                <w:szCs w:val="24"/>
+              </w:rPr>
+            </w:pPr>
+            <w:r>
+              <w:rPr>
+                <w:rFonts w:ascii="Calibri" w:eastAsiaTheme="minorEastAsia" w:hAnsi="Calibri" w:cs="Calibri"/>
+                <w:sz w:val="24"/>
+                <w:szCs w:val="24"/>
+              </w:rPr>
+              <w:t>6g. La casella sulla quale è finito il giocatore di turno è una casella speciale di tipo “Scheletro”.</w:t>
+            </w:r>
+          </w:p>
+          <w:p>
+            <w:pPr>
+              <w:cnfStyle w:val="000000100000" w:firstRow="0" w:lastRow="0" w:firstColumn="0" w:lastColumn="0" w:oddVBand="0" w:evenVBand="0" w:oddHBand="1" w:evenHBand="0" w:firstRowFirstColumn="0" w:firstRowLastColumn="0" w:lastRowFirstColumn="0" w:lastRowLastColumn="0"/>
+              <w:rPr>
+                <w:rFonts w:ascii="Calibri" w:eastAsiaTheme="minorEastAsia" w:hAnsi="Calibri" w:cs="Calibri"/>
+                <w:sz w:val="24"/>
+                <w:szCs w:val="24"/>
+              </w:rPr>
+            </w:pPr>
+            <w:r>
+              <w:rPr>
+                <w:rFonts w:ascii="Calibri" w:eastAsiaTheme="minorEastAsia" w:hAnsi="Calibri" w:cs="Calibri"/>
+                <w:sz w:val="24"/>
+                <w:szCs w:val="24"/>
+              </w:rPr>
+              <w:t>1.</w:t>
+            </w:r>
+            <w:r>
+              <w:rPr>
+                <w:rFonts w:ascii="Calibri" w:eastAsiaTheme="minorEastAsia" w:hAnsi="Calibri" w:cs="Calibri"/>
+                <w:sz w:val="24"/>
+                <w:szCs w:val="24"/>
+              </w:rPr>
+              <w:tab/>
+              <w:t>La nuova casella sulla quale finisce la pedina del giocatore di turno viene reimpostata alla casella di inizio.</w:t>
+            </w:r>
+          </w:p>
+          <w:p>
+            <w:pPr>
+              <w:cnfStyle w:val="000000100000" w:firstRow="0" w:lastRow="0" w:firstColumn="0" w:lastColumn="0" w:oddVBand="0" w:evenVBand="0" w:oddHBand="1" w:evenHBand="0" w:firstRowFirstColumn="0" w:firstRowLastColumn="0" w:lastRowFirstColumn="0" w:lastRowLastColumn="0"/>
+              <w:rPr>
+                <w:rFonts w:ascii="Calibri" w:eastAsiaTheme="minorEastAsia" w:hAnsi="Calibri" w:cs="Calibri"/>
+                <w:sz w:val="24"/>
+                <w:szCs w:val="24"/>
+              </w:rPr>
+            </w:pPr>
+          </w:p>
+          <w:p>
+            <w:pPr>
+              <w:cnfStyle w:val="000000100000" w:firstRow="0" w:lastRow="0" w:firstColumn="0" w:lastColumn="0" w:oddVBand="0" w:evenVBand="0" w:oddHBand="1" w:evenHBand="0" w:firstRowFirstColumn="0" w:firstRowLastColumn="0" w:lastRowFirstColumn="0" w:lastRowLastColumn="0"/>
+              <w:rPr>
+                <w:rFonts w:ascii="Calibri" w:eastAsiaTheme="minorEastAsia" w:hAnsi="Calibri" w:cs="Calibri"/>
+                <w:sz w:val="24"/>
+                <w:szCs w:val="24"/>
+              </w:rPr>
+            </w:pPr>
+          </w:p>
+          <w:p>
+            <w:pPr>
+              <w:cnfStyle w:val="000000100000" w:firstRow="0" w:lastRow="0" w:firstColumn="0" w:lastColumn="0" w:oddVBand="0" w:evenVBand="0" w:oddHBand="1" w:evenHBand="0" w:firstRowFirstColumn="0" w:firstRowLastColumn="0" w:lastRowFirstColumn="0" w:lastRowLastColumn="0"/>
+              <w:rPr>
+                <w:rFonts w:ascii="Calibri" w:eastAsiaTheme="minorEastAsia" w:hAnsi="Calibri" w:cs="Calibri"/>
+                <w:sz w:val="24"/>
+                <w:szCs w:val="24"/>
+              </w:rPr>
+            </w:pPr>
+            <w:r>
+              <w:rPr>
+                <w:rFonts w:ascii="Calibri" w:eastAsiaTheme="minorEastAsia" w:hAnsi="Calibri" w:cs="Calibri"/>
+                <w:sz w:val="24"/>
+                <w:szCs w:val="24"/>
+              </w:rPr>
+              <w:t>8a. La casella sulla quale è finito il giocatore di turno NON è quella finale.</w:t>
+            </w:r>
+          </w:p>
+          <w:p>
+            <w:pPr>
+              <w:cnfStyle w:val="000000100000" w:firstRow="0" w:lastRow="0" w:firstColumn="0" w:lastColumn="0" w:oddVBand="0" w:evenVBand="0" w:oddHBand="1" w:evenHBand="0" w:firstRowFirstColumn="0" w:firstRowLastColumn="0" w:lastRowFirstColumn="0" w:lastRowLastColumn="0"/>
+              <w:rPr>
+                <w:rFonts w:ascii="Calibri" w:eastAsiaTheme="minorEastAsia" w:hAnsi="Calibri" w:cs="Calibri"/>
+                <w:sz w:val="24"/>
+                <w:szCs w:val="24"/>
+              </w:rPr>
+            </w:pPr>
+            <w:r>
+              <w:rPr>
+                <w:rFonts w:ascii="Calibri" w:eastAsiaTheme="minorEastAsia" w:hAnsi="Calibri" w:cs="Calibri"/>
+                <w:sz w:val="24"/>
+                <w:szCs w:val="24"/>
+              </w:rPr>
+              <w:t>1.</w:t>
+            </w:r>
+            <w:r>
+              <w:rPr>
+                <w:rFonts w:ascii="Calibri" w:eastAsiaTheme="minorEastAsia" w:hAnsi="Calibri" w:cs="Calibri"/>
+                <w:sz w:val="24"/>
+                <w:szCs w:val="24"/>
+              </w:rPr>
+              <w:tab/>
+              <w:t>Il sistema controlla chi è il giocatore di turno.</w:t>
+            </w:r>
+          </w:p>
+          <w:p>
+            <w:pPr>
+              <w:cnfStyle w:val="000000100000" w:firstRow="0" w:lastRow="0" w:firstColumn="0" w:lastColumn="0" w:oddVBand="0" w:evenVBand="0" w:oddHBand="1" w:evenHBand="0" w:firstRowFirstColumn="0" w:firstRowLastColumn="0" w:lastRowFirstColumn="0" w:lastRowLastColumn="0"/>
+              <w:rPr>
+                <w:rFonts w:ascii="Calibri" w:eastAsiaTheme="minorEastAsia" w:hAnsi="Calibri" w:cs="Calibri"/>
+                <w:sz w:val="24"/>
+                <w:szCs w:val="24"/>
+              </w:rPr>
+            </w:pPr>
+            <w:r>
+              <w:rPr>
+                <w:rFonts w:ascii="Calibri" w:eastAsiaTheme="minorEastAsia" w:hAnsi="Calibri" w:cs="Calibri"/>
+                <w:sz w:val="24"/>
+                <w:szCs w:val="24"/>
+              </w:rPr>
+              <w:t>1a.  Il giocatore di turno è l’utente.</w:t>
+            </w:r>
+          </w:p>
+          <w:p>
+            <w:pPr>
+              <w:cnfStyle w:val="000000100000" w:firstRow="0" w:lastRow="0" w:firstColumn="0" w:lastColumn="0" w:oddVBand="0" w:evenVBand="0" w:oddHBand="1" w:evenHBand="0" w:firstRowFirstColumn="0" w:firstRowLastColumn="0" w:lastRowFirstColumn="0" w:lastRowLastColumn="0"/>
+              <w:rPr>
+                <w:rFonts w:ascii="Calibri" w:eastAsiaTheme="minorEastAsia" w:hAnsi="Calibri" w:cs="Calibri"/>
+                <w:sz w:val="24"/>
+                <w:szCs w:val="24"/>
+              </w:rPr>
+            </w:pPr>
+            <w:r>
+              <w:rPr>
+                <w:rFonts w:ascii="Calibri" w:eastAsiaTheme="minorEastAsia" w:hAnsi="Calibri" w:cs="Calibri"/>
+                <w:sz w:val="24"/>
+                <w:szCs w:val="24"/>
+              </w:rPr>
+              <w:t>2.</w:t>
+            </w:r>
+            <w:r>
+              <w:rPr>
+                <w:rFonts w:ascii="Calibri" w:eastAsiaTheme="minorEastAsia" w:hAnsi="Calibri" w:cs="Calibri"/>
+                <w:sz w:val="24"/>
+                <w:szCs w:val="24"/>
+              </w:rPr>
+              <w:tab/>
+              <w:t>Il sistema imposta come nuovo giocatore di turno il computer e ritorna al passo 4.</w:t>
+            </w:r>
+          </w:p>
+          <w:p>
+            <w:pPr>
+              <w:cnfStyle w:val="000000100000" w:firstRow="0" w:lastRow="0" w:firstColumn="0" w:lastColumn="0" w:oddVBand="0" w:evenVBand="0" w:oddHBand="1" w:evenHBand="0" w:firstRowFirstColumn="0" w:firstRowLastColumn="0" w:lastRowFirstColumn="0" w:lastRowLastColumn="0"/>
+              <w:rPr>
+                <w:rFonts w:ascii="Calibri" w:eastAsiaTheme="minorEastAsia" w:hAnsi="Calibri" w:cs="Calibri"/>
+                <w:sz w:val="24"/>
+                <w:szCs w:val="24"/>
+              </w:rPr>
+            </w:pPr>
+            <w:r>
+              <w:rPr>
+                <w:rFonts w:ascii="Calibri" w:eastAsiaTheme="minorEastAsia" w:hAnsi="Calibri" w:cs="Calibri"/>
+                <w:sz w:val="24"/>
+                <w:szCs w:val="24"/>
+              </w:rPr>
+              <w:t>1b. Il giocatore di turno è il computer.</w:t>
+            </w:r>
+          </w:p>
+          <w:p>
+            <w:pPr>
+              <w:cnfStyle w:val="000000100000" w:firstRow="0" w:lastRow="0" w:firstColumn="0" w:lastColumn="0" w:oddVBand="0" w:evenVBand="0" w:oddHBand="1" w:evenHBand="0" w:firstRowFirstColumn="0" w:firstRowLastColumn="0" w:lastRowFirstColumn="0" w:lastRowLastColumn="0"/>
+              <w:rPr>
+                <w:rFonts w:ascii="Calibri" w:eastAsiaTheme="minorEastAsia" w:hAnsi="Calibri" w:cs="Calibri"/>
+                <w:sz w:val="24"/>
+                <w:szCs w:val="24"/>
+              </w:rPr>
+            </w:pPr>
+            <w:r>
+              <w:rPr>
+                <w:rFonts w:ascii="Calibri" w:eastAsiaTheme="minorEastAsia" w:hAnsi="Calibri" w:cs="Calibri"/>
+                <w:sz w:val="24"/>
+                <w:szCs w:val="24"/>
+              </w:rPr>
+              <w:t>2.</w:t>
+            </w:r>
+            <w:r>
+              <w:rPr>
+                <w:rFonts w:ascii="Calibri" w:eastAsiaTheme="minorEastAsia" w:hAnsi="Calibri" w:cs="Calibri"/>
+                <w:sz w:val="24"/>
+                <w:szCs w:val="24"/>
+              </w:rPr>
+              <w:tab/>
+              <w:t>Il sistema imposta come nuovo giocatore di turno l’utente e ritorna al passo 3.</w:t>
+            </w:r>
+          </w:p>
+          <w:p>
+            <w:pPr>
+              <w:cnfStyle w:val="000000100000" w:firstRow="0" w:lastRow="0" w:firstColumn="0" w:lastColumn="0" w:oddVBand="0" w:evenVBand="0" w:oddHBand="1" w:evenHBand="0" w:firstRowFirstColumn="0" w:firstRowLastColumn="0" w:lastRowFirstColumn="0" w:lastRowLastColumn="0"/>
+              <w:rPr>
+                <w:rFonts w:ascii="Calibri" w:eastAsiaTheme="minorEastAsia" w:hAnsi="Calibri" w:cs="Calibri"/>
+                <w:sz w:val="24"/>
+                <w:szCs w:val="24"/>
+              </w:rPr>
+            </w:pPr>
+          </w:p>
+          <w:p>
+            <w:pPr>
+              <w:cnfStyle w:val="000000100000" w:firstRow="0" w:lastRow="0" w:firstColumn="0" w:lastColumn="0" w:oddVBand="0" w:evenVBand="0" w:oddHBand="1" w:evenHBand="0" w:firstRowFirstColumn="0" w:firstRowLastColumn="0" w:lastRowFirstColumn="0" w:lastRowLastColumn="0"/>
+              <w:rPr>
+                <w:rFonts w:ascii="Calibri" w:eastAsiaTheme="minorEastAsia" w:hAnsi="Calibri" w:cs="Calibri"/>
+                <w:sz w:val="24"/>
+                <w:szCs w:val="24"/>
+              </w:rPr>
+            </w:pPr>
+            <w:r>
+              <w:rPr>
+                <w:rFonts w:ascii="Calibri" w:eastAsiaTheme="minorEastAsia" w:hAnsi="Calibri" w:cs="Calibri"/>
+                <w:sz w:val="24"/>
+                <w:szCs w:val="24"/>
+              </w:rPr>
+              <w:t>8b. La casella sulla quale è finito il giocatore di turno è quella finale.</w:t>
+            </w:r>
+          </w:p>
+          <w:p>
+            <w:pPr>
+              <w:cnfStyle w:val="000000100000" w:firstRow="0" w:lastRow="0" w:firstColumn="0" w:lastColumn="0" w:oddVBand="0" w:evenVBand="0" w:oddHBand="1" w:evenHBand="0" w:firstRowFirstColumn="0" w:firstRowLastColumn="0" w:lastRowFirstColumn="0" w:lastRowLastColumn="0"/>
+              <w:rPr>
+                <w:rFonts w:ascii="Calibri" w:eastAsiaTheme="minorEastAsia" w:hAnsi="Calibri" w:cs="Calibri"/>
+                <w:sz w:val="24"/>
+                <w:szCs w:val="24"/>
+              </w:rPr>
+            </w:pPr>
+            <w:r>
+              <w:rPr>
+                <w:rFonts w:ascii="Calibri" w:eastAsiaTheme="minorEastAsia" w:hAnsi="Calibri" w:cs="Calibri"/>
+                <w:sz w:val="24"/>
+                <w:szCs w:val="24"/>
+              </w:rPr>
+              <w:t>1.</w:t>
+            </w:r>
+            <w:r>
+              <w:rPr>
+                <w:rFonts w:ascii="Calibri" w:eastAsiaTheme="minorEastAsia" w:hAnsi="Calibri" w:cs="Calibri"/>
+                <w:sz w:val="24"/>
+                <w:szCs w:val="24"/>
+              </w:rPr>
+              <w:tab/>
+              <w:t>Il sistema continua con il passo 9.</w:t>
+            </w:r>
+          </w:p>
+          <w:p>
+            <w:pPr>
+              <w:cnfStyle w:val="000000100000" w:firstRow="0" w:lastRow="0" w:firstColumn="0" w:lastColumn="0" w:oddVBand="0" w:evenVBand="0" w:oddHBand="1" w:evenHBand="0" w:firstRowFirstColumn="0" w:firstRowLastColumn="0" w:lastRowFirstColumn="0" w:lastRowLastColumn="0"/>
+              <w:rPr>
+                <w:rFonts w:ascii="Calibri" w:eastAsiaTheme="minorEastAsia" w:hAnsi="Calibri" w:cs="Calibri"/>
+                <w:sz w:val="24"/>
+                <w:szCs w:val="24"/>
+              </w:rPr>
+            </w:pPr>
+          </w:p>
+          <w:p>
+            <w:pPr>
+              <w:cnfStyle w:val="000000100000" w:firstRow="0" w:lastRow="0" w:firstColumn="0" w:lastColumn="0" w:oddVBand="0" w:evenVBand="0" w:oddHBand="1" w:evenHBand="0" w:firstRowFirstColumn="0" w:firstRowLastColumn="0" w:lastRowFirstColumn="0" w:lastRowLastColumn="0"/>
+              <w:rPr>
+                <w:rFonts w:ascii="Calibri" w:eastAsiaTheme="minorEastAsia" w:hAnsi="Calibri" w:cs="Calibri"/>
+                <w:sz w:val="24"/>
+                <w:szCs w:val="24"/>
+              </w:rPr>
+            </w:pPr>
+          </w:p>
+        </w:tc>
+      </w:tr>
+      <w:tr>
+        <w:trPr>
+          <w:trHeight w:val="378"/>
+          <w:jc w:val="center"/>
+        </w:trPr>
+        <w:tc>
+          <w:tcPr>
+            <w:cnfStyle w:val="001000000000" w:firstRow="0" w:lastRow="0" w:firstColumn="1" w:lastColumn="0" w:oddVBand="0" w:evenVBand="0" w:oddHBand="0" w:evenHBand="0" w:firstRowFirstColumn="0" w:firstRowLastColumn="0" w:lastRowFirstColumn="0" w:lastRowLastColumn="0"/>
+            <w:tcW w:w="2249" w:type="pct"/>
+            <w:noWrap/>
+            <w:vAlign w:val="center"/>
+          </w:tcPr>
+          <w:p>
+            <w:pPr>
+              <w:rPr>
+                <w:rFonts w:ascii="Calibri" w:hAnsi="Calibri" w:cs="Calibri"/>
+                <w:color w:val="0D0D0D"/>
+                <w:sz w:val="24"/>
+                <w:szCs w:val="24"/>
+                <w:shd w:val="clear" w:color="auto" w:fill="FFFFFF"/>
+              </w:rPr>
+            </w:pPr>
+            <w:r>
+              <w:rPr>
+                <w:rFonts w:ascii="Calibri" w:hAnsi="Calibri" w:cs="Calibri"/>
+                <w:color w:val="0D0D0D"/>
+                <w:sz w:val="24"/>
+                <w:szCs w:val="24"/>
+                <w:shd w:val="clear" w:color="auto" w:fill="FFFFFF"/>
+              </w:rPr>
+              <w:lastRenderedPageBreak/>
+              <w:t>Requisiti speciali</w:t>
+            </w:r>
+          </w:p>
+        </w:tc>
+        <w:tc>
+          <w:tcPr>
+            <w:tcW w:w="2751" w:type="pct"/>
+            <w:vAlign w:val="center"/>
+          </w:tcPr>
+          <w:p>
+            <w:pPr>
+              <w:cnfStyle w:val="000000000000" w:firstRow="0" w:lastRow="0" w:firstColumn="0" w:lastColumn="0" w:oddVBand="0" w:evenVBand="0" w:oddHBand="0" w:evenHBand="0" w:firstRowFirstColumn="0" w:firstRowLastColumn="0" w:lastRowFirstColumn="0" w:lastRowLastColumn="0"/>
+              <w:rPr>
+                <w:rFonts w:ascii="Calibri" w:eastAsiaTheme="minorEastAsia" w:hAnsi="Calibri" w:cs="Calibri"/>
+                <w:sz w:val="24"/>
+                <w:szCs w:val="24"/>
+              </w:rPr>
+            </w:pPr>
+          </w:p>
+        </w:tc>
+      </w:tr>
+      <w:tr>
+        <w:trPr>
+          <w:cnfStyle w:val="000000100000" w:firstRow="0" w:lastRow="0" w:firstColumn="0" w:lastColumn="0" w:oddVBand="0" w:evenVBand="0" w:oddHBand="1" w:evenHBand="0" w:firstRowFirstColumn="0" w:firstRowLastColumn="0" w:lastRowFirstColumn="0" w:lastRowLastColumn="0"/>
+          <w:trHeight w:val="425"/>
+          <w:jc w:val="center"/>
+        </w:trPr>
+        <w:tc>
+          <w:tcPr>
+            <w:cnfStyle w:val="001000000000" w:firstRow="0" w:lastRow="0" w:firstColumn="1" w:lastColumn="0" w:oddVBand="0" w:evenVBand="0" w:oddHBand="0" w:evenHBand="0" w:firstRowFirstColumn="0" w:firstRowLastColumn="0" w:lastRowFirstColumn="0" w:lastRowLastColumn="0"/>
+            <w:tcW w:w="2249" w:type="pct"/>
+            <w:noWrap/>
+            <w:vAlign w:val="center"/>
+          </w:tcPr>
+          <w:p>
+            <w:pPr>
+              <w:rPr>
+                <w:rFonts w:ascii="Calibri" w:hAnsi="Calibri" w:cs="Calibri"/>
+                <w:color w:val="0D0D0D"/>
+                <w:sz w:val="24"/>
+                <w:szCs w:val="24"/>
+                <w:shd w:val="clear" w:color="auto" w:fill="FFFFFF"/>
+              </w:rPr>
+            </w:pPr>
+            <w:r>
+              <w:rPr>
+                <w:rFonts w:ascii="Calibri" w:hAnsi="Calibri" w:cs="Calibri"/>
+                <w:color w:val="0D0D0D"/>
+                <w:sz w:val="24"/>
+                <w:szCs w:val="24"/>
+                <w:shd w:val="clear" w:color="auto" w:fill="FFFFFF"/>
+              </w:rPr>
+              <w:t>Elenco delle varianti tecnologiche e dei dati</w:t>
+            </w:r>
+          </w:p>
+        </w:tc>
+        <w:tc>
+          <w:tcPr>
+            <w:tcW w:w="2751" w:type="pct"/>
+            <w:vAlign w:val="center"/>
+          </w:tcPr>
+          <w:p>
+            <w:pPr>
+              <w:cnfStyle w:val="000000100000" w:firstRow="0" w:lastRow="0" w:firstColumn="0" w:lastColumn="0" w:oddVBand="0" w:evenVBand="0" w:oddHBand="1" w:evenHBand="0" w:firstRowFirstColumn="0" w:firstRowLastColumn="0" w:lastRowFirstColumn="0" w:lastRowLastColumn="0"/>
+              <w:rPr>
+                <w:rFonts w:ascii="Calibri" w:eastAsiaTheme="minorEastAsia" w:hAnsi="Calibri" w:cs="Calibri"/>
+                <w:sz w:val="24"/>
+                <w:szCs w:val="24"/>
+              </w:rPr>
+            </w:pPr>
+          </w:p>
+        </w:tc>
+      </w:tr>
+      <w:tr>
+        <w:trPr>
+          <w:trHeight w:val="715"/>
+          <w:jc w:val="center"/>
+        </w:trPr>
+        <w:tc>
+          <w:tcPr>
+            <w:cnfStyle w:val="001000000000" w:firstRow="0" w:lastRow="0" w:firstColumn="1" w:lastColumn="0" w:oddVBand="0" w:evenVBand="0" w:oddHBand="0" w:evenHBand="0" w:firstRowFirstColumn="0" w:firstRowLastColumn="0" w:lastRowFirstColumn="0" w:lastRowLastColumn="0"/>
+            <w:tcW w:w="2249" w:type="pct"/>
+            <w:noWrap/>
+            <w:vAlign w:val="center"/>
+          </w:tcPr>
+          <w:p>
+            <w:pPr>
+              <w:rPr>
+                <w:rFonts w:ascii="Calibri" w:hAnsi="Calibri" w:cs="Calibri"/>
+                <w:color w:val="0D0D0D"/>
+                <w:sz w:val="24"/>
+                <w:szCs w:val="24"/>
+                <w:shd w:val="clear" w:color="auto" w:fill="FFFFFF"/>
+              </w:rPr>
+            </w:pPr>
+            <w:r>
+              <w:rPr>
+                <w:rFonts w:ascii="Calibri" w:hAnsi="Calibri" w:cs="Calibri"/>
+                <w:color w:val="0D0D0D"/>
+                <w:sz w:val="24"/>
+                <w:szCs w:val="24"/>
+                <w:shd w:val="clear" w:color="auto" w:fill="FFFFFF"/>
+              </w:rPr>
+              <w:t>Frequenza di ripetizioni</w:t>
+            </w:r>
+          </w:p>
+        </w:tc>
+        <w:tc>
+          <w:tcPr>
+            <w:tcW w:w="2751" w:type="pct"/>
+            <w:vAlign w:val="center"/>
+          </w:tcPr>
+          <w:p>
+            <w:pPr>
+              <w:cnfStyle w:val="000000000000" w:firstRow="0" w:lastRow="0" w:firstColumn="0" w:lastColumn="0" w:oddVBand="0" w:evenVBand="0" w:oddHBand="0" w:evenHBand="0" w:firstRowFirstColumn="0" w:firstRowLastColumn="0" w:lastRowFirstColumn="0" w:lastRowLastColumn="0"/>
+              <w:rPr>
+                <w:rFonts w:ascii="Calibri" w:eastAsiaTheme="minorEastAsia" w:hAnsi="Calibri" w:cs="Calibri"/>
+                <w:sz w:val="24"/>
+                <w:szCs w:val="24"/>
+              </w:rPr>
+            </w:pPr>
+            <w:r>
+              <w:rPr>
+                <w:rFonts w:ascii="Calibri" w:eastAsiaTheme="minorEastAsia" w:hAnsi="Calibri" w:cs="Calibri"/>
+                <w:sz w:val="24"/>
+                <w:szCs w:val="24"/>
+              </w:rPr>
+              <w:t xml:space="preserve">Dipende dal numero di partite </w:t>
+            </w:r>
+            <w:proofErr w:type="spellStart"/>
+            <w:r>
+              <w:rPr>
+                <w:rFonts w:ascii="Calibri" w:eastAsiaTheme="minorEastAsia" w:hAnsi="Calibri" w:cs="Calibri"/>
+                <w:sz w:val="24"/>
+                <w:szCs w:val="24"/>
+              </w:rPr>
+              <w:t>singleplayer</w:t>
+            </w:r>
+            <w:proofErr w:type="spellEnd"/>
+            <w:r>
+              <w:rPr>
+                <w:rFonts w:ascii="Calibri" w:eastAsiaTheme="minorEastAsia" w:hAnsi="Calibri" w:cs="Calibri"/>
+                <w:sz w:val="24"/>
+                <w:szCs w:val="24"/>
+              </w:rPr>
+              <w:t xml:space="preserve"> che il giocatore vuole avviare</w:t>
+            </w:r>
+          </w:p>
+        </w:tc>
+      </w:tr>
+      <w:tr>
+        <w:trPr>
+          <w:cnfStyle w:val="000000100000" w:firstRow="0" w:lastRow="0" w:firstColumn="0" w:lastColumn="0" w:oddVBand="0" w:evenVBand="0" w:oddHBand="1" w:evenHBand="0" w:firstRowFirstColumn="0" w:firstRowLastColumn="0" w:lastRowFirstColumn="0" w:lastRowLastColumn="0"/>
+          <w:trHeight w:val="286"/>
+          <w:jc w:val="center"/>
+        </w:trPr>
+        <w:tc>
+          <w:tcPr>
+            <w:cnfStyle w:val="001000000000" w:firstRow="0" w:lastRow="0" w:firstColumn="1" w:lastColumn="0" w:oddVBand="0" w:evenVBand="0" w:oddHBand="0" w:evenHBand="0" w:firstRowFirstColumn="0" w:firstRowLastColumn="0" w:lastRowFirstColumn="0" w:lastRowLastColumn="0"/>
+            <w:tcW w:w="2249" w:type="pct"/>
+            <w:noWrap/>
+            <w:vAlign w:val="center"/>
+          </w:tcPr>
+          <w:p>
+            <w:pPr>
+              <w:rPr>
+                <w:rFonts w:ascii="Calibri" w:hAnsi="Calibri" w:cs="Calibri"/>
+                <w:color w:val="0D0D0D"/>
+                <w:sz w:val="24"/>
+                <w:szCs w:val="24"/>
+                <w:shd w:val="clear" w:color="auto" w:fill="FFFFFF"/>
+              </w:rPr>
+            </w:pPr>
+            <w:r>
+              <w:rPr>
+                <w:rFonts w:ascii="Calibri" w:hAnsi="Calibri" w:cs="Calibri"/>
+                <w:color w:val="0D0D0D"/>
+                <w:sz w:val="24"/>
+                <w:szCs w:val="24"/>
+                <w:shd w:val="clear" w:color="auto" w:fill="FFFFFF"/>
+              </w:rPr>
+              <w:t>Varie</w:t>
+            </w:r>
+          </w:p>
+        </w:tc>
+        <w:tc>
+          <w:tcPr>
+            <w:tcW w:w="2751" w:type="pct"/>
+            <w:vAlign w:val="center"/>
+          </w:tcPr>
+          <w:p>
+            <w:pPr>
+              <w:cnfStyle w:val="000000100000" w:firstRow="0" w:lastRow="0" w:firstColumn="0" w:lastColumn="0" w:oddVBand="0" w:evenVBand="0" w:oddHBand="1" w:evenHBand="0" w:firstRowFirstColumn="0" w:firstRowLastColumn="0" w:lastRowFirstColumn="0" w:lastRowLastColumn="0"/>
+              <w:rPr>
+                <w:rFonts w:ascii="Calibri" w:eastAsiaTheme="minorEastAsia" w:hAnsi="Calibri" w:cs="Calibri"/>
+                <w:sz w:val="24"/>
+                <w:szCs w:val="24"/>
+              </w:rPr>
+            </w:pPr>
+          </w:p>
+        </w:tc>
+      </w:tr>
+    </w:tbl>
+    <w:p>
+      <w:pPr>
+        <w:rPr>
+          <w:rFonts w:ascii="Calibri" w:hAnsi="Calibri" w:cs="Calibri"/>
+          <w:highlight w:val="white"/>
+        </w:rPr>
+      </w:pPr>
+    </w:p>
+    <w:p>
+      <w:pPr>
+        <w:rPr>
+          <w:rFonts w:ascii="Calibri" w:hAnsi="Calibri" w:cs="Calibri"/>
+          <w:highlight w:val="white"/>
+        </w:rPr>
+      </w:pPr>
+    </w:p>
     <w:p>
       <w:pPr>
         <w:rPr>
@@ -1254,6 +3702,7 @@
                 <w:szCs w:val="28"/>
                 <w:shd w:val="clear" w:color="auto" w:fill="FFFFFF"/>
               </w:rPr>
+              <w:lastRenderedPageBreak/>
               <w:t>Nome del caso d’uso</w:t>
             </w:r>
           </w:p>
@@ -1280,8 +3729,20 @@
                 <w:szCs w:val="28"/>
                 <w:shd w:val="clear" w:color="auto" w:fill="FFFFFF"/>
               </w:rPr>
-              <w:t>UC2: Partita singleplayer</w:t>
-            </w:r>
+              <w:t xml:space="preserve">UC2: Partita </w:t>
+            </w:r>
+            <w:proofErr w:type="spellStart"/>
+            <w:r>
+              <w:rPr>
+                <w:rFonts w:ascii="Calibri" w:hAnsi="Calibri" w:cs="Calibri"/>
+                <w:color w:val="0D0D0D"/>
+                <w:sz w:val="28"/>
+                <w:szCs w:val="28"/>
+                <w:shd w:val="clear" w:color="auto" w:fill="FFFFFF"/>
+              </w:rPr>
+              <w:t>singleplayer</w:t>
+            </w:r>
+            <w:proofErr w:type="spellEnd"/>
           </w:p>
         </w:tc>
       </w:tr>
@@ -1544,7 +4005,25 @@
                 <w:sz w:val="28"/>
                 <w:szCs w:val="28"/>
               </w:rPr>
-              <w:t>Vuole giocare una partita singleplayer al Gioco dell’Oca</w:t>
+              <w:t xml:space="preserve">Vuole giocare una partita </w:t>
+            </w:r>
+            <w:proofErr w:type="spellStart"/>
+            <w:r>
+              <w:rPr>
+                <w:rFonts w:ascii="Calibri" w:hAnsi="Calibri" w:cs="Calibri"/>
+                <w:sz w:val="28"/>
+                <w:szCs w:val="28"/>
+              </w:rPr>
+              <w:t>singleplayer</w:t>
+            </w:r>
+            <w:proofErr w:type="spellEnd"/>
+            <w:r>
+              <w:rPr>
+                <w:rFonts w:ascii="Calibri" w:hAnsi="Calibri" w:cs="Calibri"/>
+                <w:sz w:val="28"/>
+                <w:szCs w:val="28"/>
+              </w:rPr>
+              <w:t xml:space="preserve"> al Gioco dell’Oca</w:t>
             </w:r>
           </w:p>
           <w:p>
@@ -1589,7 +4068,6 @@
                 <w:szCs w:val="28"/>
                 <w:shd w:val="clear" w:color="auto" w:fill="FFFFFF"/>
               </w:rPr>
-              <w:lastRenderedPageBreak/>
               <w:t>Pre-condizioni</w:t>
             </w:r>
           </w:p>
@@ -1617,8 +4095,20 @@
                 <w:szCs w:val="28"/>
                 <w:shd w:val="clear" w:color="auto" w:fill="FFFFFF"/>
               </w:rPr>
-              <w:t>Il giocatore deve aver configurato e avviato una partita singleplayer</w:t>
-            </w:r>
+              <w:t xml:space="preserve">Il giocatore deve aver configurato e avviato una partita </w:t>
+            </w:r>
+            <w:proofErr w:type="spellStart"/>
+            <w:r>
+              <w:rPr>
+                <w:rFonts w:ascii="Calibri" w:hAnsi="Calibri" w:cs="Calibri"/>
+                <w:color w:val="0D0D0D"/>
+                <w:sz w:val="28"/>
+                <w:szCs w:val="28"/>
+                <w:shd w:val="clear" w:color="auto" w:fill="FFFFFF"/>
+              </w:rPr>
+              <w:t>singleplayer</w:t>
+            </w:r>
+            <w:proofErr w:type="spellEnd"/>
           </w:p>
         </w:tc>
       </w:tr>
@@ -1948,7 +4438,18 @@
                 <w:szCs w:val="28"/>
                 <w:shd w:val="clear" w:color="auto" w:fill="FFFFFF"/>
               </w:rPr>
-              <w:t>Il sistema conclude la partita, indicando come vincitore il giocatore la cui pedina è finita sulla casella finale.</w:t>
+              <w:t xml:space="preserve">Il sistema conclude la partita, indicando come vincitore il </w:t>
+            </w:r>
+            <w:r>
+              <w:rPr>
+                <w:rFonts w:ascii="Calibri" w:hAnsi="Calibri" w:cs="Calibri"/>
+                <w:color w:val="0D0D0D"/>
+                <w:sz w:val="28"/>
+                <w:szCs w:val="28"/>
+                <w:shd w:val="clear" w:color="auto" w:fill="FFFFFF"/>
+              </w:rPr>
+              <w:lastRenderedPageBreak/>
+              <w:t>giocatore la cui pedina è finita sulla casella finale.</w:t>
             </w:r>
           </w:p>
           <w:p>
@@ -2036,6 +4537,7 @@
                 <w:szCs w:val="28"/>
                 <w:shd w:val="clear" w:color="auto" w:fill="FFFFFF"/>
               </w:rPr>
+              <w:lastRenderedPageBreak/>
               <w:t>Estensioni</w:t>
             </w:r>
           </w:p>
@@ -2089,7 +4591,6 @@
                 <w:szCs w:val="28"/>
                 <w:shd w:val="clear" w:color="auto" w:fill="FFFFFF"/>
               </w:rPr>
-              <w:lastRenderedPageBreak/>
               <w:t xml:space="preserve">Il sistema </w:t>
             </w:r>
             <w:r>
@@ -2459,6 +4960,7 @@
                 <w:szCs w:val="28"/>
                 <w:shd w:val="clear" w:color="auto" w:fill="FFFFFF"/>
               </w:rPr>
+              <w:lastRenderedPageBreak/>
               <w:t>Il sistema imposta come nuovo giocatore di turno il computer e continua con il passo 4.</w:t>
             </w:r>
           </w:p>
@@ -2857,7 +5359,18 @@
                 <w:szCs w:val="28"/>
                 <w:shd w:val="clear" w:color="auto" w:fill="FFFFFF"/>
               </w:rPr>
-              <w:t>La nuova casella sulla quale finisce la pedina del giocatore di turno sarà calcolata come “Casella attuale” + “Somma dei numeri ottenuti dal lancio dei dadi”.</w:t>
+              <w:t xml:space="preserve">La nuova casella sulla quale finisce la pedina del giocatore di turno sarà calcolata come “Casella attuale” + “Somma </w:t>
+            </w:r>
+            <w:r>
+              <w:rPr>
+                <w:rFonts w:ascii="Calibri" w:hAnsi="Calibri" w:cs="Calibri"/>
+                <w:color w:val="0D0D0D"/>
+                <w:sz w:val="28"/>
+                <w:szCs w:val="28"/>
+                <w:shd w:val="clear" w:color="auto" w:fill="FFFFFF"/>
+              </w:rPr>
+              <w:lastRenderedPageBreak/>
+              <w:t>dei numeri ottenuti dal lancio dei dadi”.</w:t>
             </w:r>
           </w:p>
           <w:p>
@@ -3144,7 +5657,18 @@
                 <w:szCs w:val="28"/>
                 <w:shd w:val="clear" w:color="auto" w:fill="FFFFFF"/>
               </w:rPr>
-              <w:t>imposta lo stato giocatore che è finito sulla casella a “Bloccato” indefinitamente e imposta lo stato del giocatore che era già presente sulla casella a “Sbloccato”</w:t>
+              <w:t xml:space="preserve">imposta lo stato giocatore che è finito sulla casella a “Bloccato” indefinitamente e imposta lo stato del giocatore che era già </w:t>
+            </w:r>
+            <w:r>
+              <w:rPr>
+                <w:rFonts w:ascii="Calibri" w:hAnsi="Calibri" w:cs="Calibri"/>
+                <w:color w:val="0D0D0D"/>
+                <w:sz w:val="28"/>
+                <w:szCs w:val="28"/>
+                <w:shd w:val="clear" w:color="auto" w:fill="FFFFFF"/>
+              </w:rPr>
+              <w:lastRenderedPageBreak/>
+              <w:t>presente sulla casella a “Sbloccato”</w:t>
             </w:r>
             <w:r>
               <w:rPr>
@@ -3250,7 +5774,6 @@
                 <w:szCs w:val="28"/>
                 <w:shd w:val="clear" w:color="auto" w:fill="FFFFFF"/>
               </w:rPr>
-              <w:lastRenderedPageBreak/>
               <w:t>6g. La casella sulla quale è finito il giocatore di turno è una casella speciale di tipo “Scheletro”.</w:t>
             </w:r>
           </w:p>
@@ -3508,6 +6031,7 @@
                 <w:szCs w:val="28"/>
                 <w:shd w:val="clear" w:color="auto" w:fill="FFFFFF"/>
               </w:rPr>
+              <w:lastRenderedPageBreak/>
               <w:t xml:space="preserve">Il sistema continua con il passo </w:t>
             </w:r>
             <w:r>
@@ -3713,7 +6237,29 @@
                 <w:szCs w:val="28"/>
                 <w:shd w:val="clear" w:color="auto" w:fill="FFFFFF"/>
               </w:rPr>
-              <w:t>Dipende dal numero di partite singleplayer che il giocatore vuole avviare</w:t>
+              <w:t xml:space="preserve">Dipende dal numero di partite </w:t>
+            </w:r>
+            <w:proofErr w:type="spellStart"/>
+            <w:r>
+              <w:rPr>
+                <w:rFonts w:ascii="Calibri" w:hAnsi="Calibri" w:cs="Calibri"/>
+                <w:color w:val="0D0D0D"/>
+                <w:sz w:val="28"/>
+                <w:szCs w:val="28"/>
+                <w:shd w:val="clear" w:color="auto" w:fill="FFFFFF"/>
+              </w:rPr>
+              <w:t>singleplayer</w:t>
+            </w:r>
+            <w:proofErr w:type="spellEnd"/>
+            <w:r>
+              <w:rPr>
+                <w:rFonts w:ascii="Calibri" w:hAnsi="Calibri" w:cs="Calibri"/>
+                <w:color w:val="0D0D0D"/>
+                <w:sz w:val="28"/>
+                <w:szCs w:val="28"/>
+                <w:shd w:val="clear" w:color="auto" w:fill="FFFFFF"/>
+              </w:rPr>
+              <w:t xml:space="preserve"> che il giocatore vuole avviare</w:t>
             </w:r>
           </w:p>
         </w:tc>
@@ -3746,7 +6292,6 @@
                 <w:szCs w:val="28"/>
                 <w:shd w:val="clear" w:color="auto" w:fill="FFFFFF"/>
               </w:rPr>
-              <w:lastRenderedPageBreak/>
               <w:t>Varie</w:t>
             </w:r>
           </w:p>
@@ -3957,8 +6502,8 @@
       </w:pPr>
     </w:p>
     <w:sectPr>
-      <w:headerReference w:type="default" r:id="rId9"/>
-      <w:footerReference w:type="default" r:id="rId10"/>
+      <w:headerReference w:type="default" r:id="rId10"/>
+      <w:footerReference w:type="default" r:id="rId11"/>
       <w:pgSz w:w="11906" w:h="16838"/>
       <w:pgMar w:top="1417" w:right="1134" w:bottom="1134" w:left="1134" w:header="708" w:footer="640" w:gutter="0"/>
       <w:pgNumType w:start="0"/>
@@ -8862,6 +11407,7 @@
     <w:rsid w:val="003433F2"/>
     <w:rsid w:val="00355375"/>
     <w:rsid w:val="0044136E"/>
+    <w:rsid w:val="004C1A3D"/>
     <w:rsid w:val="005E049C"/>
     <w:rsid w:val="00696856"/>
     <w:rsid w:val="006C5C9A"/>
@@ -8871,6 +11417,7 @@
     <w:rsid w:val="008D0E13"/>
     <w:rsid w:val="008E6C0C"/>
     <w:rsid w:val="00A22019"/>
+    <w:rsid w:val="00B86915"/>
     <w:rsid w:val="00BA2BDF"/>
     <w:rsid w:val="00BE08AA"/>
     <w:rsid w:val="00CA6967"/>
@@ -9664,6 +12211,10 @@
 </go:gDocsCustomXmlDataStorage>
 </file>
 
+<file path=customXml/item2.xml><?xml version="1.0" encoding="utf-8"?>
+<b:Sources xmlns:b="http://schemas.openxmlformats.org/officeDocument/2006/bibliography" xmlns="http://schemas.openxmlformats.org/officeDocument/2006/bibliography" SelectedStyle="\APASixthEditionOfficeOnline.xsl" StyleName="APA" Version="6"/>
+</file>
+
 <file path=customXml/itemProps1.xml><?xml version="1.0" encoding="utf-8"?>
 <ds:datastoreItem xmlns:ds="http://schemas.openxmlformats.org/officeDocument/2006/customXml" ds:itemID="{11111111-1234-1234-1234-123412341234}">
   <ds:schemaRefs>
@@ -9671,4 +12222,12 @@
     <ds:schemaRef ds:uri="http://schemas.openxmlformats.org/officeDocument/2006/relationships"/>
   </ds:schemaRefs>
 </ds:datastoreItem>
+</file>
+
+<file path=customXml/itemProps2.xml><?xml version="1.0" encoding="utf-8"?>
+<ds:datastoreItem xmlns:ds="http://schemas.openxmlformats.org/officeDocument/2006/customXml" ds:itemID="{37B528A4-5A93-4436-BAB4-9956BF7FC17A}">
+  <ds:schemaRefs>
+    <ds:schemaRef ds:uri="http://schemas.openxmlformats.org/officeDocument/2006/bibliography"/>
+  </ds:schemaRefs>
+</ds:datastoreItem>
 </file>
</xml_diff>

<commit_message>
Modello di Dominio nel word
</commit_message>
<xml_diff>
--- a/Documentazione/Elaborazione/Iterazione 2/Iterazione 2.docx
+++ b/Documentazione/Elaborazione/Iterazione 2/Iterazione 2.docx
@@ -592,7 +592,7 @@
             </w:rPr>
             <w:fldChar w:fldCharType="separate"/>
           </w:r>
-          <w:hyperlink w:anchor="_Toc171540016" w:history="1">
+          <w:hyperlink w:anchor="_Toc171631519" w:history="1">
             <w:r>
               <w:rPr>
                 <w:rStyle w:val="Collegamentoipertestuale"/>
@@ -639,7 +639,7 @@
                 <w:noProof/>
                 <w:webHidden/>
               </w:rPr>
-              <w:instrText xml:space="preserve"> PAGEREF _Toc171540016 \h </w:instrText>
+              <w:instrText xml:space="preserve"> PAGEREF _Toc171631519 \h </w:instrText>
             </w:r>
             <w:r>
               <w:rPr>
@@ -685,7 +685,7 @@
               <w14:ligatures w14:val="standardContextual"/>
             </w:rPr>
           </w:pPr>
-          <w:hyperlink w:anchor="_Toc171540017" w:history="1">
+          <w:hyperlink w:anchor="_Toc171631520" w:history="1">
             <w:r>
               <w:rPr>
                 <w:rStyle w:val="Collegamentoipertestuale"/>
@@ -713,7 +713,7 @@
                 <w:noProof/>
                 <w:webHidden/>
               </w:rPr>
-              <w:instrText xml:space="preserve"> PAGEREF _Toc171540017 \h </w:instrText>
+              <w:instrText xml:space="preserve"> PAGEREF _Toc171631520 \h </w:instrText>
             </w:r>
             <w:r>
               <w:rPr>
@@ -759,7 +759,7 @@
               <w14:ligatures w14:val="standardContextual"/>
             </w:rPr>
           </w:pPr>
-          <w:hyperlink w:anchor="_Toc171540018" w:history="1">
+          <w:hyperlink w:anchor="_Toc171631521" w:history="1">
             <w:r>
               <w:rPr>
                 <w:rStyle w:val="Collegamentoipertestuale"/>
@@ -787,7 +787,7 @@
                 <w:noProof/>
                 <w:webHidden/>
               </w:rPr>
-              <w:instrText xml:space="preserve"> PAGEREF _Toc171540018 \h </w:instrText>
+              <w:instrText xml:space="preserve"> PAGEREF _Toc171631521 \h </w:instrText>
             </w:r>
             <w:r>
               <w:rPr>
@@ -807,7 +807,82 @@
                 <w:noProof/>
                 <w:webHidden/>
               </w:rPr>
-              <w:t>7</w:t>
+              <w:t>10</w:t>
+            </w:r>
+            <w:r>
+              <w:rPr>
+                <w:noProof/>
+                <w:webHidden/>
+              </w:rPr>
+              <w:fldChar w:fldCharType="end"/>
+            </w:r>
+          </w:hyperlink>
+        </w:p>
+        <w:p>
+          <w:pPr>
+            <w:pStyle w:val="Sommario2"/>
+            <w:tabs>
+              <w:tab w:val="right" w:leader="dot" w:pos="9628"/>
+            </w:tabs>
+            <w:rPr>
+              <w:rFonts w:asciiTheme="minorHAnsi" w:eastAsiaTheme="minorEastAsia" w:hAnsiTheme="minorHAnsi" w:cstheme="minorBidi"/>
+              <w:noProof/>
+              <w:kern w:val="2"/>
+              <w:sz w:val="24"/>
+              <w:szCs w:val="24"/>
+              <w14:ligatures w14:val="standardContextual"/>
+            </w:rPr>
+          </w:pPr>
+          <w:hyperlink w:anchor="_Toc171631522" w:history="1">
+            <w:r>
+              <w:rPr>
+                <w:rStyle w:val="Collegamentoipertestuale"/>
+                <w:rFonts w:ascii="Calibri" w:hAnsi="Calibri" w:cs="Calibri"/>
+                <w:noProof/>
+                <w:highlight w:val="white"/>
+              </w:rPr>
+              <w:t>3.1 Modello di Dominio</w:t>
+            </w:r>
+            <w:r>
+              <w:rPr>
+                <w:noProof/>
+                <w:webHidden/>
+              </w:rPr>
+              <w:tab/>
+            </w:r>
+            <w:r>
+              <w:rPr>
+                <w:noProof/>
+                <w:webHidden/>
+              </w:rPr>
+              <w:fldChar w:fldCharType="begin"/>
+            </w:r>
+            <w:r>
+              <w:rPr>
+                <w:noProof/>
+                <w:webHidden/>
+              </w:rPr>
+              <w:instrText xml:space="preserve"> PAGEREF _Toc171631522 \h </w:instrText>
+            </w:r>
+            <w:r>
+              <w:rPr>
+                <w:noProof/>
+                <w:webHidden/>
+              </w:rPr>
+            </w:r>
+            <w:r>
+              <w:rPr>
+                <w:noProof/>
+                <w:webHidden/>
+              </w:rPr>
+              <w:fldChar w:fldCharType="separate"/>
+            </w:r>
+            <w:r>
+              <w:rPr>
+                <w:noProof/>
+                <w:webHidden/>
+              </w:rPr>
+              <w:t>10</w:t>
             </w:r>
             <w:r>
               <w:rPr>
@@ -855,7 +930,7 @@
           <w:rFonts w:ascii="Calibri" w:hAnsi="Calibri" w:cs="Calibri"/>
         </w:rPr>
       </w:pPr>
-      <w:bookmarkStart w:id="0" w:name="_Toc171540016"/>
+      <w:bookmarkStart w:id="0" w:name="_Toc171631519"/>
       <w:r>
         <w:rPr>
           <w:rFonts w:ascii="Calibri" w:hAnsi="Calibri" w:cs="Calibri"/>
@@ -1070,7 +1145,7 @@
           <w:rFonts w:ascii="Calibri" w:hAnsi="Calibri" w:cs="Calibri"/>
         </w:rPr>
       </w:pPr>
-      <w:bookmarkStart w:id="1" w:name="_Toc171540017"/>
+      <w:bookmarkStart w:id="1" w:name="_Toc171631520"/>
       <w:r>
         <w:rPr>
           <w:rFonts w:ascii="Calibri" w:hAnsi="Calibri" w:cs="Calibri"/>
@@ -6331,7 +6406,7 @@
           <w:rFonts w:ascii="Calibri" w:hAnsi="Calibri" w:cs="Calibri"/>
         </w:rPr>
       </w:pPr>
-      <w:bookmarkStart w:id="3" w:name="_Toc171540018"/>
+      <w:bookmarkStart w:id="3" w:name="_Toc171631521"/>
       <w:r>
         <w:rPr>
           <w:rFonts w:ascii="Calibri" w:hAnsi="Calibri" w:cs="Calibri"/>
@@ -6492,6 +6567,686 @@
     </w:p>
     <w:p>
       <w:pPr>
+        <w:pStyle w:val="Titolo2"/>
+        <w:rPr>
+          <w:rFonts w:ascii="Calibri" w:hAnsi="Calibri" w:cs="Calibri"/>
+          <w:highlight w:val="white"/>
+        </w:rPr>
+      </w:pPr>
+      <w:bookmarkStart w:id="4" w:name="_Toc171097033"/>
+      <w:bookmarkStart w:id="5" w:name="_Toc171631522"/>
+      <w:r>
+        <w:rPr>
+          <w:rFonts w:ascii="Calibri" w:hAnsi="Calibri" w:cs="Calibri"/>
+          <w:highlight w:val="white"/>
+        </w:rPr>
+        <w:t>3.1 Modello di Dominio</w:t>
+      </w:r>
+      <w:bookmarkEnd w:id="4"/>
+      <w:bookmarkEnd w:id="5"/>
+    </w:p>
+    <w:p>
+      <w:pPr>
+        <w:rPr>
+          <w:rFonts w:ascii="Calibri" w:hAnsi="Calibri" w:cs="Calibri"/>
+          <w:highlight w:val="white"/>
+        </w:rPr>
+      </w:pPr>
+      <w:r>
+        <w:rPr>
+          <w:rFonts w:ascii="Calibri" w:hAnsi="Calibri" w:cs="Calibri"/>
+          <w:highlight w:val="white"/>
+        </w:rPr>
+        <w:t>Bisogna definire il Modello di Dominio, ovvero un elaborato grafico che permette di identificare i concetti, gli attributi e le associazioni più importanti. Dall’analisi del primo caso d’uso preso in considerazione, valutando lo scenario principale di successo, è stato possibile identificare le seguenti classi concettuali:</w:t>
+      </w:r>
+    </w:p>
+    <w:p>
+      <w:pPr>
+        <w:rPr>
+          <w:rFonts w:ascii="Calibri" w:hAnsi="Calibri" w:cs="Calibri"/>
+          <w:highlight w:val="white"/>
+        </w:rPr>
+      </w:pPr>
+      <w:r>
+        <w:rPr>
+          <w:rFonts w:ascii="Calibri" w:hAnsi="Calibri" w:cs="Calibri"/>
+          <w:highlight w:val="white"/>
+        </w:rPr>
+        <w:t xml:space="preserve">• </w:t>
+      </w:r>
+      <w:r>
+        <w:rPr>
+          <w:rFonts w:ascii="Calibri" w:hAnsi="Calibri" w:cs="Calibri"/>
+          <w:b/>
+          <w:highlight w:val="white"/>
+        </w:rPr>
+        <w:t>Giocatore</w:t>
+      </w:r>
+      <w:r>
+        <w:rPr>
+          <w:rFonts w:ascii="Calibri" w:hAnsi="Calibri" w:cs="Calibri"/>
+          <w:highlight w:val="white"/>
+        </w:rPr>
+        <w:t>: rappresenta l’attore primario, che interagisce con il sistema per eseguire le operazioni</w:t>
+      </w:r>
+      <w:r>
+        <w:rPr>
+          <w:rFonts w:ascii="Calibri" w:hAnsi="Calibri" w:cs="Calibri"/>
+          <w:highlight w:val="white"/>
+        </w:rPr>
+        <w:t>, viene definito nell’Iterazione 1</w:t>
+      </w:r>
+      <w:r>
+        <w:rPr>
+          <w:rFonts w:ascii="Calibri" w:hAnsi="Calibri" w:cs="Calibri"/>
+          <w:highlight w:val="white"/>
+        </w:rPr>
+        <w:t>;</w:t>
+      </w:r>
+    </w:p>
+    <w:p>
+      <w:pPr>
+        <w:rPr>
+          <w:rFonts w:ascii="Calibri" w:hAnsi="Calibri" w:cs="Calibri"/>
+          <w:highlight w:val="white"/>
+        </w:rPr>
+      </w:pPr>
+      <w:r>
+        <w:rPr>
+          <w:rFonts w:ascii="Calibri" w:hAnsi="Calibri" w:cs="Calibri"/>
+          <w:highlight w:val="white"/>
+        </w:rPr>
+        <w:t xml:space="preserve">• </w:t>
+      </w:r>
+      <w:proofErr w:type="spellStart"/>
+      <w:r>
+        <w:rPr>
+          <w:rFonts w:ascii="Calibri" w:hAnsi="Calibri" w:cs="Calibri"/>
+          <w:b/>
+          <w:highlight w:val="white"/>
+        </w:rPr>
+        <w:t>Gioco</w:t>
+      </w:r>
+      <w:r>
+        <w:rPr>
+          <w:rFonts w:ascii="Calibri" w:hAnsi="Calibri" w:cs="Calibri"/>
+          <w:b/>
+          <w:highlight w:val="white"/>
+        </w:rPr>
+        <w:t>DellOca</w:t>
+      </w:r>
+      <w:proofErr w:type="spellEnd"/>
+      <w:r>
+        <w:rPr>
+          <w:rFonts w:ascii="Calibri" w:hAnsi="Calibri" w:cs="Calibri"/>
+          <w:b/>
+          <w:highlight w:val="white"/>
+        </w:rPr>
+        <w:t>:</w:t>
+      </w:r>
+      <w:r>
+        <w:rPr>
+          <w:rFonts w:ascii="Calibri" w:hAnsi="Calibri" w:cs="Calibri"/>
+          <w:highlight w:val="white"/>
+        </w:rPr>
+        <w:t xml:space="preserve"> rappresenta il sistema che permette la gestione della partita</w:t>
+      </w:r>
+      <w:r>
+        <w:rPr>
+          <w:rFonts w:ascii="Calibri" w:hAnsi="Calibri" w:cs="Calibri"/>
+          <w:highlight w:val="white"/>
+        </w:rPr>
+        <w:t>, viene definito nell’Iterazione 1</w:t>
+      </w:r>
+      <w:r>
+        <w:rPr>
+          <w:rFonts w:ascii="Calibri" w:hAnsi="Calibri" w:cs="Calibri"/>
+          <w:highlight w:val="white"/>
+        </w:rPr>
+        <w:t>;</w:t>
+      </w:r>
+    </w:p>
+    <w:p>
+      <w:pPr>
+        <w:rPr>
+          <w:rFonts w:ascii="Calibri" w:hAnsi="Calibri" w:cs="Calibri"/>
+          <w:highlight w:val="white"/>
+        </w:rPr>
+      </w:pPr>
+      <w:r>
+        <w:rPr>
+          <w:rFonts w:ascii="Calibri" w:hAnsi="Calibri" w:cs="Calibri"/>
+          <w:highlight w:val="white"/>
+        </w:rPr>
+        <w:t xml:space="preserve">• </w:t>
+      </w:r>
+      <w:r>
+        <w:rPr>
+          <w:rFonts w:ascii="Calibri" w:hAnsi="Calibri" w:cs="Calibri"/>
+          <w:b/>
+          <w:highlight w:val="white"/>
+        </w:rPr>
+        <w:t>Partita</w:t>
+      </w:r>
+      <w:r>
+        <w:rPr>
+          <w:rFonts w:ascii="Calibri" w:hAnsi="Calibri" w:cs="Calibri"/>
+          <w:highlight w:val="white"/>
+        </w:rPr>
+        <w:t>: entità che rappresenta la sessione di gioco (in questo caso singolo giocatore) che dispone di impostazioni iniziali per il suo funzionamento</w:t>
+      </w:r>
+      <w:r>
+        <w:rPr>
+          <w:rFonts w:ascii="Calibri" w:hAnsi="Calibri" w:cs="Calibri"/>
+          <w:highlight w:val="white"/>
+        </w:rPr>
+        <w:t>, viene definito nell’Iterazione 1</w:t>
+      </w:r>
+      <w:r>
+        <w:rPr>
+          <w:rFonts w:ascii="Calibri" w:hAnsi="Calibri" w:cs="Calibri"/>
+          <w:highlight w:val="white"/>
+        </w:rPr>
+        <w:t>;</w:t>
+      </w:r>
+    </w:p>
+    <w:p>
+      <w:pPr>
+        <w:rPr>
+          <w:rFonts w:ascii="Calibri" w:hAnsi="Calibri" w:cs="Calibri"/>
+          <w:highlight w:val="white"/>
+        </w:rPr>
+      </w:pPr>
+      <w:r>
+        <w:rPr>
+          <w:rFonts w:ascii="Calibri" w:hAnsi="Calibri" w:cs="Calibri"/>
+          <w:highlight w:val="white"/>
+        </w:rPr>
+        <w:t xml:space="preserve">• </w:t>
+      </w:r>
+      <w:r>
+        <w:rPr>
+          <w:rFonts w:ascii="Calibri" w:hAnsi="Calibri" w:cs="Calibri"/>
+          <w:b/>
+          <w:highlight w:val="white"/>
+        </w:rPr>
+        <w:t>Impostazioni</w:t>
+      </w:r>
+      <w:r>
+        <w:rPr>
+          <w:rFonts w:ascii="Calibri" w:hAnsi="Calibri" w:cs="Calibri"/>
+          <w:highlight w:val="white"/>
+        </w:rPr>
+        <w:t>: entità che gestisce regole, scenari e personalizzazioni che verranno usati in partita</w:t>
+      </w:r>
+      <w:r>
+        <w:rPr>
+          <w:rFonts w:ascii="Calibri" w:hAnsi="Calibri" w:cs="Calibri"/>
+          <w:highlight w:val="white"/>
+        </w:rPr>
+        <w:t>, viene definito nell’Iterazione 1</w:t>
+      </w:r>
+      <w:r>
+        <w:rPr>
+          <w:rFonts w:ascii="Calibri" w:hAnsi="Calibri" w:cs="Calibri"/>
+          <w:highlight w:val="white"/>
+        </w:rPr>
+        <w:t>;</w:t>
+      </w:r>
+    </w:p>
+    <w:p>
+      <w:pPr>
+        <w:rPr>
+          <w:rFonts w:ascii="Calibri" w:hAnsi="Calibri" w:cs="Calibri"/>
+          <w:highlight w:val="yellow"/>
+        </w:rPr>
+      </w:pPr>
+      <w:r>
+        <w:rPr>
+          <w:rFonts w:ascii="Calibri" w:hAnsi="Calibri" w:cs="Calibri"/>
+          <w:highlight w:val="white"/>
+        </w:rPr>
+        <w:t xml:space="preserve">• </w:t>
+      </w:r>
+      <w:r>
+        <w:rPr>
+          <w:rFonts w:ascii="Calibri" w:hAnsi="Calibri" w:cs="Calibri"/>
+          <w:b/>
+          <w:highlight w:val="white"/>
+        </w:rPr>
+        <w:t>Scenario</w:t>
+      </w:r>
+      <w:r>
+        <w:rPr>
+          <w:rFonts w:ascii="Calibri" w:hAnsi="Calibri" w:cs="Calibri"/>
+          <w:highlight w:val="white"/>
+        </w:rPr>
+        <w:t>: lo scenario definisce la narrazione che sottintende ogni partita</w:t>
+      </w:r>
+      <w:r>
+        <w:rPr>
+          <w:rFonts w:ascii="Calibri" w:hAnsi="Calibri" w:cs="Calibri"/>
+          <w:highlight w:val="white"/>
+        </w:rPr>
+        <w:t>:</w:t>
+      </w:r>
+      <w:r>
+        <w:rPr>
+          <w:rFonts w:ascii="Calibri" w:hAnsi="Calibri" w:cs="Calibri"/>
+          <w:highlight w:val="white"/>
+        </w:rPr>
+        <w:t xml:space="preserve"> </w:t>
+      </w:r>
+      <w:r>
+        <w:rPr>
+          <w:rFonts w:ascii="Calibri" w:hAnsi="Calibri" w:cs="Calibri"/>
+          <w:highlight w:val="white"/>
+        </w:rPr>
+        <w:t>inciderà dunque</w:t>
+      </w:r>
+      <w:r>
+        <w:rPr>
+          <w:rFonts w:ascii="Calibri" w:hAnsi="Calibri" w:cs="Calibri"/>
+          <w:highlight w:val="white"/>
+        </w:rPr>
+        <w:t xml:space="preserve"> sulla descrizione di ogni casella. Viene scelto uno scenario all’inizio di ogni partita</w:t>
+      </w:r>
+      <w:r>
+        <w:rPr>
+          <w:rFonts w:ascii="Calibri" w:hAnsi="Calibri" w:cs="Calibri"/>
+          <w:highlight w:val="white"/>
+        </w:rPr>
+        <w:t>, viene definito nell’Iterazione 1</w:t>
+      </w:r>
+      <w:r>
+        <w:rPr>
+          <w:rFonts w:ascii="Calibri" w:hAnsi="Calibri" w:cs="Calibri"/>
+          <w:highlight w:val="white"/>
+        </w:rPr>
+        <w:t>;</w:t>
+      </w:r>
+    </w:p>
+    <w:p>
+      <w:pPr>
+        <w:rPr>
+          <w:rFonts w:ascii="Calibri" w:hAnsi="Calibri" w:cs="Calibri"/>
+          <w:highlight w:val="yellow"/>
+          <w:u w:val="single"/>
+        </w:rPr>
+      </w:pPr>
+      <w:r>
+        <w:rPr>
+          <w:rFonts w:ascii="Calibri" w:hAnsi="Calibri" w:cs="Calibri"/>
+          <w:highlight w:val="white"/>
+        </w:rPr>
+        <w:lastRenderedPageBreak/>
+        <w:t xml:space="preserve">• </w:t>
+      </w:r>
+      <w:r>
+        <w:rPr>
+          <w:rFonts w:ascii="Calibri" w:hAnsi="Calibri" w:cs="Calibri"/>
+          <w:b/>
+          <w:highlight w:val="white"/>
+        </w:rPr>
+        <w:t>Regola</w:t>
+      </w:r>
+      <w:r>
+        <w:rPr>
+          <w:rFonts w:ascii="Calibri" w:hAnsi="Calibri" w:cs="Calibri"/>
+          <w:highlight w:val="white"/>
+        </w:rPr>
+        <w:t>: le regole rappresentano la modalità di gioco (rapida, normale o lunga). Questa inciderà sul numero totale di caselle e sugli effetti</w:t>
+      </w:r>
+      <w:r>
+        <w:rPr>
+          <w:rFonts w:ascii="Calibri" w:hAnsi="Calibri" w:cs="Calibri"/>
+          <w:highlight w:val="white"/>
+        </w:rPr>
+        <w:t>, viene definito nell’Iterazione 1</w:t>
+      </w:r>
+      <w:r>
+        <w:rPr>
+          <w:rFonts w:ascii="Calibri" w:hAnsi="Calibri" w:cs="Calibri"/>
+          <w:highlight w:val="white"/>
+        </w:rPr>
+        <w:t>.</w:t>
+      </w:r>
+    </w:p>
+    <w:p>
+      <w:pPr>
+        <w:rPr>
+          <w:rFonts w:ascii="Calibri" w:hAnsi="Calibri" w:cs="Calibri"/>
+          <w:highlight w:val="white"/>
+        </w:rPr>
+      </w:pPr>
+      <w:r>
+        <w:rPr>
+          <w:rFonts w:ascii="Calibri" w:hAnsi="Calibri" w:cs="Calibri"/>
+          <w:highlight w:val="white"/>
+        </w:rPr>
+        <w:t xml:space="preserve">• </w:t>
+      </w:r>
+      <w:r>
+        <w:rPr>
+          <w:rFonts w:ascii="Calibri" w:hAnsi="Calibri" w:cs="Calibri"/>
+          <w:b/>
+          <w:highlight w:val="white"/>
+        </w:rPr>
+        <w:t>Personalizzazione</w:t>
+      </w:r>
+      <w:r>
+        <w:rPr>
+          <w:rFonts w:ascii="Calibri" w:hAnsi="Calibri" w:cs="Calibri"/>
+          <w:highlight w:val="white"/>
+        </w:rPr>
+        <w:t>: rappresentano le proprietà di alcuni elementi di gioco sotto il diretto controllo del giocatore (dadi e pedina del giocatore) modificabili e piacimento</w:t>
+      </w:r>
+      <w:r>
+        <w:rPr>
+          <w:rFonts w:ascii="Calibri" w:hAnsi="Calibri" w:cs="Calibri"/>
+          <w:highlight w:val="white"/>
+        </w:rPr>
+        <w:t xml:space="preserve">. La tipologia della personalizzazione viene definita da </w:t>
+      </w:r>
+      <w:proofErr w:type="spellStart"/>
+      <w:r>
+        <w:rPr>
+          <w:rFonts w:ascii="Calibri" w:hAnsi="Calibri" w:cs="Calibri"/>
+          <w:b/>
+          <w:bCs/>
+          <w:highlight w:val="white"/>
+        </w:rPr>
+        <w:t>TipologiaPersonalizzazione</w:t>
+      </w:r>
+      <w:proofErr w:type="spellEnd"/>
+      <w:r>
+        <w:rPr>
+          <w:rFonts w:ascii="Calibri" w:hAnsi="Calibri" w:cs="Calibri"/>
+          <w:highlight w:val="white"/>
+        </w:rPr>
+        <w:t>;</w:t>
+      </w:r>
+    </w:p>
+    <w:p>
+      <w:pPr>
+        <w:pStyle w:val="Paragrafoelenco"/>
+        <w:numPr>
+          <w:ilvl w:val="0"/>
+          <w:numId w:val="27"/>
+        </w:numPr>
+        <w:rPr>
+          <w:rFonts w:ascii="Calibri" w:hAnsi="Calibri" w:cs="Calibri"/>
+          <w:b/>
+          <w:bCs/>
+          <w:highlight w:val="white"/>
+        </w:rPr>
+      </w:pPr>
+      <w:r>
+        <w:rPr>
+          <w:rFonts w:ascii="Calibri" w:hAnsi="Calibri" w:cs="Calibri"/>
+          <w:b/>
+          <w:bCs/>
+          <w:highlight w:val="white"/>
+        </w:rPr>
+        <w:t>Tabellone</w:t>
+      </w:r>
+      <w:r>
+        <w:rPr>
+          <w:rFonts w:ascii="Calibri" w:hAnsi="Calibri" w:cs="Calibri"/>
+          <w:b/>
+          <w:bCs/>
+          <w:highlight w:val="white"/>
+        </w:rPr>
+        <w:t xml:space="preserve">: </w:t>
+      </w:r>
+      <w:r>
+        <w:rPr>
+          <w:rFonts w:ascii="Calibri" w:hAnsi="Calibri" w:cs="Calibri"/>
+          <w:highlight w:val="white"/>
+        </w:rPr>
+        <w:t xml:space="preserve">si tratta del campo di gioco messo a disposizione dal controller </w:t>
+      </w:r>
+      <w:proofErr w:type="spellStart"/>
+      <w:r>
+        <w:rPr>
+          <w:rFonts w:ascii="Calibri" w:hAnsi="Calibri" w:cs="Calibri"/>
+          <w:highlight w:val="white"/>
+        </w:rPr>
+        <w:t>GiocoDellOca</w:t>
+      </w:r>
+      <w:proofErr w:type="spellEnd"/>
+      <w:r>
+        <w:rPr>
+          <w:rFonts w:ascii="Calibri" w:hAnsi="Calibri" w:cs="Calibri"/>
+          <w:highlight w:val="white"/>
+        </w:rPr>
+        <w:t xml:space="preserve"> tramite Partita. L’interazione con l’oggetto Tabellone non è diretta, ma passa attraverso le Caselle che lo costituiscono.</w:t>
+      </w:r>
+    </w:p>
+    <w:p>
+      <w:pPr>
+        <w:pStyle w:val="Paragrafoelenco"/>
+        <w:numPr>
+          <w:ilvl w:val="0"/>
+          <w:numId w:val="27"/>
+        </w:numPr>
+        <w:rPr>
+          <w:rFonts w:ascii="Calibri" w:hAnsi="Calibri" w:cs="Calibri"/>
+          <w:b/>
+          <w:bCs/>
+          <w:highlight w:val="white"/>
+        </w:rPr>
+      </w:pPr>
+      <w:r>
+        <w:rPr>
+          <w:rFonts w:ascii="Calibri" w:hAnsi="Calibri" w:cs="Calibri"/>
+          <w:b/>
+          <w:bCs/>
+          <w:highlight w:val="white"/>
+        </w:rPr>
+        <w:t>Casell</w:t>
+      </w:r>
+      <w:r>
+        <w:rPr>
+          <w:rFonts w:ascii="Calibri" w:hAnsi="Calibri" w:cs="Calibri"/>
+          <w:b/>
+          <w:bCs/>
+          <w:highlight w:val="white"/>
+        </w:rPr>
+        <w:t xml:space="preserve">a: </w:t>
+      </w:r>
+      <w:r>
+        <w:rPr>
+          <w:rFonts w:ascii="Calibri" w:hAnsi="Calibri" w:cs="Calibri"/>
+          <w:highlight w:val="white"/>
+        </w:rPr>
+        <w:t xml:space="preserve">rappresentano le varie posizioni che il Giocatore tramite la Pedina può assumere. La Casella può essere di tre tipi: </w:t>
+      </w:r>
+      <w:proofErr w:type="spellStart"/>
+      <w:r>
+        <w:rPr>
+          <w:rFonts w:ascii="Calibri" w:hAnsi="Calibri" w:cs="Calibri"/>
+          <w:highlight w:val="white"/>
+        </w:rPr>
+        <w:t>CasellaNormale</w:t>
+      </w:r>
+      <w:proofErr w:type="spellEnd"/>
+      <w:r>
+        <w:rPr>
+          <w:rFonts w:ascii="Calibri" w:hAnsi="Calibri" w:cs="Calibri"/>
+          <w:highlight w:val="white"/>
+        </w:rPr>
+        <w:t xml:space="preserve">, </w:t>
+      </w:r>
+      <w:proofErr w:type="spellStart"/>
+      <w:r>
+        <w:rPr>
+          <w:rFonts w:ascii="Calibri" w:hAnsi="Calibri" w:cs="Calibri"/>
+          <w:highlight w:val="white"/>
+        </w:rPr>
+        <w:t>CasellaSpeciale</w:t>
+      </w:r>
+      <w:proofErr w:type="spellEnd"/>
+      <w:r>
+        <w:rPr>
+          <w:rFonts w:ascii="Calibri" w:hAnsi="Calibri" w:cs="Calibri"/>
+          <w:highlight w:val="white"/>
+        </w:rPr>
+        <w:t xml:space="preserve">, </w:t>
+      </w:r>
+      <w:proofErr w:type="spellStart"/>
+      <w:r>
+        <w:rPr>
+          <w:rFonts w:ascii="Calibri" w:hAnsi="Calibri" w:cs="Calibri"/>
+          <w:highlight w:val="white"/>
+        </w:rPr>
+        <w:t>CasellaFine</w:t>
+      </w:r>
+      <w:proofErr w:type="spellEnd"/>
+      <w:r>
+        <w:rPr>
+          <w:rFonts w:ascii="Calibri" w:hAnsi="Calibri" w:cs="Calibri"/>
+          <w:highlight w:val="white"/>
+        </w:rPr>
+        <w:t xml:space="preserve">. Se il Giocatore </w:t>
+      </w:r>
+      <w:r>
+        <w:rPr>
+          <w:rFonts w:ascii="Calibri" w:hAnsi="Calibri" w:cs="Calibri"/>
+          <w:highlight w:val="white"/>
+        </w:rPr>
+        <w:t xml:space="preserve">capita su una </w:t>
+      </w:r>
+      <w:proofErr w:type="spellStart"/>
+      <w:proofErr w:type="gramStart"/>
+      <w:r>
+        <w:rPr>
+          <w:rFonts w:ascii="Calibri" w:hAnsi="Calibri" w:cs="Calibri"/>
+          <w:highlight w:val="white"/>
+        </w:rPr>
+        <w:t>CasellaSpeciale</w:t>
+      </w:r>
+      <w:proofErr w:type="spellEnd"/>
+      <w:proofErr w:type="gramEnd"/>
+      <w:r>
+        <w:rPr>
+          <w:rFonts w:ascii="Calibri" w:hAnsi="Calibri" w:cs="Calibri"/>
+          <w:highlight w:val="white"/>
+        </w:rPr>
+        <w:t xml:space="preserve"> viene attivato un modificatore che provoca sulla Pedina un avanzamento o un indietreggiamento o un blocco (intervento sullo stato).</w:t>
+      </w:r>
+    </w:p>
+    <w:p>
+      <w:pPr>
+        <w:pStyle w:val="Paragrafoelenco"/>
+        <w:numPr>
+          <w:ilvl w:val="0"/>
+          <w:numId w:val="27"/>
+        </w:numPr>
+        <w:rPr>
+          <w:rFonts w:ascii="Calibri" w:hAnsi="Calibri" w:cs="Calibri"/>
+          <w:b/>
+          <w:bCs/>
+          <w:highlight w:val="white"/>
+        </w:rPr>
+      </w:pPr>
+      <w:proofErr w:type="gramStart"/>
+      <w:r>
+        <w:rPr>
+          <w:rFonts w:ascii="Calibri" w:hAnsi="Calibri" w:cs="Calibri"/>
+          <w:b/>
+          <w:bCs/>
+          <w:highlight w:val="white"/>
+        </w:rPr>
+        <w:t>Pedina</w:t>
+      </w:r>
+      <w:r>
+        <w:rPr>
+          <w:rFonts w:ascii="Calibri" w:hAnsi="Calibri" w:cs="Calibri"/>
+          <w:b/>
+          <w:bCs/>
+          <w:highlight w:val="white"/>
+        </w:rPr>
+        <w:t xml:space="preserve"> :</w:t>
+      </w:r>
+      <w:proofErr w:type="gramEnd"/>
+      <w:r>
+        <w:rPr>
+          <w:rFonts w:ascii="Calibri" w:hAnsi="Calibri" w:cs="Calibri"/>
+          <w:b/>
+          <w:bCs/>
+          <w:highlight w:val="white"/>
+        </w:rPr>
+        <w:t xml:space="preserve"> </w:t>
+      </w:r>
+      <w:r>
+        <w:rPr>
+          <w:rFonts w:ascii="Calibri" w:hAnsi="Calibri" w:cs="Calibri"/>
+          <w:highlight w:val="white"/>
+        </w:rPr>
+        <w:t>rappresenta il Giocatore sulle Caselle del Tabellone. Viene impostato dal Giocatore tramite Impostazioni all’inizio della Partita secondo quanto definito nella Iterazione 1.</w:t>
+      </w:r>
+    </w:p>
+    <w:p>
+      <w:pPr>
+        <w:pStyle w:val="Paragrafoelenco"/>
+        <w:numPr>
+          <w:ilvl w:val="0"/>
+          <w:numId w:val="27"/>
+        </w:numPr>
+        <w:rPr>
+          <w:rFonts w:ascii="Calibri" w:hAnsi="Calibri" w:cs="Calibri"/>
+          <w:b/>
+          <w:bCs/>
+          <w:highlight w:val="white"/>
+        </w:rPr>
+      </w:pPr>
+      <w:proofErr w:type="gramStart"/>
+      <w:r>
+        <w:rPr>
+          <w:rFonts w:ascii="Calibri" w:hAnsi="Calibri" w:cs="Calibri"/>
+          <w:b/>
+          <w:bCs/>
+          <w:highlight w:val="white"/>
+        </w:rPr>
+        <w:t>Dado</w:t>
+      </w:r>
+      <w:r>
+        <w:rPr>
+          <w:rFonts w:ascii="Calibri" w:hAnsi="Calibri" w:cs="Calibri"/>
+          <w:b/>
+          <w:bCs/>
+          <w:highlight w:val="white"/>
+        </w:rPr>
+        <w:t xml:space="preserve"> :</w:t>
+      </w:r>
+      <w:proofErr w:type="gramEnd"/>
+      <w:r>
+        <w:rPr>
+          <w:rFonts w:ascii="Calibri" w:hAnsi="Calibri" w:cs="Calibri"/>
+          <w:b/>
+          <w:bCs/>
+          <w:highlight w:val="white"/>
+        </w:rPr>
+        <w:t xml:space="preserve"> </w:t>
+      </w:r>
+      <w:r>
+        <w:rPr>
+          <w:rFonts w:ascii="Calibri" w:hAnsi="Calibri" w:cs="Calibri"/>
+          <w:highlight w:val="white"/>
+        </w:rPr>
+        <w:t xml:space="preserve">oggetto che serve per il movimento della Pedina lungo il Tabellone. </w:t>
+      </w:r>
+      <w:r>
+        <w:rPr>
+          <w:rFonts w:ascii="Calibri" w:hAnsi="Calibri" w:cs="Calibri"/>
+          <w:highlight w:val="white"/>
+        </w:rPr>
+        <w:t>Viene impostato dal Giocatore tramite Impostazioni all’inizio della Partita secondo quanto definito nella Iterazione 1.</w:t>
+      </w:r>
+    </w:p>
+    <w:p>
+      <w:pPr>
         <w:rPr>
           <w:rFonts w:ascii="Calibri" w:eastAsia="Calibri" w:hAnsi="Calibri" w:cs="Calibri"/>
           <w:color w:val="0D0D0D"/>
@@ -6500,6 +7255,20 @@
           <w:highlight w:val="white"/>
         </w:rPr>
       </w:pPr>
+      <w:r>
+        <w:rPr>
+          <w:rFonts w:ascii="Calibri" w:hAnsi="Calibri" w:cs="Calibri"/>
+          <w:highlight w:val="white"/>
+        </w:rPr>
+        <w:t>Tenendo conto di associazione e attributi, si costruisce il seguente Modello di Dominio:</w:t>
+      </w:r>
+      <w:r>
+        <w:rPr>
+          <w:rFonts w:ascii="Calibri" w:hAnsi="Calibri" w:cs="Calibri"/>
+          <w:highlight w:val="white"/>
+        </w:rPr>
+        <w:br/>
+      </w:r>
     </w:p>
     <w:sectPr>
       <w:headerReference w:type="default" r:id="rId10"/>
@@ -8140,6 +8909,119 @@
     </w:lvl>
   </w:abstractNum>
   <w:abstractNum w:abstractNumId="15" w15:restartNumberingAfterBreak="0">
+    <w:nsid w:val="404421C5"/>
+    <w:multiLevelType w:val="hybridMultilevel"/>
+    <w:tmpl w:val="7FA8C86A"/>
+    <w:lvl w:ilvl="0" w:tplc="04100001">
+      <w:start w:val="1"/>
+      <w:numFmt w:val="bullet"/>
+      <w:lvlText w:val=""/>
+      <w:lvlJc w:val="left"/>
+      <w:pPr>
+        <w:ind w:left="720" w:hanging="360"/>
+      </w:pPr>
+      <w:rPr>
+        <w:rFonts w:ascii="Symbol" w:hAnsi="Symbol" w:hint="default"/>
+      </w:rPr>
+    </w:lvl>
+    <w:lvl w:ilvl="1" w:tplc="04100003" w:tentative="1">
+      <w:start w:val="1"/>
+      <w:numFmt w:val="bullet"/>
+      <w:lvlText w:val="o"/>
+      <w:lvlJc w:val="left"/>
+      <w:pPr>
+        <w:ind w:left="1440" w:hanging="360"/>
+      </w:pPr>
+      <w:rPr>
+        <w:rFonts w:ascii="Courier New" w:hAnsi="Courier New" w:cs="Courier New" w:hint="default"/>
+      </w:rPr>
+    </w:lvl>
+    <w:lvl w:ilvl="2" w:tplc="04100005" w:tentative="1">
+      <w:start w:val="1"/>
+      <w:numFmt w:val="bullet"/>
+      <w:lvlText w:val=""/>
+      <w:lvlJc w:val="left"/>
+      <w:pPr>
+        <w:ind w:left="2160" w:hanging="360"/>
+      </w:pPr>
+      <w:rPr>
+        <w:rFonts w:ascii="Wingdings" w:hAnsi="Wingdings" w:hint="default"/>
+      </w:rPr>
+    </w:lvl>
+    <w:lvl w:ilvl="3" w:tplc="04100001" w:tentative="1">
+      <w:start w:val="1"/>
+      <w:numFmt w:val="bullet"/>
+      <w:lvlText w:val=""/>
+      <w:lvlJc w:val="left"/>
+      <w:pPr>
+        <w:ind w:left="2880" w:hanging="360"/>
+      </w:pPr>
+      <w:rPr>
+        <w:rFonts w:ascii="Symbol" w:hAnsi="Symbol" w:hint="default"/>
+      </w:rPr>
+    </w:lvl>
+    <w:lvl w:ilvl="4" w:tplc="04100003" w:tentative="1">
+      <w:start w:val="1"/>
+      <w:numFmt w:val="bullet"/>
+      <w:lvlText w:val="o"/>
+      <w:lvlJc w:val="left"/>
+      <w:pPr>
+        <w:ind w:left="3600" w:hanging="360"/>
+      </w:pPr>
+      <w:rPr>
+        <w:rFonts w:ascii="Courier New" w:hAnsi="Courier New" w:cs="Courier New" w:hint="default"/>
+      </w:rPr>
+    </w:lvl>
+    <w:lvl w:ilvl="5" w:tplc="04100005" w:tentative="1">
+      <w:start w:val="1"/>
+      <w:numFmt w:val="bullet"/>
+      <w:lvlText w:val=""/>
+      <w:lvlJc w:val="left"/>
+      <w:pPr>
+        <w:ind w:left="4320" w:hanging="360"/>
+      </w:pPr>
+      <w:rPr>
+        <w:rFonts w:ascii="Wingdings" w:hAnsi="Wingdings" w:hint="default"/>
+      </w:rPr>
+    </w:lvl>
+    <w:lvl w:ilvl="6" w:tplc="04100001" w:tentative="1">
+      <w:start w:val="1"/>
+      <w:numFmt w:val="bullet"/>
+      <w:lvlText w:val=""/>
+      <w:lvlJc w:val="left"/>
+      <w:pPr>
+        <w:ind w:left="5040" w:hanging="360"/>
+      </w:pPr>
+      <w:rPr>
+        <w:rFonts w:ascii="Symbol" w:hAnsi="Symbol" w:hint="default"/>
+      </w:rPr>
+    </w:lvl>
+    <w:lvl w:ilvl="7" w:tplc="04100003" w:tentative="1">
+      <w:start w:val="1"/>
+      <w:numFmt w:val="bullet"/>
+      <w:lvlText w:val="o"/>
+      <w:lvlJc w:val="left"/>
+      <w:pPr>
+        <w:ind w:left="5760" w:hanging="360"/>
+      </w:pPr>
+      <w:rPr>
+        <w:rFonts w:ascii="Courier New" w:hAnsi="Courier New" w:cs="Courier New" w:hint="default"/>
+      </w:rPr>
+    </w:lvl>
+    <w:lvl w:ilvl="8" w:tplc="04100005" w:tentative="1">
+      <w:start w:val="1"/>
+      <w:numFmt w:val="bullet"/>
+      <w:lvlText w:val=""/>
+      <w:lvlJc w:val="left"/>
+      <w:pPr>
+        <w:ind w:left="6480" w:hanging="360"/>
+      </w:pPr>
+      <w:rPr>
+        <w:rFonts w:ascii="Wingdings" w:hAnsi="Wingdings" w:hint="default"/>
+      </w:rPr>
+    </w:lvl>
+  </w:abstractNum>
+  <w:abstractNum w:abstractNumId="16" w15:restartNumberingAfterBreak="0">
     <w:nsid w:val="40594783"/>
     <w:multiLevelType w:val="hybridMultilevel"/>
     <w:tmpl w:val="BCBADA0C"/>
@@ -8228,7 +9110,7 @@
       </w:pPr>
     </w:lvl>
   </w:abstractNum>
-  <w:abstractNum w:abstractNumId="16" w15:restartNumberingAfterBreak="0">
+  <w:abstractNum w:abstractNumId="17" w15:restartNumberingAfterBreak="0">
     <w:nsid w:val="44A81745"/>
     <w:multiLevelType w:val="hybridMultilevel"/>
     <w:tmpl w:val="A42E0850"/>
@@ -8317,7 +9199,7 @@
       </w:pPr>
     </w:lvl>
   </w:abstractNum>
-  <w:abstractNum w:abstractNumId="17" w15:restartNumberingAfterBreak="0">
+  <w:abstractNum w:abstractNumId="18" w15:restartNumberingAfterBreak="0">
     <w:nsid w:val="457B3D18"/>
     <w:multiLevelType w:val="hybridMultilevel"/>
     <w:tmpl w:val="3C946BCC"/>
@@ -8406,7 +9288,7 @@
       </w:pPr>
     </w:lvl>
   </w:abstractNum>
-  <w:abstractNum w:abstractNumId="18" w15:restartNumberingAfterBreak="0">
+  <w:abstractNum w:abstractNumId="19" w15:restartNumberingAfterBreak="0">
     <w:nsid w:val="4CEF34C5"/>
     <w:multiLevelType w:val="hybridMultilevel"/>
     <w:tmpl w:val="FDAAF590"/>
@@ -8495,7 +9377,7 @@
       </w:pPr>
     </w:lvl>
   </w:abstractNum>
-  <w:abstractNum w:abstractNumId="19" w15:restartNumberingAfterBreak="0">
+  <w:abstractNum w:abstractNumId="20" w15:restartNumberingAfterBreak="0">
     <w:nsid w:val="4F250AD6"/>
     <w:multiLevelType w:val="hybridMultilevel"/>
     <w:tmpl w:val="BCBADA0C"/>
@@ -8584,7 +9466,7 @@
       </w:pPr>
     </w:lvl>
   </w:abstractNum>
-  <w:abstractNum w:abstractNumId="20" w15:restartNumberingAfterBreak="0">
+  <w:abstractNum w:abstractNumId="21" w15:restartNumberingAfterBreak="0">
     <w:nsid w:val="4FCD378C"/>
     <w:multiLevelType w:val="hybridMultilevel"/>
     <w:tmpl w:val="BCBADA0C"/>
@@ -8673,7 +9555,7 @@
       </w:pPr>
     </w:lvl>
   </w:abstractNum>
-  <w:abstractNum w:abstractNumId="21" w15:restartNumberingAfterBreak="0">
+  <w:abstractNum w:abstractNumId="22" w15:restartNumberingAfterBreak="0">
     <w:nsid w:val="4FE65F5A"/>
     <w:multiLevelType w:val="hybridMultilevel"/>
     <w:tmpl w:val="BCBADA0C"/>
@@ -8762,7 +9644,7 @@
       </w:pPr>
     </w:lvl>
   </w:abstractNum>
-  <w:abstractNum w:abstractNumId="22" w15:restartNumberingAfterBreak="0">
+  <w:abstractNum w:abstractNumId="23" w15:restartNumberingAfterBreak="0">
     <w:nsid w:val="55B5533E"/>
     <w:multiLevelType w:val="hybridMultilevel"/>
     <w:tmpl w:val="7E5E64B6"/>
@@ -8851,7 +9733,7 @@
       </w:pPr>
     </w:lvl>
   </w:abstractNum>
-  <w:abstractNum w:abstractNumId="23" w15:restartNumberingAfterBreak="0">
+  <w:abstractNum w:abstractNumId="24" w15:restartNumberingAfterBreak="0">
     <w:nsid w:val="6FFE368C"/>
     <w:multiLevelType w:val="hybridMultilevel"/>
     <w:tmpl w:val="3C946BCC"/>
@@ -8940,7 +9822,7 @@
       </w:pPr>
     </w:lvl>
   </w:abstractNum>
-  <w:abstractNum w:abstractNumId="24" w15:restartNumberingAfterBreak="0">
+  <w:abstractNum w:abstractNumId="25" w15:restartNumberingAfterBreak="0">
     <w:nsid w:val="70746A20"/>
     <w:multiLevelType w:val="multilevel"/>
     <w:tmpl w:val="28CA4454"/>
@@ -9089,7 +9971,7 @@
       </w:rPr>
     </w:lvl>
   </w:abstractNum>
-  <w:abstractNum w:abstractNumId="25" w15:restartNumberingAfterBreak="0">
+  <w:abstractNum w:abstractNumId="26" w15:restartNumberingAfterBreak="0">
     <w:nsid w:val="7DD822C3"/>
     <w:multiLevelType w:val="hybridMultilevel"/>
     <w:tmpl w:val="3C946BCC"/>
@@ -9188,34 +10070,34 @@
     <w:abstractNumId w:val="4"/>
   </w:num>
   <w:num w:numId="4" w16cid:durableId="1281305233">
-    <w:abstractNumId w:val="24"/>
+    <w:abstractNumId w:val="25"/>
   </w:num>
   <w:num w:numId="5" w16cid:durableId="478426275">
-    <w:abstractNumId w:val="18"/>
+    <w:abstractNumId w:val="19"/>
   </w:num>
   <w:num w:numId="6" w16cid:durableId="1576551924">
-    <w:abstractNumId w:val="25"/>
+    <w:abstractNumId w:val="26"/>
   </w:num>
   <w:num w:numId="7" w16cid:durableId="567691393">
-    <w:abstractNumId w:val="21"/>
+    <w:abstractNumId w:val="22"/>
   </w:num>
   <w:num w:numId="8" w16cid:durableId="594900704">
-    <w:abstractNumId w:val="15"/>
+    <w:abstractNumId w:val="16"/>
   </w:num>
   <w:num w:numId="9" w16cid:durableId="560599277">
     <w:abstractNumId w:val="6"/>
   </w:num>
   <w:num w:numId="10" w16cid:durableId="412166526">
-    <w:abstractNumId w:val="16"/>
+    <w:abstractNumId w:val="17"/>
   </w:num>
   <w:num w:numId="11" w16cid:durableId="764110979">
+    <w:abstractNumId w:val="21"/>
+  </w:num>
+  <w:num w:numId="12" w16cid:durableId="1540972270">
     <w:abstractNumId w:val="20"/>
   </w:num>
-  <w:num w:numId="12" w16cid:durableId="1540972270">
-    <w:abstractNumId w:val="19"/>
-  </w:num>
   <w:num w:numId="13" w16cid:durableId="14770558">
-    <w:abstractNumId w:val="17"/>
+    <w:abstractNumId w:val="18"/>
   </w:num>
   <w:num w:numId="14" w16cid:durableId="1430079531">
     <w:abstractNumId w:val="3"/>
@@ -9224,7 +10106,7 @@
     <w:abstractNumId w:val="9"/>
   </w:num>
   <w:num w:numId="16" w16cid:durableId="697782312">
-    <w:abstractNumId w:val="22"/>
+    <w:abstractNumId w:val="23"/>
   </w:num>
   <w:num w:numId="17" w16cid:durableId="2127001533">
     <w:abstractNumId w:val="10"/>
@@ -9242,7 +10124,7 @@
     <w:abstractNumId w:val="7"/>
   </w:num>
   <w:num w:numId="22" w16cid:durableId="1671253131">
-    <w:abstractNumId w:val="23"/>
+    <w:abstractNumId w:val="24"/>
   </w:num>
   <w:num w:numId="23" w16cid:durableId="769471647">
     <w:abstractNumId w:val="2"/>
@@ -9255,6 +10137,9 @@
   </w:num>
   <w:num w:numId="26" w16cid:durableId="1885286888">
     <w:abstractNumId w:val="14"/>
+  </w:num>
+  <w:num w:numId="27" w16cid:durableId="916980803">
+    <w:abstractNumId w:val="15"/>
   </w:num>
 </w:numbering>
 </file>
@@ -11404,6 +12289,7 @@
     <w:rsidRoot w:val="00696856"/>
     <w:rsid w:val="00046BD2"/>
     <w:rsid w:val="001B447E"/>
+    <w:rsid w:val="002837F0"/>
     <w:rsid w:val="003433F2"/>
     <w:rsid w:val="00355375"/>
     <w:rsid w:val="0044136E"/>
@@ -11422,6 +12308,7 @@
     <w:rsid w:val="00BE08AA"/>
     <w:rsid w:val="00CA6967"/>
     <w:rsid w:val="00F263EA"/>
+    <w:rsid w:val="00F301D3"/>
     <w:rsid w:val="00F435A7"/>
     <w:rsid w:val="00FB724A"/>
   </w:rsids>
@@ -12206,28 +13093,28 @@
 </file>
 
 <file path=customXml/item1.xml><?xml version="1.0" encoding="utf-8"?>
+<b:Sources xmlns:b="http://schemas.openxmlformats.org/officeDocument/2006/bibliography" xmlns="http://schemas.openxmlformats.org/officeDocument/2006/bibliography" SelectedStyle="\APASixthEditionOfficeOnline.xsl" StyleName="APA" Version="6"/>
+</file>
+
+<file path=customXml/item2.xml><?xml version="1.0" encoding="utf-8"?>
 <go:gDocsCustomXmlDataStorage xmlns:go="http://customooxmlschemas.google.com/" xmlns:r="http://schemas.openxmlformats.org/officeDocument/2006/relationships" uri="GoogleDocsCustomDataVersion2">
   <go:docsCustomData xmlns:go="http://customooxmlschemas.google.com/" roundtripDataSignature="AMtx7mg1mGL6qORe6yYgtaAnOyb4Kh8WtQ==">CgMxLjAyCGguZ2pkZ3hzOAByITE0M0V0amI5QkxqZWpESnVvRjlQQmhGMzFZMFlUX3kxOQ==</go:docsCustomData>
 </go:gDocsCustomXmlDataStorage>
 </file>
 
-<file path=customXml/item2.xml><?xml version="1.0" encoding="utf-8"?>
-<b:Sources xmlns:b="http://schemas.openxmlformats.org/officeDocument/2006/bibliography" xmlns="http://schemas.openxmlformats.org/officeDocument/2006/bibliography" SelectedStyle="\APASixthEditionOfficeOnline.xsl" StyleName="APA" Version="6"/>
+<file path=customXml/itemProps1.xml><?xml version="1.0" encoding="utf-8"?>
+<ds:datastoreItem xmlns:ds="http://schemas.openxmlformats.org/officeDocument/2006/customXml" ds:itemID="{37B528A4-5A93-4436-BAB4-9956BF7FC17A}">
+  <ds:schemaRefs>
+    <ds:schemaRef ds:uri="http://schemas.openxmlformats.org/officeDocument/2006/bibliography"/>
+  </ds:schemaRefs>
+</ds:datastoreItem>
 </file>
 
-<file path=customXml/itemProps1.xml><?xml version="1.0" encoding="utf-8"?>
+<file path=customXml/itemProps2.xml><?xml version="1.0" encoding="utf-8"?>
 <ds:datastoreItem xmlns:ds="http://schemas.openxmlformats.org/officeDocument/2006/customXml" ds:itemID="{11111111-1234-1234-1234-123412341234}">
   <ds:schemaRefs>
     <ds:schemaRef ds:uri="http://customooxmlschemas.google.com/"/>
     <ds:schemaRef ds:uri="http://schemas.openxmlformats.org/officeDocument/2006/relationships"/>
   </ds:schemaRefs>
 </ds:datastoreItem>
-</file>
-
-<file path=customXml/itemProps2.xml><?xml version="1.0" encoding="utf-8"?>
-<ds:datastoreItem xmlns:ds="http://schemas.openxmlformats.org/officeDocument/2006/customXml" ds:itemID="{37B528A4-5A93-4436-BAB4-9956BF7FC17A}">
-  <ds:schemaRefs>
-    <ds:schemaRef ds:uri="http://schemas.openxmlformats.org/officeDocument/2006/bibliography"/>
-  </ds:schemaRefs>
-</ds:datastoreItem>
 </file>
</xml_diff>

<commit_message>
Prima versione contratti operazioni, astah + word modificati
</commit_message>
<xml_diff>
--- a/Documentazione/Elaborazione/Iterazione 2/Iterazione 2.docx
+++ b/Documentazione/Elaborazione/Iterazione 2/Iterazione 2.docx
@@ -4647,7 +4647,7 @@
           <w:noProof/>
         </w:rPr>
         <w:drawing>
-          <wp:inline distT="0" distB="0" distL="0" distR="0" wp14:anchorId="1D6DDD24" wp14:editId="00554D3C">
+          <wp:inline distT="0" distB="0" distL="0" distR="0" wp14:anchorId="1D6DDD24" wp14:editId="6CBCD426">
             <wp:extent cx="6120130" cy="4519930"/>
             <wp:effectExtent l="0" t="0" r="0" b="0"/>
             <wp:docPr id="121653102" name="Immagine 10" descr="Immagine che contiene testo, diagramma, linea, Piano&#10;&#10;Descrizione generata automaticamente"/>
@@ -4956,6 +4956,1701 @@
           </wp:inline>
         </w:drawing>
       </w:r>
+    </w:p>
+    <w:p>
+      <w:pPr>
+        <w:rPr>
+          <w:rFonts w:ascii="Calibri" w:hAnsi="Calibri" w:cs="Calibri"/>
+          <w:highlight w:val="white"/>
+        </w:rPr>
+      </w:pPr>
+    </w:p>
+    <w:p>
+      <w:pPr>
+        <w:pStyle w:val="Titolo2"/>
+        <w:rPr>
+          <w:rFonts w:ascii="Calibri" w:hAnsi="Calibri" w:cs="Calibri"/>
+        </w:rPr>
+      </w:pPr>
+      <w:bookmarkStart w:id="7" w:name="_Toc171097035"/>
+      <w:r>
+        <w:rPr>
+          <w:rFonts w:ascii="Calibri" w:hAnsi="Calibri" w:cs="Calibri"/>
+        </w:rPr>
+        <w:t>3.3</w:t>
+      </w:r>
+      <w:r>
+        <w:rPr>
+          <w:rFonts w:ascii="Calibri" w:hAnsi="Calibri" w:cs="Calibri"/>
+          <w:sz w:val="40"/>
+          <w:szCs w:val="40"/>
+        </w:rPr>
+        <w:t xml:space="preserve"> </w:t>
+      </w:r>
+      <w:r>
+        <w:rPr>
+          <w:rFonts w:ascii="Calibri" w:hAnsi="Calibri" w:cs="Calibri"/>
+        </w:rPr>
+        <w:t>Contratti delle operazioni</w:t>
+      </w:r>
+      <w:bookmarkEnd w:id="7"/>
+    </w:p>
+    <w:p>
+      <w:pPr>
+        <w:rPr>
+          <w:rFonts w:ascii="Calibri" w:hAnsi="Calibri" w:cs="Calibri"/>
+        </w:rPr>
+      </w:pPr>
+      <w:r>
+        <w:rPr>
+          <w:rFonts w:ascii="Calibri" w:hAnsi="Calibri" w:cs="Calibri"/>
+        </w:rPr>
+        <w:t>Utilizzando i Contratti delle operazioni, verrà fatta una descrizione delle principali operazioni di sistema che si occupano della gestione degli eventi di sistema trovati e analizzati.</w:t>
+      </w:r>
+    </w:p>
+    <w:p>
+      <w:pPr>
+        <w:rPr>
+          <w:rFonts w:ascii="Calibri" w:hAnsi="Calibri" w:cs="Calibri"/>
+        </w:rPr>
+      </w:pPr>
+    </w:p>
+    <w:p>
+      <w:pPr>
+        <w:rPr>
+          <w:rFonts w:ascii="Calibri" w:hAnsi="Calibri" w:cs="Calibri"/>
+        </w:rPr>
+      </w:pPr>
+      <w:proofErr w:type="gramStart"/>
+      <w:r>
+        <w:rPr>
+          <w:rFonts w:ascii="Calibri" w:hAnsi="Calibri" w:cs="Calibri"/>
+          <w:highlight w:val="yellow"/>
+        </w:rPr>
+        <w:t>NOTA :</w:t>
+      </w:r>
+      <w:proofErr w:type="gramEnd"/>
+      <w:r>
+        <w:rPr>
+          <w:rFonts w:ascii="Calibri" w:hAnsi="Calibri" w:cs="Calibri"/>
+          <w:highlight w:val="yellow"/>
+        </w:rPr>
+        <w:t xml:space="preserve"> CI SIAMO SCORDATI DI METTERE UN CASO</w:t>
+      </w:r>
+      <w:r>
+        <w:rPr>
+          <w:rFonts w:ascii="Calibri" w:hAnsi="Calibri" w:cs="Calibri"/>
+          <w:highlight w:val="yellow"/>
+        </w:rPr>
+        <w:t xml:space="preserve"> PRIMA DEL LOOP</w:t>
+      </w:r>
+      <w:r>
+        <w:rPr>
+          <w:rFonts w:ascii="Calibri" w:hAnsi="Calibri" w:cs="Calibri"/>
+          <w:highlight w:val="yellow"/>
+        </w:rPr>
+        <w:t xml:space="preserve"> DI CREAZIONE TABELLONE E CREAZIONE PEDINE ASSOCIATE A GIOCATORE E BOT</w:t>
+      </w:r>
+    </w:p>
+    <w:p>
+      <w:pPr>
+        <w:rPr>
+          <w:rFonts w:ascii="Calibri" w:hAnsi="Calibri" w:cs="Calibri"/>
+        </w:rPr>
+      </w:pPr>
+    </w:p>
+    <w:tbl>
+      <w:tblPr>
+        <w:tblStyle w:val="a1"/>
+        <w:tblW w:w="9638" w:type="dxa"/>
+        <w:jc w:val="center"/>
+        <w:tblInd w:w="0" w:type="dxa"/>
+        <w:tblBorders>
+          <w:top w:val="single" w:sz="8" w:space="0" w:color="156082"/>
+          <w:left w:val="single" w:sz="8" w:space="0" w:color="156082"/>
+          <w:bottom w:val="single" w:sz="8" w:space="0" w:color="156082"/>
+          <w:right w:val="single" w:sz="8" w:space="0" w:color="156082"/>
+          <w:insideH w:val="single" w:sz="4" w:space="0" w:color="000000"/>
+          <w:insideV w:val="single" w:sz="4" w:space="0" w:color="000000"/>
+        </w:tblBorders>
+        <w:tblLayout w:type="fixed"/>
+        <w:tblLook w:val="04A0" w:firstRow="1" w:lastRow="0" w:firstColumn="1" w:lastColumn="0" w:noHBand="0" w:noVBand="1"/>
+      </w:tblPr>
+      <w:tblGrid>
+        <w:gridCol w:w="1696"/>
+        <w:gridCol w:w="7942"/>
+      </w:tblGrid>
+      <w:tr>
+        <w:trPr>
+          <w:cnfStyle w:val="100000000000" w:firstRow="1" w:lastRow="0" w:firstColumn="0" w:lastColumn="0" w:oddVBand="0" w:evenVBand="0" w:oddHBand="0" w:evenHBand="0" w:firstRowFirstColumn="0" w:firstRowLastColumn="0" w:lastRowFirstColumn="0" w:lastRowLastColumn="0"/>
+          <w:trHeight w:val="332"/>
+          <w:jc w:val="center"/>
+        </w:trPr>
+        <w:tc>
+          <w:tcPr>
+            <w:cnfStyle w:val="001000000100" w:firstRow="0" w:lastRow="0" w:firstColumn="1" w:lastColumn="0" w:oddVBand="0" w:evenVBand="0" w:oddHBand="0" w:evenHBand="0" w:firstRowFirstColumn="1" w:firstRowLastColumn="0" w:lastRowFirstColumn="0" w:lastRowLastColumn="0"/>
+            <w:tcW w:w="1696" w:type="dxa"/>
+            <w:vAlign w:val="center"/>
+          </w:tcPr>
+          <w:p>
+            <w:pPr>
+              <w:rPr>
+                <w:rFonts w:ascii="Calibri" w:eastAsia="Aptos" w:hAnsi="Calibri" w:cs="Calibri"/>
+                <w:b/>
+              </w:rPr>
+            </w:pPr>
+            <w:r>
+              <w:rPr>
+                <w:rFonts w:ascii="Calibri" w:eastAsia="Aptos" w:hAnsi="Calibri" w:cs="Calibri"/>
+                <w:b/>
+                <w:color w:val="215E99"/>
+                <w:sz w:val="22"/>
+                <w:szCs w:val="22"/>
+              </w:rPr>
+              <w:t>Contratto C01</w:t>
+            </w:r>
+          </w:p>
+        </w:tc>
+        <w:tc>
+          <w:tcPr>
+            <w:tcW w:w="7942" w:type="dxa"/>
+            <w:vAlign w:val="center"/>
+          </w:tcPr>
+          <w:p>
+            <w:pPr>
+              <w:cnfStyle w:val="100000000000" w:firstRow="1" w:lastRow="0" w:firstColumn="0" w:lastColumn="0" w:oddVBand="0" w:evenVBand="0" w:oddHBand="0" w:evenHBand="0" w:firstRowFirstColumn="0" w:firstRowLastColumn="0" w:lastRowFirstColumn="0" w:lastRowLastColumn="0"/>
+              <w:rPr>
+                <w:rFonts w:ascii="Calibri" w:eastAsia="Aptos" w:hAnsi="Calibri" w:cs="Calibri"/>
+                <w:b/>
+                <w:i/>
+              </w:rPr>
+            </w:pPr>
+            <w:proofErr w:type="spellStart"/>
+            <w:r>
+              <w:rPr>
+                <w:rFonts w:ascii="Calibri" w:eastAsia="Aptos" w:hAnsi="Calibri" w:cs="Calibri"/>
+                <w:b/>
+                <w:i/>
+                <w:color w:val="215E99" w:themeColor="text2" w:themeTint="BF"/>
+              </w:rPr>
+              <w:t>giocaTurno</w:t>
+            </w:r>
+            <w:proofErr w:type="spellEnd"/>
+          </w:p>
+        </w:tc>
+      </w:tr>
+      <w:tr>
+        <w:trPr>
+          <w:cnfStyle w:val="000000100000" w:firstRow="0" w:lastRow="0" w:firstColumn="0" w:lastColumn="0" w:oddVBand="0" w:evenVBand="0" w:oddHBand="1" w:evenHBand="0" w:firstRowFirstColumn="0" w:firstRowLastColumn="0" w:lastRowFirstColumn="0" w:lastRowLastColumn="0"/>
+          <w:trHeight w:val="362"/>
+          <w:jc w:val="center"/>
+        </w:trPr>
+        <w:tc>
+          <w:tcPr>
+            <w:cnfStyle w:val="001000000000" w:firstRow="0" w:lastRow="0" w:firstColumn="1" w:lastColumn="0" w:oddVBand="0" w:evenVBand="0" w:oddHBand="0" w:evenHBand="0" w:firstRowFirstColumn="0" w:firstRowLastColumn="0" w:lastRowFirstColumn="0" w:lastRowLastColumn="0"/>
+            <w:tcW w:w="1696" w:type="dxa"/>
+            <w:vAlign w:val="center"/>
+          </w:tcPr>
+          <w:p>
+            <w:pPr>
+              <w:rPr>
+                <w:rFonts w:ascii="Calibri" w:eastAsia="Aptos" w:hAnsi="Calibri" w:cs="Calibri"/>
+              </w:rPr>
+            </w:pPr>
+            <w:r>
+              <w:rPr>
+                <w:rFonts w:ascii="Calibri" w:eastAsia="Aptos" w:hAnsi="Calibri" w:cs="Calibri"/>
+              </w:rPr>
+              <w:t>Operazioni</w:t>
+            </w:r>
+          </w:p>
+        </w:tc>
+        <w:tc>
+          <w:tcPr>
+            <w:tcW w:w="7942" w:type="dxa"/>
+            <w:vAlign w:val="center"/>
+          </w:tcPr>
+          <w:p>
+            <w:pPr>
+              <w:cnfStyle w:val="000000100000" w:firstRow="0" w:lastRow="0" w:firstColumn="0" w:lastColumn="0" w:oddVBand="0" w:evenVBand="0" w:oddHBand="1" w:evenHBand="0" w:firstRowFirstColumn="0" w:firstRowLastColumn="0" w:lastRowFirstColumn="0" w:lastRowLastColumn="0"/>
+              <w:rPr>
+                <w:rFonts w:ascii="Calibri" w:eastAsia="Aptos" w:hAnsi="Calibri" w:cs="Calibri"/>
+              </w:rPr>
+            </w:pPr>
+            <w:proofErr w:type="spellStart"/>
+            <w:proofErr w:type="gramStart"/>
+            <w:r>
+              <w:rPr>
+                <w:rFonts w:ascii="Calibri" w:eastAsia="Aptos" w:hAnsi="Calibri" w:cs="Calibri"/>
+              </w:rPr>
+              <w:t>giocaTurno</w:t>
+            </w:r>
+            <w:proofErr w:type="spellEnd"/>
+            <w:r>
+              <w:rPr>
+                <w:rFonts w:ascii="Calibri" w:eastAsia="Aptos" w:hAnsi="Calibri" w:cs="Calibri"/>
+              </w:rPr>
+              <w:t>(</w:t>
+            </w:r>
+            <w:proofErr w:type="gramEnd"/>
+            <w:r>
+              <w:rPr>
+                <w:rFonts w:ascii="Calibri" w:eastAsia="Aptos" w:hAnsi="Calibri" w:cs="Calibri"/>
+              </w:rPr>
+              <w:t>);</w:t>
+            </w:r>
+          </w:p>
+        </w:tc>
+      </w:tr>
+      <w:tr>
+        <w:trPr>
+          <w:trHeight w:val="427"/>
+          <w:jc w:val="center"/>
+        </w:trPr>
+        <w:tc>
+          <w:tcPr>
+            <w:cnfStyle w:val="001000000000" w:firstRow="0" w:lastRow="0" w:firstColumn="1" w:lastColumn="0" w:oddVBand="0" w:evenVBand="0" w:oddHBand="0" w:evenHBand="0" w:firstRowFirstColumn="0" w:firstRowLastColumn="0" w:lastRowFirstColumn="0" w:lastRowLastColumn="0"/>
+            <w:tcW w:w="1696" w:type="dxa"/>
+            <w:vAlign w:val="center"/>
+          </w:tcPr>
+          <w:p>
+            <w:pPr>
+              <w:rPr>
+                <w:rFonts w:ascii="Calibri" w:eastAsia="Aptos" w:hAnsi="Calibri" w:cs="Calibri"/>
+              </w:rPr>
+            </w:pPr>
+            <w:r>
+              <w:rPr>
+                <w:rFonts w:ascii="Calibri" w:eastAsia="Aptos" w:hAnsi="Calibri" w:cs="Calibri"/>
+              </w:rPr>
+              <w:t>Riferimenti</w:t>
+            </w:r>
+          </w:p>
+        </w:tc>
+        <w:tc>
+          <w:tcPr>
+            <w:tcW w:w="7942" w:type="dxa"/>
+            <w:vAlign w:val="center"/>
+          </w:tcPr>
+          <w:p>
+            <w:pPr>
+              <w:cnfStyle w:val="000000000000" w:firstRow="0" w:lastRow="0" w:firstColumn="0" w:lastColumn="0" w:oddVBand="0" w:evenVBand="0" w:oddHBand="0" w:evenHBand="0" w:firstRowFirstColumn="0" w:firstRowLastColumn="0" w:lastRowFirstColumn="0" w:lastRowLastColumn="0"/>
+              <w:rPr>
+                <w:rFonts w:ascii="Calibri" w:eastAsia="Aptos" w:hAnsi="Calibri" w:cs="Calibri"/>
+              </w:rPr>
+            </w:pPr>
+            <w:r>
+              <w:rPr>
+                <w:rFonts w:ascii="Calibri" w:hAnsi="Calibri" w:cs="Calibri"/>
+              </w:rPr>
+              <w:t>Caso d’uso UC</w:t>
+            </w:r>
+            <w:r>
+              <w:rPr>
+                <w:rFonts w:ascii="Calibri" w:hAnsi="Calibri" w:cs="Calibri"/>
+              </w:rPr>
+              <w:t>2</w:t>
+            </w:r>
+            <w:r>
+              <w:rPr>
+                <w:rFonts w:ascii="Calibri" w:hAnsi="Calibri" w:cs="Calibri"/>
+              </w:rPr>
+              <w:t xml:space="preserve">: </w:t>
+            </w:r>
+            <w:r>
+              <w:rPr>
+                <w:rFonts w:ascii="Calibri" w:hAnsi="Calibri" w:cs="Calibri"/>
+              </w:rPr>
+              <w:t>P</w:t>
+            </w:r>
+            <w:r>
+              <w:rPr>
+                <w:rFonts w:ascii="Calibri" w:hAnsi="Calibri" w:cs="Calibri"/>
+              </w:rPr>
+              <w:t xml:space="preserve">artita </w:t>
+            </w:r>
+            <w:proofErr w:type="spellStart"/>
+            <w:r>
+              <w:rPr>
+                <w:rFonts w:ascii="Calibri" w:hAnsi="Calibri" w:cs="Calibri"/>
+              </w:rPr>
+              <w:t>singleplayer</w:t>
+            </w:r>
+            <w:proofErr w:type="spellEnd"/>
+            <w:r>
+              <w:rPr>
+                <w:rFonts w:ascii="Calibri" w:hAnsi="Calibri" w:cs="Calibri"/>
+              </w:rPr>
+              <w:t>;</w:t>
+            </w:r>
+          </w:p>
+        </w:tc>
+      </w:tr>
+      <w:tr>
+        <w:trPr>
+          <w:cnfStyle w:val="000000100000" w:firstRow="0" w:lastRow="0" w:firstColumn="0" w:lastColumn="0" w:oddVBand="0" w:evenVBand="0" w:oddHBand="1" w:evenHBand="0" w:firstRowFirstColumn="0" w:firstRowLastColumn="0" w:lastRowFirstColumn="0" w:lastRowLastColumn="0"/>
+          <w:trHeight w:val="434"/>
+          <w:jc w:val="center"/>
+        </w:trPr>
+        <w:tc>
+          <w:tcPr>
+            <w:cnfStyle w:val="001000000000" w:firstRow="0" w:lastRow="0" w:firstColumn="1" w:lastColumn="0" w:oddVBand="0" w:evenVBand="0" w:oddHBand="0" w:evenHBand="0" w:firstRowFirstColumn="0" w:firstRowLastColumn="0" w:lastRowFirstColumn="0" w:lastRowLastColumn="0"/>
+            <w:tcW w:w="1696" w:type="dxa"/>
+            <w:vAlign w:val="center"/>
+          </w:tcPr>
+          <w:p>
+            <w:pPr>
+              <w:rPr>
+                <w:rFonts w:ascii="Calibri" w:eastAsia="Aptos" w:hAnsi="Calibri" w:cs="Calibri"/>
+              </w:rPr>
+            </w:pPr>
+            <w:r>
+              <w:rPr>
+                <w:rFonts w:ascii="Calibri" w:eastAsia="Aptos" w:hAnsi="Calibri" w:cs="Calibri"/>
+              </w:rPr>
+              <w:t>Pre-condizioni</w:t>
+            </w:r>
+          </w:p>
+        </w:tc>
+        <w:tc>
+          <w:tcPr>
+            <w:tcW w:w="7942" w:type="dxa"/>
+            <w:vAlign w:val="center"/>
+          </w:tcPr>
+          <w:p>
+            <w:pPr>
+              <w:cnfStyle w:val="000000100000" w:firstRow="0" w:lastRow="0" w:firstColumn="0" w:lastColumn="0" w:oddVBand="0" w:evenVBand="0" w:oddHBand="1" w:evenHBand="0" w:firstRowFirstColumn="0" w:firstRowLastColumn="0" w:lastRowFirstColumn="0" w:lastRowLastColumn="0"/>
+              <w:rPr>
+                <w:rFonts w:ascii="Calibri" w:eastAsia="Aptos" w:hAnsi="Calibri" w:cs="Calibri"/>
+              </w:rPr>
+            </w:pPr>
+            <w:r>
+              <w:rPr>
+                <w:rFonts w:ascii="Calibri" w:hAnsi="Calibri" w:cs="Calibri"/>
+              </w:rPr>
+              <w:t xml:space="preserve">È stata creata una istanza </w:t>
+            </w:r>
+            <w:proofErr w:type="spellStart"/>
+            <w:proofErr w:type="gramStart"/>
+            <w:r>
+              <w:rPr>
+                <w:rFonts w:ascii="Calibri" w:hAnsi="Calibri" w:cs="Calibri"/>
+              </w:rPr>
+              <w:t>partitaCorrente</w:t>
+            </w:r>
+            <w:proofErr w:type="spellEnd"/>
+            <w:proofErr w:type="gramEnd"/>
+            <w:r>
+              <w:rPr>
+                <w:rFonts w:ascii="Calibri" w:hAnsi="Calibri" w:cs="Calibri"/>
+              </w:rPr>
+              <w:t xml:space="preserve"> ed è stata avviata la partita secondo il Caso d’uso UC1.</w:t>
+            </w:r>
+          </w:p>
+        </w:tc>
+      </w:tr>
+      <w:tr>
+        <w:trPr>
+          <w:trHeight w:val="412"/>
+          <w:jc w:val="center"/>
+        </w:trPr>
+        <w:tc>
+          <w:tcPr>
+            <w:cnfStyle w:val="001000000000" w:firstRow="0" w:lastRow="0" w:firstColumn="1" w:lastColumn="0" w:oddVBand="0" w:evenVBand="0" w:oddHBand="0" w:evenHBand="0" w:firstRowFirstColumn="0" w:firstRowLastColumn="0" w:lastRowFirstColumn="0" w:lastRowLastColumn="0"/>
+            <w:tcW w:w="1696" w:type="dxa"/>
+            <w:vAlign w:val="center"/>
+          </w:tcPr>
+          <w:p>
+            <w:pPr>
+              <w:rPr>
+                <w:rFonts w:ascii="Calibri" w:eastAsia="Aptos" w:hAnsi="Calibri" w:cs="Calibri"/>
+              </w:rPr>
+            </w:pPr>
+            <w:r>
+              <w:rPr>
+                <w:rFonts w:ascii="Calibri" w:eastAsia="Aptos" w:hAnsi="Calibri" w:cs="Calibri"/>
+              </w:rPr>
+              <w:lastRenderedPageBreak/>
+              <w:t>Post-condizioni</w:t>
+            </w:r>
+          </w:p>
+        </w:tc>
+        <w:tc>
+          <w:tcPr>
+            <w:tcW w:w="7942" w:type="dxa"/>
+            <w:vAlign w:val="center"/>
+          </w:tcPr>
+          <w:p>
+            <w:pPr>
+              <w:pStyle w:val="Paragrafoelenco"/>
+              <w:numPr>
+                <w:ilvl w:val="0"/>
+                <w:numId w:val="30"/>
+              </w:numPr>
+              <w:cnfStyle w:val="000000000000" w:firstRow="0" w:lastRow="0" w:firstColumn="0" w:lastColumn="0" w:oddVBand="0" w:evenVBand="0" w:oddHBand="0" w:evenHBand="0" w:firstRowFirstColumn="0" w:firstRowLastColumn="0" w:lastRowFirstColumn="0" w:lastRowLastColumn="0"/>
+              <w:rPr>
+                <w:rFonts w:ascii="Calibri" w:hAnsi="Calibri" w:cs="Calibri"/>
+              </w:rPr>
+            </w:pPr>
+            <w:proofErr w:type="spellStart"/>
+            <w:proofErr w:type="gramStart"/>
+            <w:r>
+              <w:rPr>
+                <w:rFonts w:ascii="Calibri" w:hAnsi="Calibri" w:cs="Calibri"/>
+                <w:i/>
+                <w:iCs/>
+              </w:rPr>
+              <w:t>partitaCorrente</w:t>
+            </w:r>
+            <w:proofErr w:type="spellEnd"/>
+            <w:proofErr w:type="gramEnd"/>
+            <w:r>
+              <w:rPr>
+                <w:rFonts w:ascii="Calibri" w:hAnsi="Calibri" w:cs="Calibri"/>
+              </w:rPr>
+              <w:t xml:space="preserve"> </w:t>
+            </w:r>
+            <w:r>
+              <w:rPr>
+                <w:rFonts w:ascii="Calibri" w:hAnsi="Calibri" w:cs="Calibri"/>
+              </w:rPr>
+              <w:t>aumenta</w:t>
+            </w:r>
+            <w:r>
+              <w:rPr>
+                <w:rFonts w:ascii="Calibri" w:hAnsi="Calibri" w:cs="Calibri"/>
+              </w:rPr>
+              <w:t xml:space="preserve"> l’attributo turno</w:t>
+            </w:r>
+            <w:r>
+              <w:rPr>
+                <w:rFonts w:ascii="Calibri" w:hAnsi="Calibri" w:cs="Calibri"/>
+              </w:rPr>
+              <w:t xml:space="preserve"> di una unità</w:t>
+            </w:r>
+            <w:r>
+              <w:rPr>
+                <w:rFonts w:ascii="Calibri" w:hAnsi="Calibri" w:cs="Calibri"/>
+              </w:rPr>
+              <w:t>;</w:t>
+            </w:r>
+          </w:p>
+          <w:p>
+            <w:pPr>
+              <w:pStyle w:val="Paragrafoelenco"/>
+              <w:numPr>
+                <w:ilvl w:val="0"/>
+                <w:numId w:val="30"/>
+              </w:numPr>
+              <w:cnfStyle w:val="000000000000" w:firstRow="0" w:lastRow="0" w:firstColumn="0" w:lastColumn="0" w:oddVBand="0" w:evenVBand="0" w:oddHBand="0" w:evenHBand="0" w:firstRowFirstColumn="0" w:firstRowLastColumn="0" w:lastRowFirstColumn="0" w:lastRowLastColumn="0"/>
+              <w:rPr>
+                <w:rFonts w:ascii="Calibri" w:hAnsi="Calibri" w:cs="Calibri"/>
+              </w:rPr>
+            </w:pPr>
+            <w:r>
+              <w:rPr>
+                <w:rFonts w:ascii="Calibri" w:hAnsi="Calibri" w:cs="Calibri"/>
+              </w:rPr>
+              <w:t xml:space="preserve">se la pedina associata al giocatore ha uno stato diverso da “Bloccato”, il </w:t>
+            </w:r>
+            <w:r>
+              <w:rPr>
+                <w:rFonts w:ascii="Calibri" w:hAnsi="Calibri" w:cs="Calibri"/>
+              </w:rPr>
+              <w:t>giocatore lancia</w:t>
+            </w:r>
+            <w:r>
+              <w:rPr>
+                <w:rFonts w:ascii="Calibri" w:hAnsi="Calibri" w:cs="Calibri"/>
+              </w:rPr>
+              <w:t xml:space="preserve"> i dadi, il valore viene </w:t>
+            </w:r>
+            <w:r>
+              <w:rPr>
+                <w:rFonts w:ascii="Calibri" w:hAnsi="Calibri" w:cs="Calibri"/>
+              </w:rPr>
+              <w:t xml:space="preserve">utilizzato per determinare il numero della nuova Casella che verrà </w:t>
+            </w:r>
+            <w:r>
+              <w:rPr>
+                <w:rFonts w:ascii="Calibri" w:hAnsi="Calibri" w:cs="Calibri"/>
+              </w:rPr>
+              <w:t xml:space="preserve">associata alla pedina tramite l’associazione </w:t>
+            </w:r>
+            <w:proofErr w:type="spellStart"/>
+            <w:r>
+              <w:rPr>
+                <w:rFonts w:ascii="Calibri" w:hAnsi="Calibri" w:cs="Calibri"/>
+              </w:rPr>
+              <w:t>segnaPosizione</w:t>
+            </w:r>
+            <w:proofErr w:type="spellEnd"/>
+            <w:r>
+              <w:rPr>
+                <w:rFonts w:ascii="Calibri" w:hAnsi="Calibri" w:cs="Calibri"/>
+              </w:rPr>
+              <w:t>.</w:t>
+            </w:r>
+          </w:p>
+          <w:p>
+            <w:pPr>
+              <w:pStyle w:val="Paragrafoelenco"/>
+              <w:numPr>
+                <w:ilvl w:val="0"/>
+                <w:numId w:val="30"/>
+              </w:numPr>
+              <w:cnfStyle w:val="000000000000" w:firstRow="0" w:lastRow="0" w:firstColumn="0" w:lastColumn="0" w:oddVBand="0" w:evenVBand="0" w:oddHBand="0" w:evenHBand="0" w:firstRowFirstColumn="0" w:firstRowLastColumn="0" w:lastRowFirstColumn="0" w:lastRowLastColumn="0"/>
+              <w:rPr>
+                <w:rFonts w:ascii="Calibri" w:hAnsi="Calibri" w:cs="Calibri"/>
+              </w:rPr>
+            </w:pPr>
+            <w:r>
+              <w:rPr>
+                <w:rFonts w:ascii="Calibri" w:hAnsi="Calibri" w:cs="Calibri"/>
+              </w:rPr>
+              <w:t xml:space="preserve">Qualora la Casella sia di tipo </w:t>
+            </w:r>
+            <w:proofErr w:type="spellStart"/>
+            <w:proofErr w:type="gramStart"/>
+            <w:r>
+              <w:rPr>
+                <w:rFonts w:ascii="Calibri" w:hAnsi="Calibri" w:cs="Calibri"/>
+              </w:rPr>
+              <w:t>CasellaSpeciale</w:t>
+            </w:r>
+            <w:proofErr w:type="spellEnd"/>
+            <w:proofErr w:type="gramEnd"/>
+            <w:r>
+              <w:rPr>
+                <w:rFonts w:ascii="Calibri" w:hAnsi="Calibri" w:cs="Calibri"/>
+              </w:rPr>
+              <w:t>, v</w:t>
+            </w:r>
+            <w:r>
+              <w:rPr>
+                <w:rFonts w:ascii="Calibri" w:hAnsi="Calibri" w:cs="Calibri"/>
+              </w:rPr>
+              <w:t>iene effettuato</w:t>
+            </w:r>
+            <w:r>
+              <w:rPr>
+                <w:rFonts w:ascii="Calibri" w:hAnsi="Calibri" w:cs="Calibri"/>
+              </w:rPr>
+              <w:t xml:space="preserve"> un controllo sulla proprietà </w:t>
+            </w:r>
+            <w:proofErr w:type="spellStart"/>
+            <w:r>
+              <w:rPr>
+                <w:rFonts w:ascii="Calibri" w:hAnsi="Calibri" w:cs="Calibri"/>
+              </w:rPr>
+              <w:t>malus</w:t>
+            </w:r>
+            <w:proofErr w:type="spellEnd"/>
+            <w:r>
+              <w:rPr>
+                <w:rFonts w:ascii="Calibri" w:hAnsi="Calibri" w:cs="Calibri"/>
+              </w:rPr>
+              <w:t xml:space="preserve"> per modificare l’attributo stato di Pedina. Viene anche effettuato un controllo sul modificatore: il valore viene sommato algebricamente al numero della Casella associata per determinare la nuova posizione tramite la associazione </w:t>
+            </w:r>
+            <w:proofErr w:type="spellStart"/>
+            <w:r>
+              <w:rPr>
+                <w:rFonts w:ascii="Calibri" w:hAnsi="Calibri" w:cs="Calibri"/>
+              </w:rPr>
+              <w:t>segnaPosizione</w:t>
+            </w:r>
+            <w:proofErr w:type="spellEnd"/>
+          </w:p>
+          <w:p>
+            <w:pPr>
+              <w:pStyle w:val="Paragrafoelenco"/>
+              <w:numPr>
+                <w:ilvl w:val="0"/>
+                <w:numId w:val="30"/>
+              </w:numPr>
+              <w:cnfStyle w:val="000000000000" w:firstRow="0" w:lastRow="0" w:firstColumn="0" w:lastColumn="0" w:oddVBand="0" w:evenVBand="0" w:oddHBand="0" w:evenHBand="0" w:firstRowFirstColumn="0" w:firstRowLastColumn="0" w:lastRowFirstColumn="0" w:lastRowLastColumn="0"/>
+              <w:rPr>
+                <w:rFonts w:ascii="Calibri" w:hAnsi="Calibri" w:cs="Calibri"/>
+              </w:rPr>
+            </w:pPr>
+            <w:r>
+              <w:rPr>
+                <w:rFonts w:ascii="Calibri" w:hAnsi="Calibri" w:cs="Calibri"/>
+              </w:rPr>
+              <w:t xml:space="preserve">Se la Casella è di tipo </w:t>
+            </w:r>
+            <w:proofErr w:type="spellStart"/>
+            <w:r>
+              <w:rPr>
+                <w:rFonts w:ascii="Calibri" w:hAnsi="Calibri" w:cs="Calibri"/>
+              </w:rPr>
+              <w:t>CasellaFine</w:t>
+            </w:r>
+            <w:proofErr w:type="spellEnd"/>
+            <w:r>
+              <w:rPr>
+                <w:rFonts w:ascii="Calibri" w:hAnsi="Calibri" w:cs="Calibri"/>
+              </w:rPr>
+              <w:t xml:space="preserve"> si procede ad effettuare il contratto </w:t>
+            </w:r>
+            <w:proofErr w:type="spellStart"/>
+            <w:proofErr w:type="gramStart"/>
+            <w:r>
+              <w:rPr>
+                <w:rFonts w:ascii="Calibri" w:hAnsi="Calibri" w:cs="Calibri"/>
+              </w:rPr>
+              <w:t>concludiPartita</w:t>
+            </w:r>
+            <w:proofErr w:type="spellEnd"/>
+            <w:r>
+              <w:rPr>
+                <w:rFonts w:ascii="Calibri" w:hAnsi="Calibri" w:cs="Calibri"/>
+              </w:rPr>
+              <w:t>(</w:t>
+            </w:r>
+            <w:proofErr w:type="gramEnd"/>
+            <w:r>
+              <w:rPr>
+                <w:rFonts w:ascii="Calibri" w:hAnsi="Calibri" w:cs="Calibri"/>
+              </w:rPr>
+              <w:t>)</w:t>
+            </w:r>
+          </w:p>
+        </w:tc>
+      </w:tr>
+    </w:tbl>
+    <w:p>
+      <w:pPr>
+        <w:rPr>
+          <w:rFonts w:ascii="Calibri" w:hAnsi="Calibri" w:cs="Calibri"/>
+          <w:highlight w:val="white"/>
+        </w:rPr>
+      </w:pPr>
+    </w:p>
+    <w:tbl>
+      <w:tblPr>
+        <w:tblStyle w:val="a1"/>
+        <w:tblW w:w="9638" w:type="dxa"/>
+        <w:jc w:val="center"/>
+        <w:tblInd w:w="0" w:type="dxa"/>
+        <w:tblBorders>
+          <w:top w:val="single" w:sz="8" w:space="0" w:color="156082"/>
+          <w:left w:val="single" w:sz="8" w:space="0" w:color="156082"/>
+          <w:bottom w:val="single" w:sz="8" w:space="0" w:color="156082"/>
+          <w:right w:val="single" w:sz="8" w:space="0" w:color="156082"/>
+          <w:insideH w:val="single" w:sz="4" w:space="0" w:color="000000"/>
+          <w:insideV w:val="single" w:sz="4" w:space="0" w:color="000000"/>
+        </w:tblBorders>
+        <w:tblLayout w:type="fixed"/>
+        <w:tblLook w:val="04A0" w:firstRow="1" w:lastRow="0" w:firstColumn="1" w:lastColumn="0" w:noHBand="0" w:noVBand="1"/>
+      </w:tblPr>
+      <w:tblGrid>
+        <w:gridCol w:w="1696"/>
+        <w:gridCol w:w="7942"/>
+      </w:tblGrid>
+      <w:tr>
+        <w:trPr>
+          <w:cnfStyle w:val="100000000000" w:firstRow="1" w:lastRow="0" w:firstColumn="0" w:lastColumn="0" w:oddVBand="0" w:evenVBand="0" w:oddHBand="0" w:evenHBand="0" w:firstRowFirstColumn="0" w:firstRowLastColumn="0" w:lastRowFirstColumn="0" w:lastRowLastColumn="0"/>
+          <w:trHeight w:val="332"/>
+          <w:jc w:val="center"/>
+        </w:trPr>
+        <w:tc>
+          <w:tcPr>
+            <w:cnfStyle w:val="001000000100" w:firstRow="0" w:lastRow="0" w:firstColumn="1" w:lastColumn="0" w:oddVBand="0" w:evenVBand="0" w:oddHBand="0" w:evenHBand="0" w:firstRowFirstColumn="1" w:firstRowLastColumn="0" w:lastRowFirstColumn="0" w:lastRowLastColumn="0"/>
+            <w:tcW w:w="1696" w:type="dxa"/>
+            <w:vAlign w:val="center"/>
+          </w:tcPr>
+          <w:p>
+            <w:pPr>
+              <w:rPr>
+                <w:rFonts w:ascii="Calibri" w:eastAsia="Aptos" w:hAnsi="Calibri" w:cs="Calibri"/>
+                <w:b/>
+              </w:rPr>
+            </w:pPr>
+            <w:r>
+              <w:rPr>
+                <w:rFonts w:ascii="Calibri" w:eastAsia="Aptos" w:hAnsi="Calibri" w:cs="Calibri"/>
+                <w:b/>
+                <w:color w:val="215E99"/>
+                <w:sz w:val="22"/>
+                <w:szCs w:val="22"/>
+              </w:rPr>
+              <w:t>Contratto C0</w:t>
+            </w:r>
+            <w:r>
+              <w:rPr>
+                <w:rFonts w:ascii="Calibri" w:eastAsia="Aptos" w:hAnsi="Calibri" w:cs="Calibri"/>
+                <w:b/>
+                <w:color w:val="215E99"/>
+                <w:sz w:val="22"/>
+                <w:szCs w:val="22"/>
+              </w:rPr>
+              <w:t>2</w:t>
+            </w:r>
+          </w:p>
+        </w:tc>
+        <w:tc>
+          <w:tcPr>
+            <w:tcW w:w="7942" w:type="dxa"/>
+            <w:vAlign w:val="center"/>
+          </w:tcPr>
+          <w:p>
+            <w:pPr>
+              <w:cnfStyle w:val="100000000000" w:firstRow="1" w:lastRow="0" w:firstColumn="0" w:lastColumn="0" w:oddVBand="0" w:evenVBand="0" w:oddHBand="0" w:evenHBand="0" w:firstRowFirstColumn="0" w:firstRowLastColumn="0" w:lastRowFirstColumn="0" w:lastRowLastColumn="0"/>
+              <w:rPr>
+                <w:rFonts w:ascii="Calibri" w:eastAsia="Aptos" w:hAnsi="Calibri" w:cs="Calibri"/>
+                <w:b/>
+                <w:i/>
+              </w:rPr>
+            </w:pPr>
+            <w:proofErr w:type="spellStart"/>
+            <w:r>
+              <w:rPr>
+                <w:rFonts w:ascii="Calibri" w:eastAsia="Aptos" w:hAnsi="Calibri" w:cs="Calibri"/>
+                <w:b/>
+                <w:i/>
+                <w:color w:val="215E99" w:themeColor="text2" w:themeTint="BF"/>
+              </w:rPr>
+              <w:t>performaTurnoComputer</w:t>
+            </w:r>
+            <w:proofErr w:type="spellEnd"/>
+          </w:p>
+        </w:tc>
+      </w:tr>
+      <w:tr>
+        <w:trPr>
+          <w:cnfStyle w:val="000000100000" w:firstRow="0" w:lastRow="0" w:firstColumn="0" w:lastColumn="0" w:oddVBand="0" w:evenVBand="0" w:oddHBand="1" w:evenHBand="0" w:firstRowFirstColumn="0" w:firstRowLastColumn="0" w:lastRowFirstColumn="0" w:lastRowLastColumn="0"/>
+          <w:trHeight w:val="362"/>
+          <w:jc w:val="center"/>
+        </w:trPr>
+        <w:tc>
+          <w:tcPr>
+            <w:cnfStyle w:val="001000000000" w:firstRow="0" w:lastRow="0" w:firstColumn="1" w:lastColumn="0" w:oddVBand="0" w:evenVBand="0" w:oddHBand="0" w:evenHBand="0" w:firstRowFirstColumn="0" w:firstRowLastColumn="0" w:lastRowFirstColumn="0" w:lastRowLastColumn="0"/>
+            <w:tcW w:w="1696" w:type="dxa"/>
+            <w:vAlign w:val="center"/>
+          </w:tcPr>
+          <w:p>
+            <w:pPr>
+              <w:rPr>
+                <w:rFonts w:ascii="Calibri" w:eastAsia="Aptos" w:hAnsi="Calibri" w:cs="Calibri"/>
+              </w:rPr>
+            </w:pPr>
+            <w:r>
+              <w:rPr>
+                <w:rFonts w:ascii="Calibri" w:eastAsia="Aptos" w:hAnsi="Calibri" w:cs="Calibri"/>
+              </w:rPr>
+              <w:t>Operazioni</w:t>
+            </w:r>
+          </w:p>
+        </w:tc>
+        <w:tc>
+          <w:tcPr>
+            <w:tcW w:w="7942" w:type="dxa"/>
+            <w:vAlign w:val="center"/>
+          </w:tcPr>
+          <w:p>
+            <w:pPr>
+              <w:cnfStyle w:val="000000100000" w:firstRow="0" w:lastRow="0" w:firstColumn="0" w:lastColumn="0" w:oddVBand="0" w:evenVBand="0" w:oddHBand="1" w:evenHBand="0" w:firstRowFirstColumn="0" w:firstRowLastColumn="0" w:lastRowFirstColumn="0" w:lastRowLastColumn="0"/>
+              <w:rPr>
+                <w:rFonts w:ascii="Calibri" w:eastAsia="Aptos" w:hAnsi="Calibri" w:cs="Calibri"/>
+              </w:rPr>
+            </w:pPr>
+            <w:proofErr w:type="spellStart"/>
+            <w:proofErr w:type="gramStart"/>
+            <w:r>
+              <w:rPr>
+                <w:rFonts w:ascii="Calibri" w:eastAsia="Aptos" w:hAnsi="Calibri" w:cs="Calibri"/>
+              </w:rPr>
+              <w:t>performaTurnoComputer</w:t>
+            </w:r>
+            <w:proofErr w:type="spellEnd"/>
+            <w:r>
+              <w:rPr>
+                <w:rFonts w:ascii="Calibri" w:eastAsia="Aptos" w:hAnsi="Calibri" w:cs="Calibri"/>
+              </w:rPr>
+              <w:t>(</w:t>
+            </w:r>
+            <w:proofErr w:type="gramEnd"/>
+            <w:r>
+              <w:rPr>
+                <w:rFonts w:ascii="Calibri" w:eastAsia="Aptos" w:hAnsi="Calibri" w:cs="Calibri"/>
+              </w:rPr>
+              <w:t>);</w:t>
+            </w:r>
+          </w:p>
+        </w:tc>
+      </w:tr>
+      <w:tr>
+        <w:trPr>
+          <w:trHeight w:val="427"/>
+          <w:jc w:val="center"/>
+        </w:trPr>
+        <w:tc>
+          <w:tcPr>
+            <w:cnfStyle w:val="001000000000" w:firstRow="0" w:lastRow="0" w:firstColumn="1" w:lastColumn="0" w:oddVBand="0" w:evenVBand="0" w:oddHBand="0" w:evenHBand="0" w:firstRowFirstColumn="0" w:firstRowLastColumn="0" w:lastRowFirstColumn="0" w:lastRowLastColumn="0"/>
+            <w:tcW w:w="1696" w:type="dxa"/>
+            <w:vAlign w:val="center"/>
+          </w:tcPr>
+          <w:p>
+            <w:pPr>
+              <w:rPr>
+                <w:rFonts w:ascii="Calibri" w:eastAsia="Aptos" w:hAnsi="Calibri" w:cs="Calibri"/>
+              </w:rPr>
+            </w:pPr>
+            <w:r>
+              <w:rPr>
+                <w:rFonts w:ascii="Calibri" w:eastAsia="Aptos" w:hAnsi="Calibri" w:cs="Calibri"/>
+              </w:rPr>
+              <w:t>Riferimenti</w:t>
+            </w:r>
+          </w:p>
+        </w:tc>
+        <w:tc>
+          <w:tcPr>
+            <w:tcW w:w="7942" w:type="dxa"/>
+            <w:vAlign w:val="center"/>
+          </w:tcPr>
+          <w:p>
+            <w:pPr>
+              <w:cnfStyle w:val="000000000000" w:firstRow="0" w:lastRow="0" w:firstColumn="0" w:lastColumn="0" w:oddVBand="0" w:evenVBand="0" w:oddHBand="0" w:evenHBand="0" w:firstRowFirstColumn="0" w:firstRowLastColumn="0" w:lastRowFirstColumn="0" w:lastRowLastColumn="0"/>
+              <w:rPr>
+                <w:rFonts w:ascii="Calibri" w:eastAsia="Aptos" w:hAnsi="Calibri" w:cs="Calibri"/>
+              </w:rPr>
+            </w:pPr>
+            <w:r>
+              <w:rPr>
+                <w:rFonts w:ascii="Calibri" w:hAnsi="Calibri" w:cs="Calibri"/>
+              </w:rPr>
+              <w:t>Caso d’uso UC</w:t>
+            </w:r>
+            <w:r>
+              <w:rPr>
+                <w:rFonts w:ascii="Calibri" w:hAnsi="Calibri" w:cs="Calibri"/>
+              </w:rPr>
+              <w:t>2</w:t>
+            </w:r>
+            <w:r>
+              <w:rPr>
+                <w:rFonts w:ascii="Calibri" w:hAnsi="Calibri" w:cs="Calibri"/>
+              </w:rPr>
+              <w:t xml:space="preserve">: </w:t>
+            </w:r>
+            <w:r>
+              <w:rPr>
+                <w:rFonts w:ascii="Calibri" w:hAnsi="Calibri" w:cs="Calibri"/>
+              </w:rPr>
+              <w:t>P</w:t>
+            </w:r>
+            <w:r>
+              <w:rPr>
+                <w:rFonts w:ascii="Calibri" w:hAnsi="Calibri" w:cs="Calibri"/>
+              </w:rPr>
+              <w:t xml:space="preserve">artita </w:t>
+            </w:r>
+            <w:proofErr w:type="spellStart"/>
+            <w:r>
+              <w:rPr>
+                <w:rFonts w:ascii="Calibri" w:hAnsi="Calibri" w:cs="Calibri"/>
+              </w:rPr>
+              <w:t>singleplayer</w:t>
+            </w:r>
+            <w:proofErr w:type="spellEnd"/>
+            <w:r>
+              <w:rPr>
+                <w:rFonts w:ascii="Calibri" w:hAnsi="Calibri" w:cs="Calibri"/>
+              </w:rPr>
+              <w:t>;</w:t>
+            </w:r>
+          </w:p>
+        </w:tc>
+      </w:tr>
+      <w:tr>
+        <w:trPr>
+          <w:cnfStyle w:val="000000100000" w:firstRow="0" w:lastRow="0" w:firstColumn="0" w:lastColumn="0" w:oddVBand="0" w:evenVBand="0" w:oddHBand="1" w:evenHBand="0" w:firstRowFirstColumn="0" w:firstRowLastColumn="0" w:lastRowFirstColumn="0" w:lastRowLastColumn="0"/>
+          <w:trHeight w:val="434"/>
+          <w:jc w:val="center"/>
+        </w:trPr>
+        <w:tc>
+          <w:tcPr>
+            <w:cnfStyle w:val="001000000000" w:firstRow="0" w:lastRow="0" w:firstColumn="1" w:lastColumn="0" w:oddVBand="0" w:evenVBand="0" w:oddHBand="0" w:evenHBand="0" w:firstRowFirstColumn="0" w:firstRowLastColumn="0" w:lastRowFirstColumn="0" w:lastRowLastColumn="0"/>
+            <w:tcW w:w="1696" w:type="dxa"/>
+            <w:vAlign w:val="center"/>
+          </w:tcPr>
+          <w:p>
+            <w:pPr>
+              <w:rPr>
+                <w:rFonts w:ascii="Calibri" w:eastAsia="Aptos" w:hAnsi="Calibri" w:cs="Calibri"/>
+              </w:rPr>
+            </w:pPr>
+            <w:r>
+              <w:rPr>
+                <w:rFonts w:ascii="Calibri" w:eastAsia="Aptos" w:hAnsi="Calibri" w:cs="Calibri"/>
+              </w:rPr>
+              <w:t>Pre-condizioni</w:t>
+            </w:r>
+          </w:p>
+        </w:tc>
+        <w:tc>
+          <w:tcPr>
+            <w:tcW w:w="7942" w:type="dxa"/>
+            <w:vAlign w:val="center"/>
+          </w:tcPr>
+          <w:p>
+            <w:pPr>
+              <w:cnfStyle w:val="000000100000" w:firstRow="0" w:lastRow="0" w:firstColumn="0" w:lastColumn="0" w:oddVBand="0" w:evenVBand="0" w:oddHBand="1" w:evenHBand="0" w:firstRowFirstColumn="0" w:firstRowLastColumn="0" w:lastRowFirstColumn="0" w:lastRowLastColumn="0"/>
+              <w:rPr>
+                <w:rFonts w:ascii="Calibri" w:hAnsi="Calibri" w:cs="Calibri"/>
+              </w:rPr>
+            </w:pPr>
+            <w:r>
+              <w:rPr>
+                <w:rFonts w:ascii="Calibri" w:hAnsi="Calibri" w:cs="Calibri"/>
+              </w:rPr>
+              <w:t xml:space="preserve">È stata creata una istanza </w:t>
+            </w:r>
+            <w:proofErr w:type="spellStart"/>
+            <w:proofErr w:type="gramStart"/>
+            <w:r>
+              <w:rPr>
+                <w:rFonts w:ascii="Calibri" w:hAnsi="Calibri" w:cs="Calibri"/>
+              </w:rPr>
+              <w:t>partitaCorrente</w:t>
+            </w:r>
+            <w:proofErr w:type="spellEnd"/>
+            <w:proofErr w:type="gramEnd"/>
+            <w:r>
+              <w:rPr>
+                <w:rFonts w:ascii="Calibri" w:hAnsi="Calibri" w:cs="Calibri"/>
+              </w:rPr>
+              <w:t xml:space="preserve"> ed è stata avviata la partita secondo il Caso d’uso UC1.</w:t>
+            </w:r>
+          </w:p>
+          <w:p>
+            <w:pPr>
+              <w:cnfStyle w:val="000000100000" w:firstRow="0" w:lastRow="0" w:firstColumn="0" w:lastColumn="0" w:oddVBand="0" w:evenVBand="0" w:oddHBand="1" w:evenHBand="0" w:firstRowFirstColumn="0" w:firstRowLastColumn="0" w:lastRowFirstColumn="0" w:lastRowLastColumn="0"/>
+              <w:rPr>
+                <w:rFonts w:ascii="Calibri" w:eastAsia="Aptos" w:hAnsi="Calibri" w:cs="Calibri"/>
+              </w:rPr>
+            </w:pPr>
+            <w:r>
+              <w:rPr>
+                <w:rFonts w:ascii="Calibri" w:hAnsi="Calibri" w:cs="Calibri"/>
+              </w:rPr>
+              <w:t xml:space="preserve">Il giocatore </w:t>
+            </w:r>
+            <w:r>
+              <w:rPr>
+                <w:rFonts w:ascii="Calibri" w:hAnsi="Calibri" w:cs="Calibri"/>
+              </w:rPr>
+              <w:t xml:space="preserve">umano </w:t>
+            </w:r>
+            <w:r>
+              <w:rPr>
+                <w:rFonts w:ascii="Calibri" w:hAnsi="Calibri" w:cs="Calibri"/>
+              </w:rPr>
+              <w:t xml:space="preserve">ha già effettuato i passaggi del </w:t>
+            </w:r>
+            <w:proofErr w:type="spellStart"/>
+            <w:proofErr w:type="gramStart"/>
+            <w:r>
+              <w:rPr>
+                <w:rFonts w:ascii="Calibri" w:hAnsi="Calibri" w:cs="Calibri"/>
+              </w:rPr>
+              <w:t>giocaTurno</w:t>
+            </w:r>
+            <w:proofErr w:type="spellEnd"/>
+            <w:proofErr w:type="gramEnd"/>
+            <w:r>
+              <w:rPr>
+                <w:rFonts w:ascii="Calibri" w:hAnsi="Calibri" w:cs="Calibri"/>
+              </w:rPr>
+              <w:t xml:space="preserve"> per il turno corrente</w:t>
+            </w:r>
+          </w:p>
+        </w:tc>
+      </w:tr>
+      <w:tr>
+        <w:trPr>
+          <w:trHeight w:val="412"/>
+          <w:jc w:val="center"/>
+        </w:trPr>
+        <w:tc>
+          <w:tcPr>
+            <w:cnfStyle w:val="001000000000" w:firstRow="0" w:lastRow="0" w:firstColumn="1" w:lastColumn="0" w:oddVBand="0" w:evenVBand="0" w:oddHBand="0" w:evenHBand="0" w:firstRowFirstColumn="0" w:firstRowLastColumn="0" w:lastRowFirstColumn="0" w:lastRowLastColumn="0"/>
+            <w:tcW w:w="1696" w:type="dxa"/>
+            <w:vAlign w:val="center"/>
+          </w:tcPr>
+          <w:p>
+            <w:pPr>
+              <w:rPr>
+                <w:rFonts w:ascii="Calibri" w:eastAsia="Aptos" w:hAnsi="Calibri" w:cs="Calibri"/>
+              </w:rPr>
+            </w:pPr>
+            <w:r>
+              <w:rPr>
+                <w:rFonts w:ascii="Calibri" w:eastAsia="Aptos" w:hAnsi="Calibri" w:cs="Calibri"/>
+              </w:rPr>
+              <w:t>Post-condizioni</w:t>
+            </w:r>
+          </w:p>
+        </w:tc>
+        <w:tc>
+          <w:tcPr>
+            <w:tcW w:w="7942" w:type="dxa"/>
+            <w:vAlign w:val="center"/>
+          </w:tcPr>
+          <w:p>
+            <w:pPr>
+              <w:pStyle w:val="Paragrafoelenco"/>
+              <w:numPr>
+                <w:ilvl w:val="0"/>
+                <w:numId w:val="30"/>
+              </w:numPr>
+              <w:cnfStyle w:val="000000000000" w:firstRow="0" w:lastRow="0" w:firstColumn="0" w:lastColumn="0" w:oddVBand="0" w:evenVBand="0" w:oddHBand="0" w:evenHBand="0" w:firstRowFirstColumn="0" w:firstRowLastColumn="0" w:lastRowFirstColumn="0" w:lastRowLastColumn="0"/>
+              <w:rPr>
+                <w:rFonts w:ascii="Calibri" w:hAnsi="Calibri" w:cs="Calibri"/>
+              </w:rPr>
+            </w:pPr>
+            <w:r>
+              <w:rPr>
+                <w:rFonts w:ascii="Calibri" w:hAnsi="Calibri" w:cs="Calibri"/>
+              </w:rPr>
+              <w:t>se la pedina associata al giocatore</w:t>
+            </w:r>
+            <w:r>
+              <w:rPr>
+                <w:rFonts w:ascii="Calibri" w:hAnsi="Calibri" w:cs="Calibri"/>
+              </w:rPr>
+              <w:t xml:space="preserve"> con </w:t>
+            </w:r>
+            <w:proofErr w:type="spellStart"/>
+            <w:r>
+              <w:rPr>
+                <w:rFonts w:ascii="Calibri" w:hAnsi="Calibri" w:cs="Calibri"/>
+              </w:rPr>
+              <w:t>nomeGiocatore</w:t>
+            </w:r>
+            <w:proofErr w:type="spellEnd"/>
+            <w:r>
+              <w:rPr>
+                <w:rFonts w:ascii="Calibri" w:hAnsi="Calibri" w:cs="Calibri"/>
+              </w:rPr>
+              <w:t xml:space="preserve"> Bot</w:t>
+            </w:r>
+            <w:r>
+              <w:rPr>
+                <w:rFonts w:ascii="Calibri" w:hAnsi="Calibri" w:cs="Calibri"/>
+              </w:rPr>
+              <w:t xml:space="preserve"> ha uno stato diverso da “Bloccato”, il giocatore</w:t>
+            </w:r>
+            <w:r>
+              <w:rPr>
+                <w:rFonts w:ascii="Calibri" w:hAnsi="Calibri" w:cs="Calibri"/>
+              </w:rPr>
+              <w:t xml:space="preserve"> bot</w:t>
+            </w:r>
+            <w:r>
+              <w:rPr>
+                <w:rFonts w:ascii="Calibri" w:hAnsi="Calibri" w:cs="Calibri"/>
+              </w:rPr>
+              <w:t xml:space="preserve"> lancia i dadi, il valore viene utilizzato per determinare il numero della nuova Casella che verrà associata alla pedina tramite l’associazione </w:t>
+            </w:r>
+            <w:proofErr w:type="spellStart"/>
+            <w:r>
+              <w:rPr>
+                <w:rFonts w:ascii="Calibri" w:hAnsi="Calibri" w:cs="Calibri"/>
+              </w:rPr>
+              <w:t>segnaPosizione</w:t>
+            </w:r>
+            <w:proofErr w:type="spellEnd"/>
+            <w:r>
+              <w:rPr>
+                <w:rFonts w:ascii="Calibri" w:hAnsi="Calibri" w:cs="Calibri"/>
+              </w:rPr>
+              <w:t>.</w:t>
+            </w:r>
+          </w:p>
+          <w:p>
+            <w:pPr>
+              <w:pStyle w:val="Paragrafoelenco"/>
+              <w:numPr>
+                <w:ilvl w:val="0"/>
+                <w:numId w:val="30"/>
+              </w:numPr>
+              <w:cnfStyle w:val="000000000000" w:firstRow="0" w:lastRow="0" w:firstColumn="0" w:lastColumn="0" w:oddVBand="0" w:evenVBand="0" w:oddHBand="0" w:evenHBand="0" w:firstRowFirstColumn="0" w:firstRowLastColumn="0" w:lastRowFirstColumn="0" w:lastRowLastColumn="0"/>
+              <w:rPr>
+                <w:rFonts w:ascii="Calibri" w:hAnsi="Calibri" w:cs="Calibri"/>
+              </w:rPr>
+            </w:pPr>
+            <w:r>
+              <w:rPr>
+                <w:rFonts w:ascii="Calibri" w:hAnsi="Calibri" w:cs="Calibri"/>
+              </w:rPr>
+              <w:t xml:space="preserve">Qualora la Casella sia di tipo </w:t>
+            </w:r>
+            <w:proofErr w:type="spellStart"/>
+            <w:proofErr w:type="gramStart"/>
+            <w:r>
+              <w:rPr>
+                <w:rFonts w:ascii="Calibri" w:hAnsi="Calibri" w:cs="Calibri"/>
+              </w:rPr>
+              <w:t>CasellaSpeciale</w:t>
+            </w:r>
+            <w:proofErr w:type="spellEnd"/>
+            <w:proofErr w:type="gramEnd"/>
+            <w:r>
+              <w:rPr>
+                <w:rFonts w:ascii="Calibri" w:hAnsi="Calibri" w:cs="Calibri"/>
+              </w:rPr>
+              <w:t xml:space="preserve">, viene effettuato un controllo sulla proprietà </w:t>
+            </w:r>
+            <w:proofErr w:type="spellStart"/>
+            <w:r>
+              <w:rPr>
+                <w:rFonts w:ascii="Calibri" w:hAnsi="Calibri" w:cs="Calibri"/>
+              </w:rPr>
+              <w:t>malus</w:t>
+            </w:r>
+            <w:proofErr w:type="spellEnd"/>
+            <w:r>
+              <w:rPr>
+                <w:rFonts w:ascii="Calibri" w:hAnsi="Calibri" w:cs="Calibri"/>
+              </w:rPr>
+              <w:t xml:space="preserve"> per modificare l’attributo stato di Pedina. Viene anche effettuato un controllo sul modificatore: il valore viene sommato algebricamente al numero della Casella associata per determinare la nuova posizione tramite la associazione </w:t>
+            </w:r>
+            <w:proofErr w:type="spellStart"/>
+            <w:r>
+              <w:rPr>
+                <w:rFonts w:ascii="Calibri" w:hAnsi="Calibri" w:cs="Calibri"/>
+              </w:rPr>
+              <w:t>segnaPosizione</w:t>
+            </w:r>
+            <w:proofErr w:type="spellEnd"/>
+          </w:p>
+          <w:p>
+            <w:pPr>
+              <w:pStyle w:val="Paragrafoelenco"/>
+              <w:numPr>
+                <w:ilvl w:val="0"/>
+                <w:numId w:val="30"/>
+              </w:numPr>
+              <w:cnfStyle w:val="000000000000" w:firstRow="0" w:lastRow="0" w:firstColumn="0" w:lastColumn="0" w:oddVBand="0" w:evenVBand="0" w:oddHBand="0" w:evenHBand="0" w:firstRowFirstColumn="0" w:firstRowLastColumn="0" w:lastRowFirstColumn="0" w:lastRowLastColumn="0"/>
+              <w:rPr>
+                <w:rFonts w:ascii="Calibri" w:hAnsi="Calibri" w:cs="Calibri"/>
+              </w:rPr>
+            </w:pPr>
+            <w:r>
+              <w:rPr>
+                <w:rFonts w:ascii="Calibri" w:hAnsi="Calibri" w:cs="Calibri"/>
+              </w:rPr>
+              <w:t xml:space="preserve">Se la Casella è di tipo </w:t>
+            </w:r>
+            <w:proofErr w:type="spellStart"/>
+            <w:r>
+              <w:rPr>
+                <w:rFonts w:ascii="Calibri" w:hAnsi="Calibri" w:cs="Calibri"/>
+              </w:rPr>
+              <w:t>CasellaFine</w:t>
+            </w:r>
+            <w:proofErr w:type="spellEnd"/>
+            <w:r>
+              <w:rPr>
+                <w:rFonts w:ascii="Calibri" w:hAnsi="Calibri" w:cs="Calibri"/>
+              </w:rPr>
+              <w:t xml:space="preserve"> si </w:t>
+            </w:r>
+            <w:r>
+              <w:rPr>
+                <w:rFonts w:ascii="Calibri" w:hAnsi="Calibri" w:cs="Calibri"/>
+              </w:rPr>
+              <w:t xml:space="preserve">procede ad effettuare il contratto </w:t>
+            </w:r>
+            <w:proofErr w:type="spellStart"/>
+            <w:proofErr w:type="gramStart"/>
+            <w:r>
+              <w:rPr>
+                <w:rFonts w:ascii="Calibri" w:hAnsi="Calibri" w:cs="Calibri"/>
+              </w:rPr>
+              <w:t>concludiPartita</w:t>
+            </w:r>
+            <w:proofErr w:type="spellEnd"/>
+            <w:r>
+              <w:rPr>
+                <w:rFonts w:ascii="Calibri" w:hAnsi="Calibri" w:cs="Calibri"/>
+              </w:rPr>
+              <w:t>(</w:t>
+            </w:r>
+            <w:proofErr w:type="gramEnd"/>
+            <w:r>
+              <w:rPr>
+                <w:rFonts w:ascii="Calibri" w:hAnsi="Calibri" w:cs="Calibri"/>
+              </w:rPr>
+              <w:t>)</w:t>
+            </w:r>
+          </w:p>
+        </w:tc>
+      </w:tr>
+    </w:tbl>
+    <w:p>
+      <w:pPr>
+        <w:rPr>
+          <w:rFonts w:ascii="Calibri" w:hAnsi="Calibri" w:cs="Calibri"/>
+          <w:highlight w:val="white"/>
+        </w:rPr>
+      </w:pPr>
+    </w:p>
+    <w:tbl>
+      <w:tblPr>
+        <w:tblStyle w:val="a1"/>
+        <w:tblW w:w="9638" w:type="dxa"/>
+        <w:jc w:val="center"/>
+        <w:tblInd w:w="0" w:type="dxa"/>
+        <w:tblBorders>
+          <w:top w:val="single" w:sz="8" w:space="0" w:color="156082"/>
+          <w:left w:val="single" w:sz="8" w:space="0" w:color="156082"/>
+          <w:bottom w:val="single" w:sz="8" w:space="0" w:color="156082"/>
+          <w:right w:val="single" w:sz="8" w:space="0" w:color="156082"/>
+          <w:insideH w:val="single" w:sz="4" w:space="0" w:color="000000"/>
+          <w:insideV w:val="single" w:sz="4" w:space="0" w:color="000000"/>
+        </w:tblBorders>
+        <w:tblLayout w:type="fixed"/>
+        <w:tblLook w:val="04A0" w:firstRow="1" w:lastRow="0" w:firstColumn="1" w:lastColumn="0" w:noHBand="0" w:noVBand="1"/>
+      </w:tblPr>
+      <w:tblGrid>
+        <w:gridCol w:w="1696"/>
+        <w:gridCol w:w="7942"/>
+      </w:tblGrid>
+      <w:tr>
+        <w:trPr>
+          <w:cnfStyle w:val="100000000000" w:firstRow="1" w:lastRow="0" w:firstColumn="0" w:lastColumn="0" w:oddVBand="0" w:evenVBand="0" w:oddHBand="0" w:evenHBand="0" w:firstRowFirstColumn="0" w:firstRowLastColumn="0" w:lastRowFirstColumn="0" w:lastRowLastColumn="0"/>
+          <w:trHeight w:val="332"/>
+          <w:jc w:val="center"/>
+        </w:trPr>
+        <w:tc>
+          <w:tcPr>
+            <w:cnfStyle w:val="001000000100" w:firstRow="0" w:lastRow="0" w:firstColumn="1" w:lastColumn="0" w:oddVBand="0" w:evenVBand="0" w:oddHBand="0" w:evenHBand="0" w:firstRowFirstColumn="1" w:firstRowLastColumn="0" w:lastRowFirstColumn="0" w:lastRowLastColumn="0"/>
+            <w:tcW w:w="1696" w:type="dxa"/>
+            <w:vAlign w:val="center"/>
+          </w:tcPr>
+          <w:p>
+            <w:pPr>
+              <w:rPr>
+                <w:rFonts w:ascii="Calibri" w:eastAsia="Aptos" w:hAnsi="Calibri" w:cs="Calibri"/>
+                <w:b/>
+              </w:rPr>
+            </w:pPr>
+            <w:r>
+              <w:rPr>
+                <w:rFonts w:ascii="Calibri" w:eastAsia="Aptos" w:hAnsi="Calibri" w:cs="Calibri"/>
+                <w:b/>
+                <w:color w:val="215E99"/>
+                <w:sz w:val="22"/>
+                <w:szCs w:val="22"/>
+              </w:rPr>
+              <w:t>Contratto C0</w:t>
+            </w:r>
+            <w:r>
+              <w:rPr>
+                <w:rFonts w:ascii="Calibri" w:eastAsia="Aptos" w:hAnsi="Calibri" w:cs="Calibri"/>
+                <w:b/>
+                <w:color w:val="215E99"/>
+                <w:sz w:val="22"/>
+                <w:szCs w:val="22"/>
+              </w:rPr>
+              <w:t>3</w:t>
+            </w:r>
+          </w:p>
+        </w:tc>
+        <w:tc>
+          <w:tcPr>
+            <w:tcW w:w="7942" w:type="dxa"/>
+            <w:vAlign w:val="center"/>
+          </w:tcPr>
+          <w:p>
+            <w:pPr>
+              <w:cnfStyle w:val="100000000000" w:firstRow="1" w:lastRow="0" w:firstColumn="0" w:lastColumn="0" w:oddVBand="0" w:evenVBand="0" w:oddHBand="0" w:evenHBand="0" w:firstRowFirstColumn="0" w:firstRowLastColumn="0" w:lastRowFirstColumn="0" w:lastRowLastColumn="0"/>
+              <w:rPr>
+                <w:rFonts w:ascii="Calibri" w:eastAsia="Aptos" w:hAnsi="Calibri" w:cs="Calibri"/>
+                <w:b/>
+                <w:i/>
+              </w:rPr>
+            </w:pPr>
+            <w:proofErr w:type="spellStart"/>
+            <w:r>
+              <w:rPr>
+                <w:rFonts w:ascii="Calibri" w:eastAsia="Aptos" w:hAnsi="Calibri" w:cs="Calibri"/>
+                <w:b/>
+                <w:i/>
+                <w:color w:val="215E99" w:themeColor="text2" w:themeTint="BF"/>
+              </w:rPr>
+              <w:t>concludiPartita</w:t>
+            </w:r>
+            <w:proofErr w:type="spellEnd"/>
+          </w:p>
+        </w:tc>
+      </w:tr>
+      <w:tr>
+        <w:trPr>
+          <w:cnfStyle w:val="000000100000" w:firstRow="0" w:lastRow="0" w:firstColumn="0" w:lastColumn="0" w:oddVBand="0" w:evenVBand="0" w:oddHBand="1" w:evenHBand="0" w:firstRowFirstColumn="0" w:firstRowLastColumn="0" w:lastRowFirstColumn="0" w:lastRowLastColumn="0"/>
+          <w:trHeight w:val="362"/>
+          <w:jc w:val="center"/>
+        </w:trPr>
+        <w:tc>
+          <w:tcPr>
+            <w:cnfStyle w:val="001000000000" w:firstRow="0" w:lastRow="0" w:firstColumn="1" w:lastColumn="0" w:oddVBand="0" w:evenVBand="0" w:oddHBand="0" w:evenHBand="0" w:firstRowFirstColumn="0" w:firstRowLastColumn="0" w:lastRowFirstColumn="0" w:lastRowLastColumn="0"/>
+            <w:tcW w:w="1696" w:type="dxa"/>
+            <w:vAlign w:val="center"/>
+          </w:tcPr>
+          <w:p>
+            <w:pPr>
+              <w:rPr>
+                <w:rFonts w:ascii="Calibri" w:eastAsia="Aptos" w:hAnsi="Calibri" w:cs="Calibri"/>
+              </w:rPr>
+            </w:pPr>
+            <w:r>
+              <w:rPr>
+                <w:rFonts w:ascii="Calibri" w:eastAsia="Aptos" w:hAnsi="Calibri" w:cs="Calibri"/>
+              </w:rPr>
+              <w:t>Operazioni</w:t>
+            </w:r>
+          </w:p>
+        </w:tc>
+        <w:tc>
+          <w:tcPr>
+            <w:tcW w:w="7942" w:type="dxa"/>
+            <w:vAlign w:val="center"/>
+          </w:tcPr>
+          <w:p>
+            <w:pPr>
+              <w:cnfStyle w:val="000000100000" w:firstRow="0" w:lastRow="0" w:firstColumn="0" w:lastColumn="0" w:oddVBand="0" w:evenVBand="0" w:oddHBand="1" w:evenHBand="0" w:firstRowFirstColumn="0" w:firstRowLastColumn="0" w:lastRowFirstColumn="0" w:lastRowLastColumn="0"/>
+              <w:rPr>
+                <w:rFonts w:ascii="Calibri" w:eastAsia="Aptos" w:hAnsi="Calibri" w:cs="Calibri"/>
+              </w:rPr>
+            </w:pPr>
+            <w:proofErr w:type="spellStart"/>
+            <w:proofErr w:type="gramStart"/>
+            <w:r>
+              <w:rPr>
+                <w:rFonts w:ascii="Calibri" w:eastAsia="Aptos" w:hAnsi="Calibri" w:cs="Calibri"/>
+              </w:rPr>
+              <w:t>concludiPartita</w:t>
+            </w:r>
+            <w:proofErr w:type="spellEnd"/>
+            <w:r>
+              <w:rPr>
+                <w:rFonts w:ascii="Calibri" w:eastAsia="Aptos" w:hAnsi="Calibri" w:cs="Calibri"/>
+              </w:rPr>
+              <w:t>(</w:t>
+            </w:r>
+            <w:proofErr w:type="gramEnd"/>
+            <w:r>
+              <w:rPr>
+                <w:rFonts w:ascii="Calibri" w:eastAsia="Aptos" w:hAnsi="Calibri" w:cs="Calibri"/>
+              </w:rPr>
+              <w:t>);</w:t>
+            </w:r>
+          </w:p>
+        </w:tc>
+      </w:tr>
+      <w:tr>
+        <w:trPr>
+          <w:trHeight w:val="427"/>
+          <w:jc w:val="center"/>
+        </w:trPr>
+        <w:tc>
+          <w:tcPr>
+            <w:cnfStyle w:val="001000000000" w:firstRow="0" w:lastRow="0" w:firstColumn="1" w:lastColumn="0" w:oddVBand="0" w:evenVBand="0" w:oddHBand="0" w:evenHBand="0" w:firstRowFirstColumn="0" w:firstRowLastColumn="0" w:lastRowFirstColumn="0" w:lastRowLastColumn="0"/>
+            <w:tcW w:w="1696" w:type="dxa"/>
+            <w:vAlign w:val="center"/>
+          </w:tcPr>
+          <w:p>
+            <w:pPr>
+              <w:rPr>
+                <w:rFonts w:ascii="Calibri" w:eastAsia="Aptos" w:hAnsi="Calibri" w:cs="Calibri"/>
+              </w:rPr>
+            </w:pPr>
+            <w:r>
+              <w:rPr>
+                <w:rFonts w:ascii="Calibri" w:eastAsia="Aptos" w:hAnsi="Calibri" w:cs="Calibri"/>
+              </w:rPr>
+              <w:t>Riferimenti</w:t>
+            </w:r>
+          </w:p>
+        </w:tc>
+        <w:tc>
+          <w:tcPr>
+            <w:tcW w:w="7942" w:type="dxa"/>
+            <w:vAlign w:val="center"/>
+          </w:tcPr>
+          <w:p>
+            <w:pPr>
+              <w:cnfStyle w:val="000000000000" w:firstRow="0" w:lastRow="0" w:firstColumn="0" w:lastColumn="0" w:oddVBand="0" w:evenVBand="0" w:oddHBand="0" w:evenHBand="0" w:firstRowFirstColumn="0" w:firstRowLastColumn="0" w:lastRowFirstColumn="0" w:lastRowLastColumn="0"/>
+              <w:rPr>
+                <w:rFonts w:ascii="Calibri" w:eastAsia="Aptos" w:hAnsi="Calibri" w:cs="Calibri"/>
+              </w:rPr>
+            </w:pPr>
+            <w:r>
+              <w:rPr>
+                <w:rFonts w:ascii="Calibri" w:hAnsi="Calibri" w:cs="Calibri"/>
+              </w:rPr>
+              <w:t>Caso d’uso UC</w:t>
+            </w:r>
+            <w:r>
+              <w:rPr>
+                <w:rFonts w:ascii="Calibri" w:hAnsi="Calibri" w:cs="Calibri"/>
+              </w:rPr>
+              <w:t>2</w:t>
+            </w:r>
+            <w:r>
+              <w:rPr>
+                <w:rFonts w:ascii="Calibri" w:hAnsi="Calibri" w:cs="Calibri"/>
+              </w:rPr>
+              <w:t xml:space="preserve">: </w:t>
+            </w:r>
+            <w:r>
+              <w:rPr>
+                <w:rFonts w:ascii="Calibri" w:hAnsi="Calibri" w:cs="Calibri"/>
+              </w:rPr>
+              <w:t>P</w:t>
+            </w:r>
+            <w:r>
+              <w:rPr>
+                <w:rFonts w:ascii="Calibri" w:hAnsi="Calibri" w:cs="Calibri"/>
+              </w:rPr>
+              <w:t xml:space="preserve">artita </w:t>
+            </w:r>
+            <w:proofErr w:type="spellStart"/>
+            <w:r>
+              <w:rPr>
+                <w:rFonts w:ascii="Calibri" w:hAnsi="Calibri" w:cs="Calibri"/>
+              </w:rPr>
+              <w:t>singleplayer</w:t>
+            </w:r>
+            <w:proofErr w:type="spellEnd"/>
+            <w:r>
+              <w:rPr>
+                <w:rFonts w:ascii="Calibri" w:hAnsi="Calibri" w:cs="Calibri"/>
+              </w:rPr>
+              <w:t>;</w:t>
+            </w:r>
+          </w:p>
+        </w:tc>
+      </w:tr>
+      <w:tr>
+        <w:trPr>
+          <w:cnfStyle w:val="000000100000" w:firstRow="0" w:lastRow="0" w:firstColumn="0" w:lastColumn="0" w:oddVBand="0" w:evenVBand="0" w:oddHBand="1" w:evenHBand="0" w:firstRowFirstColumn="0" w:firstRowLastColumn="0" w:lastRowFirstColumn="0" w:lastRowLastColumn="0"/>
+          <w:trHeight w:val="434"/>
+          <w:jc w:val="center"/>
+        </w:trPr>
+        <w:tc>
+          <w:tcPr>
+            <w:cnfStyle w:val="001000000000" w:firstRow="0" w:lastRow="0" w:firstColumn="1" w:lastColumn="0" w:oddVBand="0" w:evenVBand="0" w:oddHBand="0" w:evenHBand="0" w:firstRowFirstColumn="0" w:firstRowLastColumn="0" w:lastRowFirstColumn="0" w:lastRowLastColumn="0"/>
+            <w:tcW w:w="1696" w:type="dxa"/>
+            <w:vAlign w:val="center"/>
+          </w:tcPr>
+          <w:p>
+            <w:pPr>
+              <w:rPr>
+                <w:rFonts w:ascii="Calibri" w:eastAsia="Aptos" w:hAnsi="Calibri" w:cs="Calibri"/>
+              </w:rPr>
+            </w:pPr>
+            <w:r>
+              <w:rPr>
+                <w:rFonts w:ascii="Calibri" w:eastAsia="Aptos" w:hAnsi="Calibri" w:cs="Calibri"/>
+              </w:rPr>
+              <w:t>Pre-condizioni</w:t>
+            </w:r>
+          </w:p>
+        </w:tc>
+        <w:tc>
+          <w:tcPr>
+            <w:tcW w:w="7942" w:type="dxa"/>
+            <w:vAlign w:val="center"/>
+          </w:tcPr>
+          <w:p>
+            <w:pPr>
+              <w:cnfStyle w:val="000000100000" w:firstRow="0" w:lastRow="0" w:firstColumn="0" w:lastColumn="0" w:oddVBand="0" w:evenVBand="0" w:oddHBand="1" w:evenHBand="0" w:firstRowFirstColumn="0" w:firstRowLastColumn="0" w:lastRowFirstColumn="0" w:lastRowLastColumn="0"/>
+              <w:rPr>
+                <w:rFonts w:ascii="Calibri" w:hAnsi="Calibri" w:cs="Calibri"/>
+              </w:rPr>
+            </w:pPr>
+            <w:r>
+              <w:rPr>
+                <w:rFonts w:ascii="Calibri" w:hAnsi="Calibri" w:cs="Calibri"/>
+              </w:rPr>
+              <w:t xml:space="preserve">È stata creata una istanza </w:t>
+            </w:r>
+            <w:proofErr w:type="spellStart"/>
+            <w:proofErr w:type="gramStart"/>
+            <w:r>
+              <w:rPr>
+                <w:rFonts w:ascii="Calibri" w:hAnsi="Calibri" w:cs="Calibri"/>
+              </w:rPr>
+              <w:t>partitaCorrente</w:t>
+            </w:r>
+            <w:proofErr w:type="spellEnd"/>
+            <w:proofErr w:type="gramEnd"/>
+            <w:r>
+              <w:rPr>
+                <w:rFonts w:ascii="Calibri" w:hAnsi="Calibri" w:cs="Calibri"/>
+              </w:rPr>
+              <w:t xml:space="preserve"> ed è stata avviata la partita secondo il Caso d’uso UC1.</w:t>
+            </w:r>
+          </w:p>
+          <w:p>
+            <w:pPr>
+              <w:cnfStyle w:val="000000100000" w:firstRow="0" w:lastRow="0" w:firstColumn="0" w:lastColumn="0" w:oddVBand="0" w:evenVBand="0" w:oddHBand="1" w:evenHBand="0" w:firstRowFirstColumn="0" w:firstRowLastColumn="0" w:lastRowFirstColumn="0" w:lastRowLastColumn="0"/>
+              <w:rPr>
+                <w:rFonts w:ascii="Calibri" w:eastAsia="Aptos" w:hAnsi="Calibri" w:cs="Calibri"/>
+              </w:rPr>
+            </w:pPr>
+            <w:r>
+              <w:rPr>
+                <w:rFonts w:ascii="Calibri" w:hAnsi="Calibri" w:cs="Calibri"/>
+              </w:rPr>
+              <w:t xml:space="preserve">Il giocatore umano e il giocatore bot hanno già effettuato i passaggi del </w:t>
+            </w:r>
+            <w:proofErr w:type="spellStart"/>
+            <w:proofErr w:type="gramStart"/>
+            <w:r>
+              <w:rPr>
+                <w:rFonts w:ascii="Calibri" w:hAnsi="Calibri" w:cs="Calibri"/>
+              </w:rPr>
+              <w:t>giocaTurno</w:t>
+            </w:r>
+            <w:proofErr w:type="spellEnd"/>
+            <w:proofErr w:type="gramEnd"/>
+            <w:r>
+              <w:rPr>
+                <w:rFonts w:ascii="Calibri" w:hAnsi="Calibri" w:cs="Calibri"/>
+              </w:rPr>
+              <w:t xml:space="preserve"> per almeno un turno</w:t>
+            </w:r>
+          </w:p>
+        </w:tc>
+      </w:tr>
+      <w:tr>
+        <w:trPr>
+          <w:trHeight w:val="412"/>
+          <w:jc w:val="center"/>
+        </w:trPr>
+        <w:tc>
+          <w:tcPr>
+            <w:cnfStyle w:val="001000000000" w:firstRow="0" w:lastRow="0" w:firstColumn="1" w:lastColumn="0" w:oddVBand="0" w:evenVBand="0" w:oddHBand="0" w:evenHBand="0" w:firstRowFirstColumn="0" w:firstRowLastColumn="0" w:lastRowFirstColumn="0" w:lastRowLastColumn="0"/>
+            <w:tcW w:w="1696" w:type="dxa"/>
+            <w:vAlign w:val="center"/>
+          </w:tcPr>
+          <w:p>
+            <w:pPr>
+              <w:rPr>
+                <w:rFonts w:ascii="Calibri" w:eastAsia="Aptos" w:hAnsi="Calibri" w:cs="Calibri"/>
+              </w:rPr>
+            </w:pPr>
+            <w:r>
+              <w:rPr>
+                <w:rFonts w:ascii="Calibri" w:eastAsia="Aptos" w:hAnsi="Calibri" w:cs="Calibri"/>
+              </w:rPr>
+              <w:t>Post-condizioni</w:t>
+            </w:r>
+          </w:p>
+        </w:tc>
+        <w:tc>
+          <w:tcPr>
+            <w:tcW w:w="7942" w:type="dxa"/>
+            <w:vAlign w:val="center"/>
+          </w:tcPr>
+          <w:p>
+            <w:pPr>
+              <w:pStyle w:val="Paragrafoelenco"/>
+              <w:numPr>
+                <w:ilvl w:val="0"/>
+                <w:numId w:val="30"/>
+              </w:numPr>
+              <w:cnfStyle w:val="000000000000" w:firstRow="0" w:lastRow="0" w:firstColumn="0" w:lastColumn="0" w:oddVBand="0" w:evenVBand="0" w:oddHBand="0" w:evenHBand="0" w:firstRowFirstColumn="0" w:firstRowLastColumn="0" w:lastRowFirstColumn="0" w:lastRowLastColumn="0"/>
+              <w:rPr>
+                <w:rFonts w:ascii="Calibri" w:hAnsi="Calibri" w:cs="Calibri"/>
+              </w:rPr>
+            </w:pPr>
+            <w:r>
+              <w:rPr>
+                <w:rFonts w:ascii="Calibri" w:hAnsi="Calibri" w:cs="Calibri"/>
+              </w:rPr>
+              <w:t xml:space="preserve">Viene effettuato un controllo tramite la posizione della Pedina se la Casella su cui si trova è di tipo </w:t>
+            </w:r>
+            <w:proofErr w:type="spellStart"/>
+            <w:r>
+              <w:rPr>
+                <w:rFonts w:ascii="Calibri" w:hAnsi="Calibri" w:cs="Calibri"/>
+              </w:rPr>
+              <w:t>CasellaFine</w:t>
+            </w:r>
+            <w:proofErr w:type="spellEnd"/>
+            <w:r>
+              <w:rPr>
+                <w:rFonts w:ascii="Calibri" w:hAnsi="Calibri" w:cs="Calibri"/>
+              </w:rPr>
+              <w:t>;</w:t>
+            </w:r>
+          </w:p>
+          <w:p>
+            <w:pPr>
+              <w:pStyle w:val="Paragrafoelenco"/>
+              <w:numPr>
+                <w:ilvl w:val="0"/>
+                <w:numId w:val="30"/>
+              </w:numPr>
+              <w:cnfStyle w:val="000000000000" w:firstRow="0" w:lastRow="0" w:firstColumn="0" w:lastColumn="0" w:oddVBand="0" w:evenVBand="0" w:oddHBand="0" w:evenHBand="0" w:firstRowFirstColumn="0" w:firstRowLastColumn="0" w:lastRowFirstColumn="0" w:lastRowLastColumn="0"/>
+              <w:rPr>
+                <w:rFonts w:ascii="Calibri" w:hAnsi="Calibri" w:cs="Calibri"/>
+              </w:rPr>
+            </w:pPr>
+            <w:r>
+              <w:rPr>
+                <w:rFonts w:ascii="Calibri" w:hAnsi="Calibri" w:cs="Calibri"/>
+              </w:rPr>
+              <w:t xml:space="preserve">Se la Casella è di tipo </w:t>
+            </w:r>
+            <w:proofErr w:type="spellStart"/>
+            <w:proofErr w:type="gramStart"/>
+            <w:r>
+              <w:rPr>
+                <w:rFonts w:ascii="Calibri" w:hAnsi="Calibri" w:cs="Calibri"/>
+              </w:rPr>
+              <w:t>CasellaFine</w:t>
+            </w:r>
+            <w:proofErr w:type="spellEnd"/>
+            <w:proofErr w:type="gramEnd"/>
+            <w:r>
+              <w:rPr>
+                <w:rFonts w:ascii="Calibri" w:hAnsi="Calibri" w:cs="Calibri"/>
+              </w:rPr>
+              <w:t xml:space="preserve"> si attiva l’associazione </w:t>
+            </w:r>
+            <w:proofErr w:type="spellStart"/>
+            <w:r>
+              <w:rPr>
+                <w:rFonts w:ascii="Calibri" w:hAnsi="Calibri" w:cs="Calibri"/>
+              </w:rPr>
+              <w:t>finePartita</w:t>
+            </w:r>
+            <w:proofErr w:type="spellEnd"/>
+            <w:r>
+              <w:rPr>
+                <w:rFonts w:ascii="Calibri" w:hAnsi="Calibri" w:cs="Calibri"/>
+              </w:rPr>
+              <w:t>, il gioco finisce, compare su schermo il nome del vincitore e la possibilità di accedere al menù iniziale (secondo quanto scritto nel caso d’uso UC1)</w:t>
+            </w:r>
+          </w:p>
+        </w:tc>
+      </w:tr>
+    </w:tbl>
+    <w:p>
+      <w:pPr>
+        <w:rPr>
+          <w:rFonts w:ascii="Calibri" w:hAnsi="Calibri" w:cs="Calibri"/>
+          <w:highlight w:val="white"/>
+        </w:rPr>
+      </w:pPr>
     </w:p>
     <w:sectPr>
       <w:headerReference w:type="default" r:id="rId12"/>
@@ -6062,6 +7757,118 @@
     </w:lvl>
   </w:abstractNum>
   <w:abstractNum w:abstractNumId="9" w15:restartNumberingAfterBreak="0">
+    <w:nsid w:val="23F70304"/>
+    <w:multiLevelType w:val="hybridMultilevel"/>
+    <w:tmpl w:val="34BC8230"/>
+    <w:lvl w:ilvl="0" w:tplc="C51C538A">
+      <w:numFmt w:val="bullet"/>
+      <w:lvlText w:val="-"/>
+      <w:lvlJc w:val="left"/>
+      <w:pPr>
+        <w:ind w:left="720" w:hanging="360"/>
+      </w:pPr>
+      <w:rPr>
+        <w:rFonts w:ascii="Calibri" w:eastAsia="Play" w:hAnsi="Calibri" w:cs="Calibri" w:hint="default"/>
+      </w:rPr>
+    </w:lvl>
+    <w:lvl w:ilvl="1" w:tplc="04100003" w:tentative="1">
+      <w:start w:val="1"/>
+      <w:numFmt w:val="bullet"/>
+      <w:lvlText w:val="o"/>
+      <w:lvlJc w:val="left"/>
+      <w:pPr>
+        <w:ind w:left="1440" w:hanging="360"/>
+      </w:pPr>
+      <w:rPr>
+        <w:rFonts w:ascii="Courier New" w:hAnsi="Courier New" w:cs="Courier New" w:hint="default"/>
+      </w:rPr>
+    </w:lvl>
+    <w:lvl w:ilvl="2" w:tplc="04100005" w:tentative="1">
+      <w:start w:val="1"/>
+      <w:numFmt w:val="bullet"/>
+      <w:lvlText w:val=""/>
+      <w:lvlJc w:val="left"/>
+      <w:pPr>
+        <w:ind w:left="2160" w:hanging="360"/>
+      </w:pPr>
+      <w:rPr>
+        <w:rFonts w:ascii="Wingdings" w:hAnsi="Wingdings" w:hint="default"/>
+      </w:rPr>
+    </w:lvl>
+    <w:lvl w:ilvl="3" w:tplc="04100001" w:tentative="1">
+      <w:start w:val="1"/>
+      <w:numFmt w:val="bullet"/>
+      <w:lvlText w:val=""/>
+      <w:lvlJc w:val="left"/>
+      <w:pPr>
+        <w:ind w:left="2880" w:hanging="360"/>
+      </w:pPr>
+      <w:rPr>
+        <w:rFonts w:ascii="Symbol" w:hAnsi="Symbol" w:hint="default"/>
+      </w:rPr>
+    </w:lvl>
+    <w:lvl w:ilvl="4" w:tplc="04100003" w:tentative="1">
+      <w:start w:val="1"/>
+      <w:numFmt w:val="bullet"/>
+      <w:lvlText w:val="o"/>
+      <w:lvlJc w:val="left"/>
+      <w:pPr>
+        <w:ind w:left="3600" w:hanging="360"/>
+      </w:pPr>
+      <w:rPr>
+        <w:rFonts w:ascii="Courier New" w:hAnsi="Courier New" w:cs="Courier New" w:hint="default"/>
+      </w:rPr>
+    </w:lvl>
+    <w:lvl w:ilvl="5" w:tplc="04100005" w:tentative="1">
+      <w:start w:val="1"/>
+      <w:numFmt w:val="bullet"/>
+      <w:lvlText w:val=""/>
+      <w:lvlJc w:val="left"/>
+      <w:pPr>
+        <w:ind w:left="4320" w:hanging="360"/>
+      </w:pPr>
+      <w:rPr>
+        <w:rFonts w:ascii="Wingdings" w:hAnsi="Wingdings" w:hint="default"/>
+      </w:rPr>
+    </w:lvl>
+    <w:lvl w:ilvl="6" w:tplc="04100001" w:tentative="1">
+      <w:start w:val="1"/>
+      <w:numFmt w:val="bullet"/>
+      <w:lvlText w:val=""/>
+      <w:lvlJc w:val="left"/>
+      <w:pPr>
+        <w:ind w:left="5040" w:hanging="360"/>
+      </w:pPr>
+      <w:rPr>
+        <w:rFonts w:ascii="Symbol" w:hAnsi="Symbol" w:hint="default"/>
+      </w:rPr>
+    </w:lvl>
+    <w:lvl w:ilvl="7" w:tplc="04100003" w:tentative="1">
+      <w:start w:val="1"/>
+      <w:numFmt w:val="bullet"/>
+      <w:lvlText w:val="o"/>
+      <w:lvlJc w:val="left"/>
+      <w:pPr>
+        <w:ind w:left="5760" w:hanging="360"/>
+      </w:pPr>
+      <w:rPr>
+        <w:rFonts w:ascii="Courier New" w:hAnsi="Courier New" w:cs="Courier New" w:hint="default"/>
+      </w:rPr>
+    </w:lvl>
+    <w:lvl w:ilvl="8" w:tplc="04100005" w:tentative="1">
+      <w:start w:val="1"/>
+      <w:numFmt w:val="bullet"/>
+      <w:lvlText w:val=""/>
+      <w:lvlJc w:val="left"/>
+      <w:pPr>
+        <w:ind w:left="6480" w:hanging="360"/>
+      </w:pPr>
+      <w:rPr>
+        <w:rFonts w:ascii="Wingdings" w:hAnsi="Wingdings" w:hint="default"/>
+      </w:rPr>
+    </w:lvl>
+  </w:abstractNum>
+  <w:abstractNum w:abstractNumId="10" w15:restartNumberingAfterBreak="0">
     <w:nsid w:val="24AF7E14"/>
     <w:multiLevelType w:val="hybridMultilevel"/>
     <w:tmpl w:val="3FEA7C18"/>
@@ -6150,7 +7957,7 @@
       </w:pPr>
     </w:lvl>
   </w:abstractNum>
-  <w:abstractNum w:abstractNumId="10" w15:restartNumberingAfterBreak="0">
+  <w:abstractNum w:abstractNumId="11" w15:restartNumberingAfterBreak="0">
     <w:nsid w:val="25D64541"/>
     <w:multiLevelType w:val="hybridMultilevel"/>
     <w:tmpl w:val="7E5E64B6"/>
@@ -6239,7 +8046,7 @@
       </w:pPr>
     </w:lvl>
   </w:abstractNum>
-  <w:abstractNum w:abstractNumId="11" w15:restartNumberingAfterBreak="0">
+  <w:abstractNum w:abstractNumId="12" w15:restartNumberingAfterBreak="0">
     <w:nsid w:val="26247744"/>
     <w:multiLevelType w:val="hybridMultilevel"/>
     <w:tmpl w:val="27CC1406"/>
@@ -6328,7 +8135,7 @@
       </w:pPr>
     </w:lvl>
   </w:abstractNum>
-  <w:abstractNum w:abstractNumId="12" w15:restartNumberingAfterBreak="0">
+  <w:abstractNum w:abstractNumId="13" w15:restartNumberingAfterBreak="0">
     <w:nsid w:val="2C6B46D0"/>
     <w:multiLevelType w:val="hybridMultilevel"/>
     <w:tmpl w:val="7E5E64B6"/>
@@ -6417,7 +8224,7 @@
       </w:pPr>
     </w:lvl>
   </w:abstractNum>
-  <w:abstractNum w:abstractNumId="13" w15:restartNumberingAfterBreak="0">
+  <w:abstractNum w:abstractNumId="14" w15:restartNumberingAfterBreak="0">
     <w:nsid w:val="2DC46732"/>
     <w:multiLevelType w:val="hybridMultilevel"/>
     <w:tmpl w:val="7E5E64B6"/>
@@ -6506,7 +8313,7 @@
       </w:pPr>
     </w:lvl>
   </w:abstractNum>
-  <w:abstractNum w:abstractNumId="14" w15:restartNumberingAfterBreak="0">
+  <w:abstractNum w:abstractNumId="15" w15:restartNumberingAfterBreak="0">
     <w:nsid w:val="38DA374E"/>
     <w:multiLevelType w:val="hybridMultilevel"/>
     <w:tmpl w:val="67CEBD58"/>
@@ -6595,7 +8402,119 @@
       </w:pPr>
     </w:lvl>
   </w:abstractNum>
-  <w:abstractNum w:abstractNumId="15" w15:restartNumberingAfterBreak="0">
+  <w:abstractNum w:abstractNumId="16" w15:restartNumberingAfterBreak="0">
+    <w:nsid w:val="3D79147E"/>
+    <w:multiLevelType w:val="hybridMultilevel"/>
+    <w:tmpl w:val="ECEEE65C"/>
+    <w:lvl w:ilvl="0" w:tplc="20DAB262">
+      <w:numFmt w:val="bullet"/>
+      <w:lvlText w:val="-"/>
+      <w:lvlJc w:val="left"/>
+      <w:pPr>
+        <w:ind w:left="720" w:hanging="360"/>
+      </w:pPr>
+      <w:rPr>
+        <w:rFonts w:ascii="Calibri" w:eastAsia="Play" w:hAnsi="Calibri" w:cs="Calibri" w:hint="default"/>
+      </w:rPr>
+    </w:lvl>
+    <w:lvl w:ilvl="1" w:tplc="04100003" w:tentative="1">
+      <w:start w:val="1"/>
+      <w:numFmt w:val="bullet"/>
+      <w:lvlText w:val="o"/>
+      <w:lvlJc w:val="left"/>
+      <w:pPr>
+        <w:ind w:left="1440" w:hanging="360"/>
+      </w:pPr>
+      <w:rPr>
+        <w:rFonts w:ascii="Courier New" w:hAnsi="Courier New" w:cs="Courier New" w:hint="default"/>
+      </w:rPr>
+    </w:lvl>
+    <w:lvl w:ilvl="2" w:tplc="04100005" w:tentative="1">
+      <w:start w:val="1"/>
+      <w:numFmt w:val="bullet"/>
+      <w:lvlText w:val=""/>
+      <w:lvlJc w:val="left"/>
+      <w:pPr>
+        <w:ind w:left="2160" w:hanging="360"/>
+      </w:pPr>
+      <w:rPr>
+        <w:rFonts w:ascii="Wingdings" w:hAnsi="Wingdings" w:hint="default"/>
+      </w:rPr>
+    </w:lvl>
+    <w:lvl w:ilvl="3" w:tplc="04100001" w:tentative="1">
+      <w:start w:val="1"/>
+      <w:numFmt w:val="bullet"/>
+      <w:lvlText w:val=""/>
+      <w:lvlJc w:val="left"/>
+      <w:pPr>
+        <w:ind w:left="2880" w:hanging="360"/>
+      </w:pPr>
+      <w:rPr>
+        <w:rFonts w:ascii="Symbol" w:hAnsi="Symbol" w:hint="default"/>
+      </w:rPr>
+    </w:lvl>
+    <w:lvl w:ilvl="4" w:tplc="04100003" w:tentative="1">
+      <w:start w:val="1"/>
+      <w:numFmt w:val="bullet"/>
+      <w:lvlText w:val="o"/>
+      <w:lvlJc w:val="left"/>
+      <w:pPr>
+        <w:ind w:left="3600" w:hanging="360"/>
+      </w:pPr>
+      <w:rPr>
+        <w:rFonts w:ascii="Courier New" w:hAnsi="Courier New" w:cs="Courier New" w:hint="default"/>
+      </w:rPr>
+    </w:lvl>
+    <w:lvl w:ilvl="5" w:tplc="04100005" w:tentative="1">
+      <w:start w:val="1"/>
+      <w:numFmt w:val="bullet"/>
+      <w:lvlText w:val=""/>
+      <w:lvlJc w:val="left"/>
+      <w:pPr>
+        <w:ind w:left="4320" w:hanging="360"/>
+      </w:pPr>
+      <w:rPr>
+        <w:rFonts w:ascii="Wingdings" w:hAnsi="Wingdings" w:hint="default"/>
+      </w:rPr>
+    </w:lvl>
+    <w:lvl w:ilvl="6" w:tplc="04100001" w:tentative="1">
+      <w:start w:val="1"/>
+      <w:numFmt w:val="bullet"/>
+      <w:lvlText w:val=""/>
+      <w:lvlJc w:val="left"/>
+      <w:pPr>
+        <w:ind w:left="5040" w:hanging="360"/>
+      </w:pPr>
+      <w:rPr>
+        <w:rFonts w:ascii="Symbol" w:hAnsi="Symbol" w:hint="default"/>
+      </w:rPr>
+    </w:lvl>
+    <w:lvl w:ilvl="7" w:tplc="04100003" w:tentative="1">
+      <w:start w:val="1"/>
+      <w:numFmt w:val="bullet"/>
+      <w:lvlText w:val="o"/>
+      <w:lvlJc w:val="left"/>
+      <w:pPr>
+        <w:ind w:left="5760" w:hanging="360"/>
+      </w:pPr>
+      <w:rPr>
+        <w:rFonts w:ascii="Courier New" w:hAnsi="Courier New" w:cs="Courier New" w:hint="default"/>
+      </w:rPr>
+    </w:lvl>
+    <w:lvl w:ilvl="8" w:tplc="04100005" w:tentative="1">
+      <w:start w:val="1"/>
+      <w:numFmt w:val="bullet"/>
+      <w:lvlText w:val=""/>
+      <w:lvlJc w:val="left"/>
+      <w:pPr>
+        <w:ind w:left="6480" w:hanging="360"/>
+      </w:pPr>
+      <w:rPr>
+        <w:rFonts w:ascii="Wingdings" w:hAnsi="Wingdings" w:hint="default"/>
+      </w:rPr>
+    </w:lvl>
+  </w:abstractNum>
+  <w:abstractNum w:abstractNumId="17" w15:restartNumberingAfterBreak="0">
     <w:nsid w:val="404421C5"/>
     <w:multiLevelType w:val="hybridMultilevel"/>
     <w:tmpl w:val="7FA8C86A"/>
@@ -6708,7 +8627,7 @@
       </w:rPr>
     </w:lvl>
   </w:abstractNum>
-  <w:abstractNum w:abstractNumId="16" w15:restartNumberingAfterBreak="0">
+  <w:abstractNum w:abstractNumId="18" w15:restartNumberingAfterBreak="0">
     <w:nsid w:val="40594783"/>
     <w:multiLevelType w:val="hybridMultilevel"/>
     <w:tmpl w:val="BCBADA0C"/>
@@ -6797,7 +8716,7 @@
       </w:pPr>
     </w:lvl>
   </w:abstractNum>
-  <w:abstractNum w:abstractNumId="17" w15:restartNumberingAfterBreak="0">
+  <w:abstractNum w:abstractNumId="19" w15:restartNumberingAfterBreak="0">
     <w:nsid w:val="44A81745"/>
     <w:multiLevelType w:val="hybridMultilevel"/>
     <w:tmpl w:val="A42E0850"/>
@@ -6886,7 +8805,7 @@
       </w:pPr>
     </w:lvl>
   </w:abstractNum>
-  <w:abstractNum w:abstractNumId="18" w15:restartNumberingAfterBreak="0">
+  <w:abstractNum w:abstractNumId="20" w15:restartNumberingAfterBreak="0">
     <w:nsid w:val="457B3D18"/>
     <w:multiLevelType w:val="hybridMultilevel"/>
     <w:tmpl w:val="3C946BCC"/>
@@ -6975,7 +8894,119 @@
       </w:pPr>
     </w:lvl>
   </w:abstractNum>
-  <w:abstractNum w:abstractNumId="19" w15:restartNumberingAfterBreak="0">
+  <w:abstractNum w:abstractNumId="21" w15:restartNumberingAfterBreak="0">
+    <w:nsid w:val="4AD92ACE"/>
+    <w:multiLevelType w:val="hybridMultilevel"/>
+    <w:tmpl w:val="4514869A"/>
+    <w:lvl w:ilvl="0" w:tplc="75FCC4B0">
+      <w:numFmt w:val="bullet"/>
+      <w:lvlText w:val="-"/>
+      <w:lvlJc w:val="left"/>
+      <w:pPr>
+        <w:ind w:left="720" w:hanging="360"/>
+      </w:pPr>
+      <w:rPr>
+        <w:rFonts w:ascii="Calibri" w:eastAsia="Play" w:hAnsi="Calibri" w:cs="Calibri" w:hint="default"/>
+      </w:rPr>
+    </w:lvl>
+    <w:lvl w:ilvl="1" w:tplc="04100003" w:tentative="1">
+      <w:start w:val="1"/>
+      <w:numFmt w:val="bullet"/>
+      <w:lvlText w:val="o"/>
+      <w:lvlJc w:val="left"/>
+      <w:pPr>
+        <w:ind w:left="1440" w:hanging="360"/>
+      </w:pPr>
+      <w:rPr>
+        <w:rFonts w:ascii="Courier New" w:hAnsi="Courier New" w:cs="Courier New" w:hint="default"/>
+      </w:rPr>
+    </w:lvl>
+    <w:lvl w:ilvl="2" w:tplc="04100005" w:tentative="1">
+      <w:start w:val="1"/>
+      <w:numFmt w:val="bullet"/>
+      <w:lvlText w:val=""/>
+      <w:lvlJc w:val="left"/>
+      <w:pPr>
+        <w:ind w:left="2160" w:hanging="360"/>
+      </w:pPr>
+      <w:rPr>
+        <w:rFonts w:ascii="Wingdings" w:hAnsi="Wingdings" w:hint="default"/>
+      </w:rPr>
+    </w:lvl>
+    <w:lvl w:ilvl="3" w:tplc="04100001" w:tentative="1">
+      <w:start w:val="1"/>
+      <w:numFmt w:val="bullet"/>
+      <w:lvlText w:val=""/>
+      <w:lvlJc w:val="left"/>
+      <w:pPr>
+        <w:ind w:left="2880" w:hanging="360"/>
+      </w:pPr>
+      <w:rPr>
+        <w:rFonts w:ascii="Symbol" w:hAnsi="Symbol" w:hint="default"/>
+      </w:rPr>
+    </w:lvl>
+    <w:lvl w:ilvl="4" w:tplc="04100003" w:tentative="1">
+      <w:start w:val="1"/>
+      <w:numFmt w:val="bullet"/>
+      <w:lvlText w:val="o"/>
+      <w:lvlJc w:val="left"/>
+      <w:pPr>
+        <w:ind w:left="3600" w:hanging="360"/>
+      </w:pPr>
+      <w:rPr>
+        <w:rFonts w:ascii="Courier New" w:hAnsi="Courier New" w:cs="Courier New" w:hint="default"/>
+      </w:rPr>
+    </w:lvl>
+    <w:lvl w:ilvl="5" w:tplc="04100005" w:tentative="1">
+      <w:start w:val="1"/>
+      <w:numFmt w:val="bullet"/>
+      <w:lvlText w:val=""/>
+      <w:lvlJc w:val="left"/>
+      <w:pPr>
+        <w:ind w:left="4320" w:hanging="360"/>
+      </w:pPr>
+      <w:rPr>
+        <w:rFonts w:ascii="Wingdings" w:hAnsi="Wingdings" w:hint="default"/>
+      </w:rPr>
+    </w:lvl>
+    <w:lvl w:ilvl="6" w:tplc="04100001" w:tentative="1">
+      <w:start w:val="1"/>
+      <w:numFmt w:val="bullet"/>
+      <w:lvlText w:val=""/>
+      <w:lvlJc w:val="left"/>
+      <w:pPr>
+        <w:ind w:left="5040" w:hanging="360"/>
+      </w:pPr>
+      <w:rPr>
+        <w:rFonts w:ascii="Symbol" w:hAnsi="Symbol" w:hint="default"/>
+      </w:rPr>
+    </w:lvl>
+    <w:lvl w:ilvl="7" w:tplc="04100003" w:tentative="1">
+      <w:start w:val="1"/>
+      <w:numFmt w:val="bullet"/>
+      <w:lvlText w:val="o"/>
+      <w:lvlJc w:val="left"/>
+      <w:pPr>
+        <w:ind w:left="5760" w:hanging="360"/>
+      </w:pPr>
+      <w:rPr>
+        <w:rFonts w:ascii="Courier New" w:hAnsi="Courier New" w:cs="Courier New" w:hint="default"/>
+      </w:rPr>
+    </w:lvl>
+    <w:lvl w:ilvl="8" w:tplc="04100005" w:tentative="1">
+      <w:start w:val="1"/>
+      <w:numFmt w:val="bullet"/>
+      <w:lvlText w:val=""/>
+      <w:lvlJc w:val="left"/>
+      <w:pPr>
+        <w:ind w:left="6480" w:hanging="360"/>
+      </w:pPr>
+      <w:rPr>
+        <w:rFonts w:ascii="Wingdings" w:hAnsi="Wingdings" w:hint="default"/>
+      </w:rPr>
+    </w:lvl>
+  </w:abstractNum>
+  <w:abstractNum w:abstractNumId="22" w15:restartNumberingAfterBreak="0">
     <w:nsid w:val="4CEF34C5"/>
     <w:multiLevelType w:val="hybridMultilevel"/>
     <w:tmpl w:val="FDAAF590"/>
@@ -7064,7 +9095,7 @@
       </w:pPr>
     </w:lvl>
   </w:abstractNum>
-  <w:abstractNum w:abstractNumId="20" w15:restartNumberingAfterBreak="0">
+  <w:abstractNum w:abstractNumId="23" w15:restartNumberingAfterBreak="0">
     <w:nsid w:val="4F250AD6"/>
     <w:multiLevelType w:val="hybridMultilevel"/>
     <w:tmpl w:val="BCBADA0C"/>
@@ -7153,7 +9184,7 @@
       </w:pPr>
     </w:lvl>
   </w:abstractNum>
-  <w:abstractNum w:abstractNumId="21" w15:restartNumberingAfterBreak="0">
+  <w:abstractNum w:abstractNumId="24" w15:restartNumberingAfterBreak="0">
     <w:nsid w:val="4FCD378C"/>
     <w:multiLevelType w:val="hybridMultilevel"/>
     <w:tmpl w:val="BCBADA0C"/>
@@ -7242,7 +9273,7 @@
       </w:pPr>
     </w:lvl>
   </w:abstractNum>
-  <w:abstractNum w:abstractNumId="22" w15:restartNumberingAfterBreak="0">
+  <w:abstractNum w:abstractNumId="25" w15:restartNumberingAfterBreak="0">
     <w:nsid w:val="4FE65F5A"/>
     <w:multiLevelType w:val="hybridMultilevel"/>
     <w:tmpl w:val="BCBADA0C"/>
@@ -7331,7 +9362,7 @@
       </w:pPr>
     </w:lvl>
   </w:abstractNum>
-  <w:abstractNum w:abstractNumId="23" w15:restartNumberingAfterBreak="0">
+  <w:abstractNum w:abstractNumId="26" w15:restartNumberingAfterBreak="0">
     <w:nsid w:val="55B5533E"/>
     <w:multiLevelType w:val="hybridMultilevel"/>
     <w:tmpl w:val="7E5E64B6"/>
@@ -7420,7 +9451,7 @@
       </w:pPr>
     </w:lvl>
   </w:abstractNum>
-  <w:abstractNum w:abstractNumId="24" w15:restartNumberingAfterBreak="0">
+  <w:abstractNum w:abstractNumId="27" w15:restartNumberingAfterBreak="0">
     <w:nsid w:val="6FFE368C"/>
     <w:multiLevelType w:val="hybridMultilevel"/>
     <w:tmpl w:val="3C946BCC"/>
@@ -7509,7 +9540,7 @@
       </w:pPr>
     </w:lvl>
   </w:abstractNum>
-  <w:abstractNum w:abstractNumId="25" w15:restartNumberingAfterBreak="0">
+  <w:abstractNum w:abstractNumId="28" w15:restartNumberingAfterBreak="0">
     <w:nsid w:val="70746A20"/>
     <w:multiLevelType w:val="multilevel"/>
     <w:tmpl w:val="28CA4454"/>
@@ -7658,7 +9689,7 @@
       </w:rPr>
     </w:lvl>
   </w:abstractNum>
-  <w:abstractNum w:abstractNumId="26" w15:restartNumberingAfterBreak="0">
+  <w:abstractNum w:abstractNumId="29" w15:restartNumberingAfterBreak="0">
     <w:nsid w:val="7DD822C3"/>
     <w:multiLevelType w:val="hybridMultilevel"/>
     <w:tmpl w:val="3C946BCC"/>
@@ -7757,61 +9788,61 @@
     <w:abstractNumId w:val="4"/>
   </w:num>
   <w:num w:numId="4" w16cid:durableId="1281305233">
+    <w:abstractNumId w:val="28"/>
+  </w:num>
+  <w:num w:numId="5" w16cid:durableId="478426275">
+    <w:abstractNumId w:val="22"/>
+  </w:num>
+  <w:num w:numId="6" w16cid:durableId="1576551924">
+    <w:abstractNumId w:val="29"/>
+  </w:num>
+  <w:num w:numId="7" w16cid:durableId="567691393">
     <w:abstractNumId w:val="25"/>
   </w:num>
-  <w:num w:numId="5" w16cid:durableId="478426275">
-    <w:abstractNumId w:val="19"/>
-  </w:num>
-  <w:num w:numId="6" w16cid:durableId="1576551924">
-    <w:abstractNumId w:val="26"/>
-  </w:num>
-  <w:num w:numId="7" w16cid:durableId="567691393">
-    <w:abstractNumId w:val="22"/>
-  </w:num>
   <w:num w:numId="8" w16cid:durableId="594900704">
-    <w:abstractNumId w:val="16"/>
+    <w:abstractNumId w:val="18"/>
   </w:num>
   <w:num w:numId="9" w16cid:durableId="560599277">
     <w:abstractNumId w:val="6"/>
   </w:num>
   <w:num w:numId="10" w16cid:durableId="412166526">
-    <w:abstractNumId w:val="17"/>
+    <w:abstractNumId w:val="19"/>
   </w:num>
   <w:num w:numId="11" w16cid:durableId="764110979">
-    <w:abstractNumId w:val="21"/>
+    <w:abstractNumId w:val="24"/>
   </w:num>
   <w:num w:numId="12" w16cid:durableId="1540972270">
-    <w:abstractNumId w:val="20"/>
+    <w:abstractNumId w:val="23"/>
   </w:num>
   <w:num w:numId="13" w16cid:durableId="14770558">
-    <w:abstractNumId w:val="18"/>
+    <w:abstractNumId w:val="20"/>
   </w:num>
   <w:num w:numId="14" w16cid:durableId="1430079531">
     <w:abstractNumId w:val="3"/>
   </w:num>
   <w:num w:numId="15" w16cid:durableId="564529202">
-    <w:abstractNumId w:val="9"/>
+    <w:abstractNumId w:val="10"/>
   </w:num>
   <w:num w:numId="16" w16cid:durableId="697782312">
-    <w:abstractNumId w:val="23"/>
+    <w:abstractNumId w:val="26"/>
   </w:num>
   <w:num w:numId="17" w16cid:durableId="2127001533">
-    <w:abstractNumId w:val="10"/>
+    <w:abstractNumId w:val="11"/>
   </w:num>
   <w:num w:numId="18" w16cid:durableId="605306999">
-    <w:abstractNumId w:val="13"/>
+    <w:abstractNumId w:val="14"/>
   </w:num>
   <w:num w:numId="19" w16cid:durableId="582687429">
     <w:abstractNumId w:val="1"/>
   </w:num>
   <w:num w:numId="20" w16cid:durableId="1412118856">
-    <w:abstractNumId w:val="12"/>
+    <w:abstractNumId w:val="13"/>
   </w:num>
   <w:num w:numId="21" w16cid:durableId="1602184661">
     <w:abstractNumId w:val="7"/>
   </w:num>
   <w:num w:numId="22" w16cid:durableId="1671253131">
-    <w:abstractNumId w:val="24"/>
+    <w:abstractNumId w:val="27"/>
   </w:num>
   <w:num w:numId="23" w16cid:durableId="769471647">
     <w:abstractNumId w:val="2"/>
@@ -7820,13 +9851,22 @@
     <w:abstractNumId w:val="5"/>
   </w:num>
   <w:num w:numId="25" w16cid:durableId="657151589">
-    <w:abstractNumId w:val="11"/>
+    <w:abstractNumId w:val="12"/>
   </w:num>
   <w:num w:numId="26" w16cid:durableId="1885286888">
-    <w:abstractNumId w:val="14"/>
+    <w:abstractNumId w:val="15"/>
   </w:num>
   <w:num w:numId="27" w16cid:durableId="916980803">
-    <w:abstractNumId w:val="15"/>
+    <w:abstractNumId w:val="17"/>
+  </w:num>
+  <w:num w:numId="28" w16cid:durableId="368334978">
+    <w:abstractNumId w:val="21"/>
+  </w:num>
+  <w:num w:numId="29" w16cid:durableId="948656911">
+    <w:abstractNumId w:val="16"/>
+  </w:num>
+  <w:num w:numId="30" w16cid:durableId="1247113509">
+    <w:abstractNumId w:val="9"/>
   </w:num>
 </w:numbering>
 </file>
@@ -9909,12 +11949,17 @@
     <w:pitch w:val="variable"/>
     <w:sig w:usb0="E0002EFF" w:usb1="C000785B" w:usb2="00000009" w:usb3="00000000" w:csb0="000001FF" w:csb1="00000000"/>
   </w:font>
-  <w:font w:name="Symbol">
-    <w:panose1 w:val="05050102010706020507"/>
-    <w:charset w:val="02"/>
-    <w:family w:val="roman"/>
+  <w:font w:name="Calibri">
+    <w:panose1 w:val="020F0502020204030204"/>
+    <w:charset w:val="00"/>
+    <w:family w:val="swiss"/>
     <w:pitch w:val="variable"/>
-    <w:sig w:usb0="00000000" w:usb1="10000000" w:usb2="00000000" w:usb3="00000000" w:csb0="80000000" w:csb1="00000000"/>
+    <w:sig w:usb0="E4002EFF" w:usb1="C200247B" w:usb2="00000009" w:usb3="00000000" w:csb0="000001FF" w:csb1="00000000"/>
+  </w:font>
+  <w:font w:name="Play">
+    <w:charset w:val="00"/>
+    <w:family w:val="auto"/>
+    <w:pitch w:val="default"/>
   </w:font>
   <w:font w:name="Courier New">
     <w:panose1 w:val="02070309020205020404"/>
@@ -9930,6 +11975,13 @@
     <w:pitch w:val="variable"/>
     <w:sig w:usb0="00000000" w:usb1="10000000" w:usb2="00000000" w:usb3="00000000" w:csb0="80000000" w:csb1="00000000"/>
   </w:font>
+  <w:font w:name="Symbol">
+    <w:panose1 w:val="05050102010706020507"/>
+    <w:charset w:val="02"/>
+    <w:family w:val="roman"/>
+    <w:pitch w:val="variable"/>
+    <w:sig w:usb0="00000000" w:usb1="10000000" w:usb2="00000000" w:usb3="00000000" w:csb0="80000000" w:csb1="00000000"/>
+  </w:font>
   <w:font w:name="Aptos">
     <w:charset w:val="00"/>
     <w:family w:val="swiss"/>
@@ -9941,18 +11993,6 @@
     <w:family w:val="swiss"/>
     <w:pitch w:val="variable"/>
     <w:sig w:usb0="20000287" w:usb1="00000003" w:usb2="00000000" w:usb3="00000000" w:csb0="0000019F" w:csb1="00000000"/>
-  </w:font>
-  <w:font w:name="Calibri">
-    <w:panose1 w:val="020F0502020204030204"/>
-    <w:charset w:val="00"/>
-    <w:family w:val="swiss"/>
-    <w:pitch w:val="variable"/>
-    <w:sig w:usb0="E4002EFF" w:usb1="C200247B" w:usb2="00000009" w:usb3="00000000" w:csb0="000001FF" w:csb1="00000000"/>
-  </w:font>
-  <w:font w:name="Play">
-    <w:charset w:val="00"/>
-    <w:family w:val="auto"/>
-    <w:pitch w:val="default"/>
   </w:font>
 </w:fonts>
 </file>
@@ -9975,9 +12015,11 @@
   <w:rsids>
     <w:rsidRoot w:val="00696856"/>
     <w:rsid w:val="00046BD2"/>
+    <w:rsid w:val="001B3845"/>
     <w:rsid w:val="001B447E"/>
     <w:rsid w:val="002837F0"/>
     <w:rsid w:val="003433F2"/>
+    <w:rsid w:val="00346918"/>
     <w:rsid w:val="00355375"/>
     <w:rsid w:val="0044136E"/>
     <w:rsid w:val="004C1A3D"/>
@@ -9990,7 +12032,9 @@
     <w:rsid w:val="008C51CE"/>
     <w:rsid w:val="008D0E13"/>
     <w:rsid w:val="008E6C0C"/>
+    <w:rsid w:val="00971202"/>
     <w:rsid w:val="00A22019"/>
+    <w:rsid w:val="00B11FB2"/>
     <w:rsid w:val="00B86915"/>
     <w:rsid w:val="00BA2BDF"/>
     <w:rsid w:val="00BE08AA"/>

</xml_diff>

<commit_message>
aggiornamento documentazione iterazione 2
</commit_message>
<xml_diff>
--- a/Documentazione/Elaborazione/Iterazione 2/Iterazione 2.docx
+++ b/Documentazione/Elaborazione/Iterazione 2/Iterazione 2.docx
@@ -592,7 +592,7 @@
             </w:rPr>
             <w:fldChar w:fldCharType="separate"/>
           </w:r>
-          <w:hyperlink w:anchor="_Toc172061596" w:history="1">
+          <w:hyperlink w:anchor="_Toc173398842" w:history="1">
             <w:r>
               <w:rPr>
                 <w:rStyle w:val="Collegamentoipertestuale"/>
@@ -639,7 +639,7 @@
                 <w:noProof/>
                 <w:webHidden/>
               </w:rPr>
-              <w:instrText xml:space="preserve"> PAGEREF _Toc172061596 \h </w:instrText>
+              <w:instrText xml:space="preserve"> PAGEREF _Toc173398842 \h </w:instrText>
             </w:r>
             <w:r>
               <w:rPr>
@@ -685,7 +685,7 @@
               <w14:ligatures w14:val="standardContextual"/>
             </w:rPr>
           </w:pPr>
-          <w:hyperlink w:anchor="_Toc172061597" w:history="1">
+          <w:hyperlink w:anchor="_Toc173398843" w:history="1">
             <w:r>
               <w:rPr>
                 <w:rStyle w:val="Collegamentoipertestuale"/>
@@ -713,7 +713,7 @@
                 <w:noProof/>
                 <w:webHidden/>
               </w:rPr>
-              <w:instrText xml:space="preserve"> PAGEREF _Toc172061597 \h </w:instrText>
+              <w:instrText xml:space="preserve"> PAGEREF _Toc173398843 \h </w:instrText>
             </w:r>
             <w:r>
               <w:rPr>
@@ -759,7 +759,7 @@
               <w14:ligatures w14:val="standardContextual"/>
             </w:rPr>
           </w:pPr>
-          <w:hyperlink w:anchor="_Toc172061598" w:history="1">
+          <w:hyperlink w:anchor="_Toc173398844" w:history="1">
             <w:r>
               <w:rPr>
                 <w:rStyle w:val="Collegamentoipertestuale"/>
@@ -787,7 +787,7 @@
                 <w:noProof/>
                 <w:webHidden/>
               </w:rPr>
-              <w:instrText xml:space="preserve"> PAGEREF _Toc172061598 \h </w:instrText>
+              <w:instrText xml:space="preserve"> PAGEREF _Toc173398844 \h </w:instrText>
             </w:r>
             <w:r>
               <w:rPr>
@@ -833,7 +833,7 @@
               <w14:ligatures w14:val="standardContextual"/>
             </w:rPr>
           </w:pPr>
-          <w:hyperlink w:anchor="_Toc172061599" w:history="1">
+          <w:hyperlink w:anchor="_Toc173398845" w:history="1">
             <w:r>
               <w:rPr>
                 <w:rStyle w:val="Collegamentoipertestuale"/>
@@ -862,7 +862,7 @@
                 <w:noProof/>
                 <w:webHidden/>
               </w:rPr>
-              <w:instrText xml:space="preserve"> PAGEREF _Toc172061599 \h </w:instrText>
+              <w:instrText xml:space="preserve"> PAGEREF _Toc173398845 \h </w:instrText>
             </w:r>
             <w:r>
               <w:rPr>
@@ -908,7 +908,7 @@
               <w14:ligatures w14:val="standardContextual"/>
             </w:rPr>
           </w:pPr>
-          <w:hyperlink w:anchor="_Toc172061600" w:history="1">
+          <w:hyperlink w:anchor="_Toc173398846" w:history="1">
             <w:r>
               <w:rPr>
                 <w:rStyle w:val="Collegamentoipertestuale"/>
@@ -937,7 +937,7 @@
                 <w:noProof/>
                 <w:webHidden/>
               </w:rPr>
-              <w:instrText xml:space="preserve"> PAGEREF _Toc172061600 \h </w:instrText>
+              <w:instrText xml:space="preserve"> PAGEREF _Toc173398846 \h </w:instrText>
             </w:r>
             <w:r>
               <w:rPr>
@@ -983,7 +983,7 @@
               <w14:ligatures w14:val="standardContextual"/>
             </w:rPr>
           </w:pPr>
-          <w:hyperlink w:anchor="_Toc172061601" w:history="1">
+          <w:hyperlink w:anchor="_Toc173398847" w:history="1">
             <w:r>
               <w:rPr>
                 <w:rStyle w:val="Collegamentoipertestuale"/>
@@ -1011,7 +1011,7 @@
                 <w:noProof/>
                 <w:webHidden/>
               </w:rPr>
-              <w:instrText xml:space="preserve"> PAGEREF _Toc172061601 \h </w:instrText>
+              <w:instrText xml:space="preserve"> PAGEREF _Toc173398847 \h </w:instrText>
             </w:r>
             <w:r>
               <w:rPr>
@@ -1031,7 +1031,324 @@
                 <w:noProof/>
                 <w:webHidden/>
               </w:rPr>
-              <w:t>7</w:t>
+              <w:t>8</w:t>
+            </w:r>
+            <w:r>
+              <w:rPr>
+                <w:noProof/>
+                <w:webHidden/>
+              </w:rPr>
+              <w:fldChar w:fldCharType="end"/>
+            </w:r>
+          </w:hyperlink>
+        </w:p>
+        <w:p>
+          <w:pPr>
+            <w:pStyle w:val="Sommario1"/>
+            <w:tabs>
+              <w:tab w:val="right" w:leader="dot" w:pos="9628"/>
+            </w:tabs>
+            <w:rPr>
+              <w:rFonts w:asciiTheme="minorHAnsi" w:eastAsiaTheme="minorEastAsia" w:hAnsiTheme="minorHAnsi" w:cstheme="minorBidi"/>
+              <w:noProof/>
+              <w:kern w:val="2"/>
+              <w:sz w:val="24"/>
+              <w:szCs w:val="24"/>
+              <w14:ligatures w14:val="standardContextual"/>
+            </w:rPr>
+          </w:pPr>
+          <w:hyperlink w:anchor="_Toc173398848" w:history="1">
+            <w:r>
+              <w:rPr>
+                <w:rStyle w:val="Collegamentoipertestuale"/>
+                <w:rFonts w:ascii="Calibri" w:hAnsi="Calibri" w:cs="Calibri"/>
+                <w:noProof/>
+              </w:rPr>
+              <w:t>4.0 Progettazione Orientata agli Oggetti</w:t>
+            </w:r>
+            <w:r>
+              <w:rPr>
+                <w:noProof/>
+                <w:webHidden/>
+              </w:rPr>
+              <w:tab/>
+            </w:r>
+            <w:r>
+              <w:rPr>
+                <w:noProof/>
+                <w:webHidden/>
+              </w:rPr>
+              <w:fldChar w:fldCharType="begin"/>
+            </w:r>
+            <w:r>
+              <w:rPr>
+                <w:noProof/>
+                <w:webHidden/>
+              </w:rPr>
+              <w:instrText xml:space="preserve"> PAGEREF _Toc173398848 \h </w:instrText>
+            </w:r>
+            <w:r>
+              <w:rPr>
+                <w:noProof/>
+                <w:webHidden/>
+              </w:rPr>
+            </w:r>
+            <w:r>
+              <w:rPr>
+                <w:noProof/>
+                <w:webHidden/>
+              </w:rPr>
+              <w:fldChar w:fldCharType="separate"/>
+            </w:r>
+            <w:r>
+              <w:rPr>
+                <w:noProof/>
+                <w:webHidden/>
+              </w:rPr>
+              <w:t>9</w:t>
+            </w:r>
+            <w:r>
+              <w:rPr>
+                <w:noProof/>
+                <w:webHidden/>
+              </w:rPr>
+              <w:fldChar w:fldCharType="end"/>
+            </w:r>
+          </w:hyperlink>
+        </w:p>
+        <w:p>
+          <w:pPr>
+            <w:pStyle w:val="Sommario2"/>
+            <w:tabs>
+              <w:tab w:val="right" w:leader="dot" w:pos="9628"/>
+            </w:tabs>
+            <w:rPr>
+              <w:rFonts w:asciiTheme="minorHAnsi" w:eastAsiaTheme="minorEastAsia" w:hAnsiTheme="minorHAnsi" w:cstheme="minorBidi"/>
+              <w:noProof/>
+              <w:kern w:val="2"/>
+              <w:sz w:val="24"/>
+              <w:szCs w:val="24"/>
+              <w14:ligatures w14:val="standardContextual"/>
+            </w:rPr>
+          </w:pPr>
+          <w:hyperlink w:anchor="_Toc173398849" w:history="1">
+            <w:r>
+              <w:rPr>
+                <w:rStyle w:val="Collegamentoipertestuale"/>
+                <w:rFonts w:ascii="Calibri" w:hAnsi="Calibri" w:cs="Calibri"/>
+                <w:noProof/>
+                <w:highlight w:val="white"/>
+              </w:rPr>
+              <w:t>4.1 Diagramma di Sequenza</w:t>
+            </w:r>
+            <w:r>
+              <w:rPr>
+                <w:noProof/>
+                <w:webHidden/>
+              </w:rPr>
+              <w:tab/>
+            </w:r>
+            <w:r>
+              <w:rPr>
+                <w:noProof/>
+                <w:webHidden/>
+              </w:rPr>
+              <w:fldChar w:fldCharType="begin"/>
+            </w:r>
+            <w:r>
+              <w:rPr>
+                <w:noProof/>
+                <w:webHidden/>
+              </w:rPr>
+              <w:instrText xml:space="preserve"> PAGEREF _Toc173398849 \h </w:instrText>
+            </w:r>
+            <w:r>
+              <w:rPr>
+                <w:noProof/>
+                <w:webHidden/>
+              </w:rPr>
+            </w:r>
+            <w:r>
+              <w:rPr>
+                <w:noProof/>
+                <w:webHidden/>
+              </w:rPr>
+              <w:fldChar w:fldCharType="separate"/>
+            </w:r>
+            <w:r>
+              <w:rPr>
+                <w:noProof/>
+                <w:webHidden/>
+              </w:rPr>
+              <w:t>9</w:t>
+            </w:r>
+            <w:r>
+              <w:rPr>
+                <w:noProof/>
+                <w:webHidden/>
+              </w:rPr>
+              <w:fldChar w:fldCharType="end"/>
+            </w:r>
+          </w:hyperlink>
+        </w:p>
+        <w:p>
+          <w:pPr>
+            <w:pStyle w:val="Sommario2"/>
+            <w:tabs>
+              <w:tab w:val="right" w:leader="dot" w:pos="9628"/>
+            </w:tabs>
+            <w:rPr>
+              <w:rFonts w:asciiTheme="minorHAnsi" w:eastAsiaTheme="minorEastAsia" w:hAnsiTheme="minorHAnsi" w:cstheme="minorBidi"/>
+              <w:noProof/>
+              <w:kern w:val="2"/>
+              <w:sz w:val="24"/>
+              <w:szCs w:val="24"/>
+              <w14:ligatures w14:val="standardContextual"/>
+            </w:rPr>
+          </w:pPr>
+          <w:hyperlink w:anchor="_Toc173398850" w:history="1">
+            <w:r>
+              <w:rPr>
+                <w:rStyle w:val="Collegamentoipertestuale"/>
+                <w:rFonts w:ascii="Calibri" w:hAnsi="Calibri" w:cs="Calibri"/>
+                <w:noProof/>
+                <w:highlight w:val="white"/>
+              </w:rPr>
+              <w:t>4.2 Diagramma delle Cl</w:t>
+            </w:r>
+            <w:r>
+              <w:rPr>
+                <w:rStyle w:val="Collegamentoipertestuale"/>
+                <w:rFonts w:ascii="Calibri" w:hAnsi="Calibri" w:cs="Calibri"/>
+                <w:noProof/>
+                <w:highlight w:val="white"/>
+              </w:rPr>
+              <w:t>a</w:t>
+            </w:r>
+            <w:r>
+              <w:rPr>
+                <w:rStyle w:val="Collegamentoipertestuale"/>
+                <w:rFonts w:ascii="Calibri" w:hAnsi="Calibri" w:cs="Calibri"/>
+                <w:noProof/>
+                <w:highlight w:val="white"/>
+              </w:rPr>
+              <w:t>ssi</w:t>
+            </w:r>
+            <w:r>
+              <w:rPr>
+                <w:noProof/>
+                <w:webHidden/>
+              </w:rPr>
+              <w:tab/>
+            </w:r>
+            <w:r>
+              <w:rPr>
+                <w:noProof/>
+                <w:webHidden/>
+              </w:rPr>
+              <w:fldChar w:fldCharType="begin"/>
+            </w:r>
+            <w:r>
+              <w:rPr>
+                <w:noProof/>
+                <w:webHidden/>
+              </w:rPr>
+              <w:instrText xml:space="preserve"> PAGEREF _Toc173398850 \h </w:instrText>
+            </w:r>
+            <w:r>
+              <w:rPr>
+                <w:noProof/>
+                <w:webHidden/>
+              </w:rPr>
+            </w:r>
+            <w:r>
+              <w:rPr>
+                <w:noProof/>
+                <w:webHidden/>
+              </w:rPr>
+              <w:fldChar w:fldCharType="separate"/>
+            </w:r>
+            <w:r>
+              <w:rPr>
+                <w:noProof/>
+                <w:webHidden/>
+              </w:rPr>
+              <w:t>13</w:t>
+            </w:r>
+            <w:r>
+              <w:rPr>
+                <w:noProof/>
+                <w:webHidden/>
+              </w:rPr>
+              <w:fldChar w:fldCharType="end"/>
+            </w:r>
+          </w:hyperlink>
+        </w:p>
+        <w:p>
+          <w:pPr>
+            <w:pStyle w:val="Sommario2"/>
+            <w:tabs>
+              <w:tab w:val="right" w:leader="dot" w:pos="9628"/>
+            </w:tabs>
+            <w:rPr>
+              <w:rFonts w:asciiTheme="minorHAnsi" w:eastAsiaTheme="minorEastAsia" w:hAnsiTheme="minorHAnsi" w:cstheme="minorBidi"/>
+              <w:noProof/>
+              <w:kern w:val="2"/>
+              <w:sz w:val="24"/>
+              <w:szCs w:val="24"/>
+              <w14:ligatures w14:val="standardContextual"/>
+            </w:rPr>
+          </w:pPr>
+          <w:hyperlink w:anchor="_Toc173398851" w:history="1">
+            <w:r>
+              <w:rPr>
+                <w:rStyle w:val="Collegamentoipertestuale"/>
+                <w:rFonts w:ascii="Calibri" w:hAnsi="Calibri" w:cs="Calibri"/>
+                <w:noProof/>
+                <w:highlight w:val="white"/>
+              </w:rPr>
+              <w:t>4.3 Caso d’Uso di Avviamento</w:t>
+            </w:r>
+            <w:r>
+              <w:rPr>
+                <w:noProof/>
+                <w:webHidden/>
+              </w:rPr>
+              <w:tab/>
+            </w:r>
+            <w:r>
+              <w:rPr>
+                <w:noProof/>
+                <w:webHidden/>
+              </w:rPr>
+              <w:fldChar w:fldCharType="begin"/>
+            </w:r>
+            <w:r>
+              <w:rPr>
+                <w:noProof/>
+                <w:webHidden/>
+              </w:rPr>
+              <w:instrText xml:space="preserve"> PAGEREF _Toc173398851 \h </w:instrText>
+            </w:r>
+            <w:r>
+              <w:rPr>
+                <w:noProof/>
+                <w:webHidden/>
+              </w:rPr>
+            </w:r>
+            <w:r>
+              <w:rPr>
+                <w:noProof/>
+                <w:webHidden/>
+              </w:rPr>
+              <w:fldChar w:fldCharType="separate"/>
+            </w:r>
+            <w:r>
+              <w:rPr>
+                <w:noProof/>
+                <w:webHidden/>
+              </w:rPr>
+              <w:t>13</w:t>
             </w:r>
             <w:r>
               <w:rPr>
@@ -1079,7 +1396,7 @@
           <w:rFonts w:ascii="Calibri" w:hAnsi="Calibri" w:cs="Calibri"/>
         </w:rPr>
       </w:pPr>
-      <w:bookmarkStart w:id="0" w:name="_Toc172061596"/>
+      <w:bookmarkStart w:id="0" w:name="_Toc173398842"/>
       <w:r>
         <w:rPr>
           <w:rFonts w:ascii="Calibri" w:hAnsi="Calibri" w:cs="Calibri"/>
@@ -1176,8 +1493,18 @@
           <w:i/>
           <w:color w:val="0D0D0D"/>
         </w:rPr>
-        <w:t>Partita singleplayer</w:t>
-      </w:r>
+        <w:t xml:space="preserve">Partita </w:t>
+      </w:r>
+      <w:proofErr w:type="spellStart"/>
+      <w:r>
+        <w:rPr>
+          <w:rFonts w:ascii="Calibri" w:eastAsia="Calibri" w:hAnsi="Calibri" w:cs="Calibri"/>
+          <w:i/>
+          <w:color w:val="0D0D0D"/>
+        </w:rPr>
+        <w:t>singleplayer</w:t>
+      </w:r>
+      <w:proofErr w:type="spellEnd"/>
       <w:r>
         <w:rPr>
           <w:rFonts w:ascii="Calibri" w:eastAsia="Calibri" w:hAnsi="Calibri" w:cs="Calibri"/>
@@ -1264,21 +1591,24 @@
           <w:i/>
           <w:highlight w:val="white"/>
         </w:rPr>
-        <w:t>Configurazione e avvio partita singleplayer</w:t>
-      </w:r>
+        <w:t xml:space="preserve">Configurazione e avvio partita </w:t>
+      </w:r>
+      <w:proofErr w:type="spellStart"/>
+      <w:r>
+        <w:rPr>
+          <w:rFonts w:ascii="Calibri" w:hAnsi="Calibri" w:cs="Calibri"/>
+          <w:i/>
+          <w:highlight w:val="white"/>
+        </w:rPr>
+        <w:t>singleplayer</w:t>
+      </w:r>
+      <w:proofErr w:type="spellEnd"/>
       <w:r>
         <w:rPr>
           <w:rFonts w:ascii="Calibri" w:eastAsia="Calibri" w:hAnsi="Calibri" w:cs="Calibri"/>
           <w:color w:val="000000"/>
         </w:rPr>
-        <w:t xml:space="preserve"> </w:t>
-      </w:r>
-      <w:r>
-        <w:rPr>
-          <w:rFonts w:ascii="Calibri" w:eastAsia="Calibri" w:hAnsi="Calibri" w:cs="Calibri"/>
-          <w:color w:val="000000"/>
-        </w:rPr>
-        <w:t xml:space="preserve">per gestire le esigenze di </w:t>
+        <w:t xml:space="preserve"> per gestire le esigenze di </w:t>
       </w:r>
       <w:r>
         <w:rPr>
@@ -1312,7 +1642,7 @@
           <w:rFonts w:ascii="Calibri" w:hAnsi="Calibri" w:cs="Calibri"/>
         </w:rPr>
       </w:pPr>
-      <w:bookmarkStart w:id="1" w:name="_Toc172061597"/>
+      <w:bookmarkStart w:id="1" w:name="_Toc173398843"/>
       <w:r>
         <w:rPr>
           <w:rFonts w:ascii="Calibri" w:hAnsi="Calibri" w:cs="Calibri"/>
@@ -1335,9 +1665,17 @@
         <w:rPr>
           <w:rFonts w:ascii="Calibri" w:hAnsi="Calibri" w:cs="Calibri"/>
         </w:rPr>
-        <w:t>Partita singleplayer</w:t>
+        <w:t xml:space="preserve">Partita </w:t>
+      </w:r>
+      <w:proofErr w:type="spellStart"/>
+      <w:r>
+        <w:rPr>
+          <w:rFonts w:ascii="Calibri" w:hAnsi="Calibri" w:cs="Calibri"/>
+        </w:rPr>
+        <w:t>singleplayer</w:t>
       </w:r>
       <w:bookmarkEnd w:id="1"/>
+      <w:proofErr w:type="spellEnd"/>
     </w:p>
     <w:p>
       <w:pPr>
@@ -1394,8 +1732,19 @@
           <w:iCs/>
           <w:highlight w:val="white"/>
         </w:rPr>
-        <w:t>Partita singleplayer</w:t>
-      </w:r>
+        <w:t xml:space="preserve">Partita </w:t>
+      </w:r>
+      <w:proofErr w:type="spellStart"/>
+      <w:r>
+        <w:rPr>
+          <w:rFonts w:ascii="Calibri" w:hAnsi="Calibri" w:cs="Calibri"/>
+          <w:i/>
+          <w:iCs/>
+          <w:highlight w:val="white"/>
+        </w:rPr>
+        <w:t>singleplayer</w:t>
+      </w:r>
+      <w:proofErr w:type="spellEnd"/>
       <w:r>
         <w:rPr>
           <w:rFonts w:ascii="Calibri" w:hAnsi="Calibri" w:cs="Calibri"/>
@@ -1525,8 +1874,18 @@
                 <w:color w:val="0D0D0D"/>
                 <w:shd w:val="clear" w:color="auto" w:fill="FFFFFF"/>
               </w:rPr>
-              <w:t>Partita singleplayer</w:t>
-            </w:r>
+              <w:t xml:space="preserve">Partita </w:t>
+            </w:r>
+            <w:proofErr w:type="spellStart"/>
+            <w:r>
+              <w:rPr>
+                <w:rFonts w:ascii="Calibri" w:hAnsi="Calibri" w:cs="Calibri"/>
+                <w:color w:val="0D0D0D"/>
+                <w:shd w:val="clear" w:color="auto" w:fill="FFFFFF"/>
+              </w:rPr>
+              <w:t>singleplayer</w:t>
+            </w:r>
+            <w:proofErr w:type="spellEnd"/>
           </w:p>
         </w:tc>
       </w:tr>
@@ -1587,8 +1946,19 @@
                 <w:sz w:val="24"/>
                 <w:szCs w:val="24"/>
               </w:rPr>
-              <w:t>UC2: Partita singleplayer</w:t>
-            </w:r>
+              <w:t xml:space="preserve">UC2: Partita </w:t>
+            </w:r>
+            <w:proofErr w:type="spellStart"/>
+            <w:r>
+              <w:rPr>
+                <w:rFonts w:ascii="Calibri" w:eastAsiaTheme="minorEastAsia" w:hAnsi="Calibri" w:cs="Calibri"/>
+                <w:color w:val="auto"/>
+                <w:sz w:val="24"/>
+                <w:szCs w:val="24"/>
+              </w:rPr>
+              <w:t>singleplayer</w:t>
+            </w:r>
+            <w:proofErr w:type="spellEnd"/>
           </w:p>
         </w:tc>
       </w:tr>
@@ -1806,6 +2176,7 @@
                 <w:szCs w:val="24"/>
                 <w:shd w:val="clear" w:color="auto" w:fill="FFFFFF"/>
               </w:rPr>
+              <w:lastRenderedPageBreak/>
               <w:t>Parti interessate e interessi</w:t>
             </w:r>
           </w:p>
@@ -1830,7 +2201,25 @@
                 <w:sz w:val="24"/>
                 <w:szCs w:val="24"/>
               </w:rPr>
-              <w:t>Giocatore → Vuole giocare una partita singleplayer al Gioco dell’Oca</w:t>
+              <w:t xml:space="preserve">Giocatore → Vuole giocare una partita </w:t>
+            </w:r>
+            <w:proofErr w:type="spellStart"/>
+            <w:r>
+              <w:rPr>
+                <w:rFonts w:ascii="Calibri" w:eastAsiaTheme="minorEastAsia" w:hAnsi="Calibri" w:cs="Calibri"/>
+                <w:sz w:val="24"/>
+                <w:szCs w:val="24"/>
+              </w:rPr>
+              <w:t>singleplayer</w:t>
+            </w:r>
+            <w:proofErr w:type="spellEnd"/>
+            <w:r>
+              <w:rPr>
+                <w:rFonts w:ascii="Calibri" w:eastAsiaTheme="minorEastAsia" w:hAnsi="Calibri" w:cs="Calibri"/>
+                <w:sz w:val="24"/>
+                <w:szCs w:val="24"/>
+              </w:rPr>
+              <w:t xml:space="preserve"> al Gioco dell’Oca</w:t>
             </w:r>
           </w:p>
         </w:tc>
@@ -1889,8 +2278,18 @@
                 <w:sz w:val="24"/>
                 <w:szCs w:val="24"/>
               </w:rPr>
-              <w:t>Il giocatore deve aver configurato e avviato una partita singleplayer</w:t>
-            </w:r>
+              <w:t xml:space="preserve">Il giocatore deve aver configurato e avviato una partita </w:t>
+            </w:r>
+            <w:proofErr w:type="spellStart"/>
+            <w:r>
+              <w:rPr>
+                <w:rFonts w:ascii="Calibri" w:eastAsiaTheme="minorEastAsia" w:hAnsi="Calibri" w:cs="Calibri"/>
+                <w:sz w:val="24"/>
+                <w:szCs w:val="24"/>
+              </w:rPr>
+              <w:t>singleplayer</w:t>
+            </w:r>
+            <w:proofErr w:type="spellEnd"/>
           </w:p>
         </w:tc>
       </w:tr>
@@ -1983,7 +2382,6 @@
                 <w:szCs w:val="24"/>
                 <w:shd w:val="clear" w:color="auto" w:fill="FFFFFF"/>
               </w:rPr>
-              <w:lastRenderedPageBreak/>
               <w:t>Scenario principale di successo</w:t>
             </w:r>
           </w:p>
@@ -2518,6 +2916,7 @@
                 <w:sz w:val="24"/>
                 <w:szCs w:val="24"/>
               </w:rPr>
+              <w:lastRenderedPageBreak/>
               <w:t>1b. In qualsiasi momento, il sistema subisce un arresto improvviso.</w:t>
             </w:r>
           </w:p>
@@ -2645,7 +3044,6 @@
                 <w:sz w:val="24"/>
                 <w:szCs w:val="24"/>
               </w:rPr>
-              <w:lastRenderedPageBreak/>
               <w:t>1a.  Il giocatore di turno è l’utente.</w:t>
             </w:r>
           </w:p>
@@ -3121,6 +3519,7 @@
                 <w:sz w:val="24"/>
                 <w:szCs w:val="24"/>
               </w:rPr>
+              <w:lastRenderedPageBreak/>
               <w:t>6e. La casella sulla quale è finito il giocatore di turno è una casella speciale di tipo “Prigione”.</w:t>
             </w:r>
           </w:p>
@@ -3211,7 +3610,6 @@
                 <w:sz w:val="24"/>
                 <w:szCs w:val="24"/>
               </w:rPr>
-              <w:lastRenderedPageBreak/>
               <w:t>1b. Sulla stessa casella è presente un altro giocatore.</w:t>
             </w:r>
           </w:p>
@@ -3742,7 +4140,25 @@
                 <w:sz w:val="24"/>
                 <w:szCs w:val="24"/>
               </w:rPr>
-              <w:t>Dipende dal numero di partite singleplayer che il giocatore vuole avviare</w:t>
+              <w:t xml:space="preserve">Dipende dal numero di partite </w:t>
+            </w:r>
+            <w:proofErr w:type="spellStart"/>
+            <w:r>
+              <w:rPr>
+                <w:rFonts w:ascii="Calibri" w:eastAsiaTheme="minorEastAsia" w:hAnsi="Calibri" w:cs="Calibri"/>
+                <w:sz w:val="24"/>
+                <w:szCs w:val="24"/>
+              </w:rPr>
+              <w:t>singleplayer</w:t>
+            </w:r>
+            <w:proofErr w:type="spellEnd"/>
+            <w:r>
+              <w:rPr>
+                <w:rFonts w:ascii="Calibri" w:eastAsiaTheme="minorEastAsia" w:hAnsi="Calibri" w:cs="Calibri"/>
+                <w:sz w:val="24"/>
+                <w:szCs w:val="24"/>
+              </w:rPr>
+              <w:t xml:space="preserve"> che il giocatore vuole avviare</w:t>
             </w:r>
           </w:p>
         </w:tc>
@@ -3778,6 +4194,7 @@
                 <w:szCs w:val="24"/>
                 <w:shd w:val="clear" w:color="auto" w:fill="FFFFFF"/>
               </w:rPr>
+              <w:lastRenderedPageBreak/>
               <w:t>Varie</w:t>
             </w:r>
           </w:p>
@@ -3841,12 +4258,11 @@
           <w:rFonts w:ascii="Calibri" w:hAnsi="Calibri" w:cs="Calibri"/>
         </w:rPr>
       </w:pPr>
-      <w:bookmarkStart w:id="3" w:name="_Toc172061598"/>
-      <w:r>
-        <w:rPr>
-          <w:rFonts w:ascii="Calibri" w:hAnsi="Calibri" w:cs="Calibri"/>
-        </w:rPr>
-        <w:lastRenderedPageBreak/>
+      <w:bookmarkStart w:id="3" w:name="_Toc173398844"/>
+      <w:r>
+        <w:rPr>
+          <w:rFonts w:ascii="Calibri" w:hAnsi="Calibri" w:cs="Calibri"/>
+        </w:rPr>
         <w:t>3.0 Analisi Orientata agli Oggetti</w:t>
       </w:r>
       <w:bookmarkEnd w:id="3"/>
@@ -3975,7 +4391,7 @@
         </w:rPr>
       </w:pPr>
       <w:bookmarkStart w:id="4" w:name="_Toc171097033"/>
-      <w:bookmarkStart w:id="5" w:name="_Toc172061599"/>
+      <w:bookmarkStart w:id="5" w:name="_Toc173398845"/>
       <w:r>
         <w:rPr>
           <w:rFonts w:ascii="Calibri" w:hAnsi="Calibri" w:cs="Calibri"/>
@@ -4059,6 +4475,7 @@
         </w:rPr>
         <w:t xml:space="preserve">• </w:t>
       </w:r>
+      <w:proofErr w:type="spellStart"/>
       <w:r>
         <w:rPr>
           <w:rFonts w:ascii="Calibri" w:hAnsi="Calibri" w:cs="Calibri"/>
@@ -4073,7 +4490,16 @@
           <w:b/>
           <w:highlight w:val="white"/>
         </w:rPr>
-        <w:t>DellOca:</w:t>
+        <w:t>DellOca</w:t>
+      </w:r>
+      <w:proofErr w:type="spellEnd"/>
+      <w:r>
+        <w:rPr>
+          <w:rFonts w:ascii="Calibri" w:hAnsi="Calibri" w:cs="Calibri"/>
+          <w:b/>
+          <w:highlight w:val="white"/>
+        </w:rPr>
+        <w:t>:</w:t>
       </w:r>
       <w:r>
         <w:rPr>
@@ -4338,6 +4764,7 @@
         </w:rPr>
         <w:t xml:space="preserve">. La tipologia della personalizzazione viene definita da </w:t>
       </w:r>
+      <w:proofErr w:type="spellStart"/>
       <w:r>
         <w:rPr>
           <w:rFonts w:ascii="Calibri" w:hAnsi="Calibri" w:cs="Calibri"/>
@@ -4347,6 +4774,7 @@
         </w:rPr>
         <w:t>TipologiaPersonalizzazione</w:t>
       </w:r>
+      <w:proofErr w:type="spellEnd"/>
       <w:r>
         <w:rPr>
           <w:rFonts w:ascii="Calibri" w:hAnsi="Calibri" w:cs="Calibri"/>
@@ -4392,7 +4820,23 @@
           <w:rFonts w:ascii="Calibri" w:hAnsi="Calibri" w:cs="Calibri"/>
           <w:highlight w:val="white"/>
         </w:rPr>
-        <w:t>si tratta del campo di gioco messo a disposizione dal controller GiocoDellOca tramite Partita. L’interazione con l’oggetto Tabellone non è diretta, ma passa attraverso le Caselle che lo costituiscono.</w:t>
+        <w:t xml:space="preserve">si tratta del campo di gioco messo a disposizione dal controller </w:t>
+      </w:r>
+      <w:proofErr w:type="spellStart"/>
+      <w:r>
+        <w:rPr>
+          <w:rFonts w:ascii="Calibri" w:hAnsi="Calibri" w:cs="Calibri"/>
+          <w:highlight w:val="white"/>
+        </w:rPr>
+        <w:t>GiocoDellOca</w:t>
+      </w:r>
+      <w:proofErr w:type="spellEnd"/>
+      <w:r>
+        <w:rPr>
+          <w:rFonts w:ascii="Calibri" w:hAnsi="Calibri" w:cs="Calibri"/>
+          <w:highlight w:val="white"/>
+        </w:rPr>
+        <w:t xml:space="preserve"> tramite Partita. L’interazione con l’oggetto Tabellone non è diretta, ma passa attraverso le Caselle che lo costituiscono.</w:t>
       </w:r>
     </w:p>
     <w:p>
@@ -4416,6 +4860,7 @@
           <w:bCs/>
           <w:highlight w:val="white"/>
         </w:rPr>
+        <w:lastRenderedPageBreak/>
         <w:t>Casell</w:t>
       </w:r>
       <w:r>
@@ -4432,14 +4877,80 @@
           <w:rFonts w:ascii="Calibri" w:hAnsi="Calibri" w:cs="Calibri"/>
           <w:highlight w:val="white"/>
         </w:rPr>
-        <w:t xml:space="preserve">rappresentano le varie posizioni che il Giocatore tramite la Pedina può assumere. La Casella può essere di tre tipi: CasellaNormale, CasellaSpeciale, CasellaFine. Se il Giocatore </w:t>
-      </w:r>
-      <w:r>
-        <w:rPr>
-          <w:rFonts w:ascii="Calibri" w:hAnsi="Calibri" w:cs="Calibri"/>
-          <w:highlight w:val="white"/>
-        </w:rPr>
-        <w:t>capita su una CasellaSpeciale viene attivato un modificatore che provoca sulla Pedina un avanzamento o un indietreggiamento o un blocco (intervento sullo stato).</w:t>
+        <w:t xml:space="preserve">rappresentano le varie posizioni che il Giocatore tramite la Pedina può assumere. La Casella può essere di tre tipi: </w:t>
+      </w:r>
+      <w:proofErr w:type="spellStart"/>
+      <w:r>
+        <w:rPr>
+          <w:rFonts w:ascii="Calibri" w:hAnsi="Calibri" w:cs="Calibri"/>
+          <w:highlight w:val="white"/>
+        </w:rPr>
+        <w:t>CasellaNormale</w:t>
+      </w:r>
+      <w:proofErr w:type="spellEnd"/>
+      <w:r>
+        <w:rPr>
+          <w:rFonts w:ascii="Calibri" w:hAnsi="Calibri" w:cs="Calibri"/>
+          <w:highlight w:val="white"/>
+        </w:rPr>
+        <w:t xml:space="preserve">, </w:t>
+      </w:r>
+      <w:proofErr w:type="spellStart"/>
+      <w:r>
+        <w:rPr>
+          <w:rFonts w:ascii="Calibri" w:hAnsi="Calibri" w:cs="Calibri"/>
+          <w:highlight w:val="white"/>
+        </w:rPr>
+        <w:t>CasellaSpeciale</w:t>
+      </w:r>
+      <w:proofErr w:type="spellEnd"/>
+      <w:r>
+        <w:rPr>
+          <w:rFonts w:ascii="Calibri" w:hAnsi="Calibri" w:cs="Calibri"/>
+          <w:highlight w:val="white"/>
+        </w:rPr>
+        <w:t xml:space="preserve">, </w:t>
+      </w:r>
+      <w:proofErr w:type="spellStart"/>
+      <w:r>
+        <w:rPr>
+          <w:rFonts w:ascii="Calibri" w:hAnsi="Calibri" w:cs="Calibri"/>
+          <w:highlight w:val="white"/>
+        </w:rPr>
+        <w:t>CasellaFine</w:t>
+      </w:r>
+      <w:proofErr w:type="spellEnd"/>
+      <w:r>
+        <w:rPr>
+          <w:rFonts w:ascii="Calibri" w:hAnsi="Calibri" w:cs="Calibri"/>
+          <w:highlight w:val="white"/>
+        </w:rPr>
+        <w:t xml:space="preserve">. Se il Giocatore </w:t>
+      </w:r>
+      <w:r>
+        <w:rPr>
+          <w:rFonts w:ascii="Calibri" w:hAnsi="Calibri" w:cs="Calibri"/>
+          <w:highlight w:val="white"/>
+        </w:rPr>
+        <w:t xml:space="preserve">capita su una </w:t>
+      </w:r>
+      <w:proofErr w:type="spellStart"/>
+      <w:proofErr w:type="gramStart"/>
+      <w:r>
+        <w:rPr>
+          <w:rFonts w:ascii="Calibri" w:hAnsi="Calibri" w:cs="Calibri"/>
+          <w:highlight w:val="white"/>
+        </w:rPr>
+        <w:t>CasellaSpeciale</w:t>
+      </w:r>
+      <w:proofErr w:type="spellEnd"/>
+      <w:proofErr w:type="gramEnd"/>
+      <w:r>
+        <w:rPr>
+          <w:rFonts w:ascii="Calibri" w:hAnsi="Calibri" w:cs="Calibri"/>
+          <w:highlight w:val="white"/>
+        </w:rPr>
+        <w:t xml:space="preserve"> viene attivato un modificatore che provoca sulla Pedina un avanzamento o un indietreggiamento o un blocco (intervento sullo stato).</w:t>
       </w:r>
     </w:p>
     <w:p>
@@ -4456,6 +4967,7 @@
           <w:highlight w:val="white"/>
         </w:rPr>
       </w:pPr>
+      <w:proofErr w:type="gramStart"/>
       <w:r>
         <w:rPr>
           <w:rFonts w:ascii="Calibri" w:hAnsi="Calibri" w:cs="Calibri"/>
@@ -4472,7 +4984,17 @@
           <w:bCs/>
           <w:highlight w:val="white"/>
         </w:rPr>
-        <w:t xml:space="preserve"> : </w:t>
+        <w:t xml:space="preserve"> :</w:t>
+      </w:r>
+      <w:proofErr w:type="gramEnd"/>
+      <w:r>
+        <w:rPr>
+          <w:rFonts w:ascii="Calibri" w:hAnsi="Calibri" w:cs="Calibri"/>
+          <w:b/>
+          <w:bCs/>
+          <w:highlight w:val="white"/>
+        </w:rPr>
+        <w:t xml:space="preserve"> </w:t>
       </w:r>
       <w:r>
         <w:rPr>
@@ -4496,6 +5018,7 @@
           <w:highlight w:val="white"/>
         </w:rPr>
       </w:pPr>
+      <w:proofErr w:type="gramStart"/>
       <w:r>
         <w:rPr>
           <w:rFonts w:ascii="Calibri" w:hAnsi="Calibri" w:cs="Calibri"/>
@@ -4512,7 +5035,17 @@
           <w:bCs/>
           <w:highlight w:val="white"/>
         </w:rPr>
-        <w:t xml:space="preserve"> : </w:t>
+        <w:t xml:space="preserve"> :</w:t>
+      </w:r>
+      <w:proofErr w:type="gramEnd"/>
+      <w:r>
+        <w:rPr>
+          <w:rFonts w:ascii="Calibri" w:hAnsi="Calibri" w:cs="Calibri"/>
+          <w:b/>
+          <w:bCs/>
+          <w:highlight w:val="white"/>
+        </w:rPr>
+        <w:t xml:space="preserve"> </w:t>
       </w:r>
       <w:r>
         <w:rPr>
@@ -4550,7 +5083,6 @@
           <w:rFonts w:ascii="Calibri" w:hAnsi="Calibri" w:cs="Calibri"/>
           <w:highlight w:val="white"/>
         </w:rPr>
-        <w:lastRenderedPageBreak/>
         <w:t>Tenendo conto di associazione e attributi, si costruisce il seguente Modello di Dominio:</w:t>
       </w:r>
     </w:p>
@@ -4567,10 +5099,10 @@
           <w:noProof/>
         </w:rPr>
         <w:drawing>
-          <wp:inline distT="0" distB="0" distL="0" distR="0" wp14:anchorId="1D6DDD24" wp14:editId="4458FF34">
-            <wp:extent cx="6120130" cy="4519930"/>
-            <wp:effectExtent l="0" t="0" r="0" b="0"/>
-            <wp:docPr id="121653102" name="Immagine 10" descr="Immagine che contiene testo, diagramma, linea, Piano&#10;&#10;Descrizione generata automaticamente"/>
+          <wp:inline distT="0" distB="0" distL="0" distR="0" wp14:anchorId="1DFC5991" wp14:editId="4F51BDBB">
+            <wp:extent cx="6120130" cy="5076825"/>
+            <wp:effectExtent l="0" t="0" r="0" b="9525"/>
+            <wp:docPr id="182273254" name="Immagine 2" descr="Immagine che contiene testo, diagramma, Piano, schermata"/>
             <wp:cNvGraphicFramePr>
               <a:graphicFrameLocks xmlns:a="http://schemas.openxmlformats.org/drawingml/2006/main" noChangeAspect="1"/>
             </wp:cNvGraphicFramePr>
@@ -4578,7 +5110,7 @@
               <a:graphicData uri="http://schemas.openxmlformats.org/drawingml/2006/picture">
                 <pic:pic xmlns:pic="http://schemas.openxmlformats.org/drawingml/2006/picture">
                   <pic:nvPicPr>
-                    <pic:cNvPr id="121653102" name="Immagine 10" descr="Immagine che contiene testo, diagramma, linea, Piano&#10;&#10;Descrizione generata automaticamente"/>
+                    <pic:cNvPr id="182273254" name="Immagine 2" descr="Immagine che contiene testo, diagramma, Piano, schermata"/>
                     <pic:cNvPicPr/>
                   </pic:nvPicPr>
                   <pic:blipFill>
@@ -4596,7 +5128,7 @@
                   <pic:spPr>
                     <a:xfrm>
                       <a:off x="0" y="0"/>
-                      <a:ext cx="6120130" cy="4519930"/>
+                      <a:ext cx="6120130" cy="5076825"/>
                     </a:xfrm>
                     <a:prstGeom prst="rect">
                       <a:avLst/>
@@ -4698,33 +5230,18 @@
     </w:p>
     <w:p>
       <w:pPr>
-        <w:rPr>
-          <w:highlight w:val="white"/>
-        </w:rPr>
-      </w:pPr>
-    </w:p>
-    <w:p>
-      <w:pPr>
-        <w:rPr>
-          <w:highlight w:val="white"/>
-        </w:rPr>
-      </w:pPr>
-    </w:p>
-    <w:p>
-      <w:pPr>
         <w:pStyle w:val="Titolo2"/>
         <w:rPr>
           <w:rFonts w:ascii="Calibri" w:hAnsi="Calibri" w:cs="Calibri"/>
           <w:highlight w:val="white"/>
         </w:rPr>
       </w:pPr>
-      <w:bookmarkStart w:id="6" w:name="_Toc172061600"/>
-      <w:r>
-        <w:rPr>
-          <w:rFonts w:ascii="Calibri" w:hAnsi="Calibri" w:cs="Calibri"/>
-          <w:highlight w:val="white"/>
-        </w:rPr>
-        <w:lastRenderedPageBreak/>
+      <w:bookmarkStart w:id="6" w:name="_Toc173398846"/>
+      <w:r>
+        <w:rPr>
+          <w:rFonts w:ascii="Calibri" w:hAnsi="Calibri" w:cs="Calibri"/>
+          <w:highlight w:val="white"/>
+        </w:rPr>
         <w:t>3.</w:t>
       </w:r>
       <w:r>
@@ -4801,8 +5318,19 @@
           <w:iCs/>
           <w:highlight w:val="white"/>
         </w:rPr>
-        <w:t>UC2: Partita singleplayer</w:t>
-      </w:r>
+        <w:t xml:space="preserve">UC2: Partita </w:t>
+      </w:r>
+      <w:proofErr w:type="spellStart"/>
+      <w:r>
+        <w:rPr>
+          <w:rFonts w:ascii="Calibri" w:hAnsi="Calibri" w:cs="Calibri"/>
+          <w:i/>
+          <w:iCs/>
+          <w:highlight w:val="white"/>
+        </w:rPr>
+        <w:t>singleplayer</w:t>
+      </w:r>
+      <w:proofErr w:type="spellEnd"/>
       <w:r>
         <w:rPr>
           <w:rFonts w:ascii="Calibri" w:hAnsi="Calibri" w:cs="Calibri"/>
@@ -4882,11 +5410,12 @@
         </w:rPr>
       </w:pPr>
       <w:bookmarkStart w:id="7" w:name="_Toc171097035"/>
-      <w:bookmarkStart w:id="8" w:name="_Toc172061601"/>
-      <w:r>
-        <w:rPr>
-          <w:rFonts w:ascii="Calibri" w:hAnsi="Calibri" w:cs="Calibri"/>
-        </w:rPr>
+      <w:bookmarkStart w:id="8" w:name="_Toc173398847"/>
+      <w:r>
+        <w:rPr>
+          <w:rFonts w:ascii="Calibri" w:hAnsi="Calibri" w:cs="Calibri"/>
+        </w:rPr>
+        <w:lastRenderedPageBreak/>
         <w:t>3.3</w:t>
       </w:r>
       <w:r>
@@ -4995,6 +5524,7 @@
                 <w:i/>
               </w:rPr>
             </w:pPr>
+            <w:proofErr w:type="spellStart"/>
             <w:r>
               <w:rPr>
                 <w:rFonts w:ascii="Calibri" w:eastAsia="Aptos" w:hAnsi="Calibri" w:cs="Calibri"/>
@@ -5013,6 +5543,7 @@
               </w:rPr>
               <w:t>PartitaSP</w:t>
             </w:r>
+            <w:proofErr w:type="spellEnd"/>
           </w:p>
         </w:tc>
       </w:tr>
@@ -5054,6 +5585,8 @@
                 <w:rFonts w:ascii="Calibri" w:eastAsia="Aptos" w:hAnsi="Calibri" w:cs="Calibri"/>
               </w:rPr>
             </w:pPr>
+            <w:proofErr w:type="spellStart"/>
+            <w:proofErr w:type="gramStart"/>
             <w:r>
               <w:rPr>
                 <w:rFonts w:ascii="Calibri" w:eastAsia="Aptos" w:hAnsi="Calibri" w:cs="Calibri"/>
@@ -5066,11 +5599,19 @@
               </w:rPr>
               <w:t>PartitaSP</w:t>
             </w:r>
+            <w:proofErr w:type="spellEnd"/>
             <w:r>
               <w:rPr>
                 <w:rFonts w:ascii="Calibri" w:eastAsia="Aptos" w:hAnsi="Calibri" w:cs="Calibri"/>
               </w:rPr>
-              <w:t>();</w:t>
+              <w:t>(</w:t>
+            </w:r>
+            <w:proofErr w:type="gramEnd"/>
+            <w:r>
+              <w:rPr>
+                <w:rFonts w:ascii="Calibri" w:eastAsia="Aptos" w:hAnsi="Calibri" w:cs="Calibri"/>
+              </w:rPr>
+              <w:t>);</w:t>
             </w:r>
           </w:p>
         </w:tc>
@@ -5140,7 +5681,21 @@
               <w:rPr>
                 <w:rFonts w:ascii="Calibri" w:hAnsi="Calibri" w:cs="Calibri"/>
               </w:rPr>
-              <w:t>artita singleplayer;</w:t>
+              <w:t xml:space="preserve">artita </w:t>
+            </w:r>
+            <w:proofErr w:type="spellStart"/>
+            <w:r>
+              <w:rPr>
+                <w:rFonts w:ascii="Calibri" w:hAnsi="Calibri" w:cs="Calibri"/>
+              </w:rPr>
+              <w:t>singleplayer</w:t>
+            </w:r>
+            <w:proofErr w:type="spellEnd"/>
+            <w:r>
+              <w:rPr>
+                <w:rFonts w:ascii="Calibri" w:hAnsi="Calibri" w:cs="Calibri"/>
+              </w:rPr>
+              <w:t>;</w:t>
             </w:r>
           </w:p>
         </w:tc>
@@ -5187,7 +5742,23 @@
               <w:rPr>
                 <w:rFonts w:ascii="Calibri" w:hAnsi="Calibri" w:cs="Calibri"/>
               </w:rPr>
-              <w:t>È stata creata una istanza partitaCorrente ed è stata avviata la partita secondo il Caso d’uso UC1.</w:t>
+              <w:t xml:space="preserve">È stata creata una istanza </w:t>
+            </w:r>
+            <w:proofErr w:type="spellStart"/>
+            <w:proofErr w:type="gramStart"/>
+            <w:r>
+              <w:rPr>
+                <w:rFonts w:ascii="Calibri" w:hAnsi="Calibri" w:cs="Calibri"/>
+              </w:rPr>
+              <w:t>partitaCorrente</w:t>
+            </w:r>
+            <w:proofErr w:type="spellEnd"/>
+            <w:proofErr w:type="gramEnd"/>
+            <w:r>
+              <w:rPr>
+                <w:rFonts w:ascii="Calibri" w:hAnsi="Calibri" w:cs="Calibri"/>
+              </w:rPr>
+              <w:t xml:space="preserve"> ed è stata avviata la partita secondo il Caso d’uso UC1.</w:t>
             </w:r>
           </w:p>
         </w:tc>
@@ -5234,6 +5805,8 @@
                 <w:rFonts w:ascii="Calibri" w:hAnsi="Calibri" w:cs="Calibri"/>
               </w:rPr>
             </w:pPr>
+            <w:proofErr w:type="spellStart"/>
+            <w:proofErr w:type="gramStart"/>
             <w:r>
               <w:rPr>
                 <w:rFonts w:ascii="Calibri" w:hAnsi="Calibri" w:cs="Calibri"/>
@@ -5242,6 +5815,8 @@
               </w:rPr>
               <w:t>partitaCorrente</w:t>
             </w:r>
+            <w:proofErr w:type="spellEnd"/>
+            <w:proofErr w:type="gramEnd"/>
             <w:r>
               <w:rPr>
                 <w:rFonts w:ascii="Calibri" w:hAnsi="Calibri" w:cs="Calibri"/>
@@ -5317,15 +5892,18 @@
                 <w:rFonts w:ascii="Calibri" w:hAnsi="Calibri" w:cs="Calibri"/>
               </w:rPr>
             </w:pPr>
+            <w:proofErr w:type="spellStart"/>
+            <w:proofErr w:type="gramStart"/>
             <w:r>
               <w:rPr>
                 <w:rFonts w:ascii="Calibri" w:hAnsi="Calibri" w:cs="Calibri"/>
                 <w:i/>
                 <w:iCs/>
               </w:rPr>
-              <w:lastRenderedPageBreak/>
               <w:t>partitaCorrente</w:t>
             </w:r>
+            <w:proofErr w:type="spellEnd"/>
+            <w:proofErr w:type="gramEnd"/>
             <w:r>
               <w:rPr>
                 <w:rFonts w:ascii="Calibri" w:hAnsi="Calibri" w:cs="Calibri"/>
@@ -5433,6 +6011,7 @@
                 <w:i/>
               </w:rPr>
             </w:pPr>
+            <w:proofErr w:type="spellStart"/>
             <w:r>
               <w:rPr>
                 <w:rFonts w:ascii="Calibri" w:eastAsia="Aptos" w:hAnsi="Calibri" w:cs="Calibri"/>
@@ -5442,6 +6021,7 @@
               </w:rPr>
               <w:t>giocaTurno</w:t>
             </w:r>
+            <w:proofErr w:type="spellEnd"/>
           </w:p>
         </w:tc>
       </w:tr>
@@ -5483,17 +6063,27 @@
                 <w:rFonts w:ascii="Calibri" w:eastAsia="Aptos" w:hAnsi="Calibri" w:cs="Calibri"/>
               </w:rPr>
             </w:pPr>
+            <w:proofErr w:type="spellStart"/>
+            <w:proofErr w:type="gramStart"/>
             <w:r>
               <w:rPr>
                 <w:rFonts w:ascii="Calibri" w:eastAsia="Aptos" w:hAnsi="Calibri" w:cs="Calibri"/>
               </w:rPr>
               <w:t>giocaTurno</w:t>
             </w:r>
+            <w:proofErr w:type="spellEnd"/>
             <w:r>
               <w:rPr>
                 <w:rFonts w:ascii="Calibri" w:eastAsia="Aptos" w:hAnsi="Calibri" w:cs="Calibri"/>
               </w:rPr>
-              <w:t>();</w:t>
+              <w:t>(</w:t>
+            </w:r>
+            <w:proofErr w:type="gramEnd"/>
+            <w:r>
+              <w:rPr>
+                <w:rFonts w:ascii="Calibri" w:eastAsia="Aptos" w:hAnsi="Calibri" w:cs="Calibri"/>
+              </w:rPr>
+              <w:t>);</w:t>
             </w:r>
           </w:p>
         </w:tc>
@@ -5563,7 +6153,21 @@
               <w:rPr>
                 <w:rFonts w:ascii="Calibri" w:hAnsi="Calibri" w:cs="Calibri"/>
               </w:rPr>
-              <w:t>artita singleplayer;</w:t>
+              <w:t xml:space="preserve">artita </w:t>
+            </w:r>
+            <w:proofErr w:type="spellStart"/>
+            <w:r>
+              <w:rPr>
+                <w:rFonts w:ascii="Calibri" w:hAnsi="Calibri" w:cs="Calibri"/>
+              </w:rPr>
+              <w:t>singleplayer</w:t>
+            </w:r>
+            <w:proofErr w:type="spellEnd"/>
+            <w:r>
+              <w:rPr>
+                <w:rFonts w:ascii="Calibri" w:hAnsi="Calibri" w:cs="Calibri"/>
+              </w:rPr>
+              <w:t>;</w:t>
             </w:r>
           </w:p>
         </w:tc>
@@ -5610,7 +6214,23 @@
               <w:rPr>
                 <w:rFonts w:ascii="Calibri" w:hAnsi="Calibri" w:cs="Calibri"/>
               </w:rPr>
-              <w:t>È stata creata una istanza partitaCorrente ed è stata avviata la partita secondo il Caso d’uso UC1.</w:t>
+              <w:t xml:space="preserve">È stata creata una istanza </w:t>
+            </w:r>
+            <w:proofErr w:type="spellStart"/>
+            <w:proofErr w:type="gramStart"/>
+            <w:r>
+              <w:rPr>
+                <w:rFonts w:ascii="Calibri" w:hAnsi="Calibri" w:cs="Calibri"/>
+              </w:rPr>
+              <w:t>partitaCorrente</w:t>
+            </w:r>
+            <w:proofErr w:type="spellEnd"/>
+            <w:proofErr w:type="gramEnd"/>
+            <w:r>
+              <w:rPr>
+                <w:rFonts w:ascii="Calibri" w:hAnsi="Calibri" w:cs="Calibri"/>
+              </w:rPr>
+              <w:t xml:space="preserve"> ed è stata avviata la partita secondo il Caso d’uso UC1.</w:t>
             </w:r>
           </w:p>
         </w:tc>
@@ -5657,6 +6277,8 @@
                 <w:rFonts w:ascii="Calibri" w:hAnsi="Calibri" w:cs="Calibri"/>
               </w:rPr>
             </w:pPr>
+            <w:proofErr w:type="spellStart"/>
+            <w:proofErr w:type="gramStart"/>
             <w:r>
               <w:rPr>
                 <w:rFonts w:ascii="Calibri" w:hAnsi="Calibri" w:cs="Calibri"/>
@@ -5665,6 +6287,8 @@
               </w:rPr>
               <w:t>partitaCorrente</w:t>
             </w:r>
+            <w:proofErr w:type="spellEnd"/>
+            <w:proofErr w:type="gramEnd"/>
             <w:r>
               <w:rPr>
                 <w:rFonts w:ascii="Calibri" w:hAnsi="Calibri" w:cs="Calibri"/>
@@ -5736,8 +6360,16 @@
               <w:rPr>
                 <w:rFonts w:ascii="Calibri" w:hAnsi="Calibri" w:cs="Calibri"/>
               </w:rPr>
-              <w:t>associata alla pedina tramite l’associazione segnaPosizione</w:t>
-            </w:r>
+              <w:t xml:space="preserve">associata alla pedina tramite l’associazione </w:t>
+            </w:r>
+            <w:proofErr w:type="spellStart"/>
+            <w:r>
+              <w:rPr>
+                <w:rFonts w:ascii="Calibri" w:hAnsi="Calibri" w:cs="Calibri"/>
+              </w:rPr>
+              <w:t>segnaPosizione</w:t>
+            </w:r>
+            <w:proofErr w:type="spellEnd"/>
             <w:r>
               <w:rPr>
                 <w:rFonts w:ascii="Calibri" w:hAnsi="Calibri" w:cs="Calibri"/>
@@ -5761,7 +6393,23 @@
               <w:rPr>
                 <w:rFonts w:ascii="Calibri" w:hAnsi="Calibri" w:cs="Calibri"/>
               </w:rPr>
-              <w:t>Qualora la Casella sia di tipo CasellaSpeciale, v</w:t>
+              <w:t xml:space="preserve">Qualora la Casella sia di tipo </w:t>
+            </w:r>
+            <w:proofErr w:type="spellStart"/>
+            <w:proofErr w:type="gramStart"/>
+            <w:r>
+              <w:rPr>
+                <w:rFonts w:ascii="Calibri" w:hAnsi="Calibri" w:cs="Calibri"/>
+              </w:rPr>
+              <w:t>CasellaSpeciale</w:t>
+            </w:r>
+            <w:proofErr w:type="spellEnd"/>
+            <w:proofErr w:type="gramEnd"/>
+            <w:r>
+              <w:rPr>
+                <w:rFonts w:ascii="Calibri" w:hAnsi="Calibri" w:cs="Calibri"/>
+              </w:rPr>
+              <w:t>, v</w:t>
             </w:r>
             <w:r>
               <w:rPr>
@@ -5773,8 +6421,30 @@
               <w:rPr>
                 <w:rFonts w:ascii="Calibri" w:hAnsi="Calibri" w:cs="Calibri"/>
               </w:rPr>
-              <w:t xml:space="preserve"> un controllo sulla proprietà malus per modificare l’attributo stato di Pedina. Viene anche effettuato un controllo sul modificatore: il valore viene sommato algebricamente al numero della Casella associata per determinare la nuova posizione tramite la associazione segnaPosizione</w:t>
-            </w:r>
+              <w:t xml:space="preserve"> un controllo sulla proprietà </w:t>
+            </w:r>
+            <w:proofErr w:type="spellStart"/>
+            <w:r>
+              <w:rPr>
+                <w:rFonts w:ascii="Calibri" w:hAnsi="Calibri" w:cs="Calibri"/>
+              </w:rPr>
+              <w:t>malus</w:t>
+            </w:r>
+            <w:proofErr w:type="spellEnd"/>
+            <w:r>
+              <w:rPr>
+                <w:rFonts w:ascii="Calibri" w:hAnsi="Calibri" w:cs="Calibri"/>
+              </w:rPr>
+              <w:t xml:space="preserve"> per modificare l’attributo stato di Pedina. Viene anche effettuato un controllo sul modificatore: il valore viene sommato algebricamente al numero della Casella associata per determinare la nuova posizione tramite la associazione </w:t>
+            </w:r>
+            <w:proofErr w:type="spellStart"/>
+            <w:r>
+              <w:rPr>
+                <w:rFonts w:ascii="Calibri" w:hAnsi="Calibri" w:cs="Calibri"/>
+              </w:rPr>
+              <w:t>segnaPosizione</w:t>
+            </w:r>
+            <w:proofErr w:type="spellEnd"/>
             <w:r>
               <w:rPr>
                 <w:rFonts w:ascii="Calibri" w:hAnsi="Calibri" w:cs="Calibri"/>
@@ -5798,7 +6468,21 @@
               <w:rPr>
                 <w:rFonts w:ascii="Calibri" w:hAnsi="Calibri" w:cs="Calibri"/>
               </w:rPr>
-              <w:t xml:space="preserve">Se la Casella è di tipo CasellaFine si procede ad effettuare il </w:t>
+              <w:t xml:space="preserve">Se la Casella è di tipo </w:t>
+            </w:r>
+            <w:proofErr w:type="spellStart"/>
+            <w:r>
+              <w:rPr>
+                <w:rFonts w:ascii="Calibri" w:hAnsi="Calibri" w:cs="Calibri"/>
+              </w:rPr>
+              <w:t>CasellaFine</w:t>
+            </w:r>
+            <w:proofErr w:type="spellEnd"/>
+            <w:r>
+              <w:rPr>
+                <w:rFonts w:ascii="Calibri" w:hAnsi="Calibri" w:cs="Calibri"/>
+              </w:rPr>
+              <w:t xml:space="preserve"> si procede ad effettuare il </w:t>
             </w:r>
             <w:r>
               <w:rPr>
@@ -5810,7 +6494,29 @@
               <w:rPr>
                 <w:rFonts w:ascii="Calibri" w:hAnsi="Calibri" w:cs="Calibri"/>
               </w:rPr>
-              <w:t xml:space="preserve"> concludiPartita()</w:t>
+              <w:t xml:space="preserve"> </w:t>
+            </w:r>
+            <w:proofErr w:type="spellStart"/>
+            <w:proofErr w:type="gramStart"/>
+            <w:r>
+              <w:rPr>
+                <w:rFonts w:ascii="Calibri" w:hAnsi="Calibri" w:cs="Calibri"/>
+              </w:rPr>
+              <w:t>concludiPartita</w:t>
+            </w:r>
+            <w:proofErr w:type="spellEnd"/>
+            <w:r>
+              <w:rPr>
+                <w:rFonts w:ascii="Calibri" w:hAnsi="Calibri" w:cs="Calibri"/>
+              </w:rPr>
+              <w:t>(</w:t>
+            </w:r>
+            <w:proofErr w:type="gramEnd"/>
+            <w:r>
+              <w:rPr>
+                <w:rFonts w:ascii="Calibri" w:hAnsi="Calibri" w:cs="Calibri"/>
+              </w:rPr>
+              <w:t>)</w:t>
             </w:r>
             <w:r>
               <w:rPr>
@@ -5906,6 +6612,7 @@
                 <w:i/>
               </w:rPr>
             </w:pPr>
+            <w:proofErr w:type="spellStart"/>
             <w:r>
               <w:rPr>
                 <w:rFonts w:ascii="Calibri" w:eastAsia="Aptos" w:hAnsi="Calibri" w:cs="Calibri"/>
@@ -5915,6 +6622,7 @@
               </w:rPr>
               <w:t>performaTurnoComputer</w:t>
             </w:r>
+            <w:proofErr w:type="spellEnd"/>
           </w:p>
         </w:tc>
       </w:tr>
@@ -5956,17 +6664,27 @@
                 <w:rFonts w:ascii="Calibri" w:eastAsia="Aptos" w:hAnsi="Calibri" w:cs="Calibri"/>
               </w:rPr>
             </w:pPr>
+            <w:proofErr w:type="spellStart"/>
+            <w:proofErr w:type="gramStart"/>
             <w:r>
               <w:rPr>
                 <w:rFonts w:ascii="Calibri" w:eastAsia="Aptos" w:hAnsi="Calibri" w:cs="Calibri"/>
               </w:rPr>
               <w:t>performaTurnoComputer</w:t>
             </w:r>
+            <w:proofErr w:type="spellEnd"/>
             <w:r>
               <w:rPr>
                 <w:rFonts w:ascii="Calibri" w:eastAsia="Aptos" w:hAnsi="Calibri" w:cs="Calibri"/>
               </w:rPr>
-              <w:t>();</w:t>
+              <w:t>(</w:t>
+            </w:r>
+            <w:proofErr w:type="gramEnd"/>
+            <w:r>
+              <w:rPr>
+                <w:rFonts w:ascii="Calibri" w:eastAsia="Aptos" w:hAnsi="Calibri" w:cs="Calibri"/>
+              </w:rPr>
+              <w:t>);</w:t>
             </w:r>
           </w:p>
         </w:tc>
@@ -6036,7 +6754,21 @@
               <w:rPr>
                 <w:rFonts w:ascii="Calibri" w:hAnsi="Calibri" w:cs="Calibri"/>
               </w:rPr>
-              <w:t>artita singleplayer;</w:t>
+              <w:t xml:space="preserve">artita </w:t>
+            </w:r>
+            <w:proofErr w:type="spellStart"/>
+            <w:r>
+              <w:rPr>
+                <w:rFonts w:ascii="Calibri" w:hAnsi="Calibri" w:cs="Calibri"/>
+              </w:rPr>
+              <w:t>singleplayer</w:t>
+            </w:r>
+            <w:proofErr w:type="spellEnd"/>
+            <w:r>
+              <w:rPr>
+                <w:rFonts w:ascii="Calibri" w:hAnsi="Calibri" w:cs="Calibri"/>
+              </w:rPr>
+              <w:t>;</w:t>
             </w:r>
           </w:p>
         </w:tc>
@@ -6083,7 +6815,23 @@
               <w:rPr>
                 <w:rFonts w:ascii="Calibri" w:hAnsi="Calibri" w:cs="Calibri"/>
               </w:rPr>
-              <w:t>È stata creata una istanza partitaCorrente ed è stata avviata la partita secondo il Caso d’uso UC1.</w:t>
+              <w:t xml:space="preserve">È stata creata una istanza </w:t>
+            </w:r>
+            <w:proofErr w:type="spellStart"/>
+            <w:proofErr w:type="gramStart"/>
+            <w:r>
+              <w:rPr>
+                <w:rFonts w:ascii="Calibri" w:hAnsi="Calibri" w:cs="Calibri"/>
+              </w:rPr>
+              <w:t>partitaCorrente</w:t>
+            </w:r>
+            <w:proofErr w:type="spellEnd"/>
+            <w:proofErr w:type="gramEnd"/>
+            <w:r>
+              <w:rPr>
+                <w:rFonts w:ascii="Calibri" w:hAnsi="Calibri" w:cs="Calibri"/>
+              </w:rPr>
+              <w:t xml:space="preserve"> ed è stata avviata la partita secondo il Caso d’uso UC1.</w:t>
             </w:r>
           </w:p>
           <w:p>
@@ -6109,7 +6857,23 @@
               <w:rPr>
                 <w:rFonts w:ascii="Calibri" w:hAnsi="Calibri" w:cs="Calibri"/>
               </w:rPr>
-              <w:t>ha già effettuato i passaggi del giocaTurno per il turno corrente</w:t>
+              <w:t xml:space="preserve">ha già effettuato i passaggi del </w:t>
+            </w:r>
+            <w:proofErr w:type="spellStart"/>
+            <w:proofErr w:type="gramStart"/>
+            <w:r>
+              <w:rPr>
+                <w:rFonts w:ascii="Calibri" w:hAnsi="Calibri" w:cs="Calibri"/>
+              </w:rPr>
+              <w:t>giocaTurno</w:t>
+            </w:r>
+            <w:proofErr w:type="spellEnd"/>
+            <w:proofErr w:type="gramEnd"/>
+            <w:r>
+              <w:rPr>
+                <w:rFonts w:ascii="Calibri" w:hAnsi="Calibri" w:cs="Calibri"/>
+              </w:rPr>
+              <w:t xml:space="preserve"> per il turno corrente</w:t>
             </w:r>
           </w:p>
         </w:tc>
@@ -6156,6 +6920,8 @@
                 <w:rFonts w:ascii="Calibri" w:hAnsi="Calibri" w:cs="Calibri"/>
               </w:rPr>
             </w:pPr>
+            <w:proofErr w:type="spellStart"/>
+            <w:proofErr w:type="gramStart"/>
             <w:r>
               <w:rPr>
                 <w:rFonts w:ascii="Calibri" w:hAnsi="Calibri" w:cs="Calibri"/>
@@ -6164,6 +6930,8 @@
               </w:rPr>
               <w:t>partitaCorrente</w:t>
             </w:r>
+            <w:proofErr w:type="spellEnd"/>
+            <w:proofErr w:type="gramEnd"/>
             <w:r>
               <w:rPr>
                 <w:rFonts w:ascii="Calibri" w:hAnsi="Calibri" w:cs="Calibri"/>
@@ -6213,12 +6981,14 @@
               </w:rPr>
               <w:t xml:space="preserve"> con </w:t>
             </w:r>
+            <w:proofErr w:type="spellStart"/>
             <w:r>
               <w:rPr>
                 <w:rFonts w:ascii="Calibri" w:hAnsi="Calibri" w:cs="Calibri"/>
               </w:rPr>
               <w:t>nomeGiocatore</w:t>
             </w:r>
+            <w:proofErr w:type="spellEnd"/>
             <w:r>
               <w:rPr>
                 <w:rFonts w:ascii="Calibri" w:hAnsi="Calibri" w:cs="Calibri"/>
@@ -6241,8 +7011,23 @@
               <w:rPr>
                 <w:rFonts w:ascii="Calibri" w:hAnsi="Calibri" w:cs="Calibri"/>
               </w:rPr>
-              <w:t xml:space="preserve"> lancia i dadi, il valore viene utilizzato per determinare il numero della nuova Casella che verrà associata alla pedina tramite l’associazione segnaPosizione</w:t>
-            </w:r>
+              <w:t xml:space="preserve"> lancia i dadi, il valore viene utilizzato </w:t>
+            </w:r>
+            <w:r>
+              <w:rPr>
+                <w:rFonts w:ascii="Calibri" w:hAnsi="Calibri" w:cs="Calibri"/>
+              </w:rPr>
+              <w:lastRenderedPageBreak/>
+              <w:t xml:space="preserve">per determinare il numero della nuova Casella che verrà associata alla pedina tramite l’associazione </w:t>
+            </w:r>
+            <w:proofErr w:type="spellStart"/>
+            <w:r>
+              <w:rPr>
+                <w:rFonts w:ascii="Calibri" w:hAnsi="Calibri" w:cs="Calibri"/>
+              </w:rPr>
+              <w:t>segnaPosizione</w:t>
+            </w:r>
+            <w:proofErr w:type="spellEnd"/>
             <w:r>
               <w:rPr>
                 <w:rFonts w:ascii="Calibri" w:hAnsi="Calibri" w:cs="Calibri"/>
@@ -6266,8 +7051,46 @@
               <w:rPr>
                 <w:rFonts w:ascii="Calibri" w:hAnsi="Calibri" w:cs="Calibri"/>
               </w:rPr>
-              <w:t>Qualora la Casella sia di tipo CasellaSpeciale, viene effettuato un controllo sulla proprietà malus per modificare l’attributo stato di Pedina. Viene anche effettuato un controllo sul modificatore: il valore viene sommato algebricamente al numero della Casella associata per determinare la nuova posizione tramite la associazione segnaPosizione</w:t>
-            </w:r>
+              <w:t xml:space="preserve">Qualora la Casella sia di tipo </w:t>
+            </w:r>
+            <w:proofErr w:type="spellStart"/>
+            <w:proofErr w:type="gramStart"/>
+            <w:r>
+              <w:rPr>
+                <w:rFonts w:ascii="Calibri" w:hAnsi="Calibri" w:cs="Calibri"/>
+              </w:rPr>
+              <w:t>CasellaSpeciale</w:t>
+            </w:r>
+            <w:proofErr w:type="spellEnd"/>
+            <w:proofErr w:type="gramEnd"/>
+            <w:r>
+              <w:rPr>
+                <w:rFonts w:ascii="Calibri" w:hAnsi="Calibri" w:cs="Calibri"/>
+              </w:rPr>
+              <w:t xml:space="preserve">, viene effettuato un controllo sulla proprietà </w:t>
+            </w:r>
+            <w:proofErr w:type="spellStart"/>
+            <w:r>
+              <w:rPr>
+                <w:rFonts w:ascii="Calibri" w:hAnsi="Calibri" w:cs="Calibri"/>
+              </w:rPr>
+              <w:t>malus</w:t>
+            </w:r>
+            <w:proofErr w:type="spellEnd"/>
+            <w:r>
+              <w:rPr>
+                <w:rFonts w:ascii="Calibri" w:hAnsi="Calibri" w:cs="Calibri"/>
+              </w:rPr>
+              <w:t xml:space="preserve"> per modificare l’attributo stato di Pedina. Viene anche effettuato un controllo sul modificatore: il valore viene sommato algebricamente al numero della Casella associata per determinare la nuova posizione tramite la associazione </w:t>
+            </w:r>
+            <w:proofErr w:type="spellStart"/>
+            <w:r>
+              <w:rPr>
+                <w:rFonts w:ascii="Calibri" w:hAnsi="Calibri" w:cs="Calibri"/>
+              </w:rPr>
+              <w:t>segnaPosizione</w:t>
+            </w:r>
+            <w:proofErr w:type="spellEnd"/>
             <w:r>
               <w:rPr>
                 <w:rFonts w:ascii="Calibri" w:hAnsi="Calibri" w:cs="Calibri"/>
@@ -6291,13 +7114,49 @@
               <w:rPr>
                 <w:rFonts w:ascii="Calibri" w:hAnsi="Calibri" w:cs="Calibri"/>
               </w:rPr>
-              <w:t xml:space="preserve">Se la Casella è di tipo CasellaFine si </w:t>
-            </w:r>
-            <w:r>
-              <w:rPr>
-                <w:rFonts w:ascii="Calibri" w:hAnsi="Calibri" w:cs="Calibri"/>
-              </w:rPr>
-              <w:t>procede ad effettuare il contratto concludiPartita()</w:t>
+              <w:t xml:space="preserve">Se la Casella è di tipo </w:t>
+            </w:r>
+            <w:proofErr w:type="spellStart"/>
+            <w:r>
+              <w:rPr>
+                <w:rFonts w:ascii="Calibri" w:hAnsi="Calibri" w:cs="Calibri"/>
+              </w:rPr>
+              <w:t>CasellaFine</w:t>
+            </w:r>
+            <w:proofErr w:type="spellEnd"/>
+            <w:r>
+              <w:rPr>
+                <w:rFonts w:ascii="Calibri" w:hAnsi="Calibri" w:cs="Calibri"/>
+              </w:rPr>
+              <w:t xml:space="preserve"> si </w:t>
+            </w:r>
+            <w:r>
+              <w:rPr>
+                <w:rFonts w:ascii="Calibri" w:hAnsi="Calibri" w:cs="Calibri"/>
+              </w:rPr>
+              <w:t xml:space="preserve">procede ad effettuare il contratto </w:t>
+            </w:r>
+            <w:proofErr w:type="spellStart"/>
+            <w:proofErr w:type="gramStart"/>
+            <w:r>
+              <w:rPr>
+                <w:rFonts w:ascii="Calibri" w:hAnsi="Calibri" w:cs="Calibri"/>
+              </w:rPr>
+              <w:t>concludiPartita</w:t>
+            </w:r>
+            <w:proofErr w:type="spellEnd"/>
+            <w:r>
+              <w:rPr>
+                <w:rFonts w:ascii="Calibri" w:hAnsi="Calibri" w:cs="Calibri"/>
+              </w:rPr>
+              <w:t>(</w:t>
+            </w:r>
+            <w:proofErr w:type="gramEnd"/>
+            <w:r>
+              <w:rPr>
+                <w:rFonts w:ascii="Calibri" w:hAnsi="Calibri" w:cs="Calibri"/>
+              </w:rPr>
+              <w:t>)</w:t>
             </w:r>
             <w:r>
               <w:rPr>
@@ -6393,6 +7252,7 @@
                 <w:i/>
               </w:rPr>
             </w:pPr>
+            <w:proofErr w:type="spellStart"/>
             <w:r>
               <w:rPr>
                 <w:rFonts w:ascii="Calibri" w:eastAsia="Aptos" w:hAnsi="Calibri" w:cs="Calibri"/>
@@ -6402,6 +7262,7 @@
               </w:rPr>
               <w:t>concludiPartita</w:t>
             </w:r>
+            <w:proofErr w:type="spellEnd"/>
           </w:p>
         </w:tc>
       </w:tr>
@@ -6443,17 +7304,27 @@
                 <w:rFonts w:ascii="Calibri" w:eastAsia="Aptos" w:hAnsi="Calibri" w:cs="Calibri"/>
               </w:rPr>
             </w:pPr>
+            <w:proofErr w:type="spellStart"/>
+            <w:proofErr w:type="gramStart"/>
             <w:r>
               <w:rPr>
                 <w:rFonts w:ascii="Calibri" w:eastAsia="Aptos" w:hAnsi="Calibri" w:cs="Calibri"/>
               </w:rPr>
               <w:t>concludiPartita</w:t>
             </w:r>
+            <w:proofErr w:type="spellEnd"/>
             <w:r>
               <w:rPr>
                 <w:rFonts w:ascii="Calibri" w:eastAsia="Aptos" w:hAnsi="Calibri" w:cs="Calibri"/>
               </w:rPr>
-              <w:t>();</w:t>
+              <w:t>(</w:t>
+            </w:r>
+            <w:proofErr w:type="gramEnd"/>
+            <w:r>
+              <w:rPr>
+                <w:rFonts w:ascii="Calibri" w:eastAsia="Aptos" w:hAnsi="Calibri" w:cs="Calibri"/>
+              </w:rPr>
+              <w:t>);</w:t>
             </w:r>
           </w:p>
         </w:tc>
@@ -6523,7 +7394,21 @@
               <w:rPr>
                 <w:rFonts w:ascii="Calibri" w:hAnsi="Calibri" w:cs="Calibri"/>
               </w:rPr>
-              <w:t>artita singleplayer;</w:t>
+              <w:t xml:space="preserve">artita </w:t>
+            </w:r>
+            <w:proofErr w:type="spellStart"/>
+            <w:r>
+              <w:rPr>
+                <w:rFonts w:ascii="Calibri" w:hAnsi="Calibri" w:cs="Calibri"/>
+              </w:rPr>
+              <w:t>singleplayer</w:t>
+            </w:r>
+            <w:proofErr w:type="spellEnd"/>
+            <w:r>
+              <w:rPr>
+                <w:rFonts w:ascii="Calibri" w:hAnsi="Calibri" w:cs="Calibri"/>
+              </w:rPr>
+              <w:t>;</w:t>
             </w:r>
           </w:p>
         </w:tc>
@@ -6550,7 +7435,6 @@
               <w:rPr>
                 <w:rFonts w:ascii="Calibri" w:eastAsia="Aptos" w:hAnsi="Calibri" w:cs="Calibri"/>
               </w:rPr>
-              <w:lastRenderedPageBreak/>
               <w:t>Pre-condizioni</w:t>
             </w:r>
           </w:p>
@@ -6571,7 +7455,23 @@
               <w:rPr>
                 <w:rFonts w:ascii="Calibri" w:hAnsi="Calibri" w:cs="Calibri"/>
               </w:rPr>
-              <w:t>È stata creata una istanza partitaCorrente ed è stata avviata la partita secondo il Caso d’uso UC1.</w:t>
+              <w:t xml:space="preserve">È stata creata una istanza </w:t>
+            </w:r>
+            <w:proofErr w:type="spellStart"/>
+            <w:proofErr w:type="gramStart"/>
+            <w:r>
+              <w:rPr>
+                <w:rFonts w:ascii="Calibri" w:hAnsi="Calibri" w:cs="Calibri"/>
+              </w:rPr>
+              <w:t>partitaCorrente</w:t>
+            </w:r>
+            <w:proofErr w:type="spellEnd"/>
+            <w:proofErr w:type="gramEnd"/>
+            <w:r>
+              <w:rPr>
+                <w:rFonts w:ascii="Calibri" w:hAnsi="Calibri" w:cs="Calibri"/>
+              </w:rPr>
+              <w:t xml:space="preserve"> ed è stata avviata la partita secondo il Caso d’uso UC1.</w:t>
             </w:r>
           </w:p>
           <w:p>
@@ -6585,7 +7485,23 @@
               <w:rPr>
                 <w:rFonts w:ascii="Calibri" w:hAnsi="Calibri" w:cs="Calibri"/>
               </w:rPr>
-              <w:t>Il giocatore umano e il giocatore bot hanno già effettuato i passaggi del giocaTurno per almeno un turno</w:t>
+              <w:t xml:space="preserve">Il giocatore umano e il giocatore bot hanno già effettuato i passaggi del </w:t>
+            </w:r>
+            <w:proofErr w:type="spellStart"/>
+            <w:proofErr w:type="gramStart"/>
+            <w:r>
+              <w:rPr>
+                <w:rFonts w:ascii="Calibri" w:hAnsi="Calibri" w:cs="Calibri"/>
+              </w:rPr>
+              <w:t>giocaTurno</w:t>
+            </w:r>
+            <w:proofErr w:type="spellEnd"/>
+            <w:proofErr w:type="gramEnd"/>
+            <w:r>
+              <w:rPr>
+                <w:rFonts w:ascii="Calibri" w:hAnsi="Calibri" w:cs="Calibri"/>
+              </w:rPr>
+              <w:t xml:space="preserve"> per almeno un turno</w:t>
             </w:r>
           </w:p>
         </w:tc>
@@ -6636,7 +7552,21 @@
               <w:rPr>
                 <w:rFonts w:ascii="Calibri" w:hAnsi="Calibri" w:cs="Calibri"/>
               </w:rPr>
-              <w:t>Viene effettuato un controllo tramite la posizione della Pedina se la Casella su cui si trova è di tipo CasellaFine;</w:t>
+              <w:t xml:space="preserve">Viene effettuato un controllo tramite la posizione della Pedina se la Casella su cui si trova è di tipo </w:t>
+            </w:r>
+            <w:proofErr w:type="spellStart"/>
+            <w:r>
+              <w:rPr>
+                <w:rFonts w:ascii="Calibri" w:hAnsi="Calibri" w:cs="Calibri"/>
+              </w:rPr>
+              <w:t>CasellaFine</w:t>
+            </w:r>
+            <w:proofErr w:type="spellEnd"/>
+            <w:r>
+              <w:rPr>
+                <w:rFonts w:ascii="Calibri" w:hAnsi="Calibri" w:cs="Calibri"/>
+              </w:rPr>
+              <w:t>;</w:t>
             </w:r>
           </w:p>
           <w:p>
@@ -6655,8 +7585,18 @@
               <w:rPr>
                 <w:rFonts w:ascii="Calibri" w:hAnsi="Calibri" w:cs="Calibri"/>
               </w:rPr>
-              <w:t>Se la Casella è di tipo CasellaFine</w:t>
-            </w:r>
+              <w:t xml:space="preserve">Se la Casella è di tipo </w:t>
+            </w:r>
+            <w:proofErr w:type="spellStart"/>
+            <w:proofErr w:type="gramStart"/>
+            <w:r>
+              <w:rPr>
+                <w:rFonts w:ascii="Calibri" w:hAnsi="Calibri" w:cs="Calibri"/>
+              </w:rPr>
+              <w:t>CasellaFine</w:t>
+            </w:r>
+            <w:proofErr w:type="spellEnd"/>
+            <w:proofErr w:type="gramEnd"/>
             <w:r>
               <w:rPr>
                 <w:rFonts w:ascii="Calibri" w:hAnsi="Calibri" w:cs="Calibri"/>
@@ -6705,6 +7645,899 @@
     </w:tbl>
     <w:p>
       <w:pPr>
+        <w:pStyle w:val="Titolo1"/>
+        <w:jc w:val="center"/>
+        <w:rPr>
+          <w:rFonts w:ascii="Calibri" w:hAnsi="Calibri" w:cs="Calibri"/>
+        </w:rPr>
+      </w:pPr>
+    </w:p>
+    <w:p>
+      <w:pPr>
+        <w:pStyle w:val="Titolo1"/>
+        <w:jc w:val="center"/>
+        <w:rPr>
+          <w:rFonts w:ascii="Calibri" w:hAnsi="Calibri" w:cs="Calibri"/>
+        </w:rPr>
+      </w:pPr>
+      <w:bookmarkStart w:id="9" w:name="_Toc173398848"/>
+      <w:r>
+        <w:rPr>
+          <w:rFonts w:ascii="Calibri" w:hAnsi="Calibri" w:cs="Calibri"/>
+        </w:rPr>
+        <w:t>4</w:t>
+      </w:r>
+      <w:r>
+        <w:rPr>
+          <w:rFonts w:ascii="Calibri" w:hAnsi="Calibri" w:cs="Calibri"/>
+        </w:rPr>
+        <w:t xml:space="preserve">.0 </w:t>
+      </w:r>
+      <w:r>
+        <w:rPr>
+          <w:rFonts w:ascii="Calibri" w:hAnsi="Calibri" w:cs="Calibri"/>
+        </w:rPr>
+        <w:t>Progettazione</w:t>
+      </w:r>
+      <w:r>
+        <w:rPr>
+          <w:rFonts w:ascii="Calibri" w:hAnsi="Calibri" w:cs="Calibri"/>
+        </w:rPr>
+        <w:t xml:space="preserve"> Orientata agli Oggetti</w:t>
+      </w:r>
+      <w:bookmarkEnd w:id="9"/>
+    </w:p>
+    <w:p/>
+    <w:p>
+      <w:pPr>
+        <w:rPr>
+          <w:rFonts w:ascii="Calibri" w:hAnsi="Calibri" w:cs="Calibri"/>
+          <w:highlight w:val="white"/>
+        </w:rPr>
+      </w:pPr>
+      <w:r>
+        <w:rPr>
+          <w:rFonts w:ascii="Calibri" w:hAnsi="Calibri" w:cs="Calibri"/>
+        </w:rPr>
+        <w:t xml:space="preserve">Di seguito, in relazione al Modello di Progetto, vengono presentati i diagrammi più significativi riguardanti il caso d’uso </w:t>
+      </w:r>
+      <w:r>
+        <w:rPr>
+          <w:rFonts w:ascii="Calibri" w:eastAsia="Calibri" w:hAnsi="Calibri" w:cs="Calibri"/>
+          <w:i/>
+          <w:color w:val="000000"/>
+        </w:rPr>
+        <w:t xml:space="preserve">UC2: </w:t>
+      </w:r>
+      <w:r>
+        <w:rPr>
+          <w:rFonts w:ascii="Calibri" w:eastAsia="Calibri" w:hAnsi="Calibri" w:cs="Calibri"/>
+          <w:i/>
+          <w:color w:val="0D0D0D"/>
+        </w:rPr>
+        <w:t xml:space="preserve">Partita </w:t>
+      </w:r>
+      <w:proofErr w:type="spellStart"/>
+      <w:r>
+        <w:rPr>
+          <w:rFonts w:ascii="Calibri" w:eastAsia="Calibri" w:hAnsi="Calibri" w:cs="Calibri"/>
+          <w:i/>
+          <w:color w:val="0D0D0D"/>
+        </w:rPr>
+        <w:t>singleplayer</w:t>
+      </w:r>
+      <w:proofErr w:type="spellEnd"/>
+      <w:r>
+        <w:rPr>
+          <w:rFonts w:ascii="Calibri" w:hAnsi="Calibri" w:cs="Calibri"/>
+          <w:highlight w:val="white"/>
+        </w:rPr>
+        <w:t>.</w:t>
+      </w:r>
+    </w:p>
+    <w:p>
+      <w:pPr>
+        <w:rPr>
+          <w:rFonts w:ascii="Calibri" w:hAnsi="Calibri" w:cs="Calibri"/>
+          <w:highlight w:val="white"/>
+        </w:rPr>
+      </w:pPr>
+    </w:p>
+    <w:p>
+      <w:pPr>
+        <w:pStyle w:val="Titolo2"/>
+        <w:rPr>
+          <w:rFonts w:ascii="Calibri" w:hAnsi="Calibri" w:cs="Calibri"/>
+          <w:highlight w:val="white"/>
+        </w:rPr>
+      </w:pPr>
+      <w:bookmarkStart w:id="10" w:name="_Toc173398849"/>
+      <w:r>
+        <w:rPr>
+          <w:rFonts w:ascii="Calibri" w:hAnsi="Calibri" w:cs="Calibri"/>
+          <w:highlight w:val="white"/>
+        </w:rPr>
+        <w:t>4</w:t>
+      </w:r>
+      <w:r>
+        <w:rPr>
+          <w:rFonts w:ascii="Calibri" w:hAnsi="Calibri" w:cs="Calibri"/>
+          <w:highlight w:val="white"/>
+        </w:rPr>
+        <w:t xml:space="preserve">.1 </w:t>
+      </w:r>
+      <w:r>
+        <w:rPr>
+          <w:rFonts w:ascii="Calibri" w:hAnsi="Calibri" w:cs="Calibri"/>
+          <w:highlight w:val="white"/>
+        </w:rPr>
+        <w:t>Diagramma</w:t>
+      </w:r>
+      <w:r>
+        <w:rPr>
+          <w:rFonts w:ascii="Calibri" w:hAnsi="Calibri" w:cs="Calibri"/>
+          <w:highlight w:val="white"/>
+        </w:rPr>
+        <w:t xml:space="preserve"> di </w:t>
+      </w:r>
+      <w:r>
+        <w:rPr>
+          <w:rFonts w:ascii="Calibri" w:hAnsi="Calibri" w:cs="Calibri"/>
+          <w:highlight w:val="white"/>
+        </w:rPr>
+        <w:t>Sequenza</w:t>
+      </w:r>
+      <w:bookmarkEnd w:id="10"/>
+    </w:p>
+    <w:p>
+      <w:pPr>
+        <w:rPr>
+          <w:highlight w:val="white"/>
+        </w:rPr>
+      </w:pPr>
+    </w:p>
+    <w:p>
+      <w:pPr>
+        <w:rPr>
+          <w:highlight w:val="white"/>
+        </w:rPr>
+      </w:pPr>
+      <w:r>
+        <w:rPr>
+          <w:highlight w:val="white"/>
+        </w:rPr>
+        <w:t xml:space="preserve">SD – </w:t>
+      </w:r>
+      <w:proofErr w:type="spellStart"/>
+      <w:r>
+        <w:rPr>
+          <w:highlight w:val="white"/>
+        </w:rPr>
+        <w:t>giocaPartitaSP</w:t>
+      </w:r>
+      <w:proofErr w:type="spellEnd"/>
+    </w:p>
+    <w:p>
+      <w:pPr>
+        <w:rPr>
+          <w:highlight w:val="white"/>
+        </w:rPr>
+      </w:pPr>
+      <w:r>
+        <w:rPr>
+          <w:noProof/>
+        </w:rPr>
+        <w:lastRenderedPageBreak/>
+        <w:drawing>
+          <wp:inline distT="0" distB="0" distL="0" distR="0" wp14:anchorId="582747C8" wp14:editId="77BC3B3C">
+            <wp:extent cx="6120130" cy="2445385"/>
+            <wp:effectExtent l="0" t="0" r="0" b="0"/>
+            <wp:docPr id="839630958" name="Immagine 3" descr="Immagine che contiene testo, diagramma, linea, schermata"/>
+            <wp:cNvGraphicFramePr>
+              <a:graphicFrameLocks xmlns:a="http://schemas.openxmlformats.org/drawingml/2006/main" noChangeAspect="1"/>
+            </wp:cNvGraphicFramePr>
+            <a:graphic xmlns:a="http://schemas.openxmlformats.org/drawingml/2006/main">
+              <a:graphicData uri="http://schemas.openxmlformats.org/drawingml/2006/picture">
+                <pic:pic xmlns:pic="http://schemas.openxmlformats.org/drawingml/2006/picture">
+                  <pic:nvPicPr>
+                    <pic:cNvPr id="839630958" name="Immagine 3" descr="Immagine che contiene testo, diagramma, linea, schermata"/>
+                    <pic:cNvPicPr/>
+                  </pic:nvPicPr>
+                  <pic:blipFill>
+                    <a:blip r:embed="rId12" cstate="print">
+                      <a:extLst>
+                        <a:ext uri="{28A0092B-C50C-407E-A947-70E740481C1C}">
+                          <a14:useLocalDpi xmlns:a14="http://schemas.microsoft.com/office/drawing/2010/main" val="0"/>
+                        </a:ext>
+                      </a:extLst>
+                    </a:blip>
+                    <a:stretch>
+                      <a:fillRect/>
+                    </a:stretch>
+                  </pic:blipFill>
+                  <pic:spPr>
+                    <a:xfrm>
+                      <a:off x="0" y="0"/>
+                      <a:ext cx="6120130" cy="2445385"/>
+                    </a:xfrm>
+                    <a:prstGeom prst="rect">
+                      <a:avLst/>
+                    </a:prstGeom>
+                  </pic:spPr>
+                </pic:pic>
+              </a:graphicData>
+            </a:graphic>
+          </wp:inline>
+        </w:drawing>
+      </w:r>
+    </w:p>
+    <w:p>
+      <w:pPr>
+        <w:rPr>
+          <w:rFonts w:ascii="Calibri" w:hAnsi="Calibri" w:cs="Calibri"/>
+          <w:highlight w:val="white"/>
+        </w:rPr>
+      </w:pPr>
+    </w:p>
+    <w:p>
+      <w:pPr>
+        <w:rPr>
+          <w:rFonts w:ascii="Calibri" w:hAnsi="Calibri" w:cs="Calibri"/>
+          <w:highlight w:val="white"/>
+        </w:rPr>
+      </w:pPr>
+    </w:p>
+    <w:p>
+      <w:pPr>
+        <w:rPr>
+          <w:rFonts w:ascii="Calibri" w:hAnsi="Calibri" w:cs="Calibri"/>
+          <w:highlight w:val="white"/>
+        </w:rPr>
+      </w:pPr>
+    </w:p>
+    <w:p>
+      <w:pPr>
+        <w:rPr>
+          <w:rFonts w:ascii="Calibri" w:hAnsi="Calibri" w:cs="Calibri"/>
+          <w:highlight w:val="white"/>
+        </w:rPr>
+      </w:pPr>
+    </w:p>
+    <w:p>
+      <w:pPr>
+        <w:rPr>
+          <w:rFonts w:ascii="Calibri" w:hAnsi="Calibri" w:cs="Calibri"/>
+          <w:highlight w:val="white"/>
+        </w:rPr>
+      </w:pPr>
+    </w:p>
+    <w:p>
+      <w:pPr>
+        <w:rPr>
+          <w:rFonts w:ascii="Calibri" w:hAnsi="Calibri" w:cs="Calibri"/>
+          <w:highlight w:val="white"/>
+        </w:rPr>
+      </w:pPr>
+      <w:r>
+        <w:rPr>
+          <w:rFonts w:ascii="Calibri" w:hAnsi="Calibri" w:cs="Calibri"/>
+          <w:highlight w:val="white"/>
+        </w:rPr>
+        <w:t xml:space="preserve">SD – </w:t>
+      </w:r>
+      <w:proofErr w:type="spellStart"/>
+      <w:r>
+        <w:rPr>
+          <w:rFonts w:ascii="Calibri" w:hAnsi="Calibri" w:cs="Calibri"/>
+          <w:highlight w:val="white"/>
+        </w:rPr>
+        <w:t>giocaTurno</w:t>
+      </w:r>
+      <w:proofErr w:type="spellEnd"/>
+    </w:p>
+    <w:p>
+      <w:pPr>
+        <w:rPr>
+          <w:rFonts w:ascii="Calibri" w:hAnsi="Calibri" w:cs="Calibri"/>
+          <w:highlight w:val="white"/>
+        </w:rPr>
+      </w:pPr>
+      <w:r>
+        <w:rPr>
+          <w:rFonts w:ascii="Calibri" w:hAnsi="Calibri" w:cs="Calibri"/>
+          <w:noProof/>
+        </w:rPr>
+        <w:drawing>
+          <wp:inline distT="0" distB="0" distL="0" distR="0" wp14:anchorId="387BA269" wp14:editId="650B25F6">
+            <wp:extent cx="6120130" cy="2445385"/>
+            <wp:effectExtent l="0" t="0" r="0" b="0"/>
+            <wp:docPr id="561209082" name="Immagine 4" descr="Immagine che contiene testo, diagramma, linea, schermata&#10;&#10;Descrizione generata automaticamente"/>
+            <wp:cNvGraphicFramePr>
+              <a:graphicFrameLocks xmlns:a="http://schemas.openxmlformats.org/drawingml/2006/main" noChangeAspect="1"/>
+            </wp:cNvGraphicFramePr>
+            <a:graphic xmlns:a="http://schemas.openxmlformats.org/drawingml/2006/main">
+              <a:graphicData uri="http://schemas.openxmlformats.org/drawingml/2006/picture">
+                <pic:pic xmlns:pic="http://schemas.openxmlformats.org/drawingml/2006/picture">
+                  <pic:nvPicPr>
+                    <pic:cNvPr id="561209082" name="Immagine 4" descr="Immagine che contiene testo, diagramma, linea, schermata&#10;&#10;Descrizione generata automaticamente"/>
+                    <pic:cNvPicPr/>
+                  </pic:nvPicPr>
+                  <pic:blipFill>
+                    <a:blip r:embed="rId13" cstate="print">
+                      <a:extLst>
+                        <a:ext uri="{28A0092B-C50C-407E-A947-70E740481C1C}">
+                          <a14:useLocalDpi xmlns:a14="http://schemas.microsoft.com/office/drawing/2010/main" val="0"/>
+                        </a:ext>
+                      </a:extLst>
+                    </a:blip>
+                    <a:stretch>
+                      <a:fillRect/>
+                    </a:stretch>
+                  </pic:blipFill>
+                  <pic:spPr>
+                    <a:xfrm>
+                      <a:off x="0" y="0"/>
+                      <a:ext cx="6120130" cy="2445385"/>
+                    </a:xfrm>
+                    <a:prstGeom prst="rect">
+                      <a:avLst/>
+                    </a:prstGeom>
+                  </pic:spPr>
+                </pic:pic>
+              </a:graphicData>
+            </a:graphic>
+          </wp:inline>
+        </w:drawing>
+      </w:r>
+    </w:p>
+    <w:p>
+      <w:pPr>
+        <w:rPr>
+          <w:rFonts w:ascii="Calibri" w:hAnsi="Calibri" w:cs="Calibri"/>
+          <w:highlight w:val="white"/>
+        </w:rPr>
+      </w:pPr>
+      <w:r>
+        <w:rPr>
+          <w:rFonts w:ascii="Calibri" w:hAnsi="Calibri" w:cs="Calibri"/>
+          <w:highlight w:val="white"/>
+        </w:rPr>
+        <w:t xml:space="preserve">SD – </w:t>
+      </w:r>
+      <w:proofErr w:type="spellStart"/>
+      <w:r>
+        <w:rPr>
+          <w:rFonts w:ascii="Calibri" w:hAnsi="Calibri" w:cs="Calibri"/>
+          <w:highlight w:val="white"/>
+        </w:rPr>
+        <w:t>performaTurnoComputer</w:t>
+      </w:r>
+      <w:proofErr w:type="spellEnd"/>
+    </w:p>
+    <w:p>
+      <w:pPr>
+        <w:rPr>
+          <w:rFonts w:ascii="Calibri" w:hAnsi="Calibri" w:cs="Calibri"/>
+          <w:highlight w:val="white"/>
+        </w:rPr>
+      </w:pPr>
+      <w:r>
+        <w:rPr>
+          <w:rFonts w:ascii="Calibri" w:hAnsi="Calibri" w:cs="Calibri"/>
+          <w:noProof/>
+        </w:rPr>
+        <w:lastRenderedPageBreak/>
+        <w:drawing>
+          <wp:inline distT="0" distB="0" distL="0" distR="0" wp14:anchorId="3021F116" wp14:editId="28CD3F89">
+            <wp:extent cx="6120130" cy="2507615"/>
+            <wp:effectExtent l="0" t="0" r="0" b="6985"/>
+            <wp:docPr id="1163824681" name="Immagine 5" descr="Immagine che contiene testo, diagramma, linea, schermata"/>
+            <wp:cNvGraphicFramePr>
+              <a:graphicFrameLocks xmlns:a="http://schemas.openxmlformats.org/drawingml/2006/main" noChangeAspect="1"/>
+            </wp:cNvGraphicFramePr>
+            <a:graphic xmlns:a="http://schemas.openxmlformats.org/drawingml/2006/main">
+              <a:graphicData uri="http://schemas.openxmlformats.org/drawingml/2006/picture">
+                <pic:pic xmlns:pic="http://schemas.openxmlformats.org/drawingml/2006/picture">
+                  <pic:nvPicPr>
+                    <pic:cNvPr id="1163824681" name="Immagine 5" descr="Immagine che contiene testo, diagramma, linea, schermata"/>
+                    <pic:cNvPicPr/>
+                  </pic:nvPicPr>
+                  <pic:blipFill>
+                    <a:blip r:embed="rId14" cstate="print">
+                      <a:extLst>
+                        <a:ext uri="{28A0092B-C50C-407E-A947-70E740481C1C}">
+                          <a14:useLocalDpi xmlns:a14="http://schemas.microsoft.com/office/drawing/2010/main" val="0"/>
+                        </a:ext>
+                      </a:extLst>
+                    </a:blip>
+                    <a:stretch>
+                      <a:fillRect/>
+                    </a:stretch>
+                  </pic:blipFill>
+                  <pic:spPr>
+                    <a:xfrm>
+                      <a:off x="0" y="0"/>
+                      <a:ext cx="6120130" cy="2507615"/>
+                    </a:xfrm>
+                    <a:prstGeom prst="rect">
+                      <a:avLst/>
+                    </a:prstGeom>
+                  </pic:spPr>
+                </pic:pic>
+              </a:graphicData>
+            </a:graphic>
+          </wp:inline>
+        </w:drawing>
+      </w:r>
+    </w:p>
+    <w:p>
+      <w:pPr>
+        <w:rPr>
+          <w:rFonts w:ascii="Calibri" w:hAnsi="Calibri" w:cs="Calibri"/>
+          <w:highlight w:val="white"/>
+        </w:rPr>
+      </w:pPr>
+    </w:p>
+    <w:p>
+      <w:pPr>
+        <w:rPr>
+          <w:rFonts w:ascii="Calibri" w:hAnsi="Calibri" w:cs="Calibri"/>
+          <w:highlight w:val="white"/>
+        </w:rPr>
+      </w:pPr>
+    </w:p>
+    <w:p>
+      <w:pPr>
+        <w:rPr>
+          <w:rFonts w:ascii="Calibri" w:hAnsi="Calibri" w:cs="Calibri"/>
+          <w:highlight w:val="white"/>
+        </w:rPr>
+      </w:pPr>
+    </w:p>
+    <w:p>
+      <w:pPr>
+        <w:rPr>
+          <w:rFonts w:ascii="Calibri" w:hAnsi="Calibri" w:cs="Calibri"/>
+          <w:highlight w:val="white"/>
+        </w:rPr>
+      </w:pPr>
+    </w:p>
+    <w:p>
+      <w:pPr>
+        <w:rPr>
+          <w:rFonts w:ascii="Calibri" w:hAnsi="Calibri" w:cs="Calibri"/>
+          <w:highlight w:val="white"/>
+        </w:rPr>
+      </w:pPr>
+    </w:p>
+    <w:p>
+      <w:pPr>
+        <w:rPr>
+          <w:rFonts w:ascii="Calibri" w:hAnsi="Calibri" w:cs="Calibri"/>
+          <w:highlight w:val="white"/>
+        </w:rPr>
+      </w:pPr>
+    </w:p>
+    <w:p>
+      <w:pPr>
+        <w:rPr>
+          <w:rFonts w:ascii="Calibri" w:hAnsi="Calibri" w:cs="Calibri"/>
+          <w:highlight w:val="white"/>
+        </w:rPr>
+      </w:pPr>
+    </w:p>
+    <w:p>
+      <w:pPr>
+        <w:rPr>
+          <w:rFonts w:ascii="Calibri" w:hAnsi="Calibri" w:cs="Calibri"/>
+          <w:highlight w:val="white"/>
+        </w:rPr>
+      </w:pPr>
+    </w:p>
+    <w:p>
+      <w:pPr>
+        <w:rPr>
+          <w:rFonts w:ascii="Calibri" w:hAnsi="Calibri" w:cs="Calibri"/>
+          <w:highlight w:val="white"/>
+        </w:rPr>
+      </w:pPr>
+    </w:p>
+    <w:p>
+      <w:pPr>
+        <w:rPr>
+          <w:rFonts w:ascii="Calibri" w:hAnsi="Calibri" w:cs="Calibri"/>
+          <w:highlight w:val="white"/>
+        </w:rPr>
+      </w:pPr>
+    </w:p>
+    <w:p>
+      <w:pPr>
+        <w:rPr>
+          <w:rFonts w:ascii="Calibri" w:hAnsi="Calibri" w:cs="Calibri"/>
+          <w:highlight w:val="white"/>
+        </w:rPr>
+      </w:pPr>
+    </w:p>
+    <w:p>
+      <w:pPr>
+        <w:rPr>
+          <w:rFonts w:ascii="Calibri" w:hAnsi="Calibri" w:cs="Calibri"/>
+          <w:highlight w:val="white"/>
+        </w:rPr>
+      </w:pPr>
+      <w:r>
+        <w:rPr>
+          <w:rFonts w:ascii="Calibri" w:hAnsi="Calibri" w:cs="Calibri"/>
+          <w:highlight w:val="white"/>
+        </w:rPr>
+        <w:t xml:space="preserve">SD – </w:t>
+      </w:r>
+      <w:proofErr w:type="spellStart"/>
+      <w:r>
+        <w:rPr>
+          <w:rFonts w:ascii="Calibri" w:hAnsi="Calibri" w:cs="Calibri"/>
+          <w:highlight w:val="white"/>
+        </w:rPr>
+        <w:t>concludiPartitaSP</w:t>
+      </w:r>
+      <w:proofErr w:type="spellEnd"/>
+    </w:p>
+    <w:p>
+      <w:pPr>
+        <w:rPr>
+          <w:rFonts w:ascii="Calibri" w:hAnsi="Calibri" w:cs="Calibri"/>
+          <w:highlight w:val="white"/>
+        </w:rPr>
+      </w:pPr>
+      <w:r>
+        <w:rPr>
+          <w:rFonts w:ascii="Calibri" w:hAnsi="Calibri" w:cs="Calibri"/>
+          <w:noProof/>
+        </w:rPr>
+        <w:lastRenderedPageBreak/>
+        <w:drawing>
+          <wp:inline distT="0" distB="0" distL="0" distR="0" wp14:anchorId="70FF7542" wp14:editId="33B2F15C">
+            <wp:extent cx="6120130" cy="4906010"/>
+            <wp:effectExtent l="0" t="0" r="0" b="8890"/>
+            <wp:docPr id="1837201686" name="Immagine 7" descr="Immagine che contiene testo, schermata, diagramma, Parallelo&#10;&#10;Descrizione generata automaticamente"/>
+            <wp:cNvGraphicFramePr>
+              <a:graphicFrameLocks xmlns:a="http://schemas.openxmlformats.org/drawingml/2006/main" noChangeAspect="1"/>
+            </wp:cNvGraphicFramePr>
+            <a:graphic xmlns:a="http://schemas.openxmlformats.org/drawingml/2006/main">
+              <a:graphicData uri="http://schemas.openxmlformats.org/drawingml/2006/picture">
+                <pic:pic xmlns:pic="http://schemas.openxmlformats.org/drawingml/2006/picture">
+                  <pic:nvPicPr>
+                    <pic:cNvPr id="1837201686" name="Immagine 7" descr="Immagine che contiene testo, schermata, diagramma, Parallelo&#10;&#10;Descrizione generata automaticamente"/>
+                    <pic:cNvPicPr/>
+                  </pic:nvPicPr>
+                  <pic:blipFill>
+                    <a:blip r:embed="rId15">
+                      <a:extLst>
+                        <a:ext uri="{28A0092B-C50C-407E-A947-70E740481C1C}">
+                          <a14:useLocalDpi xmlns:a14="http://schemas.microsoft.com/office/drawing/2010/main" val="0"/>
+                        </a:ext>
+                      </a:extLst>
+                    </a:blip>
+                    <a:stretch>
+                      <a:fillRect/>
+                    </a:stretch>
+                  </pic:blipFill>
+                  <pic:spPr>
+                    <a:xfrm>
+                      <a:off x="0" y="0"/>
+                      <a:ext cx="6120130" cy="4906010"/>
+                    </a:xfrm>
+                    <a:prstGeom prst="rect">
+                      <a:avLst/>
+                    </a:prstGeom>
+                  </pic:spPr>
+                </pic:pic>
+              </a:graphicData>
+            </a:graphic>
+          </wp:inline>
+        </w:drawing>
+      </w:r>
+    </w:p>
+    <w:p>
+      <w:pPr>
+        <w:rPr>
+          <w:rFonts w:ascii="Calibri" w:hAnsi="Calibri" w:cs="Calibri"/>
+          <w:highlight w:val="white"/>
+        </w:rPr>
+      </w:pPr>
+    </w:p>
+    <w:p>
+      <w:pPr>
+        <w:rPr>
+          <w:rFonts w:ascii="Calibri" w:hAnsi="Calibri" w:cs="Calibri"/>
+          <w:highlight w:val="white"/>
+        </w:rPr>
+      </w:pPr>
+    </w:p>
+    <w:p>
+      <w:pPr>
+        <w:rPr>
+          <w:rFonts w:ascii="Calibri" w:hAnsi="Calibri" w:cs="Calibri"/>
+          <w:highlight w:val="white"/>
+        </w:rPr>
+      </w:pPr>
+    </w:p>
+    <w:p>
+      <w:pPr>
+        <w:rPr>
+          <w:rFonts w:ascii="Calibri" w:hAnsi="Calibri" w:cs="Calibri"/>
+          <w:highlight w:val="white"/>
+        </w:rPr>
+      </w:pPr>
+    </w:p>
+    <w:p>
+      <w:pPr>
+        <w:rPr>
+          <w:rFonts w:ascii="Calibri" w:hAnsi="Calibri" w:cs="Calibri"/>
+          <w:highlight w:val="white"/>
+        </w:rPr>
+      </w:pPr>
+    </w:p>
+    <w:p>
+      <w:pPr>
+        <w:rPr>
+          <w:rFonts w:ascii="Calibri" w:hAnsi="Calibri" w:cs="Calibri"/>
+          <w:highlight w:val="white"/>
+        </w:rPr>
+      </w:pPr>
+    </w:p>
+    <w:p>
+      <w:pPr>
+        <w:rPr>
+          <w:rFonts w:ascii="Calibri" w:hAnsi="Calibri" w:cs="Calibri"/>
+          <w:highlight w:val="white"/>
+        </w:rPr>
+      </w:pPr>
+    </w:p>
+    <w:p>
+      <w:pPr>
+        <w:rPr>
+          <w:rFonts w:ascii="Calibri" w:hAnsi="Calibri" w:cs="Calibri"/>
+          <w:highlight w:val="white"/>
+        </w:rPr>
+      </w:pPr>
+    </w:p>
+    <w:p>
+      <w:pPr>
+        <w:rPr>
+          <w:rFonts w:ascii="Calibri" w:hAnsi="Calibri" w:cs="Calibri"/>
+          <w:highlight w:val="white"/>
+        </w:rPr>
+      </w:pPr>
+    </w:p>
+    <w:p>
+      <w:pPr>
+        <w:rPr>
+          <w:rFonts w:ascii="Calibri" w:hAnsi="Calibri" w:cs="Calibri"/>
+          <w:highlight w:val="white"/>
+        </w:rPr>
+      </w:pPr>
+    </w:p>
+    <w:p>
+      <w:pPr>
+        <w:rPr>
+          <w:rFonts w:ascii="Calibri" w:hAnsi="Calibri" w:cs="Calibri"/>
+          <w:highlight w:val="white"/>
+        </w:rPr>
+      </w:pPr>
+    </w:p>
+    <w:p>
+      <w:pPr>
+        <w:rPr>
+          <w:rFonts w:ascii="Calibri" w:hAnsi="Calibri" w:cs="Calibri"/>
+          <w:highlight w:val="white"/>
+        </w:rPr>
+      </w:pPr>
+    </w:p>
+    <w:p>
+      <w:pPr>
+        <w:pStyle w:val="Titolo2"/>
+        <w:rPr>
+          <w:rFonts w:ascii="Calibri" w:hAnsi="Calibri" w:cs="Calibri"/>
+          <w:highlight w:val="white"/>
+        </w:rPr>
+      </w:pPr>
+      <w:bookmarkStart w:id="11" w:name="_Toc173398850"/>
+      <w:r>
+        <w:rPr>
+          <w:rFonts w:ascii="Calibri" w:hAnsi="Calibri" w:cs="Calibri"/>
+          <w:highlight w:val="white"/>
+        </w:rPr>
+        <w:lastRenderedPageBreak/>
+        <w:t>4</w:t>
+      </w:r>
+      <w:r>
+        <w:rPr>
+          <w:rFonts w:ascii="Calibri" w:hAnsi="Calibri" w:cs="Calibri"/>
+          <w:highlight w:val="white"/>
+        </w:rPr>
+        <w:t>.</w:t>
+      </w:r>
+      <w:r>
+        <w:rPr>
+          <w:rFonts w:ascii="Calibri" w:hAnsi="Calibri" w:cs="Calibri"/>
+          <w:highlight w:val="white"/>
+        </w:rPr>
+        <w:t>2</w:t>
+      </w:r>
+      <w:r>
+        <w:rPr>
+          <w:rFonts w:ascii="Calibri" w:hAnsi="Calibri" w:cs="Calibri"/>
+          <w:highlight w:val="white"/>
+        </w:rPr>
+        <w:t xml:space="preserve"> </w:t>
+      </w:r>
+      <w:r>
+        <w:rPr>
+          <w:rFonts w:ascii="Calibri" w:hAnsi="Calibri" w:cs="Calibri"/>
+          <w:highlight w:val="white"/>
+        </w:rPr>
+        <w:t>Diagramma</w:t>
+      </w:r>
+      <w:r>
+        <w:rPr>
+          <w:rFonts w:ascii="Calibri" w:hAnsi="Calibri" w:cs="Calibri"/>
+          <w:highlight w:val="white"/>
+        </w:rPr>
+        <w:t xml:space="preserve"> d</w:t>
+      </w:r>
+      <w:r>
+        <w:rPr>
+          <w:rFonts w:ascii="Calibri" w:hAnsi="Calibri" w:cs="Calibri"/>
+          <w:highlight w:val="white"/>
+        </w:rPr>
+        <w:t>elle</w:t>
+      </w:r>
+      <w:r>
+        <w:rPr>
+          <w:rFonts w:ascii="Calibri" w:hAnsi="Calibri" w:cs="Calibri"/>
+          <w:highlight w:val="white"/>
+        </w:rPr>
+        <w:t xml:space="preserve"> </w:t>
+      </w:r>
+      <w:r>
+        <w:rPr>
+          <w:rFonts w:ascii="Calibri" w:hAnsi="Calibri" w:cs="Calibri"/>
+          <w:highlight w:val="white"/>
+        </w:rPr>
+        <w:t>Classi</w:t>
+      </w:r>
+      <w:bookmarkEnd w:id="11"/>
+    </w:p>
+    <w:p>
+      <w:pPr>
+        <w:rPr>
+          <w:highlight w:val="white"/>
+        </w:rPr>
+      </w:pPr>
+      <w:r>
+        <w:rPr>
+          <w:noProof/>
+        </w:rPr>
+        <w:drawing>
+          <wp:inline distT="0" distB="0" distL="0" distR="0" wp14:anchorId="1B6B6AAE" wp14:editId="532A6D72">
+            <wp:extent cx="6120130" cy="2075815"/>
+            <wp:effectExtent l="0" t="0" r="0" b="635"/>
+            <wp:docPr id="1738293137" name="Immagine 8" descr="Immagine che contiene testo, schermata, linea, diagramma&#10;&#10;Descrizione generata automaticamente"/>
+            <wp:cNvGraphicFramePr>
+              <a:graphicFrameLocks xmlns:a="http://schemas.openxmlformats.org/drawingml/2006/main" noChangeAspect="1"/>
+            </wp:cNvGraphicFramePr>
+            <a:graphic xmlns:a="http://schemas.openxmlformats.org/drawingml/2006/main">
+              <a:graphicData uri="http://schemas.openxmlformats.org/drawingml/2006/picture">
+                <pic:pic xmlns:pic="http://schemas.openxmlformats.org/drawingml/2006/picture">
+                  <pic:nvPicPr>
+                    <pic:cNvPr id="1738293137" name="Immagine 8" descr="Immagine che contiene testo, schermata, linea, diagramma&#10;&#10;Descrizione generata automaticamente"/>
+                    <pic:cNvPicPr/>
+                  </pic:nvPicPr>
+                  <pic:blipFill>
+                    <a:blip r:embed="rId16" cstate="print">
+                      <a:extLst>
+                        <a:ext uri="{28A0092B-C50C-407E-A947-70E740481C1C}">
+                          <a14:useLocalDpi xmlns:a14="http://schemas.microsoft.com/office/drawing/2010/main" val="0"/>
+                        </a:ext>
+                      </a:extLst>
+                    </a:blip>
+                    <a:stretch>
+                      <a:fillRect/>
+                    </a:stretch>
+                  </pic:blipFill>
+                  <pic:spPr>
+                    <a:xfrm>
+                      <a:off x="0" y="0"/>
+                      <a:ext cx="6120130" cy="2075815"/>
+                    </a:xfrm>
+                    <a:prstGeom prst="rect">
+                      <a:avLst/>
+                    </a:prstGeom>
+                  </pic:spPr>
+                </pic:pic>
+              </a:graphicData>
+            </a:graphic>
+          </wp:inline>
+        </w:drawing>
+      </w:r>
+    </w:p>
+    <w:p>
+      <w:pPr>
+        <w:rPr>
+          <w:highlight w:val="white"/>
+        </w:rPr>
+      </w:pPr>
+    </w:p>
+    <w:p>
+      <w:pPr>
+        <w:pStyle w:val="Titolo2"/>
+        <w:rPr>
+          <w:rFonts w:ascii="Calibri" w:hAnsi="Calibri" w:cs="Calibri"/>
+          <w:highlight w:val="white"/>
+        </w:rPr>
+      </w:pPr>
+      <w:bookmarkStart w:id="12" w:name="_Toc173398851"/>
+      <w:r>
+        <w:rPr>
+          <w:rFonts w:ascii="Calibri" w:hAnsi="Calibri" w:cs="Calibri"/>
+          <w:highlight w:val="white"/>
+        </w:rPr>
+        <w:t>4</w:t>
+      </w:r>
+      <w:r>
+        <w:rPr>
+          <w:rFonts w:ascii="Calibri" w:hAnsi="Calibri" w:cs="Calibri"/>
+          <w:highlight w:val="white"/>
+        </w:rPr>
+        <w:t>.</w:t>
+      </w:r>
+      <w:r>
+        <w:rPr>
+          <w:rFonts w:ascii="Calibri" w:hAnsi="Calibri" w:cs="Calibri"/>
+          <w:highlight w:val="white"/>
+        </w:rPr>
+        <w:t>3</w:t>
+      </w:r>
+      <w:r>
+        <w:rPr>
+          <w:rFonts w:ascii="Calibri" w:hAnsi="Calibri" w:cs="Calibri"/>
+          <w:highlight w:val="white"/>
+        </w:rPr>
+        <w:t xml:space="preserve"> </w:t>
+      </w:r>
+      <w:r>
+        <w:rPr>
+          <w:rFonts w:ascii="Calibri" w:hAnsi="Calibri" w:cs="Calibri"/>
+          <w:highlight w:val="white"/>
+        </w:rPr>
+        <w:t>Caso d’Uso di Avviamento</w:t>
+      </w:r>
+      <w:bookmarkEnd w:id="12"/>
+    </w:p>
+    <w:p>
+      <w:pPr>
+        <w:rPr>
+          <w:rFonts w:ascii="Calibri" w:hAnsi="Calibri" w:cs="Calibri"/>
+          <w:highlight w:val="white"/>
+        </w:rPr>
+      </w:pPr>
+      <w:r>
+        <w:rPr>
+          <w:rFonts w:ascii="Calibri" w:hAnsi="Calibri" w:cs="Calibri"/>
+        </w:rPr>
+        <w:t>Il Caso d’Uso di Avviamento non presenta modifiche rispetto a quello presentato durante l’Iterazione 1.</w:t>
+      </w:r>
+    </w:p>
+    <w:p>
+      <w:pPr>
+        <w:rPr>
+          <w:highlight w:val="white"/>
+        </w:rPr>
+      </w:pPr>
+    </w:p>
+    <w:p>
+      <w:pPr>
         <w:rPr>
           <w:rFonts w:ascii="Calibri" w:hAnsi="Calibri" w:cs="Calibri"/>
           <w:highlight w:val="white"/>
@@ -6712,8 +8545,8 @@
       </w:pPr>
     </w:p>
     <w:sectPr>
-      <w:headerReference w:type="default" r:id="rId12"/>
-      <w:footerReference w:type="default" r:id="rId13"/>
+      <w:headerReference w:type="default" r:id="rId17"/>
+      <w:footerReference w:type="default" r:id="rId18"/>
       <w:pgSz w:w="11906" w:h="16838"/>
       <w:pgMar w:top="1417" w:right="1134" w:bottom="1134" w:left="1134" w:header="708" w:footer="640" w:gutter="0"/>
       <w:pgNumType w:start="0"/>
@@ -10531,7 +12364,6 @@
   <w:style w:type="character" w:default="1" w:styleId="Carpredefinitoparagrafo">
     <w:name w:val="Default Paragraph Font"/>
     <w:uiPriority w:val="1"/>
-    <w:semiHidden/>
     <w:unhideWhenUsed/>
   </w:style>
   <w:style w:type="table" w:default="1" w:styleId="Tabellanormale">
@@ -12096,6 +13928,7 @@
     <w:rsid w:val="00733765"/>
     <w:rsid w:val="00781888"/>
     <w:rsid w:val="007F0F73"/>
+    <w:rsid w:val="00823465"/>
     <w:rsid w:val="00867A01"/>
     <w:rsid w:val="008C51CE"/>
     <w:rsid w:val="008D094B"/>
@@ -12108,6 +13941,7 @@
     <w:rsid w:val="00B11FB2"/>
     <w:rsid w:val="00B86915"/>
     <w:rsid w:val="00BA2BDF"/>
+    <w:rsid w:val="00BC399B"/>
     <w:rsid w:val="00BE08AA"/>
     <w:rsid w:val="00CA6967"/>
     <w:rsid w:val="00DB41AF"/>
@@ -12899,28 +14733,28 @@
 </file>
 
 <file path=customXml/item1.xml><?xml version="1.0" encoding="utf-8"?>
-<b:Sources xmlns:b="http://schemas.openxmlformats.org/officeDocument/2006/bibliography" xmlns="http://schemas.openxmlformats.org/officeDocument/2006/bibliography" SelectedStyle="\APASixthEditionOfficeOnline.xsl" StyleName="APA" Version="6"/>
-</file>
-
-<file path=customXml/item2.xml><?xml version="1.0" encoding="utf-8"?>
 <go:gDocsCustomXmlDataStorage xmlns:go="http://customooxmlschemas.google.com/" xmlns:r="http://schemas.openxmlformats.org/officeDocument/2006/relationships" uri="GoogleDocsCustomDataVersion2">
   <go:docsCustomData xmlns:go="http://customooxmlschemas.google.com/" roundtripDataSignature="AMtx7mg1mGL6qORe6yYgtaAnOyb4Kh8WtQ==">CgMxLjAyCGguZ2pkZ3hzOAByITE0M0V0amI5QkxqZWpESnVvRjlQQmhGMzFZMFlUX3kxOQ==</go:docsCustomData>
 </go:gDocsCustomXmlDataStorage>
 </file>
 
-<file path=customXml/itemProps1.xml><?xml version="1.0" encoding="utf-8"?>
-<ds:datastoreItem xmlns:ds="http://schemas.openxmlformats.org/officeDocument/2006/customXml" ds:itemID="{37B528A4-5A93-4436-BAB4-9956BF7FC17A}">
-  <ds:schemaRefs>
-    <ds:schemaRef ds:uri="http://schemas.openxmlformats.org/officeDocument/2006/bibliography"/>
-  </ds:schemaRefs>
-</ds:datastoreItem>
+<file path=customXml/item2.xml><?xml version="1.0" encoding="utf-8"?>
+<b:Sources xmlns:b="http://schemas.openxmlformats.org/officeDocument/2006/bibliography" xmlns="http://schemas.openxmlformats.org/officeDocument/2006/bibliography" SelectedStyle="\APASixthEditionOfficeOnline.xsl" StyleName="APA" Version="6"/>
 </file>
 
-<file path=customXml/itemProps2.xml><?xml version="1.0" encoding="utf-8"?>
+<file path=customXml/itemProps1.xml><?xml version="1.0" encoding="utf-8"?>
 <ds:datastoreItem xmlns:ds="http://schemas.openxmlformats.org/officeDocument/2006/customXml" ds:itemID="{11111111-1234-1234-1234-123412341234}">
   <ds:schemaRefs>
     <ds:schemaRef ds:uri="http://customooxmlschemas.google.com/"/>
     <ds:schemaRef ds:uri="http://schemas.openxmlformats.org/officeDocument/2006/relationships"/>
   </ds:schemaRefs>
 </ds:datastoreItem>
+</file>
+
+<file path=customXml/itemProps2.xml><?xml version="1.0" encoding="utf-8"?>
+<ds:datastoreItem xmlns:ds="http://schemas.openxmlformats.org/officeDocument/2006/customXml" ds:itemID="{37B528A4-5A93-4436-BAB4-9956BF7FC17A}">
+  <ds:schemaRefs>
+    <ds:schemaRef ds:uri="http://schemas.openxmlformats.org/officeDocument/2006/bibliography"/>
+  </ds:schemaRefs>
+</ds:datastoreItem>
 </file>
</xml_diff>